<commit_message>
feat: add shared API guardrails
</commit_message>
<xml_diff>
--- a/docs/NanoLoop_Agent_协同开发规格与接口总文档_v3.0.docx
+++ b/docs/NanoLoop_Agent_协同开发规格与接口总文档_v3.0.docx
@@ -493,7 +493,7 @@
                 <w:sz w:val="17"/>
                 <w:lang w:val="zh-CN" w:eastAsia="zh-CN"/>
               </w:rPr>
-              <w:t xml:space="preserve">d3cc934fcd1ec999996f549c91a557979e7f33407d5838be19d2f61d6d70b8c5</w:t>
+              <w:t xml:space="preserve">2b46e1238fc0e4b51d270a880d54d08b835a31d24b4cf1efeae7ccd7f5764493</w:t>
             </w:r>
           </w:p>
         </w:tc>
@@ -616,7 +616,7 @@
                 <w:sz w:val="17"/>
                 <w:lang w:val="zh-CN" w:eastAsia="zh-CN"/>
               </w:rPr>
-              <w:t xml:space="preserve">Ruff、严格 Mypy、OpenAPI、396 项 Pytest、6 页 Streamlit 启动、Alembic 往返与漂移检查均通过</w:t>
+              <w:t xml:space="preserve">Ruff、严格 Mypy、OpenAPI、435 项 Pytest、6 页 Streamlit 启动、Alembic 往返与漂移检查均通过</w:t>
             </w:r>
           </w:p>
         </w:tc>
@@ -1616,7 +1616,7 @@
                 <w:sz w:val="17"/>
                 <w:lang w:val="zh-CN" w:eastAsia="zh-CN"/>
               </w:rPr>
-              <w:t xml:space="preserve">认证、配额、保留策略与多实例演进</w:t>
+              <w:t xml:space="preserve">用户/租户授权、配额、备份与多实例演进</w:t>
             </w:r>
           </w:p>
         </w:tc>
@@ -2793,7 +2793,7 @@
           <w:rFonts w:ascii="Arial" w:hAnsi="Arial" w:eastAsia="PingFang SC" w:cs="Arial"/>
           <w:lang w:val="zh-CN" w:eastAsia="zh-CN"/>
         </w:rPr>
-        <w:t xml:space="preserve">并增加 Host/Origin、请求体、multipart、图像/PDF/RAG 规模和确定性证据上限。开发者不得把这些</w:t>
+        <w:t xml:space="preserve">并增加 Host/Origin、可选共享</w:t>
       </w:r>
       <w:r>
         <w:rPr>
@@ -2804,10 +2804,92 @@
       </w:r>
       <w:r>
         <w:rPr>
-          <w:rFonts w:ascii="Arial" w:hAnsi="Arial" w:eastAsia="PingFang SC" w:cs="Arial"/>
-          <w:lang w:val="zh-CN" w:eastAsia="zh-CN"/>
-        </w:rPr>
-        <w:t xml:space="preserve">已经落地的保护降回 v2 的简化示例。</w:t>
+          <w:rStyle w:val="VerbatimChar"/>
+        </w:rPr>
+        <w:t xml:space="preserve">X-API-Key</w:t>
+      </w:r>
+      <w:r>
+        <w:rPr>
+          <w:rFonts w:ascii="Arial" w:hAnsi="Arial" w:eastAsia="PingFang SC" w:cs="Arial"/>
+          <w:lang w:val="zh-CN" w:eastAsia="zh-CN"/>
+        </w:rPr>
+        <w:t xml:space="preserve">、单进程固定三桶限流、请求体、multipart、</w:t>
+      </w:r>
+      <w:r>
+        <w:rPr>
+          <w:rFonts w:ascii="Arial" w:hAnsi="Arial" w:eastAsia="PingFang SC" w:cs="Arial"/>
+          <w:lang w:val="zh-CN" w:eastAsia="zh-CN"/>
+        </w:rPr>
+        <w:t xml:space="preserve"> </w:t>
+      </w:r>
+      <w:r>
+        <w:rPr>
+          <w:rFonts w:ascii="Arial" w:hAnsi="Arial" w:eastAsia="PingFang SC" w:cs="Arial"/>
+          <w:lang w:val="zh-CN" w:eastAsia="zh-CN"/>
+        </w:rPr>
+        <w:t xml:space="preserve">图像/PDF/RAG 规模和确定性证据上限。OpenAPI、前端 client、smoke、Compose 和 CI 已同步这一部署</w:t>
+      </w:r>
+      <w:r>
+        <w:rPr>
+          <w:rFonts w:ascii="Arial" w:hAnsi="Arial" w:eastAsia="PingFang SC" w:cs="Arial"/>
+          <w:lang w:val="zh-CN" w:eastAsia="zh-CN"/>
+        </w:rPr>
+        <w:t xml:space="preserve"> </w:t>
+      </w:r>
+      <w:r>
+        <w:rPr>
+          <w:rFonts w:ascii="Arial" w:hAnsi="Arial" w:eastAsia="PingFang SC" w:cs="Arial"/>
+          <w:lang w:val="zh-CN" w:eastAsia="zh-CN"/>
+        </w:rPr>
+        <w:t xml:space="preserve">合同；共享 Key 启用时，Streamlit 还会把 API 目标锁定到运维配置的</w:t>
+      </w:r>
+      <w:r>
+        <w:rPr>
+          <w:rFonts w:ascii="Arial" w:hAnsi="Arial" w:eastAsia="PingFang SC" w:cs="Arial"/>
+          <w:lang w:val="zh-CN" w:eastAsia="zh-CN"/>
+        </w:rPr>
+        <w:t xml:space="preserve"> </w:t>
+      </w:r>
+      <w:r>
+        <w:rPr>
+          <w:rStyle w:val="VerbatimChar"/>
+        </w:rPr>
+        <w:t xml:space="preserve">NANOLOOP_API_BASE_URL</w:t>
+      </w:r>
+      <w:r>
+        <w:rPr>
+          <w:rFonts w:ascii="Arial" w:hAnsi="Arial" w:eastAsia="PingFang SC" w:cs="Arial"/>
+          <w:lang w:val="zh-CN" w:eastAsia="zh-CN"/>
+        </w:rPr>
+        <w:t xml:space="preserve">。GitHub CI</w:t>
+      </w:r>
+      <w:r>
+        <w:rPr>
+          <w:rFonts w:ascii="Arial" w:hAnsi="Arial" w:eastAsia="PingFang SC" w:cs="Arial"/>
+          <w:lang w:val="zh-CN" w:eastAsia="zh-CN"/>
+        </w:rPr>
+        <w:t xml:space="preserve"> </w:t>
+      </w:r>
+      <w:r>
+        <w:rPr>
+          <w:rFonts w:ascii="Arial" w:hAnsi="Arial" w:eastAsia="PingFang SC" w:cs="Arial"/>
+          <w:lang w:val="zh-CN" w:eastAsia="zh-CN"/>
+        </w:rPr>
+        <w:t xml:space="preserve">构建 API 与前端容器，再置于同一隔离网络验证 DNS/Host/Key 跨容器链路；官方 Actions 引用已固定到 commit SHA。</w:t>
+      </w:r>
+      <w:r>
+        <w:rPr>
+          <w:rFonts w:ascii="Arial" w:hAnsi="Arial" w:eastAsia="PingFang SC" w:cs="Arial"/>
+          <w:lang w:val="zh-CN" w:eastAsia="zh-CN"/>
+        </w:rPr>
+        <w:t xml:space="preserve"> </w:t>
+      </w:r>
+      <w:r>
+        <w:rPr>
+          <w:rFonts w:ascii="Arial" w:hAnsi="Arial" w:eastAsia="PingFang SC" w:cs="Arial"/>
+          <w:lang w:val="zh-CN" w:eastAsia="zh-CN"/>
+        </w:rPr>
+        <w:t xml:space="preserve">开发者不得把这些已经落地的保护降回 v2 的简化示例。</w:t>
       </w:r>
     </w:p>
     <w:bookmarkEnd w:id="26"/>
@@ -3064,7 +3146,7 @@
                 <w:sz w:val="17"/>
                 <w:lang w:val="zh-CN" w:eastAsia="zh-CN"/>
               </w:rPr>
-              <w:t xml:space="preserve">FastAPI、SQLite/Alembic、审计事件、内容寻址导出、受控下载均有测试</w:t>
+              <w:t xml:space="preserve">FastAPI、SQLite/Alembic、审计事件、内容寻址导出、受控下载、可选共享 Key 和单进程限流均有测试</w:t>
             </w:r>
           </w:p>
         </w:tc>
@@ -3092,7 +3174,7 @@
                 <w:sz w:val="17"/>
                 <w:lang w:val="zh-CN" w:eastAsia="zh-CN"/>
               </w:rPr>
-              <w:t xml:space="preserve">尚无登录、租户、配额和共享数据库</w:t>
+              <w:t xml:space="preserve">尚无用户/租户登录与资源授权、分布式限流、用户配额和共享数据库</w:t>
             </w:r>
           </w:p>
         </w:tc>
@@ -3649,7 +3731,7 @@
                 <w:sz w:val="17"/>
                 <w:lang w:val="zh-CN" w:eastAsia="zh-CN"/>
               </w:rPr>
-              <w:t xml:space="preserve">非 root 容器、只读根文件系统、CI、门禁和降级 smoke 已定义</w:t>
+              <w:t xml:space="preserve">GitHub CI 构建 API/前端 CPU 镜像，以非 root、只读根启动，并在隔离网络验证前端容器到 API 的 DNS/Host/Key 链路</w:t>
             </w:r>
           </w:p>
         </w:tc>
@@ -3677,7 +3759,7 @@
                 <w:sz w:val="17"/>
                 <w:lang w:val="zh-CN" w:eastAsia="zh-CN"/>
               </w:rPr>
-              <w:t xml:space="preserve">本地 Docker image build 未因外部镜像拉取超时得到通过证据</w:t>
+              <w:t xml:space="preserve">本地 Docker image build 曾因外部镜像拉取超时；仍无生产备份/恢复演练与多实例证据</w:t>
             </w:r>
           </w:p>
         </w:tc>
@@ -5915,7 +5997,54 @@
           <w:rFonts w:ascii="Arial" w:hAnsi="Arial" w:eastAsia="PingFang SC" w:cs="Arial"/>
           <w:lang w:val="zh-CN" w:eastAsia="zh-CN"/>
         </w:rPr>
-        <w:t xml:space="preserve">是唯一后端入口；ROI canvas 运行时不依赖 CDN/npm；结果页优先展示质量结论，再展示数值和五层图像。</w:t>
+        <w:t xml:space="preserve">是唯一后端入口；它从进程环境接收可选部署 Key，并统一附加到 JSON、multipart 与同源签名下载请求。配置共享 Key 时，连接地址由</w:t>
+      </w:r>
+      <w:r>
+        <w:rPr>
+          <w:rFonts w:ascii="Arial" w:hAnsi="Arial" w:eastAsia="PingFang SC" w:cs="Arial"/>
+          <w:lang w:val="zh-CN" w:eastAsia="zh-CN"/>
+        </w:rPr>
+        <w:t xml:space="preserve"> </w:t>
+      </w:r>
+      <w:r>
+        <w:rPr>
+          <w:rStyle w:val="VerbatimChar"/>
+        </w:rPr>
+        <w:t xml:space="preserve">NANOLOOP_API_BASE_URL</w:t>
+      </w:r>
+      <w:r>
+        <w:rPr>
+          <w:rFonts w:ascii="Arial" w:hAnsi="Arial" w:eastAsia="PingFang SC" w:cs="Arial"/>
+          <w:lang w:val="zh-CN" w:eastAsia="zh-CN"/>
+        </w:rPr>
+        <w:t xml:space="preserve"> </w:t>
+      </w:r>
+      <w:r>
+        <w:rPr>
+          <w:rFonts w:ascii="Arial" w:hAnsi="Arial" w:eastAsia="PingFang SC" w:cs="Arial"/>
+          <w:lang w:val="zh-CN" w:eastAsia="zh-CN"/>
+        </w:rPr>
+        <w:t xml:space="preserve">锁定，</w:t>
+      </w:r>
+      <w:r>
+        <w:rPr>
+          <w:rStyle w:val="VerbatimChar"/>
+        </w:rPr>
+        <w:t xml:space="preserve">_get_client()</w:t>
+      </w:r>
+      <w:r>
+        <w:rPr>
+          <w:rFonts w:ascii="Arial" w:hAnsi="Arial" w:eastAsia="PingFang SC" w:cs="Arial"/>
+          <w:lang w:val="zh-CN" w:eastAsia="zh-CN"/>
+        </w:rPr>
+        <w:t xml:space="preserve"> </w:t>
+      </w:r>
+      <w:r>
+        <w:rPr>
+          <w:rFonts w:ascii="Arial" w:hAnsi="Arial" w:eastAsia="PingFang SC" w:cs="Arial"/>
+          <w:lang w:val="zh-CN" w:eastAsia="zh-CN"/>
+        </w:rPr>
+        <w:t xml:space="preserve">对会话值与运维值分别规范化后要求完全相等；不匹配则不创建 client，避免把进程级 Key 发往会话用户可控的地址。未配置 Key 的开发模式仍允许编辑 API 地址。ROI canvas 运行时不依赖 CDN/npm；结果页优先展示质量结论，再展示数值和五层图像。</w:t>
       </w:r>
     </w:p>
     <w:bookmarkEnd w:id="33"/>
@@ -6838,7 +6967,439 @@
           <w:rFonts w:ascii="Arial" w:hAnsi="Arial" w:eastAsia="PingFang SC" w:cs="Arial"/>
           <w:lang w:val="zh-CN" w:eastAsia="zh-CN"/>
         </w:rPr>
-        <w:t xml:space="preserve">上述防护不等于认证；开放公网前必须由受信任反向代理提供 TLS、身份认证、限速和访问日志。</w:t>
+        <w:t xml:space="preserve">配置</w:t>
+      </w:r>
+      <w:r>
+        <w:rPr>
+          <w:rFonts w:ascii="Arial" w:hAnsi="Arial" w:eastAsia="PingFang SC" w:cs="Arial"/>
+          <w:lang w:val="zh-CN" w:eastAsia="zh-CN"/>
+        </w:rPr>
+        <w:t xml:space="preserve"> </w:t>
+      </w:r>
+      <w:r>
+        <w:rPr>
+          <w:rStyle w:val="VerbatimChar"/>
+        </w:rPr>
+        <w:t xml:space="preserve">NANOLOOP_API_KEY</w:t>
+      </w:r>
+      <w:r>
+        <w:rPr>
+          <w:rFonts w:ascii="Arial" w:hAnsi="Arial" w:eastAsia="PingFang SC" w:cs="Arial"/>
+          <w:lang w:val="zh-CN" w:eastAsia="zh-CN"/>
+        </w:rPr>
+        <w:t xml:space="preserve"> </w:t>
+      </w:r>
+      <w:r>
+        <w:rPr>
+          <w:rFonts w:ascii="Arial" w:hAnsi="Arial" w:eastAsia="PingFang SC" w:cs="Arial"/>
+          <w:lang w:val="zh-CN" w:eastAsia="zh-CN"/>
+        </w:rPr>
+        <w:t xml:space="preserve">时，除精确公开路径外的请求必须只携带一个有效</w:t>
+      </w:r>
+      <w:r>
+        <w:rPr>
+          <w:rFonts w:ascii="Arial" w:hAnsi="Arial" w:eastAsia="PingFang SC" w:cs="Arial"/>
+          <w:lang w:val="zh-CN" w:eastAsia="zh-CN"/>
+        </w:rPr>
+        <w:t xml:space="preserve"> </w:t>
+      </w:r>
+      <w:r>
+        <w:rPr>
+          <w:rStyle w:val="VerbatimChar"/>
+        </w:rPr>
+        <w:t xml:space="preserve">X-API-Key</w:t>
+      </w:r>
+      <w:r>
+        <w:rPr>
+          <w:rFonts w:ascii="Arial" w:hAnsi="Arial" w:eastAsia="PingFang SC" w:cs="Arial"/>
+          <w:lang w:val="zh-CN" w:eastAsia="zh-CN"/>
+        </w:rPr>
+        <w:t xml:space="preserve">；缺失、错误或重复头部统一返回</w:t>
+      </w:r>
+      <w:r>
+        <w:rPr>
+          <w:rFonts w:ascii="Arial" w:hAnsi="Arial" w:eastAsia="PingFang SC" w:cs="Arial"/>
+          <w:lang w:val="zh-CN" w:eastAsia="zh-CN"/>
+        </w:rPr>
+        <w:t xml:space="preserve"> </w:t>
+      </w:r>
+      <w:r>
+        <w:rPr>
+          <w:rStyle w:val="VerbatimChar"/>
+        </w:rPr>
+        <w:t xml:space="preserve">401 AUTHENTICATION_REQUIRED</w:t>
+      </w:r>
+      <w:r>
+        <w:rPr>
+          <w:rFonts w:ascii="Arial" w:hAnsi="Arial" w:eastAsia="PingFang SC" w:cs="Arial"/>
+          <w:lang w:val="zh-CN" w:eastAsia="zh-CN"/>
+        </w:rPr>
+        <w:t xml:space="preserve">，不暴露匹配细节。合法 CORS 预检由外层 CORS middleware 直接响应；没有</w:t>
+      </w:r>
+      <w:r>
+        <w:rPr>
+          <w:rFonts w:ascii="Arial" w:hAnsi="Arial" w:eastAsia="PingFang SC" w:cs="Arial"/>
+          <w:lang w:val="zh-CN" w:eastAsia="zh-CN"/>
+        </w:rPr>
+        <w:t xml:space="preserve"> </w:t>
+      </w:r>
+      <w:r>
+        <w:rPr>
+          <w:rStyle w:val="VerbatimChar"/>
+        </w:rPr>
+        <w:t xml:space="preserve">Origin</w:t>
+      </w:r>
+      <w:r>
+        <w:rPr>
+          <w:rFonts w:ascii="Arial" w:hAnsi="Arial" w:eastAsia="PingFang SC" w:cs="Arial"/>
+          <w:lang w:val="zh-CN" w:eastAsia="zh-CN"/>
+        </w:rPr>
+        <w:t xml:space="preserve">/</w:t>
+      </w:r>
+      <w:r>
+        <w:rPr>
+          <w:rStyle w:val="VerbatimChar"/>
+        </w:rPr>
+        <w:t xml:space="preserve">Access-Control-Request-Method</w:t>
+      </w:r>
+      <w:r>
+        <w:rPr>
+          <w:rFonts w:ascii="Arial" w:hAnsi="Arial" w:eastAsia="PingFang SC" w:cs="Arial"/>
+          <w:lang w:val="zh-CN" w:eastAsia="zh-CN"/>
+        </w:rPr>
+        <w:t xml:space="preserve"> </w:t>
+      </w:r>
+      <w:r>
+        <w:rPr>
+          <w:rFonts w:ascii="Arial" w:hAnsi="Arial" w:eastAsia="PingFang SC" w:cs="Arial"/>
+          <w:lang w:val="zh-CN" w:eastAsia="zh-CN"/>
+        </w:rPr>
+        <w:t xml:space="preserve">的普通</w:t>
+      </w:r>
+      <w:r>
+        <w:rPr>
+          <w:rFonts w:ascii="Arial" w:hAnsi="Arial" w:eastAsia="PingFang SC" w:cs="Arial"/>
+          <w:lang w:val="zh-CN" w:eastAsia="zh-CN"/>
+        </w:rPr>
+        <w:t xml:space="preserve"> </w:t>
+      </w:r>
+      <w:r>
+        <w:rPr>
+          <w:rStyle w:val="VerbatimChar"/>
+        </w:rPr>
+        <w:t xml:space="preserve">OPTIONS</w:t>
+      </w:r>
+      <w:r>
+        <w:rPr>
+          <w:rFonts w:ascii="Arial" w:hAnsi="Arial" w:eastAsia="PingFang SC" w:cs="Arial"/>
+          <w:lang w:val="zh-CN" w:eastAsia="zh-CN"/>
+        </w:rPr>
+        <w:t xml:space="preserve"> </w:t>
+      </w:r>
+      <w:r>
+        <w:rPr>
+          <w:rFonts w:ascii="Arial" w:hAnsi="Arial" w:eastAsia="PingFang SC" w:cs="Arial"/>
+          <w:lang w:val="zh-CN" w:eastAsia="zh-CN"/>
+        </w:rPr>
+        <w:t xml:space="preserve">不获得认证或限流豁免。</w:t>
+      </w:r>
+    </w:p>
+    <w:p>
+      <w:pPr>
+        <w:widowControl/>
+        <w:numPr>
+          <w:ilvl w:val="0"/>
+          <w:numId w:val="1008"/>
+        </w:numPr>
+        <w:pStyle w:val="Compact"/>
+      </w:pPr>
+      <w:r>
+        <w:rPr>
+          <w:rFonts w:ascii="Arial" w:hAnsi="Arial" w:eastAsia="PingFang SC" w:cs="Arial"/>
+          <w:lang w:val="zh-CN" w:eastAsia="zh-CN"/>
+        </w:rPr>
+        <w:t xml:space="preserve">精确公开路径是根</w:t>
+      </w:r>
+      <w:r>
+        <w:rPr>
+          <w:rFonts w:ascii="Arial" w:hAnsi="Arial" w:eastAsia="PingFang SC" w:cs="Arial"/>
+          <w:lang w:val="zh-CN" w:eastAsia="zh-CN"/>
+        </w:rPr>
+        <w:t xml:space="preserve"> </w:t>
+      </w:r>
+      <w:r>
+        <w:rPr>
+          <w:rStyle w:val="VerbatimChar"/>
+        </w:rPr>
+        <w:t xml:space="preserve">GET /health</w:t>
+      </w:r>
+      <w:r>
+        <w:rPr>
+          <w:rFonts w:ascii="Arial" w:hAnsi="Arial" w:eastAsia="PingFang SC" w:cs="Arial"/>
+          <w:lang w:val="zh-CN" w:eastAsia="zh-CN"/>
+        </w:rPr>
+        <w:t xml:space="preserve">、OpenAPI/Swagger/ReDoc 文档路径；</w:t>
+      </w:r>
+      <w:r>
+        <w:rPr>
+          <w:rStyle w:val="VerbatimChar"/>
+        </w:rPr>
+        <w:t xml:space="preserve">GET /api/v1/health</w:t>
+      </w:r>
+      <w:r>
+        <w:rPr>
+          <w:rFonts w:ascii="Arial" w:hAnsi="Arial" w:eastAsia="PingFang SC" w:cs="Arial"/>
+          <w:lang w:val="zh-CN" w:eastAsia="zh-CN"/>
+        </w:rPr>
+        <w:t xml:space="preserve"> </w:t>
+      </w:r>
+      <w:r>
+        <w:rPr>
+          <w:rFonts w:ascii="Arial" w:hAnsi="Arial" w:eastAsia="PingFang SC" w:cs="Arial"/>
+          <w:lang w:val="zh-CN" w:eastAsia="zh-CN"/>
+        </w:rPr>
+        <w:t xml:space="preserve">和</w:t>
+      </w:r>
+      <w:r>
+        <w:rPr>
+          <w:rFonts w:ascii="Arial" w:hAnsi="Arial" w:eastAsia="PingFang SC" w:cs="Arial"/>
+          <w:lang w:val="zh-CN" w:eastAsia="zh-CN"/>
+        </w:rPr>
+        <w:t xml:space="preserve"> </w:t>
+      </w:r>
+      <w:r>
+        <w:rPr>
+          <w:rStyle w:val="VerbatimChar"/>
+        </w:rPr>
+        <w:t xml:space="preserve">/api/v1/files/{token}</w:t>
+      </w:r>
+      <w:r>
+        <w:rPr>
+          <w:rFonts w:ascii="Arial" w:hAnsi="Arial" w:eastAsia="PingFang SC" w:cs="Arial"/>
+          <w:lang w:val="zh-CN" w:eastAsia="zh-CN"/>
+        </w:rPr>
+        <w:t xml:space="preserve"> </w:t>
+      </w:r>
+      <w:r>
+        <w:rPr>
+          <w:rFonts w:ascii="Arial" w:hAnsi="Arial" w:eastAsia="PingFang SC" w:cs="Arial"/>
+          <w:lang w:val="zh-CN" w:eastAsia="zh-CN"/>
+        </w:rPr>
+        <w:t xml:space="preserve">与其他版本化 API 一样受保护，相似前缀不会获得豁免。</w:t>
+      </w:r>
+    </w:p>
+    <w:p>
+      <w:pPr>
+        <w:widowControl/>
+        <w:numPr>
+          <w:ilvl w:val="0"/>
+          <w:numId w:val="1008"/>
+        </w:numPr>
+        <w:pStyle w:val="Compact"/>
+      </w:pPr>
+      <w:r>
+        <w:rPr>
+          <w:rStyle w:val="VerbatimChar"/>
+        </w:rPr>
+        <w:t xml:space="preserve">API_RATE_LIMIT_REQUESTS &gt; 0</w:t>
+      </w:r>
+      <w:r>
+        <w:rPr>
+          <w:rFonts w:ascii="Arial" w:hAnsi="Arial" w:eastAsia="PingFang SC" w:cs="Arial"/>
+          <w:lang w:val="zh-CN" w:eastAsia="zh-CN"/>
+        </w:rPr>
+        <w:t xml:space="preserve"> </w:t>
+      </w:r>
+      <w:r>
+        <w:rPr>
+          <w:rFonts w:ascii="Arial" w:hAnsi="Arial" w:eastAsia="PingFang SC" w:cs="Arial"/>
+          <w:lang w:val="zh-CN" w:eastAsia="zh-CN"/>
+        </w:rPr>
+        <w:t xml:space="preserve">时启用单进程 token bucket，桶命名空间固定为</w:t>
+      </w:r>
+      <w:r>
+        <w:rPr>
+          <w:rFonts w:ascii="Arial" w:hAnsi="Arial" w:eastAsia="PingFang SC" w:cs="Arial"/>
+          <w:lang w:val="zh-CN" w:eastAsia="zh-CN"/>
+        </w:rPr>
+        <w:t xml:space="preserve"> </w:t>
+      </w:r>
+      <w:r>
+        <w:rPr>
+          <w:rStyle w:val="VerbatimChar"/>
+        </w:rPr>
+        <w:t xml:space="preserve">service</w:t>
+      </w:r>
+      <w:r>
+        <w:rPr>
+          <w:rFonts w:ascii="Arial" w:hAnsi="Arial" w:eastAsia="PingFang SC" w:cs="Arial"/>
+          <w:lang w:val="zh-CN" w:eastAsia="zh-CN"/>
+        </w:rPr>
+        <w:t xml:space="preserve">、</w:t>
+      </w:r>
+      <w:r>
+        <w:rPr>
+          <w:rStyle w:val="VerbatimChar"/>
+        </w:rPr>
+        <w:t xml:space="preserve">authenticated</w:t>
+      </w:r>
+      <w:r>
+        <w:rPr>
+          <w:rFonts w:ascii="Arial" w:hAnsi="Arial" w:eastAsia="PingFang SC" w:cs="Arial"/>
+          <w:lang w:val="zh-CN" w:eastAsia="zh-CN"/>
+        </w:rPr>
+        <w:t xml:space="preserve">、</w:t>
+      </w:r>
+      <w:r>
+        <w:rPr>
+          <w:rStyle w:val="VerbatimChar"/>
+        </w:rPr>
+        <w:t xml:space="preserve">anonymous</w:t>
+      </w:r>
+      <w:r>
+        <w:rPr>
+          <w:rFonts w:ascii="Arial" w:hAnsi="Arial" w:eastAsia="PingFang SC" w:cs="Arial"/>
+          <w:lang w:val="zh-CN" w:eastAsia="zh-CN"/>
+        </w:rPr>
+        <w:t xml:space="preserve">，最多持有三个桶。成功响应带</w:t>
+      </w:r>
+      <w:r>
+        <w:rPr>
+          <w:rFonts w:ascii="Arial" w:hAnsi="Arial" w:eastAsia="PingFang SC" w:cs="Arial"/>
+          <w:lang w:val="zh-CN" w:eastAsia="zh-CN"/>
+        </w:rPr>
+        <w:t xml:space="preserve"> </w:t>
+      </w:r>
+      <w:r>
+        <w:rPr>
+          <w:rStyle w:val="VerbatimChar"/>
+        </w:rPr>
+        <w:t xml:space="preserve">X-RateLimit-Limit/Remaining</w:t>
+      </w:r>
+      <w:r>
+        <w:rPr>
+          <w:rFonts w:ascii="Arial" w:hAnsi="Arial" w:eastAsia="PingFang SC" w:cs="Arial"/>
+          <w:lang w:val="zh-CN" w:eastAsia="zh-CN"/>
+        </w:rPr>
+        <w:t xml:space="preserve">，超限返回可重试的</w:t>
+      </w:r>
+      <w:r>
+        <w:rPr>
+          <w:rFonts w:ascii="Arial" w:hAnsi="Arial" w:eastAsia="PingFang SC" w:cs="Arial"/>
+          <w:lang w:val="zh-CN" w:eastAsia="zh-CN"/>
+        </w:rPr>
+        <w:t xml:space="preserve"> </w:t>
+      </w:r>
+      <w:r>
+        <w:rPr>
+          <w:rStyle w:val="VerbatimChar"/>
+        </w:rPr>
+        <w:t xml:space="preserve">429 RATE_LIMITED</w:t>
+      </w:r>
+      <w:r>
+        <w:rPr>
+          <w:rFonts w:ascii="Arial" w:hAnsi="Arial" w:eastAsia="PingFang SC" w:cs="Arial"/>
+          <w:lang w:val="zh-CN" w:eastAsia="zh-CN"/>
+        </w:rPr>
+        <w:t xml:space="preserve"> </w:t>
+      </w:r>
+      <w:r>
+        <w:rPr>
+          <w:rFonts w:ascii="Arial" w:hAnsi="Arial" w:eastAsia="PingFang SC" w:cs="Arial"/>
+          <w:lang w:val="zh-CN" w:eastAsia="zh-CN"/>
+        </w:rPr>
+        <w:t xml:space="preserve">与</w:t>
+      </w:r>
+      <w:r>
+        <w:rPr>
+          <w:rFonts w:ascii="Arial" w:hAnsi="Arial" w:eastAsia="PingFang SC" w:cs="Arial"/>
+          <w:lang w:val="zh-CN" w:eastAsia="zh-CN"/>
+        </w:rPr>
+        <w:t xml:space="preserve"> </w:t>
+      </w:r>
+      <w:r>
+        <w:rPr>
+          <w:rStyle w:val="VerbatimChar"/>
+        </w:rPr>
+        <w:t xml:space="preserve">Retry-After</w:t>
+      </w:r>
+      <w:r>
+        <w:rPr>
+          <w:rFonts w:ascii="Arial" w:hAnsi="Arial" w:eastAsia="PingFang SC" w:cs="Arial"/>
+          <w:lang w:val="zh-CN" w:eastAsia="zh-CN"/>
+        </w:rPr>
+        <w:t xml:space="preserve">。</w:t>
+      </w:r>
+    </w:p>
+    <w:p>
+      <w:pPr>
+        <w:widowControl/>
+        <w:numPr>
+          <w:ilvl w:val="0"/>
+          <w:numId w:val="1008"/>
+        </w:numPr>
+        <w:pStyle w:val="Compact"/>
+      </w:pPr>
+      <w:r>
+        <w:rPr>
+          <w:rFonts w:ascii="Arial" w:hAnsi="Arial" w:eastAsia="PingFang SC" w:cs="Arial"/>
+          <w:lang w:val="zh-CN" w:eastAsia="zh-CN"/>
+        </w:rPr>
+        <w:t xml:space="preserve">有效请求的中间件顺序由外到内为：Request Context → Trusted Host → Browser Mutation Guard → CORS → 限流（启用时）→ API Key → 请求体上限 → route。Host/Origin 拒绝先于 Key，Key 拒绝先于 body 解析。</w:t>
+      </w:r>
+    </w:p>
+    <w:p>
+      <w:pPr>
+        <w:widowControl/>
+        <w:numPr>
+          <w:ilvl w:val="0"/>
+          <w:numId w:val="1008"/>
+        </w:numPr>
+        <w:pStyle w:val="Compact"/>
+      </w:pPr>
+      <w:r>
+        <w:rPr>
+          <w:rFonts w:ascii="Arial" w:hAnsi="Arial" w:eastAsia="PingFang SC" w:cs="Arial"/>
+          <w:lang w:val="zh-CN" w:eastAsia="zh-CN"/>
+        </w:rPr>
+        <w:t xml:space="preserve">共享 Key 同时配置到 Streamlit 时，前端必须把规范化后的请求地址锁定到</w:t>
+      </w:r>
+      <w:r>
+        <w:rPr>
+          <w:rFonts w:ascii="Arial" w:hAnsi="Arial" w:eastAsia="PingFang SC" w:cs="Arial"/>
+          <w:lang w:val="zh-CN" w:eastAsia="zh-CN"/>
+        </w:rPr>
+        <w:t xml:space="preserve"> </w:t>
+      </w:r>
+      <w:r>
+        <w:rPr>
+          <w:rStyle w:val="VerbatimChar"/>
+        </w:rPr>
+        <w:t xml:space="preserve">NANOLOOP_API_BASE_URL</w:t>
+      </w:r>
+      <w:r>
+        <w:rPr>
+          <w:rFonts w:ascii="Arial" w:hAnsi="Arial" w:eastAsia="PingFang SC" w:cs="Arial"/>
+          <w:lang w:val="zh-CN" w:eastAsia="zh-CN"/>
+        </w:rPr>
+        <w:t xml:space="preserve">，不允许会话状态把 Key 改投到其他 origin/path。没有共享 Key 时才保留可编辑地址的本地开发行为。</w:t>
+      </w:r>
+    </w:p>
+    <w:p>
+      <w:pPr>
+        <w:widowControl/>
+        <w:numPr>
+          <w:ilvl w:val="0"/>
+          <w:numId w:val="1008"/>
+        </w:numPr>
+        <w:pStyle w:val="Compact"/>
+      </w:pPr>
+      <w:r>
+        <w:rPr>
+          <w:rFonts w:ascii="Arial" w:hAnsi="Arial" w:eastAsia="PingFang SC" w:cs="Arial"/>
+          <w:lang w:val="zh-CN" w:eastAsia="zh-CN"/>
+        </w:rPr>
+        <w:t xml:space="preserve">共享 Key 只是单一部署密钥，不是用户/租户身份、角色或资源授权；三桶限流也不跨进程共享。开放公网前仍必须由受信任反向代理提供 TLS、真实身份/授权、分布式限速和访问日志。</w:t>
       </w:r>
     </w:p>
     <w:bookmarkEnd w:id="42"/>
@@ -7143,7 +7704,7 @@
                 <w:sz w:val="17"/>
                 <w:lang w:val="zh-CN" w:eastAsia="zh-CN"/>
               </w:rPr>
-              <w:t xml:space="preserve">routes、API client、OpenAPI、HTTP fixtures、集成测试、部署限制说明</w:t>
+              <w:t xml:space="preserve">routes、API client、OpenAPI（含 security/responses）、HTTP fixtures、集成测试、部署限制说明</w:t>
             </w:r>
           </w:p>
         </w:tc>
@@ -14140,7 +14701,229 @@
           <w:rFonts w:ascii="Arial" w:hAnsi="Arial" w:eastAsia="PingFang SC" w:cs="Arial"/>
           <w:lang w:val="zh-CN" w:eastAsia="zh-CN"/>
         </w:rPr>
-        <w:t xml:space="preserve">统一响应/错误/request ID、可信 Host、浏览器写请求保护、CORS、请求体与 route-specific multipart 限额已接通。</w:t>
+        <w:t xml:space="preserve">统一响应/错误/request ID、可信 Host、浏览器写请求保护、CORS、可选共享</w:t>
+      </w:r>
+      <w:r>
+        <w:rPr>
+          <w:rFonts w:ascii="Arial" w:hAnsi="Arial" w:eastAsia="PingFang SC" w:cs="Arial"/>
+          <w:lang w:val="zh-CN" w:eastAsia="zh-CN"/>
+        </w:rPr>
+        <w:t xml:space="preserve"> </w:t>
+      </w:r>
+      <w:r>
+        <w:rPr>
+          <w:rStyle w:val="VerbatimChar"/>
+        </w:rPr>
+        <w:t xml:space="preserve">X-API-Key</w:t>
+      </w:r>
+      <w:r>
+        <w:rPr>
+          <w:rFonts w:ascii="Arial" w:hAnsi="Arial" w:eastAsia="PingFang SC" w:cs="Arial"/>
+          <w:lang w:val="zh-CN" w:eastAsia="zh-CN"/>
+        </w:rPr>
+        <w:t xml:space="preserve">、请求体与 route-specific multipart 限额已接通。</w:t>
+      </w:r>
+    </w:p>
+    <w:p>
+      <w:pPr>
+        <w:widowControl/>
+        <w:numPr>
+          <w:ilvl w:val="0"/>
+          <w:numId w:val="1014"/>
+        </w:numPr>
+        <w:pStyle w:val="Compact"/>
+      </w:pPr>
+      <w:r>
+        <w:rPr>
+          <w:rStyle w:val="VerbatimChar"/>
+        </w:rPr>
+        <w:t xml:space="preserve">ApiKeyVerifier</w:t>
+      </w:r>
+      <w:r>
+        <w:rPr>
+          <w:rFonts w:ascii="Arial" w:hAnsi="Arial" w:eastAsia="PingFang SC" w:cs="Arial"/>
+          <w:lang w:val="zh-CN" w:eastAsia="zh-CN"/>
+        </w:rPr>
+        <w:t xml:space="preserve"> </w:t>
+      </w:r>
+      <w:r>
+        <w:rPr>
+          <w:rFonts w:ascii="Arial" w:hAnsi="Arial" w:eastAsia="PingFang SC" w:cs="Arial"/>
+          <w:lang w:val="zh-CN" w:eastAsia="zh-CN"/>
+        </w:rPr>
+        <w:t xml:space="preserve">仅保留 Key 的 SHA-256 摘要并做恒定时间比较；缺失、错误或重复头部有不可区分的 401 响应，所有版本化操作在 OpenAPI 声明</w:t>
+      </w:r>
+      <w:r>
+        <w:rPr>
+          <w:rFonts w:ascii="Arial" w:hAnsi="Arial" w:eastAsia="PingFang SC" w:cs="Arial"/>
+          <w:lang w:val="zh-CN" w:eastAsia="zh-CN"/>
+        </w:rPr>
+        <w:t xml:space="preserve"> </w:t>
+      </w:r>
+      <w:r>
+        <w:rPr>
+          <w:rStyle w:val="VerbatimChar"/>
+        </w:rPr>
+        <w:t xml:space="preserve">ApiKeyAuth</w:t>
+      </w:r>
+      <w:r>
+        <w:rPr>
+          <w:rFonts w:ascii="Arial" w:hAnsi="Arial" w:eastAsia="PingFang SC" w:cs="Arial"/>
+          <w:lang w:val="zh-CN" w:eastAsia="zh-CN"/>
+        </w:rPr>
+        <w:t xml:space="preserve">。</w:t>
+      </w:r>
+    </w:p>
+    <w:p>
+      <w:pPr>
+        <w:widowControl/>
+        <w:numPr>
+          <w:ilvl w:val="0"/>
+          <w:numId w:val="1014"/>
+        </w:numPr>
+        <w:pStyle w:val="Compact"/>
+      </w:pPr>
+      <w:r>
+        <w:rPr>
+          <w:rFonts w:ascii="Arial" w:hAnsi="Arial" w:eastAsia="PingFang SC" w:cs="Arial"/>
+          <w:lang w:val="zh-CN" w:eastAsia="zh-CN"/>
+        </w:rPr>
+        <w:t xml:space="preserve">可选</w:t>
+      </w:r>
+      <w:r>
+        <w:rPr>
+          <w:rFonts w:ascii="Arial" w:hAnsi="Arial" w:eastAsia="PingFang SC" w:cs="Arial"/>
+          <w:lang w:val="zh-CN" w:eastAsia="zh-CN"/>
+        </w:rPr>
+        <w:t xml:space="preserve"> </w:t>
+      </w:r>
+      <w:r>
+        <w:rPr>
+          <w:rStyle w:val="VerbatimChar"/>
+        </w:rPr>
+        <w:t xml:space="preserve">TokenBucketLimiter</w:t>
+      </w:r>
+      <w:r>
+        <w:rPr>
+          <w:rFonts w:ascii="Arial" w:hAnsi="Arial" w:eastAsia="PingFang SC" w:cs="Arial"/>
+          <w:lang w:val="zh-CN" w:eastAsia="zh-CN"/>
+        </w:rPr>
+        <w:t xml:space="preserve"> </w:t>
+      </w:r>
+      <w:r>
+        <w:rPr>
+          <w:rFonts w:ascii="Arial" w:hAnsi="Arial" w:eastAsia="PingFang SC" w:cs="Arial"/>
+          <w:lang w:val="zh-CN" w:eastAsia="zh-CN"/>
+        </w:rPr>
+        <w:t xml:space="preserve">按</w:t>
+      </w:r>
+      <w:r>
+        <w:rPr>
+          <w:rFonts w:ascii="Arial" w:hAnsi="Arial" w:eastAsia="PingFang SC" w:cs="Arial"/>
+          <w:lang w:val="zh-CN" w:eastAsia="zh-CN"/>
+        </w:rPr>
+        <w:t xml:space="preserve"> </w:t>
+      </w:r>
+      <w:r>
+        <w:rPr>
+          <w:rStyle w:val="VerbatimChar"/>
+        </w:rPr>
+        <w:t xml:space="preserve">service/authenticated/anonymous</w:t>
+      </w:r>
+      <w:r>
+        <w:rPr>
+          <w:rFonts w:ascii="Arial" w:hAnsi="Arial" w:eastAsia="PingFang SC" w:cs="Arial"/>
+          <w:lang w:val="zh-CN" w:eastAsia="zh-CN"/>
+        </w:rPr>
+        <w:t xml:space="preserve"> </w:t>
+      </w:r>
+      <w:r>
+        <w:rPr>
+          <w:rFonts w:ascii="Arial" w:hAnsi="Arial" w:eastAsia="PingFang SC" w:cs="Arial"/>
+          <w:lang w:val="zh-CN" w:eastAsia="zh-CN"/>
+        </w:rPr>
+        <w:t xml:space="preserve">三个固定调用类别限流，内存随请求来源数量保持常数；它只对当前进程生效。</w:t>
+      </w:r>
+    </w:p>
+    <w:p>
+      <w:pPr>
+        <w:widowControl/>
+        <w:numPr>
+          <w:ilvl w:val="0"/>
+          <w:numId w:val="1014"/>
+        </w:numPr>
+        <w:pStyle w:val="Compact"/>
+      </w:pPr>
+      <w:r>
+        <w:rPr>
+          <w:rFonts w:ascii="Arial" w:hAnsi="Arial" w:eastAsia="PingFang SC" w:cs="Arial"/>
+          <w:lang w:val="zh-CN" w:eastAsia="zh-CN"/>
+        </w:rPr>
+        <w:t xml:space="preserve">安全中间件保持 Host/Origin 先于限流和 Key，Key 先于 body/multipart 解析；CORS 还对浏览器暴露 401/429 所需响应头。</w:t>
+      </w:r>
+    </w:p>
+    <w:p>
+      <w:pPr>
+        <w:widowControl/>
+        <w:numPr>
+          <w:ilvl w:val="0"/>
+          <w:numId w:val="1014"/>
+        </w:numPr>
+        <w:pStyle w:val="Compact"/>
+      </w:pPr>
+      <w:r>
+        <w:rPr>
+          <w:rFonts w:ascii="Arial" w:hAnsi="Arial" w:eastAsia="PingFang SC" w:cs="Arial"/>
+          <w:lang w:val="zh-CN" w:eastAsia="zh-CN"/>
+        </w:rPr>
+        <w:t xml:space="preserve">Compose 的显式</w:t>
+      </w:r>
+      <w:r>
+        <w:rPr>
+          <w:rFonts w:ascii="Arial" w:hAnsi="Arial" w:eastAsia="PingFang SC" w:cs="Arial"/>
+          <w:lang w:val="zh-CN" w:eastAsia="zh-CN"/>
+        </w:rPr>
+        <w:t xml:space="preserve"> </w:t>
+      </w:r>
+      <w:r>
+        <w:rPr>
+          <w:rStyle w:val="VerbatimChar"/>
+        </w:rPr>
+        <w:t xml:space="preserve">TRUSTED_HOSTS</w:t>
+      </w:r>
+      <w:r>
+        <w:rPr>
+          <w:rFonts w:ascii="Arial" w:hAnsi="Arial" w:eastAsia="PingFang SC" w:cs="Arial"/>
+          <w:lang w:val="zh-CN" w:eastAsia="zh-CN"/>
+        </w:rPr>
+        <w:t xml:space="preserve"> </w:t>
+      </w:r>
+      <w:r>
+        <w:rPr>
+          <w:rFonts w:ascii="Arial" w:hAnsi="Arial" w:eastAsia="PingFang SC" w:cs="Arial"/>
+          <w:lang w:val="zh-CN" w:eastAsia="zh-CN"/>
+        </w:rPr>
+        <w:t xml:space="preserve">默认项包含内部服务名</w:t>
+      </w:r>
+      <w:r>
+        <w:rPr>
+          <w:rFonts w:ascii="Arial" w:hAnsi="Arial" w:eastAsia="PingFang SC" w:cs="Arial"/>
+          <w:lang w:val="zh-CN" w:eastAsia="zh-CN"/>
+        </w:rPr>
+        <w:t xml:space="preserve"> </w:t>
+      </w:r>
+      <w:r>
+        <w:rPr>
+          <w:rStyle w:val="VerbatimChar"/>
+        </w:rPr>
+        <w:t xml:space="preserve">api</w:t>
+      </w:r>
+      <w:r>
+        <w:rPr>
+          <w:rFonts w:ascii="Arial" w:hAnsi="Arial" w:eastAsia="PingFang SC" w:cs="Arial"/>
+          <w:lang w:val="zh-CN" w:eastAsia="zh-CN"/>
+        </w:rPr>
+        <w:t xml:space="preserve">，使前端可经 Compose DNS 访问后端；这是精确 Host 允许项，不是 wildcard。</w:t>
       </w:r>
     </w:p>
     <w:p>
@@ -14442,7 +15225,7 @@
                 <w:sz w:val="17"/>
                 <w:lang w:val="zh-CN" w:eastAsia="zh-CN"/>
               </w:rPr>
-              <w:t xml:space="preserve">、服务装配、lifespan</w:t>
+              <w:t xml:space="preserve">、服务装配、lifespan、中间件顺序</w:t>
             </w:r>
           </w:p>
         </w:tc>
@@ -14594,7 +15377,7 @@
                 <w:sz w:val="17"/>
                 <w:lang w:val="zh-CN" w:eastAsia="zh-CN"/>
               </w:rPr>
-              <w:t xml:space="preserve">app/api/routing.py</w:t>
+              <w:t xml:space="preserve">app/api/deps.py</w:t>
             </w:r>
           </w:p>
         </w:tc>
@@ -14623,7 +15406,24 @@
                 <w:sz w:val="17"/>
                 <w:lang w:val="zh-CN" w:eastAsia="zh-CN"/>
               </w:rPr>
-              <w:t xml:space="preserve">BoundedMultipartRoute</w:t>
+              <w:t xml:space="preserve">ApiKeyAuth</w:t>
+            </w:r>
+            <w:r>
+              <w:rPr>
+                <w:rFonts w:ascii="Arial" w:hAnsi="Arial" w:eastAsia="PingFang SC" w:cs="Arial"/>
+                <w:sz w:val="17"/>
+                <w:lang w:val="zh-CN" w:eastAsia="zh-CN"/>
+              </w:rPr>
+              <w:t xml:space="preserve">、</w:t>
+            </w:r>
+            <w:r>
+              <w:rPr>
+                <w:rStyle w:val="VerbatimChar"/>
+                <w:rFonts w:ascii="Arial" w:hAnsi="Arial" w:eastAsia="PingFang SC" w:cs="Arial"/>
+                <w:sz w:val="17"/>
+                <w:lang w:val="zh-CN" w:eastAsia="zh-CN"/>
+              </w:rPr>
+              <w:t xml:space="preserve">require_api_key_contract</w:t>
             </w:r>
           </w:p>
         </w:tc>
@@ -14651,7 +15451,7 @@
                 <w:sz w:val="17"/>
                 <w:lang w:val="zh-CN" w:eastAsia="zh-CN"/>
               </w:rPr>
-              <w:t xml:space="preserve">文件/字段数、part size 与类型政策</w:t>
+              <w:t xml:space="preserve">OpenAPI 安全声明与路由 fail-closed 复核</w:t>
             </w:r>
           </w:p>
         </w:tc>
@@ -14685,7 +15485,7 @@
                 <w:sz w:val="17"/>
                 <w:lang w:val="zh-CN" w:eastAsia="zh-CN"/>
               </w:rPr>
-              <w:t xml:space="preserve">app/api/middleware.py</w:t>
+              <w:t xml:space="preserve">app/api/routing.py</w:t>
             </w:r>
           </w:p>
         </w:tc>
@@ -14709,11 +15509,12 @@
             </w:pPr>
             <w:r>
               <w:rPr>
-                <w:rFonts w:ascii="Arial" w:hAnsi="Arial" w:eastAsia="PingFang SC" w:cs="Arial"/>
-                <w:sz w:val="17"/>
-                <w:lang w:val="zh-CN" w:eastAsia="zh-CN"/>
-              </w:rPr>
-              <w:t xml:space="preserve">Host/Origin/body/context middleware</w:t>
+                <w:rStyle w:val="VerbatimChar"/>
+                <w:rFonts w:ascii="Arial" w:hAnsi="Arial" w:eastAsia="PingFang SC" w:cs="Arial"/>
+                <w:sz w:val="17"/>
+                <w:lang w:val="zh-CN" w:eastAsia="zh-CN"/>
+              </w:rPr>
+              <w:t xml:space="preserve">BoundedMultipartRoute</w:t>
             </w:r>
           </w:p>
         </w:tc>
@@ -14741,7 +15542,7 @@
                 <w:sz w:val="17"/>
                 <w:lang w:val="zh-CN" w:eastAsia="zh-CN"/>
               </w:rPr>
-              <w:t xml:space="preserve">请求安全、限额和日志上下文</w:t>
+              <w:t xml:space="preserve">文件/字段数、part size 与类型政策</w:t>
             </w:r>
           </w:p>
         </w:tc>
@@ -14775,7 +15576,7 @@
                 <w:sz w:val="17"/>
                 <w:lang w:val="zh-CN" w:eastAsia="zh-CN"/>
               </w:rPr>
-              <w:t xml:space="preserve">app/api/errors.py</w:t>
+              <w:t xml:space="preserve">app/api/middleware.py</w:t>
             </w:r>
           </w:p>
         </w:tc>
@@ -14803,7 +15604,7 @@
                 <w:sz w:val="17"/>
                 <w:lang w:val="zh-CN" w:eastAsia="zh-CN"/>
               </w:rPr>
-              <w:t xml:space="preserve">异常处理器</w:t>
+              <w:t xml:space="preserve">Host/Origin/API Key/限流/body/context middleware</w:t>
             </w:r>
           </w:p>
         </w:tc>
@@ -14831,7 +15632,7 @@
                 <w:sz w:val="17"/>
                 <w:lang w:val="zh-CN" w:eastAsia="zh-CN"/>
               </w:rPr>
-              <w:t xml:space="preserve">稳定错误码与公开信息</w:t>
+              <w:t xml:space="preserve">请求安全、限额、拒绝顺序和日志上下文</w:t>
             </w:r>
           </w:p>
         </w:tc>
@@ -14865,7 +15666,7 @@
                 <w:sz w:val="17"/>
                 <w:lang w:val="zh-CN" w:eastAsia="zh-CN"/>
               </w:rPr>
-              <w:t xml:space="preserve">app/db/models.py</w:t>
+              <w:t xml:space="preserve">app/api/errors.py</w:t>
             </w:r>
           </w:p>
         </w:tc>
@@ -14893,7 +15694,7 @@
                 <w:sz w:val="17"/>
                 <w:lang w:val="zh-CN" w:eastAsia="zh-CN"/>
               </w:rPr>
-              <w:t xml:space="preserve">12 个业务表模型</w:t>
+              <w:t xml:space="preserve">异常处理器</w:t>
             </w:r>
           </w:p>
         </w:tc>
@@ -14921,7 +15722,7 @@
                 <w:sz w:val="17"/>
                 <w:lang w:val="zh-CN" w:eastAsia="zh-CN"/>
               </w:rPr>
-              <w:t xml:space="preserve">schema 事实模型</w:t>
+              <w:t xml:space="preserve">稳定错误码与公开信息</w:t>
             </w:r>
           </w:p>
         </w:tc>
@@ -14955,7 +15756,7 @@
                 <w:sz w:val="17"/>
                 <w:lang w:val="zh-CN" w:eastAsia="zh-CN"/>
               </w:rPr>
-              <w:t xml:space="preserve">app/db/repositories.py</w:t>
+              <w:t xml:space="preserve">app/db/models.py</w:t>
             </w:r>
           </w:p>
         </w:tc>
@@ -14983,16 +15784,7 @@
                 <w:sz w:val="17"/>
                 <w:lang w:val="zh-CN" w:eastAsia="zh-CN"/>
               </w:rPr>
-              <w:t xml:space="preserve">repositories、</w:t>
-            </w:r>
-            <w:r>
-              <w:rPr>
-                <w:rStyle w:val="VerbatimChar"/>
-                <w:rFonts w:ascii="Arial" w:hAnsi="Arial" w:eastAsia="PingFang SC" w:cs="Arial"/>
-                <w:sz w:val="17"/>
-                <w:lang w:val="zh-CN" w:eastAsia="zh-CN"/>
-              </w:rPr>
-              <w:t xml:space="preserve">SqlAlchemyUnitOfWork</w:t>
+              <w:t xml:space="preserve">12 个业务表模型</w:t>
             </w:r>
           </w:p>
         </w:tc>
@@ -15020,7 +15812,7 @@
                 <w:sz w:val="17"/>
                 <w:lang w:val="zh-CN" w:eastAsia="zh-CN"/>
               </w:rPr>
-              <w:t xml:space="preserve">查询、事务、CAS 与状态转换</w:t>
+              <w:t xml:space="preserve">schema 事实模型</w:t>
             </w:r>
           </w:p>
         </w:tc>
@@ -15054,7 +15846,7 @@
                 <w:sz w:val="17"/>
                 <w:lang w:val="zh-CN" w:eastAsia="zh-CN"/>
               </w:rPr>
-              <w:t xml:space="preserve">app/db/migrations/versions/</w:t>
+              <w:t xml:space="preserve">app/db/repositories.py</w:t>
             </w:r>
           </w:p>
         </w:tc>
@@ -15082,7 +15874,16 @@
                 <w:sz w:val="17"/>
                 <w:lang w:val="zh-CN" w:eastAsia="zh-CN"/>
               </w:rPr>
-              <w:t xml:space="preserve">Alembic revisions</w:t>
+              <w:t xml:space="preserve">repositories、</w:t>
+            </w:r>
+            <w:r>
+              <w:rPr>
+                <w:rStyle w:val="VerbatimChar"/>
+                <w:rFonts w:ascii="Arial" w:hAnsi="Arial" w:eastAsia="PingFang SC" w:cs="Arial"/>
+                <w:sz w:val="17"/>
+                <w:lang w:val="zh-CN" w:eastAsia="zh-CN"/>
+              </w:rPr>
+              <w:t xml:space="preserve">SqlAlchemyUnitOfWork</w:t>
             </w:r>
           </w:p>
         </w:tc>
@@ -15110,7 +15911,7 @@
                 <w:sz w:val="17"/>
                 <w:lang w:val="zh-CN" w:eastAsia="zh-CN"/>
               </w:rPr>
-              <w:t xml:space="preserve">只追加迁移，不改已发布历史</w:t>
+              <w:t xml:space="preserve">查询、事务、CAS 与状态转换</w:t>
             </w:r>
           </w:p>
         </w:tc>
@@ -15144,7 +15945,7 @@
                 <w:sz w:val="17"/>
                 <w:lang w:val="zh-CN" w:eastAsia="zh-CN"/>
               </w:rPr>
-              <w:t xml:space="preserve">app/storage/file_store.py</w:t>
+              <w:t xml:space="preserve">app/db/migrations/versions/</w:t>
             </w:r>
           </w:p>
         </w:tc>
@@ -15168,12 +15969,11 @@
             </w:pPr>
             <w:r>
               <w:rPr>
-                <w:rStyle w:val="VerbatimChar"/>
-                <w:rFonts w:ascii="Arial" w:hAnsi="Arial" w:eastAsia="PingFang SC" w:cs="Arial"/>
-                <w:sz w:val="17"/>
-                <w:lang w:val="zh-CN" w:eastAsia="zh-CN"/>
-              </w:rPr>
-              <w:t xml:space="preserve">LocalFileStore</w:t>
+                <w:rFonts w:ascii="Arial" w:hAnsi="Arial" w:eastAsia="PingFang SC" w:cs="Arial"/>
+                <w:sz w:val="17"/>
+                <w:lang w:val="zh-CN" w:eastAsia="zh-CN"/>
+              </w:rPr>
+              <w:t xml:space="preserve">Alembic revisions</w:t>
             </w:r>
           </w:p>
         </w:tc>
@@ -15201,7 +16001,7 @@
                 <w:sz w:val="17"/>
                 <w:lang w:val="zh-CN" w:eastAsia="zh-CN"/>
               </w:rPr>
-              <w:t xml:space="preserve">上传、制品、令牌、内容寻址发布</w:t>
+              <w:t xml:space="preserve">只追加迁移，不改已发布历史</w:t>
             </w:r>
           </w:p>
         </w:tc>
@@ -15235,7 +16035,7 @@
                 <w:sz w:val="17"/>
                 <w:lang w:val="zh-CN" w:eastAsia="zh-CN"/>
               </w:rPr>
-              <w:t xml:space="preserve">app/storage/knowledge_store.py</w:t>
+              <w:t xml:space="preserve">app/storage/file_store.py</w:t>
             </w:r>
           </w:p>
         </w:tc>
@@ -15264,7 +16064,7 @@
                 <w:sz w:val="17"/>
                 <w:lang w:val="zh-CN" w:eastAsia="zh-CN"/>
               </w:rPr>
-              <w:t xml:space="preserve">KnowledgeSourceStore</w:t>
+              <w:t xml:space="preserve">LocalFileStore</w:t>
             </w:r>
           </w:p>
         </w:tc>
@@ -15292,7 +16092,7 @@
                 <w:sz w:val="17"/>
                 <w:lang w:val="zh-CN" w:eastAsia="zh-CN"/>
               </w:rPr>
-              <w:t xml:space="preserve">知识源 staging、共享引用与清理</w:t>
+              <w:t xml:space="preserve">上传、制品、令牌、内容寻址发布</w:t>
             </w:r>
           </w:p>
         </w:tc>
@@ -15326,7 +16126,7 @@
                 <w:sz w:val="17"/>
                 <w:lang w:val="zh-CN" w:eastAsia="zh-CN"/>
               </w:rPr>
-              <w:t xml:space="preserve">app/orchestration/</w:t>
+              <w:t xml:space="preserve">app/storage/knowledge_store.py</w:t>
             </w:r>
           </w:p>
         </w:tc>
@@ -15350,11 +16150,12 @@
             </w:pPr>
             <w:r>
               <w:rPr>
-                <w:rFonts w:ascii="Arial" w:hAnsi="Arial" w:eastAsia="PingFang SC" w:cs="Arial"/>
-                <w:sz w:val="17"/>
-                <w:lang w:val="zh-CN" w:eastAsia="zh-CN"/>
-              </w:rPr>
-              <w:t xml:space="preserve">dispatcher、scheduler、recovery</w:t>
+                <w:rStyle w:val="VerbatimChar"/>
+                <w:rFonts w:ascii="Arial" w:hAnsi="Arial" w:eastAsia="PingFang SC" w:cs="Arial"/>
+                <w:sz w:val="17"/>
+                <w:lang w:val="zh-CN" w:eastAsia="zh-CN"/>
+              </w:rPr>
+              <w:t xml:space="preserve">KnowledgeSourceStore</w:t>
             </w:r>
           </w:p>
         </w:tc>
@@ -15382,7 +16183,7 @@
                 <w:sz w:val="17"/>
                 <w:lang w:val="zh-CN" w:eastAsia="zh-CN"/>
               </w:rPr>
-              <w:t xml:space="preserve">队列、关闭、恢复与 post-commit</w:t>
+              <w:t xml:space="preserve">知识源 staging、共享引用与清理</w:t>
             </w:r>
           </w:p>
         </w:tc>
@@ -15416,6 +16217,96 @@
                 <w:sz w:val="17"/>
                 <w:lang w:val="zh-CN" w:eastAsia="zh-CN"/>
               </w:rPr>
+              <w:t xml:space="preserve">app/orchestration/</w:t>
+            </w:r>
+          </w:p>
+        </w:tc>
+        <w:tc>
+          <w:tcPr>
+            <w:tcW w:w="3150" w:type="dxa"/>
+            <w:vAlign w:val="center"/>
+            <w:tcMar>
+              <w:top w:w="80" w:type="dxa"/>
+              <w:start w:w="120" w:type="dxa"/>
+              <w:bottom w:w="80" w:type="dxa"/>
+              <w:end w:w="120" w:type="dxa"/>
+            </w:tcMar>
+          </w:tcPr>
+          <w:p>
+            <w:pPr>
+              <w:pStyle w:val="NanoLoopTable"/>
+              <w:keepNext w:val="0"/>
+              <w:keepLines w:val="0"/>
+              <w:jc w:val="left"/>
+            </w:pPr>
+            <w:r>
+              <w:rPr>
+                <w:rFonts w:ascii="Arial" w:hAnsi="Arial" w:eastAsia="PingFang SC" w:cs="Arial"/>
+                <w:sz w:val="17"/>
+                <w:lang w:val="zh-CN" w:eastAsia="zh-CN"/>
+              </w:rPr>
+              <w:t xml:space="preserve">dispatcher、scheduler、recovery</w:t>
+            </w:r>
+          </w:p>
+        </w:tc>
+        <w:tc>
+          <w:tcPr>
+            <w:tcW w:w="4310" w:type="dxa"/>
+            <w:vAlign w:val="center"/>
+            <w:tcMar>
+              <w:top w:w="80" w:type="dxa"/>
+              <w:start w:w="120" w:type="dxa"/>
+              <w:bottom w:w="80" w:type="dxa"/>
+              <w:end w:w="120" w:type="dxa"/>
+            </w:tcMar>
+          </w:tcPr>
+          <w:p>
+            <w:pPr>
+              <w:pStyle w:val="NanoLoopTable"/>
+              <w:keepNext w:val="0"/>
+              <w:keepLines w:val="0"/>
+              <w:jc w:val="left"/>
+            </w:pPr>
+            <w:r>
+              <w:rPr>
+                <w:rFonts w:ascii="Arial" w:hAnsi="Arial" w:eastAsia="PingFang SC" w:cs="Arial"/>
+                <w:sz w:val="17"/>
+                <w:lang w:val="zh-CN" w:eastAsia="zh-CN"/>
+              </w:rPr>
+              <w:t xml:space="preserve">队列、关闭、恢复与 post-commit</w:t>
+            </w:r>
+          </w:p>
+        </w:tc>
+      </w:tr>
+      <w:tr>
+        <w:trPr>
+          <w:cantSplit w:val="true"/>
+        </w:trPr>
+        <w:tc>
+          <w:tcPr>
+            <w:tcW w:w="1900" w:type="dxa"/>
+            <w:vAlign w:val="center"/>
+            <w:tcMar>
+              <w:top w:w="80" w:type="dxa"/>
+              <w:start w:w="120" w:type="dxa"/>
+              <w:bottom w:w="80" w:type="dxa"/>
+              <w:end w:w="120" w:type="dxa"/>
+            </w:tcMar>
+          </w:tcPr>
+          <w:p>
+            <w:pPr>
+              <w:pStyle w:val="NanoLoopTable"/>
+              <w:keepNext w:val="0"/>
+              <w:keepLines w:val="0"/>
+              <w:jc w:val="left"/>
+            </w:pPr>
+            <w:r>
+              <w:rPr>
+                <w:rStyle w:val="VerbatimChar"/>
+                <w:rFonts w:ascii="Arial" w:hAnsi="Arial" w:eastAsia="PingFang SC" w:cs="Arial"/>
+                <w:sz w:val="17"/>
+                <w:lang w:val="zh-CN" w:eastAsia="zh-CN"/>
+              </w:rPr>
               <w:t xml:space="preserve">app/core/config.py</w:t>
             </w:r>
             <w:r>
@@ -15450,6 +16341,23 @@
                 <w:sz w:val="17"/>
                 <w:lang w:val="zh-CN" w:eastAsia="zh-CN"/>
               </w:rPr>
+              <w:t xml:space="preserve">rate_limit.py</w:t>
+            </w:r>
+            <w:r>
+              <w:rPr>
+                <w:rFonts w:ascii="Arial" w:hAnsi="Arial" w:eastAsia="PingFang SC" w:cs="Arial"/>
+                <w:sz w:val="17"/>
+                <w:lang w:val="zh-CN" w:eastAsia="zh-CN"/>
+              </w:rPr>
+              <w:t xml:space="preserve">、</w:t>
+            </w:r>
+            <w:r>
+              <w:rPr>
+                <w:rStyle w:val="VerbatimChar"/>
+                <w:rFonts w:ascii="Arial" w:hAnsi="Arial" w:eastAsia="PingFang SC" w:cs="Arial"/>
+                <w:sz w:val="17"/>
+                <w:lang w:val="zh-CN" w:eastAsia="zh-CN"/>
+              </w:rPr>
               <w:t xml:space="preserve">logging.py</w:t>
             </w:r>
           </w:p>
@@ -15478,7 +16386,7 @@
                 <w:sz w:val="17"/>
                 <w:lang w:val="zh-CN" w:eastAsia="zh-CN"/>
               </w:rPr>
-              <w:t xml:space="preserve">Settings、安全与结构化日志</w:t>
+              <w:t xml:space="preserve">Settings、Key 验证、固定三桶限流与结构化日志</w:t>
             </w:r>
           </w:p>
         </w:tc>
@@ -15507,6 +16415,96 @@
                 <w:lang w:val="zh-CN" w:eastAsia="zh-CN"/>
               </w:rPr>
               <w:t xml:space="preserve">环境合同与生产边界</w:t>
+            </w:r>
+          </w:p>
+        </w:tc>
+      </w:tr>
+      <w:tr>
+        <w:trPr>
+          <w:cantSplit w:val="true"/>
+        </w:trPr>
+        <w:tc>
+          <w:tcPr>
+            <w:tcW w:w="1900" w:type="dxa"/>
+            <w:vAlign w:val="center"/>
+            <w:tcMar>
+              <w:top w:w="80" w:type="dxa"/>
+              <w:start w:w="120" w:type="dxa"/>
+              <w:bottom w:w="80" w:type="dxa"/>
+              <w:end w:w="120" w:type="dxa"/>
+            </w:tcMar>
+          </w:tcPr>
+          <w:p>
+            <w:pPr>
+              <w:pStyle w:val="NanoLoopTable"/>
+              <w:keepNext w:val="0"/>
+              <w:keepLines w:val="0"/>
+              <w:jc w:val="left"/>
+            </w:pPr>
+            <w:r>
+              <w:rPr>
+                <w:rStyle w:val="VerbatimChar"/>
+                <w:rFonts w:ascii="Arial" w:hAnsi="Arial" w:eastAsia="PingFang SC" w:cs="Arial"/>
+                <w:sz w:val="17"/>
+                <w:lang w:val="zh-CN" w:eastAsia="zh-CN"/>
+              </w:rPr>
+              <w:t xml:space="preserve">docs/adr/0004-shared-api-key-and-single-process-rate-limit.md</w:t>
+            </w:r>
+          </w:p>
+        </w:tc>
+        <w:tc>
+          <w:tcPr>
+            <w:tcW w:w="3150" w:type="dxa"/>
+            <w:vAlign w:val="center"/>
+            <w:tcMar>
+              <w:top w:w="80" w:type="dxa"/>
+              <w:start w:w="120" w:type="dxa"/>
+              <w:bottom w:w="80" w:type="dxa"/>
+              <w:end w:w="120" w:type="dxa"/>
+            </w:tcMar>
+          </w:tcPr>
+          <w:p>
+            <w:pPr>
+              <w:pStyle w:val="NanoLoopTable"/>
+              <w:keepNext w:val="0"/>
+              <w:keepLines w:val="0"/>
+              <w:jc w:val="left"/>
+            </w:pPr>
+            <w:r>
+              <w:rPr>
+                <w:rFonts w:ascii="Arial" w:hAnsi="Arial" w:eastAsia="PingFang SC" w:cs="Arial"/>
+                <w:sz w:val="17"/>
+                <w:lang w:val="zh-CN" w:eastAsia="zh-CN"/>
+              </w:rPr>
+              <w:t xml:space="preserve">当前安全决策、顺序与局限</w:t>
+            </w:r>
+          </w:p>
+        </w:tc>
+        <w:tc>
+          <w:tcPr>
+            <w:tcW w:w="4310" w:type="dxa"/>
+            <w:vAlign w:val="center"/>
+            <w:tcMar>
+              <w:top w:w="80" w:type="dxa"/>
+              <w:start w:w="120" w:type="dxa"/>
+              <w:bottom w:w="80" w:type="dxa"/>
+              <w:end w:w="120" w:type="dxa"/>
+            </w:tcMar>
+          </w:tcPr>
+          <w:p>
+            <w:pPr>
+              <w:pStyle w:val="NanoLoopTable"/>
+              <w:keepNext w:val="0"/>
+              <w:keepLines w:val="0"/>
+              <w:jc w:val="left"/>
+            </w:pPr>
+            <w:r>
+              <w:rPr>
+                <w:rFonts w:ascii="Arial" w:hAnsi="Arial" w:eastAsia="PingFang SC" w:cs="Arial"/>
+                <w:sz w:val="17"/>
+                <w:lang w:val="zh-CN" w:eastAsia="zh-CN"/>
+              </w:rPr>
+              <w:t xml:space="preserve">认证/限流更换前先写新 ADR</w:t>
             </w:r>
           </w:p>
         </w:tc>
@@ -16912,6 +17910,158 @@
     </w:p>
     <w:p>
       <w:pPr>
+        <w:widowControl/>
+        <w:numPr>
+          <w:ilvl w:val="0"/>
+          <w:numId w:val="1015"/>
+        </w:numPr>
+        <w:pStyle w:val="Compact"/>
+      </w:pPr>
+      <w:r>
+        <w:rPr>
+          <w:rFonts w:ascii="Arial" w:hAnsi="Arial" w:eastAsia="PingFang SC" w:cs="Arial"/>
+          <w:lang w:val="zh-CN" w:eastAsia="zh-CN"/>
+        </w:rPr>
+        <w:t xml:space="preserve">共享 Key 启用时，版本化 API、签名文件下载和版本化 health 不得绕过验证；公开豁免必须是精确路径，只有外层 CORS middleware 识别的合法预检可直接响应。</w:t>
+      </w:r>
+    </w:p>
+    <w:p>
+      <w:pPr>
+        <w:widowControl/>
+        <w:numPr>
+          <w:ilvl w:val="0"/>
+          <w:numId w:val="1015"/>
+        </w:numPr>
+        <w:pStyle w:val="Compact"/>
+      </w:pPr>
+      <w:r>
+        <w:rPr>
+          <w:rFonts w:ascii="Arial" w:hAnsi="Arial" w:eastAsia="PingFang SC" w:cs="Arial"/>
+          <w:lang w:val="zh-CN" w:eastAsia="zh-CN"/>
+        </w:rPr>
+        <w:t xml:space="preserve">不得记录、回显或把原始 Key 放入错误 details；后端 verifier 只保留摘要，重复 Key 头部必须 fail closed。</w:t>
+      </w:r>
+    </w:p>
+    <w:p>
+      <w:pPr>
+        <w:widowControl/>
+        <w:numPr>
+          <w:ilvl w:val="0"/>
+          <w:numId w:val="1015"/>
+        </w:numPr>
+        <w:pStyle w:val="Compact"/>
+      </w:pPr>
+      <w:r>
+        <w:rPr>
+          <w:rFonts w:ascii="Arial" w:hAnsi="Arial" w:eastAsia="PingFang SC" w:cs="Arial"/>
+          <w:lang w:val="zh-CN" w:eastAsia="zh-CN"/>
+        </w:rPr>
+        <w:t xml:space="preserve">中间件顺序、CORS 响应头和 OpenAPI</w:t>
+      </w:r>
+      <w:r>
+        <w:rPr>
+          <w:rFonts w:ascii="Arial" w:hAnsi="Arial" w:eastAsia="PingFang SC" w:cs="Arial"/>
+          <w:lang w:val="zh-CN" w:eastAsia="zh-CN"/>
+        </w:rPr>
+        <w:t xml:space="preserve"> </w:t>
+      </w:r>
+      <w:r>
+        <w:rPr>
+          <w:rStyle w:val="VerbatimChar"/>
+        </w:rPr>
+        <w:t xml:space="preserve">ApiKeyAuth</w:t>
+      </w:r>
+      <w:r>
+        <w:rPr>
+          <w:rFonts w:ascii="Arial" w:hAnsi="Arial" w:eastAsia="PingFang SC" w:cs="Arial"/>
+          <w:lang w:val="zh-CN" w:eastAsia="zh-CN"/>
+        </w:rPr>
+        <w:t xml:space="preserve">/401/403/429 是公开合同；修改时同步 HTTP 合同测试。</w:t>
+      </w:r>
+    </w:p>
+    <w:p>
+      <w:pPr>
+        <w:widowControl/>
+        <w:numPr>
+          <w:ilvl w:val="0"/>
+          <w:numId w:val="1015"/>
+        </w:numPr>
+        <w:pStyle w:val="Compact"/>
+      </w:pPr>
+      <w:r>
+        <w:rPr>
+          <w:rFonts w:ascii="Arial" w:hAnsi="Arial" w:eastAsia="PingFang SC" w:cs="Arial"/>
+          <w:lang w:val="zh-CN" w:eastAsia="zh-CN"/>
+        </w:rPr>
+        <w:t xml:space="preserve">进程内限流不得按 IP/Key 动态无界建桶，也不得声称为多 worker/多副本全局配额。</w:t>
+      </w:r>
+    </w:p>
+    <w:p>
+      <w:pPr>
+        <w:widowControl/>
+        <w:numPr>
+          <w:ilvl w:val="0"/>
+          <w:numId w:val="1015"/>
+        </w:numPr>
+        <w:pStyle w:val="Compact"/>
+      </w:pPr>
+      <w:r>
+        <w:rPr>
+          <w:rFonts w:ascii="Arial" w:hAnsi="Arial" w:eastAsia="PingFang SC" w:cs="Arial"/>
+          <w:lang w:val="zh-CN" w:eastAsia="zh-CN"/>
+        </w:rPr>
+        <w:t xml:space="preserve">Compose/容器 DNS 名必须显式进入</w:t>
+      </w:r>
+      <w:r>
+        <w:rPr>
+          <w:rFonts w:ascii="Arial" w:hAnsi="Arial" w:eastAsia="PingFang SC" w:cs="Arial"/>
+          <w:lang w:val="zh-CN" w:eastAsia="zh-CN"/>
+        </w:rPr>
+        <w:t xml:space="preserve"> </w:t>
+      </w:r>
+      <w:r>
+        <w:rPr>
+          <w:rStyle w:val="VerbatimChar"/>
+        </w:rPr>
+        <w:t xml:space="preserve">TRUSTED_HOSTS</w:t>
+      </w:r>
+      <w:r>
+        <w:rPr>
+          <w:rFonts w:ascii="Arial" w:hAnsi="Arial" w:eastAsia="PingFang SC" w:cs="Arial"/>
+          <w:lang w:val="zh-CN" w:eastAsia="zh-CN"/>
+        </w:rPr>
+        <w:t xml:space="preserve">；不得用</w:t>
+      </w:r>
+      <w:r>
+        <w:rPr>
+          <w:rFonts w:ascii="Arial" w:hAnsi="Arial" w:eastAsia="PingFang SC" w:cs="Arial"/>
+          <w:lang w:val="zh-CN" w:eastAsia="zh-CN"/>
+        </w:rPr>
+        <w:t xml:space="preserve"> </w:t>
+      </w:r>
+      <w:r>
+        <w:rPr>
+          <w:rStyle w:val="VerbatimChar"/>
+        </w:rPr>
+        <w:t xml:space="preserve">*</w:t>
+      </w:r>
+      <w:r>
+        <w:rPr>
+          <w:rFonts w:ascii="Arial" w:hAnsi="Arial" w:eastAsia="PingFang SC" w:cs="Arial"/>
+          <w:lang w:val="zh-CN" w:eastAsia="zh-CN"/>
+        </w:rPr>
+        <w:t xml:space="preserve"> </w:t>
+      </w:r>
+      <w:r>
+        <w:rPr>
+          <w:rFonts w:ascii="Arial" w:hAnsi="Arial" w:eastAsia="PingFang SC" w:cs="Arial"/>
+          <w:lang w:val="zh-CN" w:eastAsia="zh-CN"/>
+        </w:rPr>
+        <w:t xml:space="preserve">为了便利跨容器访问而关闭 Host 边界。</w:t>
+      </w:r>
+    </w:p>
+    <w:p>
+      <w:pPr>
         <w:pStyle w:val="FirstParagraph"/>
         <w:widowControl/>
       </w:pPr>
@@ -17165,7 +18315,7 @@
                 <w:sz w:val="17"/>
                 <w:lang w:val="zh-CN" w:eastAsia="zh-CN"/>
               </w:rPr>
-              <w:t xml:space="preserve">引入明确身份认证和授权边界</w:t>
+              <w:t xml:space="preserve">用用户/租户身份与资源授权取代共享 Key 边界</w:t>
             </w:r>
           </w:p>
         </w:tc>
@@ -17193,7 +18343,7 @@
                 <w:sz w:val="17"/>
                 <w:lang w:val="zh-CN" w:eastAsia="zh-CN"/>
               </w:rPr>
-              <w:t xml:space="preserve">API/文件下载均按主体授权；匿名行为、错误与审计有测试</w:t>
+              <w:t xml:space="preserve">API/文件下载按主体和所有权授权；登录、匿名、撤销、错误与审计有测试</w:t>
             </w:r>
           </w:p>
         </w:tc>
@@ -17315,7 +18465,7 @@
                 <w:sz w:val="17"/>
                 <w:lang w:val="zh-CN" w:eastAsia="zh-CN"/>
               </w:rPr>
-              <w:t xml:space="preserve">C-P1</w:t>
+              <w:t xml:space="preserve">C-P0</w:t>
             </w:r>
           </w:p>
         </w:tc>
@@ -17343,7 +18493,7 @@
                 <w:sz w:val="17"/>
                 <w:lang w:val="zh-CN" w:eastAsia="zh-CN"/>
               </w:rPr>
-              <w:t xml:space="preserve">设计 PostgreSQL + 共享对象存储 + 外部任务队列</w:t>
+              <w:t xml:space="preserve">增加备份/恢复与灾难演练</w:t>
             </w:r>
           </w:p>
         </w:tc>
@@ -17371,7 +18521,7 @@
                 <w:sz w:val="17"/>
                 <w:lang w:val="zh-CN" w:eastAsia="zh-CN"/>
               </w:rPr>
-              <w:t xml:space="preserve">ADR、迁移工具、幂等 worker ownership 和回滚演练</w:t>
+              <w:t xml:space="preserve">DB、制品、模型 snapshot、知识索引版本可一致恢复；定期演练 RPO/RTO</w:t>
             </w:r>
           </w:p>
         </w:tc>
@@ -17432,7 +18582,7 @@
                 <w:sz w:val="17"/>
                 <w:lang w:val="zh-CN" w:eastAsia="zh-CN"/>
               </w:rPr>
-              <w:t xml:space="preserve">增加备份/恢复与灾难演练</w:t>
+              <w:t xml:space="preserve">设计 PostgreSQL + 共享对象存储 + 外部任务队列</w:t>
             </w:r>
           </w:p>
         </w:tc>
@@ -17460,7 +18610,96 @@
                 <w:sz w:val="17"/>
                 <w:lang w:val="zh-CN" w:eastAsia="zh-CN"/>
               </w:rPr>
-              <w:t xml:space="preserve">DB、制品、模型 snapshot、知识索引版本可一致恢复</w:t>
+              <w:t xml:space="preserve">ADR、迁移工具、幂等 worker ownership 和回滚演练</w:t>
+            </w:r>
+          </w:p>
+        </w:tc>
+      </w:tr>
+      <w:tr>
+        <w:trPr>
+          <w:cantSplit w:val="true"/>
+        </w:trPr>
+        <w:tc>
+          <w:tcPr>
+            <w:tcW w:w="1900" w:type="dxa"/>
+            <w:vAlign w:val="center"/>
+            <w:tcMar>
+              <w:top w:w="80" w:type="dxa"/>
+              <w:start w:w="120" w:type="dxa"/>
+              <w:bottom w:w="80" w:type="dxa"/>
+              <w:end w:w="120" w:type="dxa"/>
+            </w:tcMar>
+          </w:tcPr>
+          <w:p>
+            <w:pPr>
+              <w:pStyle w:val="NanoLoopTable"/>
+              <w:keepNext w:val="0"/>
+              <w:keepLines w:val="0"/>
+              <w:jc w:val="left"/>
+            </w:pPr>
+            <w:r>
+              <w:rPr>
+                <w:rFonts w:ascii="Arial" w:hAnsi="Arial" w:eastAsia="PingFang SC" w:cs="Arial"/>
+                <w:sz w:val="17"/>
+                <w:lang w:val="zh-CN" w:eastAsia="zh-CN"/>
+              </w:rPr>
+              <w:t xml:space="preserve">C-P1</w:t>
+            </w:r>
+          </w:p>
+        </w:tc>
+        <w:tc>
+          <w:tcPr>
+            <w:tcW w:w="3150" w:type="dxa"/>
+            <w:vAlign w:val="center"/>
+            <w:tcMar>
+              <w:top w:w="80" w:type="dxa"/>
+              <w:start w:w="120" w:type="dxa"/>
+              <w:bottom w:w="80" w:type="dxa"/>
+              <w:end w:w="120" w:type="dxa"/>
+            </w:tcMar>
+          </w:tcPr>
+          <w:p>
+            <w:pPr>
+              <w:pStyle w:val="NanoLoopTable"/>
+              <w:keepNext w:val="0"/>
+              <w:keepLines w:val="0"/>
+              <w:jc w:val="left"/>
+            </w:pPr>
+            <w:r>
+              <w:rPr>
+                <w:rFonts w:ascii="Arial" w:hAnsi="Arial" w:eastAsia="PingFang SC" w:cs="Arial"/>
+                <w:sz w:val="17"/>
+                <w:lang w:val="zh-CN" w:eastAsia="zh-CN"/>
+              </w:rPr>
+              <w:t xml:space="preserve">将单进程三桶升级为分布式主体限流</w:t>
+            </w:r>
+          </w:p>
+        </w:tc>
+        <w:tc>
+          <w:tcPr>
+            <w:tcW w:w="4310" w:type="dxa"/>
+            <w:vAlign w:val="center"/>
+            <w:tcMar>
+              <w:top w:w="80" w:type="dxa"/>
+              <w:start w:w="120" w:type="dxa"/>
+              <w:bottom w:w="80" w:type="dxa"/>
+              <w:end w:w="120" w:type="dxa"/>
+            </w:tcMar>
+          </w:tcPr>
+          <w:p>
+            <w:pPr>
+              <w:pStyle w:val="NanoLoopTable"/>
+              <w:keepNext w:val="0"/>
+              <w:keepLines w:val="0"/>
+              <w:jc w:val="left"/>
+            </w:pPr>
+            <w:r>
+              <w:rPr>
+                <w:rFonts w:ascii="Arial" w:hAnsi="Arial" w:eastAsia="PingFang SC" w:cs="Arial"/>
+                <w:sz w:val="17"/>
+                <w:lang w:val="zh-CN" w:eastAsia="zh-CN"/>
+              </w:rPr>
+              <w:t xml:space="preserve">多副本共享计数、按主体/操作分级、时钟/故障策略和容量测试有证据</w:t>
             </w:r>
           </w:p>
         </w:tc>
@@ -17611,7 +18850,51 @@
           <w:sz w:val="16"/>
           <w:lang w:val="zh-CN" w:eastAsia="zh-CN"/>
         </w:rPr>
-        <w:t xml:space="preserve"> tests/unit/api tests/unit/db tests/unit/storage tests/unit/orchestration</w:t>
+        <w:t xml:space="preserve"> tests/unit/api tests/unit/core/test_security.py tests/unit/core/test_rate_limit.py</w:t>
+      </w:r>
+      <w:r>
+        <w:rPr>
+          <w:rFonts w:ascii="Menlo" w:hAnsi="Menlo" w:eastAsia="PingFang SC" w:cs="Menlo"/>
+          <w:sz w:val="16"/>
+          <w:lang w:val="zh-CN" w:eastAsia="zh-CN"/>
+        </w:rPr>
+        <w:br/>
+      </w:r>
+      <w:r>
+        <w:rPr>
+          <w:rStyle w:val="ExtensionTok"/>
+          <w:rFonts w:ascii="Menlo" w:hAnsi="Menlo" w:eastAsia="PingFang SC" w:cs="Menlo"/>
+          <w:sz w:val="16"/>
+          <w:lang w:val="zh-CN" w:eastAsia="zh-CN"/>
+        </w:rPr>
+        <w:t xml:space="preserve">.venv/bin/pytest</w:t>
+      </w:r>
+      <w:r>
+        <w:rPr>
+          <w:rStyle w:val="NormalTok"/>
+          <w:rFonts w:ascii="Menlo" w:hAnsi="Menlo" w:eastAsia="PingFang SC" w:cs="Menlo"/>
+          <w:sz w:val="16"/>
+          <w:lang w:val="zh-CN" w:eastAsia="zh-CN"/>
+        </w:rPr>
+        <w:t xml:space="preserve"> </w:t>
+      </w:r>
+      <w:r>
+        <w:rPr>
+          <w:rStyle w:val="AttributeTok"/>
+          <w:rFonts w:ascii="Menlo" w:hAnsi="Menlo" w:eastAsia="PingFang SC" w:cs="Menlo"/>
+          <w:sz w:val="16"/>
+          <w:lang w:val="zh-CN" w:eastAsia="zh-CN"/>
+        </w:rPr>
+        <w:t xml:space="preserve">-q</w:t>
+      </w:r>
+      <w:r>
+        <w:rPr>
+          <w:rStyle w:val="NormalTok"/>
+          <w:rFonts w:ascii="Menlo" w:hAnsi="Menlo" w:eastAsia="PingFang SC" w:cs="Menlo"/>
+          <w:sz w:val="16"/>
+          <w:lang w:val="zh-CN" w:eastAsia="zh-CN"/>
+        </w:rPr>
+        <w:t xml:space="preserve"> tests/unit/db tests/unit/storage tests/unit/orchestration</w:t>
       </w:r>
       <w:r>
         <w:rPr>
@@ -20401,7 +21684,165 @@
           <w:rFonts w:ascii="Arial" w:hAnsi="Arial" w:eastAsia="PingFang SC" w:cs="Arial"/>
           <w:lang w:val="zh-CN" w:eastAsia="zh-CN"/>
         </w:rPr>
-        <w:t xml:space="preserve">统一处理 envelope、错误、multipart、下载和查询。</w:t>
+        <w:t xml:space="preserve">统一处理 envelope、错误、multipart、下载和查询；</w:t>
+      </w:r>
+      <w:r>
+        <w:rPr>
+          <w:rStyle w:val="VerbatimChar"/>
+        </w:rPr>
+        <w:t xml:space="preserve">X-API-Key</w:t>
+      </w:r>
+      <w:r>
+        <w:rPr>
+          <w:rFonts w:ascii="Arial" w:hAnsi="Arial" w:eastAsia="PingFang SC" w:cs="Arial"/>
+          <w:lang w:val="zh-CN" w:eastAsia="zh-CN"/>
+        </w:rPr>
+        <w:t xml:space="preserve"> </w:t>
+      </w:r>
+      <w:r>
+        <w:rPr>
+          <w:rFonts w:ascii="Arial" w:hAnsi="Arial" w:eastAsia="PingFang SC" w:cs="Arial"/>
+          <w:lang w:val="zh-CN" w:eastAsia="zh-CN"/>
+        </w:rPr>
+        <w:t xml:space="preserve">只由 client 内部注入，调用方不能通过通用 headers 伪造或替换它。</w:t>
+      </w:r>
+    </w:p>
+    <w:p>
+      <w:pPr>
+        <w:widowControl/>
+        <w:numPr>
+          <w:ilvl w:val="0"/>
+          <w:numId w:val="1018"/>
+        </w:numPr>
+        <w:pStyle w:val="Compact"/>
+      </w:pPr>
+      <w:r>
+        <w:rPr>
+          <w:rStyle w:val="VerbatimChar"/>
+        </w:rPr>
+        <w:t xml:space="preserve">frontend/app.py</w:t>
+      </w:r>
+      <w:r>
+        <w:rPr>
+          <w:rFonts w:ascii="Arial" w:hAnsi="Arial" w:eastAsia="PingFang SC" w:cs="Arial"/>
+          <w:lang w:val="zh-CN" w:eastAsia="zh-CN"/>
+        </w:rPr>
+        <w:t xml:space="preserve"> </w:t>
+      </w:r>
+      <w:r>
+        <w:rPr>
+          <w:rFonts w:ascii="Arial" w:hAnsi="Arial" w:eastAsia="PingFang SC" w:cs="Arial"/>
+          <w:lang w:val="zh-CN" w:eastAsia="zh-CN"/>
+        </w:rPr>
+        <w:t xml:space="preserve">只从</w:t>
+      </w:r>
+      <w:r>
+        <w:rPr>
+          <w:rFonts w:ascii="Arial" w:hAnsi="Arial" w:eastAsia="PingFang SC" w:cs="Arial"/>
+          <w:lang w:val="zh-CN" w:eastAsia="zh-CN"/>
+        </w:rPr>
+        <w:t xml:space="preserve"> </w:t>
+      </w:r>
+      <w:r>
+        <w:rPr>
+          <w:rStyle w:val="VerbatimChar"/>
+        </w:rPr>
+        <w:t xml:space="preserve">NANOLOOP_API_KEY</w:t>
+      </w:r>
+      <w:r>
+        <w:rPr>
+          <w:rFonts w:ascii="Arial" w:hAnsi="Arial" w:eastAsia="PingFang SC" w:cs="Arial"/>
+          <w:lang w:val="zh-CN" w:eastAsia="zh-CN"/>
+        </w:rPr>
+        <w:t xml:space="preserve"> </w:t>
+      </w:r>
+      <w:r>
+        <w:rPr>
+          <w:rFonts w:ascii="Arial" w:hAnsi="Arial" w:eastAsia="PingFang SC" w:cs="Arial"/>
+          <w:lang w:val="zh-CN" w:eastAsia="zh-CN"/>
+        </w:rPr>
+        <w:t xml:space="preserve">进程环境取 Key；client cache key 只保存 SHA-256 指纹，环境 Key 轮换会重建 client。</w:t>
+      </w:r>
+    </w:p>
+    <w:p>
+      <w:pPr>
+        <w:widowControl/>
+        <w:numPr>
+          <w:ilvl w:val="0"/>
+          <w:numId w:val="1018"/>
+        </w:numPr>
+        <w:pStyle w:val="Compact"/>
+      </w:pPr>
+      <w:r>
+        <w:rPr>
+          <w:rFonts w:ascii="Arial" w:hAnsi="Arial" w:eastAsia="PingFang SC" w:cs="Arial"/>
+          <w:lang w:val="zh-CN" w:eastAsia="zh-CN"/>
+        </w:rPr>
+        <w:t xml:space="preserve">Key 启用时，侧边栏的后端地址被</w:t>
+      </w:r>
+      <w:r>
+        <w:rPr>
+          <w:rFonts w:ascii="Arial" w:hAnsi="Arial" w:eastAsia="PingFang SC" w:cs="Arial"/>
+          <w:lang w:val="zh-CN" w:eastAsia="zh-CN"/>
+        </w:rPr>
+        <w:t xml:space="preserve"> </w:t>
+      </w:r>
+      <w:r>
+        <w:rPr>
+          <w:rStyle w:val="VerbatimChar"/>
+        </w:rPr>
+        <w:t xml:space="preserve">NANOLOOP_API_BASE_URL</w:t>
+      </w:r>
+      <w:r>
+        <w:rPr>
+          <w:rFonts w:ascii="Arial" w:hAnsi="Arial" w:eastAsia="PingFang SC" w:cs="Arial"/>
+          <w:lang w:val="zh-CN" w:eastAsia="zh-CN"/>
+        </w:rPr>
+        <w:t xml:space="preserve"> </w:t>
+      </w:r>
+      <w:r>
+        <w:rPr>
+          <w:rFonts w:ascii="Arial" w:hAnsi="Arial" w:eastAsia="PingFang SC" w:cs="Arial"/>
+          <w:lang w:val="zh-CN" w:eastAsia="zh-CN"/>
+        </w:rPr>
+        <w:t xml:space="preserve">锁定且不可编辑；</w:t>
+      </w:r>
+      <w:r>
+        <w:rPr>
+          <w:rStyle w:val="VerbatimChar"/>
+        </w:rPr>
+        <w:t xml:space="preserve">_get_client()</w:t>
+      </w:r>
+      <w:r>
+        <w:rPr>
+          <w:rFonts w:ascii="Arial" w:hAnsi="Arial" w:eastAsia="PingFang SC" w:cs="Arial"/>
+          <w:lang w:val="zh-CN" w:eastAsia="zh-CN"/>
+        </w:rPr>
+        <w:t xml:space="preserve"> </w:t>
+      </w:r>
+      <w:r>
+        <w:rPr>
+          <w:rFonts w:ascii="Arial" w:hAnsi="Arial" w:eastAsia="PingFang SC" w:cs="Arial"/>
+          <w:lang w:val="zh-CN" w:eastAsia="zh-CN"/>
+        </w:rPr>
+        <w:t xml:space="preserve">再次规范化并完全比对会话/运维地址，因而被篡改的 session 无法获得带 Key 的 client。</w:t>
+      </w:r>
+    </w:p>
+    <w:p>
+      <w:pPr>
+        <w:widowControl/>
+        <w:numPr>
+          <w:ilvl w:val="0"/>
+          <w:numId w:val="1018"/>
+        </w:numPr>
+        <w:pStyle w:val="Compact"/>
+      </w:pPr>
+      <w:r>
+        <w:rPr>
+          <w:rFonts w:ascii="Arial" w:hAnsi="Arial" w:eastAsia="PingFang SC" w:cs="Arial"/>
+          <w:lang w:val="zh-CN" w:eastAsia="zh-CN"/>
+        </w:rPr>
+        <w:t xml:space="preserve">Key 未启用时保留原有开发体验：用户可编辑、规范化并保存 API 地址。</w:t>
       </w:r>
     </w:p>
     <w:p>
@@ -20667,7 +22108,7 @@
                 <w:sz w:val="17"/>
                 <w:lang w:val="zh-CN" w:eastAsia="zh-CN"/>
               </w:rPr>
-              <w:t xml:space="preserve">页面路由与业务流程</w:t>
+              <w:t xml:space="preserve">页面路由、业务流程、API 地址锁定与 client cache</w:t>
             </w:r>
           </w:p>
         </w:tc>
@@ -20695,7 +22136,7 @@
                 <w:sz w:val="17"/>
                 <w:lang w:val="zh-CN" w:eastAsia="zh-CN"/>
               </w:rPr>
-              <w:t xml:space="preserve">新页面、工作流和可见状态</w:t>
+              <w:t xml:space="preserve">新页面、工作流、Key 轮换/目标绑定和可见状态</w:t>
             </w:r>
           </w:p>
         </w:tc>
@@ -20757,7 +22198,40 @@
                 <w:sz w:val="17"/>
                 <w:lang w:val="zh-CN" w:eastAsia="zh-CN"/>
               </w:rPr>
-              <w:t xml:space="preserve">REST 唯一入口</w:t>
+              <w:t xml:space="preserve">REST 唯一入口与</w:t>
+            </w:r>
+            <w:r>
+              <w:rPr>
+                <w:rFonts w:ascii="Arial" w:hAnsi="Arial" w:eastAsia="PingFang SC" w:cs="Arial"/>
+                <w:sz w:val="17"/>
+                <w:lang w:val="zh-CN" w:eastAsia="zh-CN"/>
+              </w:rPr>
+              <w:t xml:space="preserve"> </w:t>
+            </w:r>
+            <w:r>
+              <w:rPr>
+                <w:rStyle w:val="VerbatimChar"/>
+                <w:rFonts w:ascii="Arial" w:hAnsi="Arial" w:eastAsia="PingFang SC" w:cs="Arial"/>
+                <w:sz w:val="17"/>
+                <w:lang w:val="zh-CN" w:eastAsia="zh-CN"/>
+              </w:rPr>
+              <w:t xml:space="preserve">X-API-Key</w:t>
+            </w:r>
+            <w:r>
+              <w:rPr>
+                <w:rFonts w:ascii="Arial" w:hAnsi="Arial" w:eastAsia="PingFang SC" w:cs="Arial"/>
+                <w:sz w:val="17"/>
+                <w:lang w:val="zh-CN" w:eastAsia="zh-CN"/>
+              </w:rPr>
+              <w:t xml:space="preserve"> </w:t>
+            </w:r>
+            <w:r>
+              <w:rPr>
+                <w:rFonts w:ascii="Arial" w:hAnsi="Arial" w:eastAsia="PingFang SC" w:cs="Arial"/>
+                <w:sz w:val="17"/>
+                <w:lang w:val="zh-CN" w:eastAsia="zh-CN"/>
+              </w:rPr>
+              <w:t xml:space="preserve">注入</w:t>
             </w:r>
           </w:p>
         </w:tc>
@@ -20785,7 +22259,7 @@
                 <w:sz w:val="17"/>
                 <w:lang w:val="zh-CN" w:eastAsia="zh-CN"/>
               </w:rPr>
-              <w:t xml:space="preserve">API 合同变化、上传、轮询与下载</w:t>
+              <w:t xml:space="preserve">API 合同变化、认证错误、上传、轮询与下载</w:t>
             </w:r>
           </w:p>
         </w:tc>
@@ -21650,6 +23124,185 @@
           <w:lang w:val="zh-CN" w:eastAsia="zh-CN"/>
         </w:rPr>
         <w:t xml:space="preserve">；不合格时隐藏并解释。</w:t>
+      </w:r>
+    </w:p>
+    <w:p>
+      <w:pPr>
+        <w:widowControl/>
+        <w:numPr>
+          <w:ilvl w:val="0"/>
+          <w:numId w:val="1019"/>
+        </w:numPr>
+        <w:pStyle w:val="Compact"/>
+      </w:pPr>
+      <w:r>
+        <w:rPr>
+          <w:rFonts w:ascii="Arial" w:hAnsi="Arial" w:eastAsia="PingFang SC" w:cs="Arial"/>
+          <w:lang w:val="zh-CN" w:eastAsia="zh-CN"/>
+        </w:rPr>
+        <w:t xml:space="preserve">部署 Key 不得作为明文字段进入</w:t>
+      </w:r>
+      <w:r>
+        <w:rPr>
+          <w:rFonts w:ascii="Arial" w:hAnsi="Arial" w:eastAsia="PingFang SC" w:cs="Arial"/>
+          <w:lang w:val="zh-CN" w:eastAsia="zh-CN"/>
+        </w:rPr>
+        <w:t xml:space="preserve"> </w:t>
+      </w:r>
+      <w:r>
+        <w:rPr>
+          <w:rStyle w:val="VerbatimChar"/>
+        </w:rPr>
+        <w:t xml:space="preserve">st.session_state</w:t>
+      </w:r>
+      <w:r>
+        <w:rPr>
+          <w:rFonts w:ascii="Arial" w:hAnsi="Arial" w:eastAsia="PingFang SC" w:cs="Arial"/>
+          <w:lang w:val="zh-CN" w:eastAsia="zh-CN"/>
+        </w:rPr>
+        <w:t xml:space="preserve">、URL、页面、错误文本或日志；client cache 身份只使用指纹，原值封装在 API client 内。</w:t>
+      </w:r>
+    </w:p>
+    <w:p>
+      <w:pPr>
+        <w:widowControl/>
+        <w:numPr>
+          <w:ilvl w:val="0"/>
+          <w:numId w:val="1019"/>
+        </w:numPr>
+        <w:pStyle w:val="Compact"/>
+      </w:pPr>
+      <w:r>
+        <w:rPr>
+          <w:rFonts w:ascii="Arial" w:hAnsi="Arial" w:eastAsia="PingFang SC" w:cs="Arial"/>
+          <w:lang w:val="zh-CN" w:eastAsia="zh-CN"/>
+        </w:rPr>
+        <w:t xml:space="preserve">前端必须保留</w:t>
+      </w:r>
+      <w:r>
+        <w:rPr>
+          <w:rFonts w:ascii="Arial" w:hAnsi="Arial" w:eastAsia="PingFang SC" w:cs="Arial"/>
+          <w:lang w:val="zh-CN" w:eastAsia="zh-CN"/>
+        </w:rPr>
+        <w:t xml:space="preserve"> </w:t>
+      </w:r>
+      <w:r>
+        <w:rPr>
+          <w:rStyle w:val="VerbatimChar"/>
+        </w:rPr>
+        <w:t xml:space="preserve">AUTHENTICATION_REQUIRED</w:t>
+      </w:r>
+      <w:r>
+        <w:rPr>
+          <w:rFonts w:ascii="Arial" w:hAnsi="Arial" w:eastAsia="PingFang SC" w:cs="Arial"/>
+          <w:lang w:val="zh-CN" w:eastAsia="zh-CN"/>
+        </w:rPr>
+        <w:t xml:space="preserve"> </w:t>
+      </w:r>
+      <w:r>
+        <w:rPr>
+          <w:rFonts w:ascii="Arial" w:hAnsi="Arial" w:eastAsia="PingFang SC" w:cs="Arial"/>
+          <w:lang w:val="zh-CN" w:eastAsia="zh-CN"/>
+        </w:rPr>
+        <w:t xml:space="preserve">和</w:t>
+      </w:r>
+      <w:r>
+        <w:rPr>
+          <w:rFonts w:ascii="Arial" w:hAnsi="Arial" w:eastAsia="PingFang SC" w:cs="Arial"/>
+          <w:lang w:val="zh-CN" w:eastAsia="zh-CN"/>
+        </w:rPr>
+        <w:t xml:space="preserve"> </w:t>
+      </w:r>
+      <w:r>
+        <w:rPr>
+          <w:rStyle w:val="VerbatimChar"/>
+        </w:rPr>
+        <w:t xml:space="preserve">RATE_LIMITED</w:t>
+      </w:r>
+      <w:r>
+        <w:rPr>
+          <w:rFonts w:ascii="Arial" w:hAnsi="Arial" w:eastAsia="PingFang SC" w:cs="Arial"/>
+          <w:lang w:val="zh-CN" w:eastAsia="zh-CN"/>
+        </w:rPr>
+        <w:t xml:space="preserve"> </w:t>
+      </w:r>
+      <w:r>
+        <w:rPr>
+          <w:rFonts w:ascii="Arial" w:hAnsi="Arial" w:eastAsia="PingFang SC" w:cs="Arial"/>
+          <w:lang w:val="zh-CN" w:eastAsia="zh-CN"/>
+        </w:rPr>
+        <w:t xml:space="preserve">的服务端语义；对可变更请求不因</w:t>
+      </w:r>
+      <w:r>
+        <w:rPr>
+          <w:rFonts w:ascii="Arial" w:hAnsi="Arial" w:eastAsia="PingFang SC" w:cs="Arial"/>
+          <w:lang w:val="zh-CN" w:eastAsia="zh-CN"/>
+        </w:rPr>
+        <w:t xml:space="preserve"> </w:t>
+      </w:r>
+      <w:r>
+        <w:rPr>
+          <w:rStyle w:val="VerbatimChar"/>
+        </w:rPr>
+        <w:t xml:space="preserve">retryable=true</w:t>
+      </w:r>
+      <w:r>
+        <w:rPr>
+          <w:rFonts w:ascii="Arial" w:hAnsi="Arial" w:eastAsia="PingFang SC" w:cs="Arial"/>
+          <w:lang w:val="zh-CN" w:eastAsia="zh-CN"/>
+        </w:rPr>
+        <w:t xml:space="preserve"> </w:t>
+      </w:r>
+      <w:r>
+        <w:rPr>
+          <w:rFonts w:ascii="Arial" w:hAnsi="Arial" w:eastAsia="PingFang SC" w:cs="Arial"/>
+          <w:lang w:val="zh-CN" w:eastAsia="zh-CN"/>
+        </w:rPr>
+        <w:t xml:space="preserve">而无条件自动重放。</w:t>
+      </w:r>
+    </w:p>
+    <w:p>
+      <w:pPr>
+        <w:widowControl/>
+        <w:numPr>
+          <w:ilvl w:val="0"/>
+          <w:numId w:val="1019"/>
+        </w:numPr>
+        <w:pStyle w:val="Compact"/>
+      </w:pPr>
+      <w:r>
+        <w:rPr>
+          <w:rFonts w:ascii="Arial" w:hAnsi="Arial" w:eastAsia="PingFang SC" w:cs="Arial"/>
+          <w:lang w:val="zh-CN" w:eastAsia="zh-CN"/>
+        </w:rPr>
+        <w:t xml:space="preserve">只要进程配置共享 Key，任何 session 控制的 API 地址都不得越过规范化后的</w:t>
+      </w:r>
+      <w:r>
+        <w:rPr>
+          <w:rFonts w:ascii="Arial" w:hAnsi="Arial" w:eastAsia="PingFang SC" w:cs="Arial"/>
+          <w:lang w:val="zh-CN" w:eastAsia="zh-CN"/>
+        </w:rPr>
+        <w:t xml:space="preserve"> </w:t>
+      </w:r>
+      <w:r>
+        <w:rPr>
+          <w:rStyle w:val="VerbatimChar"/>
+        </w:rPr>
+        <w:t xml:space="preserve">NANOLOOP_API_BASE_URL</w:t>
+      </w:r>
+      <w:r>
+        <w:rPr>
+          <w:rFonts w:ascii="Arial" w:hAnsi="Arial" w:eastAsia="PingFang SC" w:cs="Arial"/>
+          <w:lang w:val="zh-CN" w:eastAsia="zh-CN"/>
+        </w:rPr>
+        <w:t xml:space="preserve"> </w:t>
+      </w:r>
+      <w:r>
+        <w:rPr>
+          <w:rFonts w:ascii="Arial" w:hAnsi="Arial" w:eastAsia="PingFang SC" w:cs="Arial"/>
+          <w:lang w:val="zh-CN" w:eastAsia="zh-CN"/>
+        </w:rPr>
+        <w:t xml:space="preserve">完全匹配；失配时先丢弃旧 client，再可见拒绝创建。</w:t>
       </w:r>
     </w:p>
     <w:bookmarkEnd w:id="81"/>
@@ -22280,6 +23933,184 @@
                 <w:sz w:val="17"/>
                 <w:lang w:val="zh-CN" w:eastAsia="zh-CN"/>
               </w:rPr>
+              <w:t xml:space="preserve">E-P1</w:t>
+            </w:r>
+          </w:p>
+        </w:tc>
+        <w:tc>
+          <w:tcPr>
+            <w:tcW w:w="3150" w:type="dxa"/>
+            <w:vAlign w:val="center"/>
+            <w:tcMar>
+              <w:top w:w="80" w:type="dxa"/>
+              <w:start w:w="120" w:type="dxa"/>
+              <w:bottom w:w="80" w:type="dxa"/>
+              <w:end w:w="120" w:type="dxa"/>
+            </w:tcMar>
+          </w:tcPr>
+          <w:p>
+            <w:pPr>
+              <w:pStyle w:val="NanoLoopTable"/>
+              <w:keepNext w:val="0"/>
+              <w:keepLines w:val="0"/>
+              <w:jc w:val="left"/>
+            </w:pPr>
+            <w:r>
+              <w:rPr>
+                <w:rFonts w:ascii="Arial" w:hAnsi="Arial" w:eastAsia="PingFang SC" w:cs="Arial"/>
+                <w:sz w:val="17"/>
+                <w:lang w:val="zh-CN" w:eastAsia="zh-CN"/>
+              </w:rPr>
+              <w:t xml:space="preserve">完善 401/429 与 Key 轮换体验</w:t>
+            </w:r>
+          </w:p>
+        </w:tc>
+        <w:tc>
+          <w:tcPr>
+            <w:tcW w:w="4310" w:type="dxa"/>
+            <w:vAlign w:val="center"/>
+            <w:tcMar>
+              <w:top w:w="80" w:type="dxa"/>
+              <w:start w:w="120" w:type="dxa"/>
+              <w:bottom w:w="80" w:type="dxa"/>
+              <w:end w:w="120" w:type="dxa"/>
+            </w:tcMar>
+          </w:tcPr>
+          <w:p>
+            <w:pPr>
+              <w:pStyle w:val="NanoLoopTable"/>
+              <w:keepNext w:val="0"/>
+              <w:keepLines w:val="0"/>
+              <w:jc w:val="left"/>
+            </w:pPr>
+            <w:r>
+              <w:rPr>
+                <w:rFonts w:ascii="Arial" w:hAnsi="Arial" w:eastAsia="PingFang SC" w:cs="Arial"/>
+                <w:sz w:val="17"/>
+                <w:lang w:val="zh-CN" w:eastAsia="zh-CN"/>
+              </w:rPr>
+              <w:t xml:space="preserve">401 引导运维更新环境；429 显示等待信息，只对可安全重试的读请求按策略重试</w:t>
+            </w:r>
+          </w:p>
+        </w:tc>
+      </w:tr>
+      <w:tr>
+        <w:trPr>
+          <w:cantSplit w:val="true"/>
+        </w:trPr>
+        <w:tc>
+          <w:tcPr>
+            <w:tcW w:w="1900" w:type="dxa"/>
+            <w:vAlign w:val="center"/>
+            <w:tcMar>
+              <w:top w:w="80" w:type="dxa"/>
+              <w:start w:w="120" w:type="dxa"/>
+              <w:bottom w:w="80" w:type="dxa"/>
+              <w:end w:w="120" w:type="dxa"/>
+            </w:tcMar>
+          </w:tcPr>
+          <w:p>
+            <w:pPr>
+              <w:pStyle w:val="NanoLoopTable"/>
+              <w:keepNext w:val="0"/>
+              <w:keepLines w:val="0"/>
+              <w:jc w:val="left"/>
+            </w:pPr>
+            <w:r>
+              <w:rPr>
+                <w:rFonts w:ascii="Arial" w:hAnsi="Arial" w:eastAsia="PingFang SC" w:cs="Arial"/>
+                <w:sz w:val="17"/>
+                <w:lang w:val="zh-CN" w:eastAsia="zh-CN"/>
+              </w:rPr>
+              <w:t xml:space="preserve">E-P1</w:t>
+            </w:r>
+          </w:p>
+        </w:tc>
+        <w:tc>
+          <w:tcPr>
+            <w:tcW w:w="3150" w:type="dxa"/>
+            <w:vAlign w:val="center"/>
+            <w:tcMar>
+              <w:top w:w="80" w:type="dxa"/>
+              <w:start w:w="120" w:type="dxa"/>
+              <w:bottom w:w="80" w:type="dxa"/>
+              <w:end w:w="120" w:type="dxa"/>
+            </w:tcMar>
+          </w:tcPr>
+          <w:p>
+            <w:pPr>
+              <w:pStyle w:val="NanoLoopTable"/>
+              <w:keepNext w:val="0"/>
+              <w:keepLines w:val="0"/>
+              <w:jc w:val="left"/>
+            </w:pPr>
+            <w:r>
+              <w:rPr>
+                <w:rFonts w:ascii="Arial" w:hAnsi="Arial" w:eastAsia="PingFang SC" w:cs="Arial"/>
+                <w:sz w:val="17"/>
+                <w:lang w:val="zh-CN" w:eastAsia="zh-CN"/>
+              </w:rPr>
+              <w:t xml:space="preserve">扩展共享 Key 目标绑定回归</w:t>
+            </w:r>
+          </w:p>
+        </w:tc>
+        <w:tc>
+          <w:tcPr>
+            <w:tcW w:w="4310" w:type="dxa"/>
+            <w:vAlign w:val="center"/>
+            <w:tcMar>
+              <w:top w:w="80" w:type="dxa"/>
+              <w:start w:w="120" w:type="dxa"/>
+              <w:bottom w:w="80" w:type="dxa"/>
+              <w:end w:w="120" w:type="dxa"/>
+            </w:tcMar>
+          </w:tcPr>
+          <w:p>
+            <w:pPr>
+              <w:pStyle w:val="NanoLoopTable"/>
+              <w:keepNext w:val="0"/>
+              <w:keepLines w:val="0"/>
+              <w:jc w:val="left"/>
+            </w:pPr>
+            <w:r>
+              <w:rPr>
+                <w:rFonts w:ascii="Arial" w:hAnsi="Arial" w:eastAsia="PingFang SC" w:cs="Arial"/>
+                <w:sz w:val="17"/>
+                <w:lang w:val="zh-CN" w:eastAsia="zh-CN"/>
+              </w:rPr>
+              <w:t xml:space="preserve">覆盖等价 URL 规范化、带 path 部署、非法运维值、session 篡改与 Key 轮换；错误中不泄密</w:t>
+            </w:r>
+          </w:p>
+        </w:tc>
+      </w:tr>
+      <w:tr>
+        <w:trPr>
+          <w:cantSplit w:val="true"/>
+        </w:trPr>
+        <w:tc>
+          <w:tcPr>
+            <w:tcW w:w="1900" w:type="dxa"/>
+            <w:vAlign w:val="center"/>
+            <w:tcMar>
+              <w:top w:w="80" w:type="dxa"/>
+              <w:start w:w="120" w:type="dxa"/>
+              <w:bottom w:w="80" w:type="dxa"/>
+              <w:end w:w="120" w:type="dxa"/>
+            </w:tcMar>
+          </w:tcPr>
+          <w:p>
+            <w:pPr>
+              <w:pStyle w:val="NanoLoopTable"/>
+              <w:keepNext w:val="0"/>
+              <w:keepLines w:val="0"/>
+              <w:jc w:val="left"/>
+            </w:pPr>
+            <w:r>
+              <w:rPr>
+                <w:rFonts w:ascii="Arial" w:hAnsi="Arial" w:eastAsia="PingFang SC" w:cs="Arial"/>
+                <w:sz w:val="17"/>
+                <w:lang w:val="zh-CN" w:eastAsia="zh-CN"/>
+              </w:rPr>
               <w:t xml:space="preserve">E-P2</w:t>
             </w:r>
           </w:p>
@@ -22605,7 +24436,34 @@
           <w:rFonts w:ascii="Arial" w:hAnsi="Arial" w:eastAsia="PingFang SC" w:cs="Arial"/>
           <w:lang w:val="zh-CN" w:eastAsia="zh-CN"/>
         </w:rPr>
-        <w:t xml:space="preserve">在 Python 3.11/3.12 测试，并构建非 root、只读根文件系统的 API/前端 CPU 镜像。</w:t>
+        <w:t xml:space="preserve">在 Python 3.11/3.12 测试，并构建 API/前端 CPU 镜像；GitHub</w:t>
+      </w:r>
+      <w:r>
+        <w:rPr>
+          <w:rFonts w:ascii="Arial" w:hAnsi="Arial" w:eastAsia="PingFang SC" w:cs="Arial"/>
+          <w:lang w:val="zh-CN" w:eastAsia="zh-CN"/>
+        </w:rPr>
+        <w:t xml:space="preserve"> </w:t>
+      </w:r>
+      <w:r>
+        <w:rPr>
+          <w:rStyle w:val="VerbatimChar"/>
+        </w:rPr>
+        <w:t xml:space="preserve">main</w:t>
+      </w:r>
+      <w:r>
+        <w:rPr>
+          <w:rFonts w:ascii="Arial" w:hAnsi="Arial" w:eastAsia="PingFang SC" w:cs="Arial"/>
+          <w:lang w:val="zh-CN" w:eastAsia="zh-CN"/>
+        </w:rPr>
+        <w:t xml:space="preserve"> </w:t>
+      </w:r>
+      <w:r>
+        <w:rPr>
+          <w:rFonts w:ascii="Arial" w:hAnsi="Arial" w:eastAsia="PingFang SC" w:cs="Arial"/>
+          <w:lang w:val="zh-CN" w:eastAsia="zh-CN"/>
+        </w:rPr>
+        <w:t xml:space="preserve">基线已通过两个镜像的实际启动验活。</w:t>
       </w:r>
     </w:p>
     <w:p>
@@ -22619,9 +24477,16 @@
       </w:pPr>
       <w:r>
         <w:rPr>
+          <w:rFonts w:ascii="Arial" w:hAnsi="Arial" w:eastAsia="PingFang SC" w:cs="Arial"/>
+          <w:lang w:val="zh-CN" w:eastAsia="zh-CN"/>
+        </w:rPr>
+        <w:t xml:space="preserve">容器 job 用非 root、只读根、</w:t>
+      </w:r>
+      <w:r>
+        <w:rPr>
           <w:rStyle w:val="VerbatimChar"/>
         </w:rPr>
-        <w:t xml:space="preserve">docker-compose.yml</w:t>
+        <w:t xml:space="preserve">cap-drop ALL</w:t>
       </w:r>
       <w:r>
         <w:rPr>
@@ -22635,7 +24500,74 @@
           <w:rFonts w:ascii="Arial" w:hAnsi="Arial" w:eastAsia="PingFang SC" w:cs="Arial"/>
           <w:lang w:val="zh-CN" w:eastAsia="zh-CN"/>
         </w:rPr>
-        <w:t xml:space="preserve">明确只读模型 bundle、可写 snapshot/output/knowledge volumes、cap drop、no-new-privileges 和健康检查。</w:t>
+        <w:t xml:space="preserve">和</w:t>
+      </w:r>
+      <w:r>
+        <w:rPr>
+          <w:rFonts w:ascii="Arial" w:hAnsi="Arial" w:eastAsia="PingFang SC" w:cs="Arial"/>
+          <w:lang w:val="zh-CN" w:eastAsia="zh-CN"/>
+        </w:rPr>
+        <w:t xml:space="preserve"> </w:t>
+      </w:r>
+      <w:r>
+        <w:rPr>
+          <w:rStyle w:val="VerbatimChar"/>
+        </w:rPr>
+        <w:t xml:space="preserve">no-new-privileges</w:t>
+      </w:r>
+      <w:r>
+        <w:rPr>
+          <w:rFonts w:ascii="Arial" w:hAnsi="Arial" w:eastAsia="PingFang SC" w:cs="Arial"/>
+          <w:lang w:val="zh-CN" w:eastAsia="zh-CN"/>
+        </w:rPr>
+        <w:t xml:space="preserve"> </w:t>
+      </w:r>
+      <w:r>
+        <w:rPr>
+          <w:rFonts w:ascii="Arial" w:hAnsi="Arial" w:eastAsia="PingFang SC" w:cs="Arial"/>
+          <w:lang w:val="zh-CN" w:eastAsia="zh-CN"/>
+        </w:rPr>
+        <w:t xml:space="preserve">启动 API/前端；API 先在容器内用 CI 专用 Key 验证受保护的</w:t>
+      </w:r>
+      <w:r>
+        <w:rPr>
+          <w:rFonts w:ascii="Arial" w:hAnsi="Arial" w:eastAsia="PingFang SC" w:cs="Arial"/>
+          <w:lang w:val="zh-CN" w:eastAsia="zh-CN"/>
+        </w:rPr>
+        <w:t xml:space="preserve"> </w:t>
+      </w:r>
+      <w:r>
+        <w:rPr>
+          <w:rStyle w:val="VerbatimChar"/>
+        </w:rPr>
+        <w:t xml:space="preserve">/api/v1/health</w:t>
+      </w:r>
+      <w:r>
+        <w:rPr>
+          <w:rFonts w:ascii="Arial" w:hAnsi="Arial" w:eastAsia="PingFang SC" w:cs="Arial"/>
+          <w:lang w:val="zh-CN" w:eastAsia="zh-CN"/>
+        </w:rPr>
+        <w:t xml:space="preserve">，前端也验证自身</w:t>
+      </w:r>
+      <w:r>
+        <w:rPr>
+          <w:rFonts w:ascii="Arial" w:hAnsi="Arial" w:eastAsia="PingFang SC" w:cs="Arial"/>
+          <w:lang w:val="zh-CN" w:eastAsia="zh-CN"/>
+        </w:rPr>
+        <w:t xml:space="preserve"> </w:t>
+      </w:r>
+      <w:r>
+        <w:rPr>
+          <w:rStyle w:val="VerbatimChar"/>
+        </w:rPr>
+        <w:t xml:space="preserve">/_stcore/health</w:t>
+      </w:r>
+      <w:r>
+        <w:rPr>
+          <w:rFonts w:ascii="Arial" w:hAnsi="Arial" w:eastAsia="PingFang SC" w:cs="Arial"/>
+          <w:lang w:val="zh-CN" w:eastAsia="zh-CN"/>
+        </w:rPr>
+        <w:t xml:space="preserve">。</w:t>
       </w:r>
     </w:p>
     <w:p>
@@ -22649,8 +24581,200 @@
       </w:pPr>
       <w:r>
         <w:rPr>
+          <w:rFonts w:ascii="Arial" w:hAnsi="Arial" w:eastAsia="PingFang SC" w:cs="Arial"/>
+          <w:lang w:val="zh-CN" w:eastAsia="zh-CN"/>
+        </w:rPr>
+        <w:t xml:space="preserve">API 与前端运行在同一个临时隔离 Docker 网络，API 使用</w:t>
+      </w:r>
+      <w:r>
+        <w:rPr>
+          <w:rFonts w:ascii="Arial" w:hAnsi="Arial" w:eastAsia="PingFang SC" w:cs="Arial"/>
+          <w:lang w:val="zh-CN" w:eastAsia="zh-CN"/>
+        </w:rPr>
+        <w:t xml:space="preserve"> </w:t>
+      </w:r>
+      <w:r>
+        <w:rPr>
           <w:rStyle w:val="VerbatimChar"/>
         </w:rPr>
+        <w:t xml:space="preserve">api</w:t>
+      </w:r>
+      <w:r>
+        <w:rPr>
+          <w:rFonts w:ascii="Arial" w:hAnsi="Arial" w:eastAsia="PingFang SC" w:cs="Arial"/>
+          <w:lang w:val="zh-CN" w:eastAsia="zh-CN"/>
+        </w:rPr>
+        <w:t xml:space="preserve"> </w:t>
+      </w:r>
+      <w:r>
+        <w:rPr>
+          <w:rFonts w:ascii="Arial" w:hAnsi="Arial" w:eastAsia="PingFang SC" w:cs="Arial"/>
+          <w:lang w:val="zh-CN" w:eastAsia="zh-CN"/>
+        </w:rPr>
+        <w:t xml:space="preserve">网络别名且</w:t>
+      </w:r>
+      <w:r>
+        <w:rPr>
+          <w:rFonts w:ascii="Arial" w:hAnsi="Arial" w:eastAsia="PingFang SC" w:cs="Arial"/>
+          <w:lang w:val="zh-CN" w:eastAsia="zh-CN"/>
+        </w:rPr>
+        <w:t xml:space="preserve"> </w:t>
+      </w:r>
+      <w:r>
+        <w:rPr>
+          <w:rStyle w:val="VerbatimChar"/>
+        </w:rPr>
+        <w:t xml:space="preserve">TRUSTED_HOSTS</w:t>
+      </w:r>
+      <w:r>
+        <w:rPr>
+          <w:rFonts w:ascii="Arial" w:hAnsi="Arial" w:eastAsia="PingFang SC" w:cs="Arial"/>
+          <w:lang w:val="zh-CN" w:eastAsia="zh-CN"/>
+        </w:rPr>
+        <w:t xml:space="preserve"> </w:t>
+      </w:r>
+      <w:r>
+        <w:rPr>
+          <w:rFonts w:ascii="Arial" w:hAnsi="Arial" w:eastAsia="PingFang SC" w:cs="Arial"/>
+          <w:lang w:val="zh-CN" w:eastAsia="zh-CN"/>
+        </w:rPr>
+        <w:t xml:space="preserve">显式允许该名。前端容器携带同一合成 Key 实际请求</w:t>
+      </w:r>
+      <w:r>
+        <w:rPr>
+          <w:rFonts w:ascii="Arial" w:hAnsi="Arial" w:eastAsia="PingFang SC" w:cs="Arial"/>
+          <w:lang w:val="zh-CN" w:eastAsia="zh-CN"/>
+        </w:rPr>
+        <w:t xml:space="preserve"> </w:t>
+      </w:r>
+      <w:r>
+        <w:rPr>
+          <w:rStyle w:val="VerbatimChar"/>
+        </w:rPr>
+        <w:t xml:space="preserve">http://api:8000/api/v1/health</w:t>
+      </w:r>
+      <w:r>
+        <w:rPr>
+          <w:rFonts w:ascii="Arial" w:hAnsi="Arial" w:eastAsia="PingFang SC" w:cs="Arial"/>
+          <w:lang w:val="zh-CN" w:eastAsia="zh-CN"/>
+        </w:rPr>
+        <w:t xml:space="preserve">，一次覆盖 Docker DNS、Host allowlist 和 Key 跨容器传递。</w:t>
+      </w:r>
+    </w:p>
+    <w:p>
+      <w:pPr>
+        <w:widowControl/>
+        <w:numPr>
+          <w:ilvl w:val="0"/>
+          <w:numId w:val="1020"/>
+        </w:numPr>
+        <w:pStyle w:val="Compact"/>
+      </w:pPr>
+      <w:r>
+        <w:rPr>
+          <w:rFonts w:ascii="Arial" w:hAnsi="Arial" w:eastAsia="PingFang SC" w:cs="Arial"/>
+          <w:lang w:val="zh-CN" w:eastAsia="zh-CN"/>
+        </w:rPr>
+        <w:t xml:space="preserve">当前 workflow 中</w:t>
+      </w:r>
+      <w:r>
+        <w:rPr>
+          <w:rFonts w:ascii="Arial" w:hAnsi="Arial" w:eastAsia="PingFang SC" w:cs="Arial"/>
+          <w:lang w:val="zh-CN" w:eastAsia="zh-CN"/>
+        </w:rPr>
+        <w:t xml:space="preserve"> </w:t>
+      </w:r>
+      <w:r>
+        <w:rPr>
+          <w:rStyle w:val="VerbatimChar"/>
+        </w:rPr>
+        <w:t xml:space="preserve">actions/checkout</w:t>
+      </w:r>
+      <w:r>
+        <w:rPr>
+          <w:rFonts w:ascii="Arial" w:hAnsi="Arial" w:eastAsia="PingFang SC" w:cs="Arial"/>
+          <w:lang w:val="zh-CN" w:eastAsia="zh-CN"/>
+        </w:rPr>
+        <w:t xml:space="preserve"> </w:t>
+      </w:r>
+      <w:r>
+        <w:rPr>
+          <w:rFonts w:ascii="Arial" w:hAnsi="Arial" w:eastAsia="PingFang SC" w:cs="Arial"/>
+          <w:lang w:val="zh-CN" w:eastAsia="zh-CN"/>
+        </w:rPr>
+        <w:t xml:space="preserve">和</w:t>
+      </w:r>
+      <w:r>
+        <w:rPr>
+          <w:rFonts w:ascii="Arial" w:hAnsi="Arial" w:eastAsia="PingFang SC" w:cs="Arial"/>
+          <w:lang w:val="zh-CN" w:eastAsia="zh-CN"/>
+        </w:rPr>
+        <w:t xml:space="preserve"> </w:t>
+      </w:r>
+      <w:r>
+        <w:rPr>
+          <w:rStyle w:val="VerbatimChar"/>
+        </w:rPr>
+        <w:t xml:space="preserve">actions/setup-python</w:t>
+      </w:r>
+      <w:r>
+        <w:rPr>
+          <w:rFonts w:ascii="Arial" w:hAnsi="Arial" w:eastAsia="PingFang SC" w:cs="Arial"/>
+          <w:lang w:val="zh-CN" w:eastAsia="zh-CN"/>
+        </w:rPr>
+        <w:t xml:space="preserve"> </w:t>
+      </w:r>
+      <w:r>
+        <w:rPr>
+          <w:rFonts w:ascii="Arial" w:hAnsi="Arial" w:eastAsia="PingFang SC" w:cs="Arial"/>
+          <w:lang w:val="zh-CN" w:eastAsia="zh-CN"/>
+        </w:rPr>
+        <w:t xml:space="preserve">均固定为官方 release 的完整 commit SHA；更新时必须记录对应 tag 与审核依据。</w:t>
+      </w:r>
+    </w:p>
+    <w:p>
+      <w:pPr>
+        <w:widowControl/>
+        <w:numPr>
+          <w:ilvl w:val="0"/>
+          <w:numId w:val="1020"/>
+        </w:numPr>
+        <w:pStyle w:val="Compact"/>
+      </w:pPr>
+      <w:r>
+        <w:rPr>
+          <w:rStyle w:val="VerbatimChar"/>
+        </w:rPr>
+        <w:t xml:space="preserve">docker-compose.yml</w:t>
+      </w:r>
+      <w:r>
+        <w:rPr>
+          <w:rFonts w:ascii="Arial" w:hAnsi="Arial" w:eastAsia="PingFang SC" w:cs="Arial"/>
+          <w:lang w:val="zh-CN" w:eastAsia="zh-CN"/>
+        </w:rPr>
+        <w:t xml:space="preserve"> </w:t>
+      </w:r>
+      <w:r>
+        <w:rPr>
+          <w:rFonts w:ascii="Arial" w:hAnsi="Arial" w:eastAsia="PingFang SC" w:cs="Arial"/>
+          <w:lang w:val="zh-CN" w:eastAsia="zh-CN"/>
+        </w:rPr>
+        <w:t xml:space="preserve">明确只读模型 bundle、可写 snapshot/output/knowledge volumes、cap drop、no-new-privileges 和健康检查。</w:t>
+      </w:r>
+    </w:p>
+    <w:p>
+      <w:pPr>
+        <w:widowControl/>
+        <w:numPr>
+          <w:ilvl w:val="0"/>
+          <w:numId w:val="1020"/>
+        </w:numPr>
+        <w:pStyle w:val="Compact"/>
+      </w:pPr>
+      <w:r>
+        <w:rPr>
+          <w:rStyle w:val="VerbatimChar"/>
+        </w:rPr>
         <w:t xml:space="preserve">scripts/smoke_test.py</w:t>
       </w:r>
       <w:r>
@@ -22665,7 +24789,61 @@
           <w:rFonts w:ascii="Arial" w:hAnsi="Arial" w:eastAsia="PingFang SC" w:cs="Arial"/>
           <w:lang w:val="zh-CN" w:eastAsia="zh-CN"/>
         </w:rPr>
-        <w:t xml:space="preserve">定义黑盒闭环；无外部资产时只能用</w:t>
+        <w:t xml:space="preserve">定义黑盒闭环，通过</w:t>
+      </w:r>
+      <w:r>
+        <w:rPr>
+          <w:rFonts w:ascii="Arial" w:hAnsi="Arial" w:eastAsia="PingFang SC" w:cs="Arial"/>
+          <w:lang w:val="zh-CN" w:eastAsia="zh-CN"/>
+        </w:rPr>
+        <w:t xml:space="preserve"> </w:t>
+      </w:r>
+      <w:r>
+        <w:rPr>
+          <w:rStyle w:val="VerbatimChar"/>
+        </w:rPr>
+        <w:t xml:space="preserve">--api-key</w:t>
+      </w:r>
+      <w:r>
+        <w:rPr>
+          <w:rFonts w:ascii="Arial" w:hAnsi="Arial" w:eastAsia="PingFang SC" w:cs="Arial"/>
+          <w:lang w:val="zh-CN" w:eastAsia="zh-CN"/>
+        </w:rPr>
+        <w:t xml:space="preserve"> </w:t>
+      </w:r>
+      <w:r>
+        <w:rPr>
+          <w:rFonts w:ascii="Arial" w:hAnsi="Arial" w:eastAsia="PingFang SC" w:cs="Arial"/>
+          <w:lang w:val="zh-CN" w:eastAsia="zh-CN"/>
+        </w:rPr>
+        <w:t xml:space="preserve">或</w:t>
+      </w:r>
+      <w:r>
+        <w:rPr>
+          <w:rFonts w:ascii="Arial" w:hAnsi="Arial" w:eastAsia="PingFang SC" w:cs="Arial"/>
+          <w:lang w:val="zh-CN" w:eastAsia="zh-CN"/>
+        </w:rPr>
+        <w:t xml:space="preserve"> </w:t>
+      </w:r>
+      <w:r>
+        <w:rPr>
+          <w:rStyle w:val="VerbatimChar"/>
+        </w:rPr>
+        <w:t xml:space="preserve">NANOLOOP_API_KEY</w:t>
+      </w:r>
+      <w:r>
+        <w:rPr>
+          <w:rFonts w:ascii="Arial" w:hAnsi="Arial" w:eastAsia="PingFang SC" w:cs="Arial"/>
+          <w:lang w:val="zh-CN" w:eastAsia="zh-CN"/>
+        </w:rPr>
+        <w:t xml:space="preserve"> </w:t>
+      </w:r>
+      <w:r>
+        <w:rPr>
+          <w:rFonts w:ascii="Arial" w:hAnsi="Arial" w:eastAsia="PingFang SC" w:cs="Arial"/>
+          <w:lang w:val="zh-CN" w:eastAsia="zh-CN"/>
+        </w:rPr>
+        <w:t xml:space="preserve">调用受保护 API；无外部资产时只能用</w:t>
       </w:r>
       <w:r>
         <w:rPr>
@@ -23816,7 +25994,7 @@
           <w:rFonts w:ascii="Arial" w:hAnsi="Arial" w:eastAsia="PingFang SC" w:cs="Arial"/>
           <w:lang w:val="zh-CN" w:eastAsia="zh-CN"/>
         </w:rPr>
-        <w:t xml:space="preserve">普通测试不得依赖外网、私有权重、生产语料、API Key 或特定 GPU。</w:t>
+        <w:t xml:space="preserve">普通测试不得依赖外网、私有权重、生产语料、外部注入/生产 API Key 或特定 GPU；安全合同测试使用固定合成 Key。</w:t>
       </w:r>
     </w:p>
     <w:p>
@@ -23943,6 +26121,148 @@
           <w:lang w:val="zh-CN" w:eastAsia="zh-CN"/>
         </w:rPr>
         <w:t xml:space="preserve">、数据库和运行输出。</w:t>
+      </w:r>
+    </w:p>
+    <w:p>
+      <w:pPr>
+        <w:widowControl/>
+        <w:numPr>
+          <w:ilvl w:val="0"/>
+          <w:numId w:val="1021"/>
+        </w:numPr>
+        <w:pStyle w:val="Compact"/>
+      </w:pPr>
+      <w:r>
+        <w:rPr>
+          <w:rFonts w:ascii="Arial" w:hAnsi="Arial" w:eastAsia="PingFang SC" w:cs="Arial"/>
+          <w:lang w:val="zh-CN" w:eastAsia="zh-CN"/>
+        </w:rPr>
+        <w:t xml:space="preserve">第三方 Actions 只能引用审核过的完整 commit SHA；版本 tag 仅作注释，不得退回浮动</w:t>
+      </w:r>
+      <w:r>
+        <w:rPr>
+          <w:rFonts w:ascii="Arial" w:hAnsi="Arial" w:eastAsia="PingFang SC" w:cs="Arial"/>
+          <w:lang w:val="zh-CN" w:eastAsia="zh-CN"/>
+        </w:rPr>
+        <w:t xml:space="preserve"> </w:t>
+      </w:r>
+      <w:r>
+        <w:rPr>
+          <w:rStyle w:val="VerbatimChar"/>
+        </w:rPr>
+        <w:t xml:space="preserve">@vN</w:t>
+      </w:r>
+      <w:r>
+        <w:rPr>
+          <w:rFonts w:ascii="Arial" w:hAnsi="Arial" w:eastAsia="PingFang SC" w:cs="Arial"/>
+          <w:lang w:val="zh-CN" w:eastAsia="zh-CN"/>
+        </w:rPr>
+        <w:t xml:space="preserve">。</w:t>
+      </w:r>
+    </w:p>
+    <w:p>
+      <w:pPr>
+        <w:widowControl/>
+        <w:numPr>
+          <w:ilvl w:val="0"/>
+          <w:numId w:val="1021"/>
+        </w:numPr>
+        <w:pStyle w:val="Compact"/>
+      </w:pPr>
+      <w:r>
+        <w:rPr>
+          <w:rFonts w:ascii="Arial" w:hAnsi="Arial" w:eastAsia="PingFang SC" w:cs="Arial"/>
+          <w:lang w:val="zh-CN" w:eastAsia="zh-CN"/>
+        </w:rPr>
+        <w:t xml:space="preserve">CI 中的 API Key 必须是专用合成值，不复用部署密钥；日志、失败输出和测试 snapshot 不得包含原始秘密。</w:t>
+      </w:r>
+    </w:p>
+    <w:p>
+      <w:pPr>
+        <w:widowControl/>
+        <w:numPr>
+          <w:ilvl w:val="0"/>
+          <w:numId w:val="1021"/>
+        </w:numPr>
+        <w:pStyle w:val="Compact"/>
+      </w:pPr>
+      <w:r>
+        <w:rPr>
+          <w:rFonts w:ascii="Arial" w:hAnsi="Arial" w:eastAsia="PingFang SC" w:cs="Arial"/>
+          <w:lang w:val="zh-CN" w:eastAsia="zh-CN"/>
+        </w:rPr>
+        <w:t xml:space="preserve">OpenAPI 快照必须保留</w:t>
+      </w:r>
+      <w:r>
+        <w:rPr>
+          <w:rFonts w:ascii="Arial" w:hAnsi="Arial" w:eastAsia="PingFang SC" w:cs="Arial"/>
+          <w:lang w:val="zh-CN" w:eastAsia="zh-CN"/>
+        </w:rPr>
+        <w:t xml:space="preserve"> </w:t>
+      </w:r>
+      <w:r>
+        <w:rPr>
+          <w:rStyle w:val="VerbatimChar"/>
+        </w:rPr>
+        <w:t xml:space="preserve">ApiKeyAuth</w:t>
+      </w:r>
+      <w:r>
+        <w:rPr>
+          <w:rFonts w:ascii="Arial" w:hAnsi="Arial" w:eastAsia="PingFang SC" w:cs="Arial"/>
+          <w:lang w:val="zh-CN" w:eastAsia="zh-CN"/>
+        </w:rPr>
+        <w:t xml:space="preserve"> </w:t>
+      </w:r>
+      <w:r>
+        <w:rPr>
+          <w:rFonts w:ascii="Arial" w:hAnsi="Arial" w:eastAsia="PingFang SC" w:cs="Arial"/>
+          <w:lang w:val="zh-CN" w:eastAsia="zh-CN"/>
+        </w:rPr>
+        <w:t xml:space="preserve">header scheme、全部版本化 operation 的 security requirement 以及 401/403/429 错误响应。</w:t>
+      </w:r>
+    </w:p>
+    <w:p>
+      <w:pPr>
+        <w:widowControl/>
+        <w:numPr>
+          <w:ilvl w:val="0"/>
+          <w:numId w:val="1021"/>
+        </w:numPr>
+        <w:pStyle w:val="Compact"/>
+      </w:pPr>
+      <w:r>
+        <w:rPr>
+          <w:rFonts w:ascii="Arial" w:hAnsi="Arial" w:eastAsia="PingFang SC" w:cs="Arial"/>
+          <w:lang w:val="zh-CN" w:eastAsia="zh-CN"/>
+        </w:rPr>
+        <w:t xml:space="preserve">容器 CI 不得只用 localhost 分别验进程；至少一个请求必须从前端容器通过服务 DNS 携 Key 到达受保护 API，并保持精确</w:t>
+      </w:r>
+      <w:r>
+        <w:rPr>
+          <w:rFonts w:ascii="Arial" w:hAnsi="Arial" w:eastAsia="PingFang SC" w:cs="Arial"/>
+          <w:lang w:val="zh-CN" w:eastAsia="zh-CN"/>
+        </w:rPr>
+        <w:t xml:space="preserve"> </w:t>
+      </w:r>
+      <w:r>
+        <w:rPr>
+          <w:rStyle w:val="VerbatimChar"/>
+        </w:rPr>
+        <w:t xml:space="preserve">TRUSTED_HOSTS</w:t>
+      </w:r>
+      <w:r>
+        <w:rPr>
+          <w:rFonts w:ascii="Arial" w:hAnsi="Arial" w:eastAsia="PingFang SC" w:cs="Arial"/>
+          <w:lang w:val="zh-CN" w:eastAsia="zh-CN"/>
+        </w:rPr>
+        <w:t xml:space="preserve"> </w:t>
+      </w:r>
+      <w:r>
+        <w:rPr>
+          <w:rFonts w:ascii="Arial" w:hAnsi="Arial" w:eastAsia="PingFang SC" w:cs="Arial"/>
+          <w:lang w:val="zh-CN" w:eastAsia="zh-CN"/>
+        </w:rPr>
+        <w:t xml:space="preserve">而非 wildcard。</w:t>
       </w:r>
     </w:p>
     <w:bookmarkEnd w:id="88"/>
@@ -24139,7 +26459,7 @@
                 <w:sz w:val="17"/>
                 <w:lang w:val="zh-CN" w:eastAsia="zh-CN"/>
               </w:rPr>
-              <w:t xml:space="preserve">建立首次可追溯 GitHub 基线并按批次同步</w:t>
+              <w:t xml:space="preserve">持续维护 GitHub 发布门禁与可追溯批次</w:t>
             </w:r>
           </w:p>
         </w:tc>
@@ -24167,7 +26487,7 @@
                 <w:sz w:val="17"/>
                 <w:lang w:val="zh-CN" w:eastAsia="zh-CN"/>
               </w:rPr>
-              <w:t xml:space="preserve">分支、提交、Draft PR、CI 链接和变更摘要完整</w:t>
+              <w:t xml:space="preserve">短分支、提交、Draft PR、必需 CI、回滚信息和变更摘要完整</w:t>
             </w:r>
           </w:p>
         </w:tc>
@@ -24406,7 +26726,7 @@
                 <w:sz w:val="17"/>
                 <w:lang w:val="zh-CN" w:eastAsia="zh-CN"/>
               </w:rPr>
-              <w:t xml:space="preserve">启动并健康检查前端 CI 容器</w:t>
+              <w:t xml:space="preserve">把已有跨容器 health 扩展为业务请求/安全头 E2E</w:t>
             </w:r>
           </w:p>
         </w:tc>
@@ -24434,40 +26754,7 @@
                 <w:sz w:val="17"/>
                 <w:lang w:val="zh-CN" w:eastAsia="zh-CN"/>
               </w:rPr>
-              <w:t xml:space="preserve">当前 CI 只构建前端镜像；新增非 root、只读根和</w:t>
-            </w:r>
-            <w:r>
-              <w:rPr>
-                <w:rFonts w:ascii="Arial" w:hAnsi="Arial" w:eastAsia="PingFang SC" w:cs="Arial"/>
-                <w:sz w:val="17"/>
-                <w:lang w:val="zh-CN" w:eastAsia="zh-CN"/>
-              </w:rPr>
-              <w:t xml:space="preserve"> </w:t>
-            </w:r>
-            <w:r>
-              <w:rPr>
-                <w:rStyle w:val="VerbatimChar"/>
-                <w:rFonts w:ascii="Arial" w:hAnsi="Arial" w:eastAsia="PingFang SC" w:cs="Arial"/>
-                <w:sz w:val="17"/>
-                <w:lang w:val="zh-CN" w:eastAsia="zh-CN"/>
-              </w:rPr>
-              <w:t xml:space="preserve">/health</w:t>
-            </w:r>
-            <w:r>
-              <w:rPr>
-                <w:rFonts w:ascii="Arial" w:hAnsi="Arial" w:eastAsia="PingFang SC" w:cs="Arial"/>
-                <w:sz w:val="17"/>
-                <w:lang w:val="zh-CN" w:eastAsia="zh-CN"/>
-              </w:rPr>
-              <w:t xml:space="preserve"> </w:t>
-            </w:r>
-            <w:r>
-              <w:rPr>
-                <w:rFonts w:ascii="Arial" w:hAnsi="Arial" w:eastAsia="PingFang SC" w:cs="Arial"/>
-                <w:sz w:val="17"/>
-                <w:lang w:val="zh-CN" w:eastAsia="zh-CN"/>
-              </w:rPr>
-              <w:t xml:space="preserve">运行证据</w:t>
+              <w:t xml:space="preserve">在已验证 DNS/Host/Key 基础上，覆盖 Streamlit 实际 client、上传、读状态、签名下载和 CORS/限流响应头；可使用可授权固定 fixture</w:t>
             </w:r>
           </w:p>
         </w:tc>
@@ -24645,7 +26932,7 @@
                 <w:sz w:val="17"/>
                 <w:lang w:val="zh-CN" w:eastAsia="zh-CN"/>
               </w:rPr>
-              <w:t xml:space="preserve">constraints/lock、基础镜像 digest、Actions commit SHA 与更新流程明确</w:t>
+              <w:t xml:space="preserve">constraints/lock、基础镜像 digest、已固定 Actions 的更新流程明确</w:t>
             </w:r>
           </w:p>
         </w:tc>
@@ -25261,6 +27548,42 @@
       </w:pPr>
       <w:r>
         <w:rPr>
+          <w:rStyle w:val="VariableTok"/>
+          <w:rFonts w:ascii="Menlo" w:hAnsi="Menlo" w:eastAsia="PingFang SC" w:cs="Menlo"/>
+          <w:sz w:val="16"/>
+          <w:lang w:val="zh-CN" w:eastAsia="zh-CN"/>
+        </w:rPr>
+        <w:t xml:space="preserve">NANOLOOP_API_KEY</w:t>
+      </w:r>
+      <w:r>
+        <w:rPr>
+          <w:rStyle w:val="OperatorTok"/>
+          <w:rFonts w:ascii="Menlo" w:hAnsi="Menlo" w:eastAsia="PingFang SC" w:cs="Menlo"/>
+          <w:sz w:val="16"/>
+          <w:lang w:val="zh-CN" w:eastAsia="zh-CN"/>
+        </w:rPr>
+        <w:t xml:space="preserve">=</w:t>
+      </w:r>
+      <w:r>
+        <w:rPr>
+          <w:rStyle w:val="StringTok"/>
+          <w:rFonts w:ascii="Menlo" w:hAnsi="Menlo" w:eastAsia="PingFang SC" w:cs="Menlo"/>
+          <w:sz w:val="16"/>
+          <w:lang w:val="zh-CN" w:eastAsia="zh-CN"/>
+        </w:rPr>
+        <w:t xml:space="preserve">'&lt;deployment-key&gt;'</w:t>
+      </w:r>
+      <w:r>
+        <w:rPr>
+          <w:rStyle w:val="NormalTok"/>
+          <w:rFonts w:ascii="Menlo" w:hAnsi="Menlo" w:eastAsia="PingFang SC" w:cs="Menlo"/>
+          <w:sz w:val="16"/>
+          <w:lang w:val="zh-CN" w:eastAsia="zh-CN"/>
+        </w:rPr>
+        <w:t xml:space="preserve"> </w:t>
+      </w:r>
+      <w:r>
+        <w:rPr>
           <w:rStyle w:val="ExtensionTok"/>
           <w:rFonts w:ascii="Menlo" w:hAnsi="Menlo" w:eastAsia="PingFang SC" w:cs="Menlo"/>
           <w:sz w:val="16"/>
@@ -25369,6 +27692,32 @@
     <w:p>
       <w:pPr>
         <w:pStyle w:val="FirstParagraph"/>
+        <w:widowControl/>
+      </w:pPr>
+      <w:r>
+        <w:rPr>
+          <w:rStyle w:val="VerbatimChar"/>
+        </w:rPr>
+        <w:t xml:space="preserve">--api-key</w:t>
+      </w:r>
+      <w:r>
+        <w:rPr>
+          <w:rFonts w:ascii="Arial" w:hAnsi="Arial" w:eastAsia="PingFang SC" w:cs="Arial"/>
+          <w:lang w:val="zh-CN" w:eastAsia="zh-CN"/>
+        </w:rPr>
+        <w:t xml:space="preserve"> </w:t>
+      </w:r>
+      <w:r>
+        <w:rPr>
+          <w:rFonts w:ascii="Arial" w:hAnsi="Arial" w:eastAsia="PingFang SC" w:cs="Arial"/>
+          <w:lang w:val="zh-CN" w:eastAsia="zh-CN"/>
+        </w:rPr>
+        <w:t xml:space="preserve">可显式覆盖环境值；CI 和文档不得使用真实部署 Key 作示例。</w:t>
+      </w:r>
+    </w:p>
+    <w:p>
+      <w:pPr>
+        <w:pStyle w:val="BodyText"/>
         <w:widowControl/>
       </w:pPr>
       <w:r>
@@ -26521,7 +28870,7 @@
           <w:rFonts w:ascii="Arial" w:hAnsi="Arial" w:eastAsia="PingFang SC" w:cs="Arial"/>
           <w:lang w:val="zh-CN" w:eastAsia="zh-CN"/>
         </w:rPr>
-        <w:t xml:space="preserve">所有路径均位于</w:t>
+        <w:t xml:space="preserve">所有版本化路径均位于</w:t>
       </w:r>
       <w:r>
         <w:rPr>
@@ -26541,12 +28890,59 @@
           <w:rFonts w:ascii="Arial" w:hAnsi="Arial" w:eastAsia="PingFang SC" w:cs="Arial"/>
           <w:lang w:val="zh-CN" w:eastAsia="zh-CN"/>
         </w:rPr>
-        <w:t xml:space="preserve">；</w:t>
+        <w:t xml:space="preserve">，并在 OpenAPI 声明 header 型</w:t>
+      </w:r>
+      <w:r>
+        <w:rPr>
+          <w:rFonts w:ascii="Arial" w:hAnsi="Arial" w:eastAsia="PingFang SC" w:cs="Arial"/>
+          <w:lang w:val="zh-CN" w:eastAsia="zh-CN"/>
+        </w:rPr>
+        <w:t xml:space="preserve"> </w:t>
       </w:r>
       <w:r>
         <w:rPr>
           <w:rStyle w:val="VerbatimChar"/>
         </w:rPr>
+        <w:t xml:space="preserve">ApiKeyAuth</w:t>
+      </w:r>
+      <w:r>
+        <w:rPr>
+          <w:rFonts w:ascii="Arial" w:hAnsi="Arial" w:eastAsia="PingFang SC" w:cs="Arial"/>
+          <w:lang w:val="zh-CN" w:eastAsia="zh-CN"/>
+        </w:rPr>
+        <w:t xml:space="preserve">。只有配置</w:t>
+      </w:r>
+      <w:r>
+        <w:rPr>
+          <w:rFonts w:ascii="Arial" w:hAnsi="Arial" w:eastAsia="PingFang SC" w:cs="Arial"/>
+          <w:lang w:val="zh-CN" w:eastAsia="zh-CN"/>
+        </w:rPr>
+        <w:t xml:space="preserve"> </w:t>
+      </w:r>
+      <w:r>
+        <w:rPr>
+          <w:rStyle w:val="VerbatimChar"/>
+        </w:rPr>
+        <w:t xml:space="preserve">NANOLOOP_API_KEY</w:t>
+      </w:r>
+      <w:r>
+        <w:rPr>
+          <w:rFonts w:ascii="Arial" w:hAnsi="Arial" w:eastAsia="PingFang SC" w:cs="Arial"/>
+          <w:lang w:val="zh-CN" w:eastAsia="zh-CN"/>
+        </w:rPr>
+        <w:t xml:space="preserve"> </w:t>
+      </w:r>
+      <w:r>
+        <w:rPr>
+          <w:rFonts w:ascii="Arial" w:hAnsi="Arial" w:eastAsia="PingFang SC" w:cs="Arial"/>
+          <w:lang w:val="zh-CN" w:eastAsia="zh-CN"/>
+        </w:rPr>
+        <w:t xml:space="preserve">时才执行共享 Key；没配置时保持本地开发兼容。</w:t>
+      </w:r>
+      <w:r>
+        <w:rPr>
+          <w:rStyle w:val="VerbatimChar"/>
+        </w:rPr>
         <w:t xml:space="preserve">GET /health</w:t>
       </w:r>
       <w:r>
@@ -26561,7 +28957,82 @@
           <w:rFonts w:ascii="Arial" w:hAnsi="Arial" w:eastAsia="PingFang SC" w:cs="Arial"/>
           <w:lang w:val="zh-CN" w:eastAsia="zh-CN"/>
         </w:rPr>
-        <w:t xml:space="preserve">还提供无前缀兼容入口。</w:t>
+        <w:t xml:space="preserve">是精确公开的无前缀</w:t>
+      </w:r>
+      <w:r>
+        <w:rPr>
+          <w:rFonts w:ascii="Arial" w:hAnsi="Arial" w:eastAsia="PingFang SC" w:cs="Arial"/>
+          <w:lang w:val="zh-CN" w:eastAsia="zh-CN"/>
+        </w:rPr>
+        <w:t xml:space="preserve"> </w:t>
+      </w:r>
+      <w:r>
+        <w:rPr>
+          <w:rFonts w:ascii="Arial" w:hAnsi="Arial" w:eastAsia="PingFang SC" w:cs="Arial"/>
+          <w:lang w:val="zh-CN" w:eastAsia="zh-CN"/>
+        </w:rPr>
+        <w:t xml:space="preserve">容器健康入口，而表中</w:t>
+      </w:r>
+      <w:r>
+        <w:rPr>
+          <w:rFonts w:ascii="Arial" w:hAnsi="Arial" w:eastAsia="PingFang SC" w:cs="Arial"/>
+          <w:lang w:val="zh-CN" w:eastAsia="zh-CN"/>
+        </w:rPr>
+        <w:t xml:space="preserve"> </w:t>
+      </w:r>
+      <w:r>
+        <w:rPr>
+          <w:rStyle w:val="VerbatimChar"/>
+        </w:rPr>
+        <w:t xml:space="preserve">/api/v1/health</w:t>
+      </w:r>
+      <w:r>
+        <w:rPr>
+          <w:rFonts w:ascii="Arial" w:hAnsi="Arial" w:eastAsia="PingFang SC" w:cs="Arial"/>
+          <w:lang w:val="zh-CN" w:eastAsia="zh-CN"/>
+        </w:rPr>
+        <w:t xml:space="preserve"> </w:t>
+      </w:r>
+      <w:r>
+        <w:rPr>
+          <w:rFonts w:ascii="Arial" w:hAnsi="Arial" w:eastAsia="PingFang SC" w:cs="Arial"/>
+          <w:lang w:val="zh-CN" w:eastAsia="zh-CN"/>
+        </w:rPr>
+        <w:t xml:space="preserve">在 Key 启用时需要</w:t>
+      </w:r>
+      <w:r>
+        <w:rPr>
+          <w:rFonts w:ascii="Arial" w:hAnsi="Arial" w:eastAsia="PingFang SC" w:cs="Arial"/>
+          <w:lang w:val="zh-CN" w:eastAsia="zh-CN"/>
+        </w:rPr>
+        <w:t xml:space="preserve"> </w:t>
+      </w:r>
+      <w:r>
+        <w:rPr>
+          <w:rStyle w:val="VerbatimChar"/>
+        </w:rPr>
+        <w:t xml:space="preserve">X-API-Key</w:t>
+      </w:r>
+      <w:r>
+        <w:rPr>
+          <w:rFonts w:ascii="Arial" w:hAnsi="Arial" w:eastAsia="PingFang SC" w:cs="Arial"/>
+          <w:lang w:val="zh-CN" w:eastAsia="zh-CN"/>
+        </w:rPr>
+        <w:t xml:space="preserve">。OpenAPI/Swagger/ReDoc 路径同样</w:t>
+      </w:r>
+      <w:r>
+        <w:rPr>
+          <w:rFonts w:ascii="Arial" w:hAnsi="Arial" w:eastAsia="PingFang SC" w:cs="Arial"/>
+          <w:lang w:val="zh-CN" w:eastAsia="zh-CN"/>
+        </w:rPr>
+        <w:t xml:space="preserve"> </w:t>
+      </w:r>
+      <w:r>
+        <w:rPr>
+          <w:rFonts w:ascii="Arial" w:hAnsi="Arial" w:eastAsia="PingFang SC" w:cs="Arial"/>
+          <w:lang w:val="zh-CN" w:eastAsia="zh-CN"/>
+        </w:rPr>
+        <w:t xml:space="preserve">精确公开；签名文件 URL 仍需 Key，token 不替代部署认证。</w:t>
       </w:r>
     </w:p>
     <w:tbl>
@@ -28991,6 +31462,39 @@
         <w:rPr>
           <w:rStyle w:val="VerbatimChar"/>
         </w:rPr>
+        <w:t xml:space="preserve">AUTHENTICATION_REQUIRED</w:t>
+      </w:r>
+      <w:r>
+        <w:rPr>
+          <w:rFonts w:ascii="Arial" w:hAnsi="Arial" w:eastAsia="PingFang SC" w:cs="Arial"/>
+          <w:lang w:val="zh-CN" w:eastAsia="zh-CN"/>
+        </w:rPr>
+        <w:t xml:space="preserve">、</w:t>
+      </w:r>
+      <w:r>
+        <w:rPr>
+          <w:rStyle w:val="VerbatimChar"/>
+        </w:rPr>
+        <w:t xml:space="preserve">RATE_LIMITED</w:t>
+      </w:r>
+      <w:r>
+        <w:rPr>
+          <w:rFonts w:ascii="Arial" w:hAnsi="Arial" w:eastAsia="PingFang SC" w:cs="Arial"/>
+          <w:lang w:val="zh-CN" w:eastAsia="zh-CN"/>
+        </w:rPr>
+        <w:t xml:space="preserve">、</w:t>
+      </w:r>
+      <w:r>
+        <w:rPr>
+          <w:rFonts w:ascii="Arial" w:hAnsi="Arial" w:eastAsia="PingFang SC" w:cs="Arial"/>
+          <w:lang w:val="zh-CN" w:eastAsia="zh-CN"/>
+        </w:rPr>
+        <w:t xml:space="preserve"> </w:t>
+      </w:r>
+      <w:r>
+        <w:rPr>
+          <w:rStyle w:val="VerbatimChar"/>
+        </w:rPr>
         <w:t xml:space="preserve">INPUT_ARTIFACT_MISMATCH</w:t>
       </w:r>
       <w:r>
@@ -29209,7 +31713,148 @@
           <w:rFonts w:ascii="Arial" w:hAnsi="Arial" w:eastAsia="PingFang SC" w:cs="Arial"/>
           <w:lang w:val="zh-CN" w:eastAsia="zh-CN"/>
         </w:rPr>
-        <w:t xml:space="preserve">。证据不足通常是 HTTP 200 的业务结果，不应误当传输异常。</w:t>
+        <w:t xml:space="preserve">。</w:t>
+      </w:r>
+      <w:r>
+        <w:rPr>
+          <w:rStyle w:val="VerbatimChar"/>
+        </w:rPr>
+        <w:t xml:space="preserve">AUTHENTICATION_REQUIRED</w:t>
+      </w:r>
+      <w:r>
+        <w:rPr>
+          <w:rFonts w:ascii="Arial" w:hAnsi="Arial" w:eastAsia="PingFang SC" w:cs="Arial"/>
+          <w:lang w:val="zh-CN" w:eastAsia="zh-CN"/>
+        </w:rPr>
+        <w:t xml:space="preserve"> </w:t>
+      </w:r>
+      <w:r>
+        <w:rPr>
+          <w:rFonts w:ascii="Arial" w:hAnsi="Arial" w:eastAsia="PingFang SC" w:cs="Arial"/>
+          <w:lang w:val="zh-CN" w:eastAsia="zh-CN"/>
+        </w:rPr>
+        <w:t xml:space="preserve">使用 HTTP 401 与</w:t>
+      </w:r>
+      <w:r>
+        <w:rPr>
+          <w:rFonts w:ascii="Arial" w:hAnsi="Arial" w:eastAsia="PingFang SC" w:cs="Arial"/>
+          <w:lang w:val="zh-CN" w:eastAsia="zh-CN"/>
+        </w:rPr>
+        <w:t xml:space="preserve"> </w:t>
+      </w:r>
+      <w:r>
+        <w:rPr>
+          <w:rStyle w:val="VerbatimChar"/>
+        </w:rPr>
+        <w:t xml:space="preserve">WWW-Authenticate</w:t>
+      </w:r>
+      <w:r>
+        <w:rPr>
+          <w:rFonts w:ascii="Arial" w:hAnsi="Arial" w:eastAsia="PingFang SC" w:cs="Arial"/>
+          <w:lang w:val="zh-CN" w:eastAsia="zh-CN"/>
+        </w:rPr>
+        <w:t xml:space="preserve">；</w:t>
+      </w:r>
+      <w:r>
+        <w:rPr>
+          <w:rFonts w:ascii="Arial" w:hAnsi="Arial" w:eastAsia="PingFang SC" w:cs="Arial"/>
+          <w:lang w:val="zh-CN" w:eastAsia="zh-CN"/>
+        </w:rPr>
+        <w:t xml:space="preserve"> </w:t>
+      </w:r>
+      <w:r>
+        <w:rPr>
+          <w:rStyle w:val="VerbatimChar"/>
+        </w:rPr>
+        <w:t xml:space="preserve">RATE_LIMITED</w:t>
+      </w:r>
+      <w:r>
+        <w:rPr>
+          <w:rFonts w:ascii="Arial" w:hAnsi="Arial" w:eastAsia="PingFang SC" w:cs="Arial"/>
+          <w:lang w:val="zh-CN" w:eastAsia="zh-CN"/>
+        </w:rPr>
+        <w:t xml:space="preserve"> </w:t>
+      </w:r>
+      <w:r>
+        <w:rPr>
+          <w:rFonts w:ascii="Arial" w:hAnsi="Arial" w:eastAsia="PingFang SC" w:cs="Arial"/>
+          <w:lang w:val="zh-CN" w:eastAsia="zh-CN"/>
+        </w:rPr>
+        <w:t xml:space="preserve">使用 HTTP 429、</w:t>
+      </w:r>
+      <w:r>
+        <w:rPr>
+          <w:rStyle w:val="VerbatimChar"/>
+        </w:rPr>
+        <w:t xml:space="preserve">retryable=true</w:t>
+      </w:r>
+      <w:r>
+        <w:rPr>
+          <w:rFonts w:ascii="Arial" w:hAnsi="Arial" w:eastAsia="PingFang SC" w:cs="Arial"/>
+          <w:lang w:val="zh-CN" w:eastAsia="zh-CN"/>
+        </w:rPr>
+        <w:t xml:space="preserve">、</w:t>
+      </w:r>
+      <w:r>
+        <w:rPr>
+          <w:rStyle w:val="VerbatimChar"/>
+        </w:rPr>
+        <w:t xml:space="preserve">Retry-After</w:t>
+      </w:r>
+      <w:r>
+        <w:rPr>
+          <w:rFonts w:ascii="Arial" w:hAnsi="Arial" w:eastAsia="PingFang SC" w:cs="Arial"/>
+          <w:lang w:val="zh-CN" w:eastAsia="zh-CN"/>
+        </w:rPr>
+        <w:t xml:space="preserve"> </w:t>
+      </w:r>
+      <w:r>
+        <w:rPr>
+          <w:rFonts w:ascii="Arial" w:hAnsi="Arial" w:eastAsia="PingFang SC" w:cs="Arial"/>
+          <w:lang w:val="zh-CN" w:eastAsia="zh-CN"/>
+        </w:rPr>
+        <w:t xml:space="preserve">与</w:t>
+      </w:r>
+      <w:r>
+        <w:rPr>
+          <w:rFonts w:ascii="Arial" w:hAnsi="Arial" w:eastAsia="PingFang SC" w:cs="Arial"/>
+          <w:lang w:val="zh-CN" w:eastAsia="zh-CN"/>
+        </w:rPr>
+        <w:t xml:space="preserve"> </w:t>
+      </w:r>
+      <w:r>
+        <w:rPr>
+          <w:rStyle w:val="VerbatimChar"/>
+        </w:rPr>
+        <w:t xml:space="preserve">X-RateLimit-*</w:t>
+      </w:r>
+      <w:r>
+        <w:rPr>
+          <w:rFonts w:ascii="Arial" w:hAnsi="Arial" w:eastAsia="PingFang SC" w:cs="Arial"/>
+          <w:lang w:val="zh-CN" w:eastAsia="zh-CN"/>
+        </w:rPr>
+        <w:t xml:space="preserve"> </w:t>
+      </w:r>
+      <w:r>
+        <w:rPr>
+          <w:rFonts w:ascii="Arial" w:hAnsi="Arial" w:eastAsia="PingFang SC" w:cs="Arial"/>
+          <w:lang w:val="zh-CN" w:eastAsia="zh-CN"/>
+        </w:rPr>
+        <w:t xml:space="preserve">头。证据不足</w:t>
+      </w:r>
+      <w:r>
+        <w:rPr>
+          <w:rFonts w:ascii="Arial" w:hAnsi="Arial" w:eastAsia="PingFang SC" w:cs="Arial"/>
+          <w:lang w:val="zh-CN" w:eastAsia="zh-CN"/>
+        </w:rPr>
+        <w:t xml:space="preserve"> </w:t>
+      </w:r>
+      <w:r>
+        <w:rPr>
+          <w:rFonts w:ascii="Arial" w:hAnsi="Arial" w:eastAsia="PingFang SC" w:cs="Arial"/>
+          <w:lang w:val="zh-CN" w:eastAsia="zh-CN"/>
+        </w:rPr>
+        <w:t xml:space="preserve">通常是 HTTP 200 的业务结果，不应误当传输异常。</w:t>
       </w:r>
     </w:p>
     <w:bookmarkEnd w:id="97"/>
@@ -32052,7 +34697,24 @@
                 <w:sz w:val="17"/>
                 <w:lang w:val="zh-CN" w:eastAsia="zh-CN"/>
               </w:rPr>
-              <w:t xml:space="preserve">local/test hosts</w:t>
+              <w:t xml:space="preserve">local/test hosts；Compose 追加</w:t>
+            </w:r>
+            <w:r>
+              <w:rPr>
+                <w:rFonts w:ascii="Arial" w:hAnsi="Arial" w:eastAsia="PingFang SC" w:cs="Arial"/>
+                <w:sz w:val="17"/>
+                <w:lang w:val="zh-CN" w:eastAsia="zh-CN"/>
+              </w:rPr>
+              <w:t xml:space="preserve"> </w:t>
+            </w:r>
+            <w:r>
+              <w:rPr>
+                <w:rStyle w:val="VerbatimChar"/>
+                <w:rFonts w:ascii="Arial" w:hAnsi="Arial" w:eastAsia="PingFang SC" w:cs="Arial"/>
+                <w:sz w:val="17"/>
+                <w:lang w:val="zh-CN" w:eastAsia="zh-CN"/>
+              </w:rPr>
+              <w:t xml:space="preserve">api</w:t>
             </w:r>
           </w:p>
         </w:tc>
@@ -32108,7 +34770,7 @@
                 <w:sz w:val="17"/>
                 <w:lang w:val="zh-CN" w:eastAsia="zh-CN"/>
               </w:rPr>
-              <w:t xml:space="preserve">显式 Host allowlist</w:t>
+              <w:t xml:space="preserve">显式 Host allowlist；内部服务 DNS 名也必须精确列出</w:t>
             </w:r>
           </w:p>
         </w:tc>
@@ -32227,6 +34889,572 @@
                 <w:lang w:val="zh-CN" w:eastAsia="zh-CN"/>
               </w:rPr>
               <w:t xml:space="preserve">浏览器写请求允许 origin</w:t>
+            </w:r>
+          </w:p>
+        </w:tc>
+      </w:tr>
+      <w:tr>
+        <w:trPr>
+          <w:cantSplit w:val="true"/>
+        </w:trPr>
+        <w:tc>
+          <w:tcPr>
+            <w:tcW w:w="2450" w:type="dxa"/>
+            <w:vAlign w:val="center"/>
+            <w:tcMar>
+              <w:top w:w="80" w:type="dxa"/>
+              <w:start w:w="120" w:type="dxa"/>
+              <w:bottom w:w="80" w:type="dxa"/>
+              <w:end w:w="120" w:type="dxa"/>
+            </w:tcMar>
+          </w:tcPr>
+          <w:p>
+            <w:pPr>
+              <w:pStyle w:val="NanoLoopTable"/>
+              <w:keepNext w:val="0"/>
+              <w:keepLines w:val="0"/>
+              <w:jc w:val="left"/>
+            </w:pPr>
+            <w:r>
+              <w:rPr>
+                <w:rStyle w:val="VerbatimChar"/>
+                <w:rFonts w:ascii="Arial" w:hAnsi="Arial" w:eastAsia="PingFang SC" w:cs="Arial"/>
+                <w:sz w:val="17"/>
+                <w:lang w:val="zh-CN" w:eastAsia="zh-CN"/>
+              </w:rPr>
+              <w:t xml:space="preserve">NANOLOOP_API_KEY</w:t>
+            </w:r>
+          </w:p>
+        </w:tc>
+        <w:tc>
+          <w:tcPr>
+            <w:tcW w:w="1550" w:type="dxa"/>
+            <w:vAlign w:val="center"/>
+            <w:tcMar>
+              <w:top w:w="80" w:type="dxa"/>
+              <w:start w:w="120" w:type="dxa"/>
+              <w:bottom w:w="80" w:type="dxa"/>
+              <w:end w:w="120" w:type="dxa"/>
+            </w:tcMar>
+          </w:tcPr>
+          <w:p>
+            <w:pPr>
+              <w:pStyle w:val="NanoLoopTable"/>
+              <w:keepNext w:val="0"/>
+              <w:keepLines w:val="0"/>
+              <w:jc w:val="left"/>
+            </w:pPr>
+            <w:r>
+              <w:rPr>
+                <w:rFonts w:ascii="Arial" w:hAnsi="Arial" w:eastAsia="PingFang SC" w:cs="Arial"/>
+                <w:sz w:val="17"/>
+                <w:lang w:val="zh-CN" w:eastAsia="zh-CN"/>
+              </w:rPr>
+              <w:t xml:space="preserve">空（关闭）</w:t>
+            </w:r>
+          </w:p>
+        </w:tc>
+        <w:tc>
+          <w:tcPr>
+            <w:tcW w:w="900" w:type="dxa"/>
+            <w:vAlign w:val="center"/>
+            <w:tcMar>
+              <w:top w:w="80" w:type="dxa"/>
+              <w:start w:w="120" w:type="dxa"/>
+              <w:bottom w:w="80" w:type="dxa"/>
+              <w:end w:w="120" w:type="dxa"/>
+            </w:tcMar>
+          </w:tcPr>
+          <w:p>
+            <w:pPr>
+              <w:pStyle w:val="NanoLoopTable"/>
+              <w:keepNext w:val="0"/>
+              <w:keepLines w:val="0"/>
+              <w:jc w:val="left"/>
+            </w:pPr>
+            <w:r>
+              <w:rPr>
+                <w:rFonts w:ascii="Arial" w:hAnsi="Arial" w:eastAsia="PingFang SC" w:cs="Arial"/>
+                <w:sz w:val="17"/>
+                <w:lang w:val="zh-CN" w:eastAsia="zh-CN"/>
+              </w:rPr>
+              <w:t xml:space="preserve">C/E/F</w:t>
+            </w:r>
+          </w:p>
+        </w:tc>
+        <w:tc>
+          <w:tcPr>
+            <w:tcW w:w="4460" w:type="dxa"/>
+            <w:vAlign w:val="center"/>
+            <w:tcMar>
+              <w:top w:w="80" w:type="dxa"/>
+              <w:start w:w="120" w:type="dxa"/>
+              <w:bottom w:w="80" w:type="dxa"/>
+              <w:end w:w="120" w:type="dxa"/>
+            </w:tcMar>
+          </w:tcPr>
+          <w:p>
+            <w:pPr>
+              <w:pStyle w:val="NanoLoopTable"/>
+              <w:keepNext w:val="0"/>
+              <w:keepLines w:val="0"/>
+              <w:jc w:val="left"/>
+            </w:pPr>
+            <w:r>
+              <w:rPr>
+                <w:rFonts w:ascii="Arial" w:hAnsi="Arial" w:eastAsia="PingFang SC" w:cs="Arial"/>
+                <w:sz w:val="17"/>
+                <w:lang w:val="zh-CN" w:eastAsia="zh-CN"/>
+              </w:rPr>
+              <w:t xml:space="preserve">可选共享部署 Key；32～128 位 URL-safe 字符，只在 TLS 后使用</w:t>
+            </w:r>
+          </w:p>
+        </w:tc>
+      </w:tr>
+      <w:tr>
+        <w:trPr>
+          <w:cantSplit w:val="true"/>
+        </w:trPr>
+        <w:tc>
+          <w:tcPr>
+            <w:tcW w:w="2450" w:type="dxa"/>
+            <w:vAlign w:val="center"/>
+            <w:tcMar>
+              <w:top w:w="80" w:type="dxa"/>
+              <w:start w:w="120" w:type="dxa"/>
+              <w:bottom w:w="80" w:type="dxa"/>
+              <w:end w:w="120" w:type="dxa"/>
+            </w:tcMar>
+          </w:tcPr>
+          <w:p>
+            <w:pPr>
+              <w:pStyle w:val="NanoLoopTable"/>
+              <w:keepNext w:val="0"/>
+              <w:keepLines w:val="0"/>
+              <w:jc w:val="left"/>
+            </w:pPr>
+            <w:r>
+              <w:rPr>
+                <w:rStyle w:val="VerbatimChar"/>
+                <w:rFonts w:ascii="Arial" w:hAnsi="Arial" w:eastAsia="PingFang SC" w:cs="Arial"/>
+                <w:sz w:val="17"/>
+                <w:lang w:val="zh-CN" w:eastAsia="zh-CN"/>
+              </w:rPr>
+              <w:t xml:space="preserve">NANOLOOP_API_BASE_URL</w:t>
+            </w:r>
+          </w:p>
+        </w:tc>
+        <w:tc>
+          <w:tcPr>
+            <w:tcW w:w="1550" w:type="dxa"/>
+            <w:vAlign w:val="center"/>
+            <w:tcMar>
+              <w:top w:w="80" w:type="dxa"/>
+              <w:start w:w="120" w:type="dxa"/>
+              <w:bottom w:w="80" w:type="dxa"/>
+              <w:end w:w="120" w:type="dxa"/>
+            </w:tcMar>
+          </w:tcPr>
+          <w:p>
+            <w:pPr>
+              <w:pStyle w:val="NanoLoopTable"/>
+              <w:keepNext w:val="0"/>
+              <w:keepLines w:val="0"/>
+              <w:jc w:val="left"/>
+            </w:pPr>
+            <w:r>
+              <w:rPr>
+                <w:rStyle w:val="VerbatimChar"/>
+                <w:rFonts w:ascii="Arial" w:hAnsi="Arial" w:eastAsia="PingFang SC" w:cs="Arial"/>
+                <w:sz w:val="17"/>
+                <w:lang w:val="zh-CN" w:eastAsia="zh-CN"/>
+              </w:rPr>
+              <w:t xml:space="preserve">http://127.0.0.1:8000</w:t>
+            </w:r>
+            <w:r>
+              <w:rPr>
+                <w:rFonts w:ascii="Arial" w:hAnsi="Arial" w:eastAsia="PingFang SC" w:cs="Arial"/>
+                <w:sz w:val="17"/>
+                <w:lang w:val="zh-CN" w:eastAsia="zh-CN"/>
+              </w:rPr>
+              <w:t xml:space="preserve">；Compose</w:t>
+            </w:r>
+            <w:r>
+              <w:rPr>
+                <w:rFonts w:ascii="Arial" w:hAnsi="Arial" w:eastAsia="PingFang SC" w:cs="Arial"/>
+                <w:sz w:val="17"/>
+                <w:lang w:val="zh-CN" w:eastAsia="zh-CN"/>
+              </w:rPr>
+              <w:t xml:space="preserve"> </w:t>
+            </w:r>
+            <w:r>
+              <w:rPr>
+                <w:rStyle w:val="VerbatimChar"/>
+                <w:rFonts w:ascii="Arial" w:hAnsi="Arial" w:eastAsia="PingFang SC" w:cs="Arial"/>
+                <w:sz w:val="17"/>
+                <w:lang w:val="zh-CN" w:eastAsia="zh-CN"/>
+              </w:rPr>
+              <w:t xml:space="preserve">http://api:8000</w:t>
+            </w:r>
+          </w:p>
+        </w:tc>
+        <w:tc>
+          <w:tcPr>
+            <w:tcW w:w="900" w:type="dxa"/>
+            <w:vAlign w:val="center"/>
+            <w:tcMar>
+              <w:top w:w="80" w:type="dxa"/>
+              <w:start w:w="120" w:type="dxa"/>
+              <w:bottom w:w="80" w:type="dxa"/>
+              <w:end w:w="120" w:type="dxa"/>
+            </w:tcMar>
+          </w:tcPr>
+          <w:p>
+            <w:pPr>
+              <w:pStyle w:val="NanoLoopTable"/>
+              <w:keepNext w:val="0"/>
+              <w:keepLines w:val="0"/>
+              <w:jc w:val="left"/>
+            </w:pPr>
+            <w:r>
+              <w:rPr>
+                <w:rFonts w:ascii="Arial" w:hAnsi="Arial" w:eastAsia="PingFang SC" w:cs="Arial"/>
+                <w:sz w:val="17"/>
+                <w:lang w:val="zh-CN" w:eastAsia="zh-CN"/>
+              </w:rPr>
+              <w:t xml:space="preserve">E/F</w:t>
+            </w:r>
+          </w:p>
+        </w:tc>
+        <w:tc>
+          <w:tcPr>
+            <w:tcW w:w="4460" w:type="dxa"/>
+            <w:vAlign w:val="center"/>
+            <w:tcMar>
+              <w:top w:w="80" w:type="dxa"/>
+              <w:start w:w="120" w:type="dxa"/>
+              <w:bottom w:w="80" w:type="dxa"/>
+              <w:end w:w="120" w:type="dxa"/>
+            </w:tcMar>
+          </w:tcPr>
+          <w:p>
+            <w:pPr>
+              <w:pStyle w:val="NanoLoopTable"/>
+              <w:keepNext w:val="0"/>
+              <w:keepLines w:val="0"/>
+              <w:jc w:val="left"/>
+            </w:pPr>
+            <w:r>
+              <w:rPr>
+                <w:rFonts w:ascii="Arial" w:hAnsi="Arial" w:eastAsia="PingFang SC" w:cs="Arial"/>
+                <w:sz w:val="17"/>
+                <w:lang w:val="zh-CN" w:eastAsia="zh-CN"/>
+              </w:rPr>
+              <w:t xml:space="preserve">Streamlit 后端目标；配置共享 Key 时是不可被 session 改写的运维锁定值</w:t>
+            </w:r>
+          </w:p>
+        </w:tc>
+      </w:tr>
+      <w:tr>
+        <w:trPr>
+          <w:cantSplit w:val="true"/>
+        </w:trPr>
+        <w:tc>
+          <w:tcPr>
+            <w:tcW w:w="2450" w:type="dxa"/>
+            <w:vAlign w:val="center"/>
+            <w:tcMar>
+              <w:top w:w="80" w:type="dxa"/>
+              <w:start w:w="120" w:type="dxa"/>
+              <w:bottom w:w="80" w:type="dxa"/>
+              <w:end w:w="120" w:type="dxa"/>
+            </w:tcMar>
+          </w:tcPr>
+          <w:p>
+            <w:pPr>
+              <w:pStyle w:val="NanoLoopTable"/>
+              <w:keepNext w:val="0"/>
+              <w:keepLines w:val="0"/>
+              <w:jc w:val="left"/>
+            </w:pPr>
+            <w:r>
+              <w:rPr>
+                <w:rStyle w:val="VerbatimChar"/>
+                <w:rFonts w:ascii="Arial" w:hAnsi="Arial" w:eastAsia="PingFang SC" w:cs="Arial"/>
+                <w:sz w:val="17"/>
+                <w:lang w:val="zh-CN" w:eastAsia="zh-CN"/>
+              </w:rPr>
+              <w:t xml:space="preserve">API_RATE_LIMIT_REQUESTS</w:t>
+            </w:r>
+          </w:p>
+        </w:tc>
+        <w:tc>
+          <w:tcPr>
+            <w:tcW w:w="1550" w:type="dxa"/>
+            <w:vAlign w:val="center"/>
+            <w:tcMar>
+              <w:top w:w="80" w:type="dxa"/>
+              <w:start w:w="120" w:type="dxa"/>
+              <w:bottom w:w="80" w:type="dxa"/>
+              <w:end w:w="120" w:type="dxa"/>
+            </w:tcMar>
+          </w:tcPr>
+          <w:p>
+            <w:pPr>
+              <w:pStyle w:val="NanoLoopTable"/>
+              <w:keepNext w:val="0"/>
+              <w:keepLines w:val="0"/>
+              <w:jc w:val="left"/>
+            </w:pPr>
+            <w:r>
+              <w:rPr>
+                <w:rFonts w:ascii="Arial" w:hAnsi="Arial" w:eastAsia="PingFang SC" w:cs="Arial"/>
+                <w:sz w:val="17"/>
+                <w:lang w:val="zh-CN" w:eastAsia="zh-CN"/>
+              </w:rPr>
+              <w:t xml:space="preserve">Settings</w:t>
+            </w:r>
+            <w:r>
+              <w:rPr>
+                <w:rFonts w:ascii="Arial" w:hAnsi="Arial" w:eastAsia="PingFang SC" w:cs="Arial"/>
+                <w:sz w:val="17"/>
+                <w:lang w:val="zh-CN" w:eastAsia="zh-CN"/>
+              </w:rPr>
+              <w:t xml:space="preserve"> </w:t>
+            </w:r>
+            <w:r>
+              <w:rPr>
+                <w:rStyle w:val="VerbatimChar"/>
+                <w:rFonts w:ascii="Arial" w:hAnsi="Arial" w:eastAsia="PingFang SC" w:cs="Arial"/>
+                <w:sz w:val="17"/>
+                <w:lang w:val="zh-CN" w:eastAsia="zh-CN"/>
+              </w:rPr>
+              <w:t xml:space="preserve">0</w:t>
+            </w:r>
+            <w:r>
+              <w:rPr>
+                <w:rFonts w:ascii="Arial" w:hAnsi="Arial" w:eastAsia="PingFang SC" w:cs="Arial"/>
+                <w:sz w:val="17"/>
+                <w:lang w:val="zh-CN" w:eastAsia="zh-CN"/>
+              </w:rPr>
+              <w:t xml:space="preserve">；Compose</w:t>
+            </w:r>
+            <w:r>
+              <w:rPr>
+                <w:rFonts w:ascii="Arial" w:hAnsi="Arial" w:eastAsia="PingFang SC" w:cs="Arial"/>
+                <w:sz w:val="17"/>
+                <w:lang w:val="zh-CN" w:eastAsia="zh-CN"/>
+              </w:rPr>
+              <w:t xml:space="preserve"> </w:t>
+            </w:r>
+            <w:r>
+              <w:rPr>
+                <w:rStyle w:val="VerbatimChar"/>
+                <w:rFonts w:ascii="Arial" w:hAnsi="Arial" w:eastAsia="PingFang SC" w:cs="Arial"/>
+                <w:sz w:val="17"/>
+                <w:lang w:val="zh-CN" w:eastAsia="zh-CN"/>
+              </w:rPr>
+              <w:t xml:space="preserve">120</w:t>
+            </w:r>
+          </w:p>
+        </w:tc>
+        <w:tc>
+          <w:tcPr>
+            <w:tcW w:w="900" w:type="dxa"/>
+            <w:vAlign w:val="center"/>
+            <w:tcMar>
+              <w:top w:w="80" w:type="dxa"/>
+              <w:start w:w="120" w:type="dxa"/>
+              <w:bottom w:w="80" w:type="dxa"/>
+              <w:end w:w="120" w:type="dxa"/>
+            </w:tcMar>
+          </w:tcPr>
+          <w:p>
+            <w:pPr>
+              <w:pStyle w:val="NanoLoopTable"/>
+              <w:keepNext w:val="0"/>
+              <w:keepLines w:val="0"/>
+              <w:jc w:val="left"/>
+            </w:pPr>
+            <w:r>
+              <w:rPr>
+                <w:rFonts w:ascii="Arial" w:hAnsi="Arial" w:eastAsia="PingFang SC" w:cs="Arial"/>
+                <w:sz w:val="17"/>
+                <w:lang w:val="zh-CN" w:eastAsia="zh-CN"/>
+              </w:rPr>
+              <w:t xml:space="preserve">C/F</w:t>
+            </w:r>
+          </w:p>
+        </w:tc>
+        <w:tc>
+          <w:tcPr>
+            <w:tcW w:w="4460" w:type="dxa"/>
+            <w:vAlign w:val="center"/>
+            <w:tcMar>
+              <w:top w:w="80" w:type="dxa"/>
+              <w:start w:w="120" w:type="dxa"/>
+              <w:bottom w:w="80" w:type="dxa"/>
+              <w:end w:w="120" w:type="dxa"/>
+            </w:tcMar>
+          </w:tcPr>
+          <w:p>
+            <w:pPr>
+              <w:pStyle w:val="NanoLoopTable"/>
+              <w:keepNext w:val="0"/>
+              <w:keepLines w:val="0"/>
+              <w:jc w:val="left"/>
+            </w:pPr>
+            <w:r>
+              <w:rPr>
+                <w:rFonts w:ascii="Arial" w:hAnsi="Arial" w:eastAsia="PingFang SC" w:cs="Arial"/>
+                <w:sz w:val="17"/>
+                <w:lang w:val="zh-CN" w:eastAsia="zh-CN"/>
+              </w:rPr>
+              <w:t xml:space="preserve">每个固定类别桶的容量；与下一项共同决定连续补充速率，</w:t>
+            </w:r>
+            <w:r>
+              <w:rPr>
+                <w:rStyle w:val="VerbatimChar"/>
+                <w:rFonts w:ascii="Arial" w:hAnsi="Arial" w:eastAsia="PingFang SC" w:cs="Arial"/>
+                <w:sz w:val="17"/>
+                <w:lang w:val="zh-CN" w:eastAsia="zh-CN"/>
+              </w:rPr>
+              <w:t xml:space="preserve">0</w:t>
+            </w:r>
+            <w:r>
+              <w:rPr>
+                <w:rFonts w:ascii="Arial" w:hAnsi="Arial" w:eastAsia="PingFang SC" w:cs="Arial"/>
+                <w:sz w:val="17"/>
+                <w:lang w:val="zh-CN" w:eastAsia="zh-CN"/>
+              </w:rPr>
+              <w:t xml:space="preserve"> </w:t>
+            </w:r>
+            <w:r>
+              <w:rPr>
+                <w:rFonts w:ascii="Arial" w:hAnsi="Arial" w:eastAsia="PingFang SC" w:cs="Arial"/>
+                <w:sz w:val="17"/>
+                <w:lang w:val="zh-CN" w:eastAsia="zh-CN"/>
+              </w:rPr>
+              <w:t xml:space="preserve">关闭</w:t>
+            </w:r>
+          </w:p>
+        </w:tc>
+      </w:tr>
+      <w:tr>
+        <w:trPr>
+          <w:cantSplit w:val="true"/>
+        </w:trPr>
+        <w:tc>
+          <w:tcPr>
+            <w:tcW w:w="2450" w:type="dxa"/>
+            <w:vAlign w:val="center"/>
+            <w:tcMar>
+              <w:top w:w="80" w:type="dxa"/>
+              <w:start w:w="120" w:type="dxa"/>
+              <w:bottom w:w="80" w:type="dxa"/>
+              <w:end w:w="120" w:type="dxa"/>
+            </w:tcMar>
+          </w:tcPr>
+          <w:p>
+            <w:pPr>
+              <w:pStyle w:val="NanoLoopTable"/>
+              <w:keepNext w:val="0"/>
+              <w:keepLines w:val="0"/>
+              <w:jc w:val="left"/>
+            </w:pPr>
+            <w:r>
+              <w:rPr>
+                <w:rStyle w:val="VerbatimChar"/>
+                <w:rFonts w:ascii="Arial" w:hAnsi="Arial" w:eastAsia="PingFang SC" w:cs="Arial"/>
+                <w:sz w:val="17"/>
+                <w:lang w:val="zh-CN" w:eastAsia="zh-CN"/>
+              </w:rPr>
+              <w:t xml:space="preserve">API_RATE_LIMIT_WINDOW_SECONDS</w:t>
+            </w:r>
+          </w:p>
+        </w:tc>
+        <w:tc>
+          <w:tcPr>
+            <w:tcW w:w="1550" w:type="dxa"/>
+            <w:vAlign w:val="center"/>
+            <w:tcMar>
+              <w:top w:w="80" w:type="dxa"/>
+              <w:start w:w="120" w:type="dxa"/>
+              <w:bottom w:w="80" w:type="dxa"/>
+              <w:end w:w="120" w:type="dxa"/>
+            </w:tcMar>
+          </w:tcPr>
+          <w:p>
+            <w:pPr>
+              <w:pStyle w:val="NanoLoopTable"/>
+              <w:keepNext w:val="0"/>
+              <w:keepLines w:val="0"/>
+              <w:jc w:val="left"/>
+            </w:pPr>
+            <w:r>
+              <w:rPr>
+                <w:rStyle w:val="VerbatimChar"/>
+                <w:rFonts w:ascii="Arial" w:hAnsi="Arial" w:eastAsia="PingFang SC" w:cs="Arial"/>
+                <w:sz w:val="17"/>
+                <w:lang w:val="zh-CN" w:eastAsia="zh-CN"/>
+              </w:rPr>
+              <w:t xml:space="preserve">60</w:t>
+            </w:r>
+          </w:p>
+        </w:tc>
+        <w:tc>
+          <w:tcPr>
+            <w:tcW w:w="900" w:type="dxa"/>
+            <w:vAlign w:val="center"/>
+            <w:tcMar>
+              <w:top w:w="80" w:type="dxa"/>
+              <w:start w:w="120" w:type="dxa"/>
+              <w:bottom w:w="80" w:type="dxa"/>
+              <w:end w:w="120" w:type="dxa"/>
+            </w:tcMar>
+          </w:tcPr>
+          <w:p>
+            <w:pPr>
+              <w:pStyle w:val="NanoLoopTable"/>
+              <w:keepNext w:val="0"/>
+              <w:keepLines w:val="0"/>
+              <w:jc w:val="left"/>
+            </w:pPr>
+            <w:r>
+              <w:rPr>
+                <w:rFonts w:ascii="Arial" w:hAnsi="Arial" w:eastAsia="PingFang SC" w:cs="Arial"/>
+                <w:sz w:val="17"/>
+                <w:lang w:val="zh-CN" w:eastAsia="zh-CN"/>
+              </w:rPr>
+              <w:t xml:space="preserve">C/F</w:t>
+            </w:r>
+          </w:p>
+        </w:tc>
+        <w:tc>
+          <w:tcPr>
+            <w:tcW w:w="4460" w:type="dxa"/>
+            <w:vAlign w:val="center"/>
+            <w:tcMar>
+              <w:top w:w="80" w:type="dxa"/>
+              <w:start w:w="120" w:type="dxa"/>
+              <w:bottom w:w="80" w:type="dxa"/>
+              <w:end w:w="120" w:type="dxa"/>
+            </w:tcMar>
+          </w:tcPr>
+          <w:p>
+            <w:pPr>
+              <w:pStyle w:val="NanoLoopTable"/>
+              <w:keepNext w:val="0"/>
+              <w:keepLines w:val="0"/>
+              <w:jc w:val="left"/>
+            </w:pPr>
+            <w:r>
+              <w:rPr>
+                <w:rFonts w:ascii="Arial" w:hAnsi="Arial" w:eastAsia="PingFang SC" w:cs="Arial"/>
+                <w:sz w:val="17"/>
+                <w:lang w:val="zh-CN" w:eastAsia="zh-CN"/>
+              </w:rPr>
+              <w:t xml:space="preserve">token bucket 从空到满的补充时长；进程内生效，不在副本间共享</w:t>
             </w:r>
           </w:p>
         </w:tc>
@@ -32998,7 +36226,7 @@
                 <w:sz w:val="17"/>
                 <w:lang w:val="zh-CN" w:eastAsia="zh-CN"/>
               </w:rPr>
-              <w:t xml:space="preserve">迁移</w:t>
+              <w:t xml:space="preserve">API 安全</w:t>
             </w:r>
           </w:p>
         </w:tc>
@@ -33027,7 +36255,7 @@
                 <w:sz w:val="17"/>
                 <w:lang w:val="zh-CN" w:eastAsia="zh-CN"/>
               </w:rPr>
-              <w:t xml:space="preserve">PYTHON_BIN=.venv/bin/python ./scripts/check_migrations.sh</w:t>
+              <w:t xml:space="preserve">.venv/bin/pytest -q tests/unit/core/test_security.py tests/unit/core/test_rate_limit.py tests/unit/api/test_middleware.py tests/unit/frontend/test_api_client.py tests/integration/api_contract</w:t>
             </w:r>
           </w:p>
         </w:tc>
@@ -33055,7 +36283,7 @@
                 <w:sz w:val="17"/>
                 <w:lang w:val="zh-CN" w:eastAsia="zh-CN"/>
               </w:rPr>
-              <w:t xml:space="preserve">upgrade/downgrade/upgrade 与 drift 为零</w:t>
+              <w:t xml:space="preserve">Key 成败/目标绑定、CORS 预检、三桶隔离、429 头和 OpenAPI security 均符合合同</w:t>
             </w:r>
           </w:p>
         </w:tc>
@@ -33088,6 +36316,96 @@
                 <w:sz w:val="17"/>
                 <w:lang w:val="zh-CN" w:eastAsia="zh-CN"/>
               </w:rPr>
+              <w:t xml:space="preserve">迁移</w:t>
+            </w:r>
+          </w:p>
+        </w:tc>
+        <w:tc>
+          <w:tcPr>
+            <w:tcW w:w="2850" w:type="dxa"/>
+            <w:vAlign w:val="center"/>
+            <w:tcMar>
+              <w:top w:w="80" w:type="dxa"/>
+              <w:start w:w="120" w:type="dxa"/>
+              <w:bottom w:w="80" w:type="dxa"/>
+              <w:end w:w="120" w:type="dxa"/>
+            </w:tcMar>
+          </w:tcPr>
+          <w:p>
+            <w:pPr>
+              <w:pStyle w:val="NanoLoopTable"/>
+              <w:keepNext w:val="0"/>
+              <w:keepLines w:val="0"/>
+              <w:jc w:val="left"/>
+            </w:pPr>
+            <w:r>
+              <w:rPr>
+                <w:rStyle w:val="VerbatimChar"/>
+                <w:rFonts w:ascii="Arial" w:hAnsi="Arial" w:eastAsia="PingFang SC" w:cs="Arial"/>
+                <w:sz w:val="17"/>
+                <w:lang w:val="zh-CN" w:eastAsia="zh-CN"/>
+              </w:rPr>
+              <w:t xml:space="preserve">PYTHON_BIN=.venv/bin/python ./scripts/check_migrations.sh</w:t>
+            </w:r>
+          </w:p>
+        </w:tc>
+        <w:tc>
+          <w:tcPr>
+            <w:tcW w:w="5060" w:type="dxa"/>
+            <w:vAlign w:val="center"/>
+            <w:tcMar>
+              <w:top w:w="80" w:type="dxa"/>
+              <w:start w:w="120" w:type="dxa"/>
+              <w:bottom w:w="80" w:type="dxa"/>
+              <w:end w:w="120" w:type="dxa"/>
+            </w:tcMar>
+          </w:tcPr>
+          <w:p>
+            <w:pPr>
+              <w:pStyle w:val="NanoLoopTable"/>
+              <w:keepNext w:val="0"/>
+              <w:keepLines w:val="0"/>
+              <w:jc w:val="left"/>
+            </w:pPr>
+            <w:r>
+              <w:rPr>
+                <w:rFonts w:ascii="Arial" w:hAnsi="Arial" w:eastAsia="PingFang SC" w:cs="Arial"/>
+                <w:sz w:val="17"/>
+                <w:lang w:val="zh-CN" w:eastAsia="zh-CN"/>
+              </w:rPr>
+              <w:t xml:space="preserve">upgrade/downgrade/upgrade 与 drift 为零</w:t>
+            </w:r>
+          </w:p>
+        </w:tc>
+      </w:tr>
+      <w:tr>
+        <w:trPr>
+          <w:cantSplit w:val="true"/>
+        </w:trPr>
+        <w:tc>
+          <w:tcPr>
+            <w:tcW w:w="1450" w:type="dxa"/>
+            <w:vAlign w:val="center"/>
+            <w:tcMar>
+              <w:top w:w="80" w:type="dxa"/>
+              <w:start w:w="120" w:type="dxa"/>
+              <w:bottom w:w="80" w:type="dxa"/>
+              <w:end w:w="120" w:type="dxa"/>
+            </w:tcMar>
+          </w:tcPr>
+          <w:p>
+            <w:pPr>
+              <w:pStyle w:val="NanoLoopTable"/>
+              <w:keepNext w:val="0"/>
+              <w:keepLines w:val="0"/>
+              <w:jc w:val="left"/>
+            </w:pPr>
+            <w:r>
+              <w:rPr>
+                <w:rFonts w:ascii="Arial" w:hAnsi="Arial" w:eastAsia="PingFang SC" w:cs="Arial"/>
+                <w:sz w:val="17"/>
+                <w:lang w:val="zh-CN" w:eastAsia="zh-CN"/>
+              </w:rPr>
               <w:t xml:space="preserve">Compose</w:t>
             </w:r>
           </w:p>
@@ -33146,6 +36464,145 @@
                 <w:lang w:val="zh-CN" w:eastAsia="zh-CN"/>
               </w:rPr>
               <w:t xml:space="preserve">配置可解析且变量合同一致</w:t>
+            </w:r>
+          </w:p>
+        </w:tc>
+      </w:tr>
+      <w:tr>
+        <w:trPr>
+          <w:cantSplit w:val="true"/>
+        </w:trPr>
+        <w:tc>
+          <w:tcPr>
+            <w:tcW w:w="1450" w:type="dxa"/>
+            <w:vAlign w:val="center"/>
+            <w:tcMar>
+              <w:top w:w="80" w:type="dxa"/>
+              <w:start w:w="120" w:type="dxa"/>
+              <w:bottom w:w="80" w:type="dxa"/>
+              <w:end w:w="120" w:type="dxa"/>
+            </w:tcMar>
+          </w:tcPr>
+          <w:p>
+            <w:pPr>
+              <w:pStyle w:val="NanoLoopTable"/>
+              <w:keepNext w:val="0"/>
+              <w:keepLines w:val="0"/>
+              <w:jc w:val="left"/>
+            </w:pPr>
+            <w:r>
+              <w:rPr>
+                <w:rFonts w:ascii="Arial" w:hAnsi="Arial" w:eastAsia="PingFang SC" w:cs="Arial"/>
+                <w:sz w:val="17"/>
+                <w:lang w:val="zh-CN" w:eastAsia="zh-CN"/>
+              </w:rPr>
+              <w:t xml:space="preserve">容器 CI</w:t>
+            </w:r>
+          </w:p>
+        </w:tc>
+        <w:tc>
+          <w:tcPr>
+            <w:tcW w:w="2850" w:type="dxa"/>
+            <w:vAlign w:val="center"/>
+            <w:tcMar>
+              <w:top w:w="80" w:type="dxa"/>
+              <w:start w:w="120" w:type="dxa"/>
+              <w:bottom w:w="80" w:type="dxa"/>
+              <w:end w:w="120" w:type="dxa"/>
+            </w:tcMar>
+          </w:tcPr>
+          <w:p>
+            <w:pPr>
+              <w:pStyle w:val="NanoLoopTable"/>
+              <w:keepNext w:val="0"/>
+              <w:keepLines w:val="0"/>
+              <w:jc w:val="left"/>
+            </w:pPr>
+            <w:r>
+              <w:rPr>
+                <w:rFonts w:ascii="Arial" w:hAnsi="Arial" w:eastAsia="PingFang SC" w:cs="Arial"/>
+                <w:sz w:val="17"/>
+                <w:lang w:val="zh-CN" w:eastAsia="zh-CN"/>
+              </w:rPr>
+              <w:t xml:space="preserve">GitHub</w:t>
+            </w:r>
+            <w:r>
+              <w:rPr>
+                <w:rFonts w:ascii="Arial" w:hAnsi="Arial" w:eastAsia="PingFang SC" w:cs="Arial"/>
+                <w:sz w:val="17"/>
+                <w:lang w:val="zh-CN" w:eastAsia="zh-CN"/>
+              </w:rPr>
+              <w:t xml:space="preserve"> </w:t>
+            </w:r>
+            <w:r>
+              <w:rPr>
+                <w:rStyle w:val="VerbatimChar"/>
+                <w:rFonts w:ascii="Arial" w:hAnsi="Arial" w:eastAsia="PingFang SC" w:cs="Arial"/>
+                <w:sz w:val="17"/>
+                <w:lang w:val="zh-CN" w:eastAsia="zh-CN"/>
+              </w:rPr>
+              <w:t xml:space="preserve">CPU container smoke test</w:t>
+            </w:r>
+          </w:p>
+        </w:tc>
+        <w:tc>
+          <w:tcPr>
+            <w:tcW w:w="5060" w:type="dxa"/>
+            <w:vAlign w:val="center"/>
+            <w:tcMar>
+              <w:top w:w="80" w:type="dxa"/>
+              <w:start w:w="120" w:type="dxa"/>
+              <w:bottom w:w="80" w:type="dxa"/>
+              <w:end w:w="120" w:type="dxa"/>
+            </w:tcMar>
+          </w:tcPr>
+          <w:p>
+            <w:pPr>
+              <w:pStyle w:val="NanoLoopTable"/>
+              <w:keepNext w:val="0"/>
+              <w:keepLines w:val="0"/>
+              <w:jc w:val="left"/>
+            </w:pPr>
+            <w:r>
+              <w:rPr>
+                <w:rFonts w:ascii="Arial" w:hAnsi="Arial" w:eastAsia="PingFang SC" w:cs="Arial"/>
+                <w:sz w:val="17"/>
+                <w:lang w:val="zh-CN" w:eastAsia="zh-CN"/>
+              </w:rPr>
+              <w:t xml:space="preserve">API/前端以非 root、只读根启动；前端容器在隔离网络经</w:t>
+            </w:r>
+            <w:r>
+              <w:rPr>
+                <w:rFonts w:ascii="Arial" w:hAnsi="Arial" w:eastAsia="PingFang SC" w:cs="Arial"/>
+                <w:sz w:val="17"/>
+                <w:lang w:val="zh-CN" w:eastAsia="zh-CN"/>
+              </w:rPr>
+              <w:t xml:space="preserve"> </w:t>
+            </w:r>
+            <w:r>
+              <w:rPr>
+                <w:rStyle w:val="VerbatimChar"/>
+                <w:rFonts w:ascii="Arial" w:hAnsi="Arial" w:eastAsia="PingFang SC" w:cs="Arial"/>
+                <w:sz w:val="17"/>
+                <w:lang w:val="zh-CN" w:eastAsia="zh-CN"/>
+              </w:rPr>
+              <w:t xml:space="preserve">api</w:t>
+            </w:r>
+            <w:r>
+              <w:rPr>
+                <w:rFonts w:ascii="Arial" w:hAnsi="Arial" w:eastAsia="PingFang SC" w:cs="Arial"/>
+                <w:sz w:val="17"/>
+                <w:lang w:val="zh-CN" w:eastAsia="zh-CN"/>
+              </w:rPr>
+              <w:t xml:space="preserve"> </w:t>
+            </w:r>
+            <w:r>
+              <w:rPr>
+                <w:rFonts w:ascii="Arial" w:hAnsi="Arial" w:eastAsia="PingFang SC" w:cs="Arial"/>
+                <w:sz w:val="17"/>
+                <w:lang w:val="zh-CN" w:eastAsia="zh-CN"/>
+              </w:rPr>
+              <w:t xml:space="preserve">DNS/Host 携测试 Key 访问版本化 health</w:t>
             </w:r>
           </w:p>
         </w:tc>
@@ -33174,7 +36631,7 @@
           <w:rFonts w:ascii="Arial" w:hAnsi="Arial" w:eastAsia="PingFang SC" w:cs="Arial"/>
           <w:lang w:val="zh-CN" w:eastAsia="zh-CN"/>
         </w:rPr>
-        <w:t xml:space="preserve">已聚合前六项中的本地代码门禁。</w:t>
+        <w:t xml:space="preserve">已聚合代码质量、类型、OpenAPI、全量 Pytest、前端与迁移门禁；API 安全用例包含在全量 Pytest 中。Compose 和容器运行证据需另行执行。</w:t>
       </w:r>
     </w:p>
     <w:bookmarkEnd w:id="105"/>
@@ -34990,10 +38447,6 @@
     </w:sectPr>
   </w:body>
 </w:document>
-</file>
-
-<file path=word/comments.xml><?xml version="1.0" encoding="utf-8"?>
-<w:comments xmlns:w="http://schemas.openxmlformats.org/wordprocessingml/2006/main" xmlns:m="http://schemas.openxmlformats.org/officeDocument/2006/math" xmlns:r="http://schemas.openxmlformats.org/officeDocument/2006/relationships" xmlns:o="urn:schemas-microsoft-com:office:office" xmlns:v="urn:schemas-microsoft-com:vml" xmlns:w10="urn:schemas-microsoft-com:office:word" xmlns:a="http://schemas.openxmlformats.org/drawingml/2006/main" xmlns:pic="http://schemas.openxmlformats.org/drawingml/2006/picture" xmlns:wp="http://schemas.openxmlformats.org/drawingml/2006/wordprocessingDrawing"/>
 </file>
 
 <file path=word/footer1.xml><?xml version="1.0" encoding="utf-8"?>

</xml_diff>

<commit_message>
feat: add shared API guardrails (#1)
</commit_message>
<xml_diff>
--- a/docs/NanoLoop_Agent_协同开发规格与接口总文档_v3.0.docx
+++ b/docs/NanoLoop_Agent_协同开发规格与接口总文档_v3.0.docx
@@ -493,7 +493,7 @@
                 <w:sz w:val="17"/>
                 <w:lang w:val="zh-CN" w:eastAsia="zh-CN"/>
               </w:rPr>
-              <w:t xml:space="preserve">d3cc934fcd1ec999996f549c91a557979e7f33407d5838be19d2f61d6d70b8c5</w:t>
+              <w:t xml:space="preserve">2b46e1238fc0e4b51d270a880d54d08b835a31d24b4cf1efeae7ccd7f5764493</w:t>
             </w:r>
           </w:p>
         </w:tc>
@@ -616,7 +616,7 @@
                 <w:sz w:val="17"/>
                 <w:lang w:val="zh-CN" w:eastAsia="zh-CN"/>
               </w:rPr>
-              <w:t xml:space="preserve">Ruff、严格 Mypy、OpenAPI、396 项 Pytest、6 页 Streamlit 启动、Alembic 往返与漂移检查均通过</w:t>
+              <w:t xml:space="preserve">Ruff、严格 Mypy、OpenAPI、435 项 Pytest、6 页 Streamlit 启动、Alembic 往返与漂移检查均通过</w:t>
             </w:r>
           </w:p>
         </w:tc>
@@ -1616,7 +1616,7 @@
                 <w:sz w:val="17"/>
                 <w:lang w:val="zh-CN" w:eastAsia="zh-CN"/>
               </w:rPr>
-              <w:t xml:space="preserve">认证、配额、保留策略与多实例演进</w:t>
+              <w:t xml:space="preserve">用户/租户授权、配额、备份与多实例演进</w:t>
             </w:r>
           </w:p>
         </w:tc>
@@ -2793,7 +2793,7 @@
           <w:rFonts w:ascii="Arial" w:hAnsi="Arial" w:eastAsia="PingFang SC" w:cs="Arial"/>
           <w:lang w:val="zh-CN" w:eastAsia="zh-CN"/>
         </w:rPr>
-        <w:t xml:space="preserve">并增加 Host/Origin、请求体、multipart、图像/PDF/RAG 规模和确定性证据上限。开发者不得把这些</w:t>
+        <w:t xml:space="preserve">并增加 Host/Origin、可选共享</w:t>
       </w:r>
       <w:r>
         <w:rPr>
@@ -2804,10 +2804,92 @@
       </w:r>
       <w:r>
         <w:rPr>
-          <w:rFonts w:ascii="Arial" w:hAnsi="Arial" w:eastAsia="PingFang SC" w:cs="Arial"/>
-          <w:lang w:val="zh-CN" w:eastAsia="zh-CN"/>
-        </w:rPr>
-        <w:t xml:space="preserve">已经落地的保护降回 v2 的简化示例。</w:t>
+          <w:rStyle w:val="VerbatimChar"/>
+        </w:rPr>
+        <w:t xml:space="preserve">X-API-Key</w:t>
+      </w:r>
+      <w:r>
+        <w:rPr>
+          <w:rFonts w:ascii="Arial" w:hAnsi="Arial" w:eastAsia="PingFang SC" w:cs="Arial"/>
+          <w:lang w:val="zh-CN" w:eastAsia="zh-CN"/>
+        </w:rPr>
+        <w:t xml:space="preserve">、单进程固定三桶限流、请求体、multipart、</w:t>
+      </w:r>
+      <w:r>
+        <w:rPr>
+          <w:rFonts w:ascii="Arial" w:hAnsi="Arial" w:eastAsia="PingFang SC" w:cs="Arial"/>
+          <w:lang w:val="zh-CN" w:eastAsia="zh-CN"/>
+        </w:rPr>
+        <w:t xml:space="preserve"> </w:t>
+      </w:r>
+      <w:r>
+        <w:rPr>
+          <w:rFonts w:ascii="Arial" w:hAnsi="Arial" w:eastAsia="PingFang SC" w:cs="Arial"/>
+          <w:lang w:val="zh-CN" w:eastAsia="zh-CN"/>
+        </w:rPr>
+        <w:t xml:space="preserve">图像/PDF/RAG 规模和确定性证据上限。OpenAPI、前端 client、smoke、Compose 和 CI 已同步这一部署</w:t>
+      </w:r>
+      <w:r>
+        <w:rPr>
+          <w:rFonts w:ascii="Arial" w:hAnsi="Arial" w:eastAsia="PingFang SC" w:cs="Arial"/>
+          <w:lang w:val="zh-CN" w:eastAsia="zh-CN"/>
+        </w:rPr>
+        <w:t xml:space="preserve"> </w:t>
+      </w:r>
+      <w:r>
+        <w:rPr>
+          <w:rFonts w:ascii="Arial" w:hAnsi="Arial" w:eastAsia="PingFang SC" w:cs="Arial"/>
+          <w:lang w:val="zh-CN" w:eastAsia="zh-CN"/>
+        </w:rPr>
+        <w:t xml:space="preserve">合同；共享 Key 启用时，Streamlit 还会把 API 目标锁定到运维配置的</w:t>
+      </w:r>
+      <w:r>
+        <w:rPr>
+          <w:rFonts w:ascii="Arial" w:hAnsi="Arial" w:eastAsia="PingFang SC" w:cs="Arial"/>
+          <w:lang w:val="zh-CN" w:eastAsia="zh-CN"/>
+        </w:rPr>
+        <w:t xml:space="preserve"> </w:t>
+      </w:r>
+      <w:r>
+        <w:rPr>
+          <w:rStyle w:val="VerbatimChar"/>
+        </w:rPr>
+        <w:t xml:space="preserve">NANOLOOP_API_BASE_URL</w:t>
+      </w:r>
+      <w:r>
+        <w:rPr>
+          <w:rFonts w:ascii="Arial" w:hAnsi="Arial" w:eastAsia="PingFang SC" w:cs="Arial"/>
+          <w:lang w:val="zh-CN" w:eastAsia="zh-CN"/>
+        </w:rPr>
+        <w:t xml:space="preserve">。GitHub CI</w:t>
+      </w:r>
+      <w:r>
+        <w:rPr>
+          <w:rFonts w:ascii="Arial" w:hAnsi="Arial" w:eastAsia="PingFang SC" w:cs="Arial"/>
+          <w:lang w:val="zh-CN" w:eastAsia="zh-CN"/>
+        </w:rPr>
+        <w:t xml:space="preserve"> </w:t>
+      </w:r>
+      <w:r>
+        <w:rPr>
+          <w:rFonts w:ascii="Arial" w:hAnsi="Arial" w:eastAsia="PingFang SC" w:cs="Arial"/>
+          <w:lang w:val="zh-CN" w:eastAsia="zh-CN"/>
+        </w:rPr>
+        <w:t xml:space="preserve">构建 API 与前端容器，再置于同一隔离网络验证 DNS/Host/Key 跨容器链路；官方 Actions 引用已固定到 commit SHA。</w:t>
+      </w:r>
+      <w:r>
+        <w:rPr>
+          <w:rFonts w:ascii="Arial" w:hAnsi="Arial" w:eastAsia="PingFang SC" w:cs="Arial"/>
+          <w:lang w:val="zh-CN" w:eastAsia="zh-CN"/>
+        </w:rPr>
+        <w:t xml:space="preserve"> </w:t>
+      </w:r>
+      <w:r>
+        <w:rPr>
+          <w:rFonts w:ascii="Arial" w:hAnsi="Arial" w:eastAsia="PingFang SC" w:cs="Arial"/>
+          <w:lang w:val="zh-CN" w:eastAsia="zh-CN"/>
+        </w:rPr>
+        <w:t xml:space="preserve">开发者不得把这些已经落地的保护降回 v2 的简化示例。</w:t>
       </w:r>
     </w:p>
     <w:bookmarkEnd w:id="26"/>
@@ -3064,7 +3146,7 @@
                 <w:sz w:val="17"/>
                 <w:lang w:val="zh-CN" w:eastAsia="zh-CN"/>
               </w:rPr>
-              <w:t xml:space="preserve">FastAPI、SQLite/Alembic、审计事件、内容寻址导出、受控下载均有测试</w:t>
+              <w:t xml:space="preserve">FastAPI、SQLite/Alembic、审计事件、内容寻址导出、受控下载、可选共享 Key 和单进程限流均有测试</w:t>
             </w:r>
           </w:p>
         </w:tc>
@@ -3092,7 +3174,7 @@
                 <w:sz w:val="17"/>
                 <w:lang w:val="zh-CN" w:eastAsia="zh-CN"/>
               </w:rPr>
-              <w:t xml:space="preserve">尚无登录、租户、配额和共享数据库</w:t>
+              <w:t xml:space="preserve">尚无用户/租户登录与资源授权、分布式限流、用户配额和共享数据库</w:t>
             </w:r>
           </w:p>
         </w:tc>
@@ -3649,7 +3731,7 @@
                 <w:sz w:val="17"/>
                 <w:lang w:val="zh-CN" w:eastAsia="zh-CN"/>
               </w:rPr>
-              <w:t xml:space="preserve">非 root 容器、只读根文件系统、CI、门禁和降级 smoke 已定义</w:t>
+              <w:t xml:space="preserve">GitHub CI 构建 API/前端 CPU 镜像，以非 root、只读根启动，并在隔离网络验证前端容器到 API 的 DNS/Host/Key 链路</w:t>
             </w:r>
           </w:p>
         </w:tc>
@@ -3677,7 +3759,7 @@
                 <w:sz w:val="17"/>
                 <w:lang w:val="zh-CN" w:eastAsia="zh-CN"/>
               </w:rPr>
-              <w:t xml:space="preserve">本地 Docker image build 未因外部镜像拉取超时得到通过证据</w:t>
+              <w:t xml:space="preserve">本地 Docker image build 曾因外部镜像拉取超时；仍无生产备份/恢复演练与多实例证据</w:t>
             </w:r>
           </w:p>
         </w:tc>
@@ -5915,7 +5997,54 @@
           <w:rFonts w:ascii="Arial" w:hAnsi="Arial" w:eastAsia="PingFang SC" w:cs="Arial"/>
           <w:lang w:val="zh-CN" w:eastAsia="zh-CN"/>
         </w:rPr>
-        <w:t xml:space="preserve">是唯一后端入口；ROI canvas 运行时不依赖 CDN/npm；结果页优先展示质量结论，再展示数值和五层图像。</w:t>
+        <w:t xml:space="preserve">是唯一后端入口；它从进程环境接收可选部署 Key，并统一附加到 JSON、multipart 与同源签名下载请求。配置共享 Key 时，连接地址由</w:t>
+      </w:r>
+      <w:r>
+        <w:rPr>
+          <w:rFonts w:ascii="Arial" w:hAnsi="Arial" w:eastAsia="PingFang SC" w:cs="Arial"/>
+          <w:lang w:val="zh-CN" w:eastAsia="zh-CN"/>
+        </w:rPr>
+        <w:t xml:space="preserve"> </w:t>
+      </w:r>
+      <w:r>
+        <w:rPr>
+          <w:rStyle w:val="VerbatimChar"/>
+        </w:rPr>
+        <w:t xml:space="preserve">NANOLOOP_API_BASE_URL</w:t>
+      </w:r>
+      <w:r>
+        <w:rPr>
+          <w:rFonts w:ascii="Arial" w:hAnsi="Arial" w:eastAsia="PingFang SC" w:cs="Arial"/>
+          <w:lang w:val="zh-CN" w:eastAsia="zh-CN"/>
+        </w:rPr>
+        <w:t xml:space="preserve"> </w:t>
+      </w:r>
+      <w:r>
+        <w:rPr>
+          <w:rFonts w:ascii="Arial" w:hAnsi="Arial" w:eastAsia="PingFang SC" w:cs="Arial"/>
+          <w:lang w:val="zh-CN" w:eastAsia="zh-CN"/>
+        </w:rPr>
+        <w:t xml:space="preserve">锁定，</w:t>
+      </w:r>
+      <w:r>
+        <w:rPr>
+          <w:rStyle w:val="VerbatimChar"/>
+        </w:rPr>
+        <w:t xml:space="preserve">_get_client()</w:t>
+      </w:r>
+      <w:r>
+        <w:rPr>
+          <w:rFonts w:ascii="Arial" w:hAnsi="Arial" w:eastAsia="PingFang SC" w:cs="Arial"/>
+          <w:lang w:val="zh-CN" w:eastAsia="zh-CN"/>
+        </w:rPr>
+        <w:t xml:space="preserve"> </w:t>
+      </w:r>
+      <w:r>
+        <w:rPr>
+          <w:rFonts w:ascii="Arial" w:hAnsi="Arial" w:eastAsia="PingFang SC" w:cs="Arial"/>
+          <w:lang w:val="zh-CN" w:eastAsia="zh-CN"/>
+        </w:rPr>
+        <w:t xml:space="preserve">对会话值与运维值分别规范化后要求完全相等；不匹配则不创建 client，避免把进程级 Key 发往会话用户可控的地址。未配置 Key 的开发模式仍允许编辑 API 地址。ROI canvas 运行时不依赖 CDN/npm；结果页优先展示质量结论，再展示数值和五层图像。</w:t>
       </w:r>
     </w:p>
     <w:bookmarkEnd w:id="33"/>
@@ -6838,7 +6967,439 @@
           <w:rFonts w:ascii="Arial" w:hAnsi="Arial" w:eastAsia="PingFang SC" w:cs="Arial"/>
           <w:lang w:val="zh-CN" w:eastAsia="zh-CN"/>
         </w:rPr>
-        <w:t xml:space="preserve">上述防护不等于认证；开放公网前必须由受信任反向代理提供 TLS、身份认证、限速和访问日志。</w:t>
+        <w:t xml:space="preserve">配置</w:t>
+      </w:r>
+      <w:r>
+        <w:rPr>
+          <w:rFonts w:ascii="Arial" w:hAnsi="Arial" w:eastAsia="PingFang SC" w:cs="Arial"/>
+          <w:lang w:val="zh-CN" w:eastAsia="zh-CN"/>
+        </w:rPr>
+        <w:t xml:space="preserve"> </w:t>
+      </w:r>
+      <w:r>
+        <w:rPr>
+          <w:rStyle w:val="VerbatimChar"/>
+        </w:rPr>
+        <w:t xml:space="preserve">NANOLOOP_API_KEY</w:t>
+      </w:r>
+      <w:r>
+        <w:rPr>
+          <w:rFonts w:ascii="Arial" w:hAnsi="Arial" w:eastAsia="PingFang SC" w:cs="Arial"/>
+          <w:lang w:val="zh-CN" w:eastAsia="zh-CN"/>
+        </w:rPr>
+        <w:t xml:space="preserve"> </w:t>
+      </w:r>
+      <w:r>
+        <w:rPr>
+          <w:rFonts w:ascii="Arial" w:hAnsi="Arial" w:eastAsia="PingFang SC" w:cs="Arial"/>
+          <w:lang w:val="zh-CN" w:eastAsia="zh-CN"/>
+        </w:rPr>
+        <w:t xml:space="preserve">时，除精确公开路径外的请求必须只携带一个有效</w:t>
+      </w:r>
+      <w:r>
+        <w:rPr>
+          <w:rFonts w:ascii="Arial" w:hAnsi="Arial" w:eastAsia="PingFang SC" w:cs="Arial"/>
+          <w:lang w:val="zh-CN" w:eastAsia="zh-CN"/>
+        </w:rPr>
+        <w:t xml:space="preserve"> </w:t>
+      </w:r>
+      <w:r>
+        <w:rPr>
+          <w:rStyle w:val="VerbatimChar"/>
+        </w:rPr>
+        <w:t xml:space="preserve">X-API-Key</w:t>
+      </w:r>
+      <w:r>
+        <w:rPr>
+          <w:rFonts w:ascii="Arial" w:hAnsi="Arial" w:eastAsia="PingFang SC" w:cs="Arial"/>
+          <w:lang w:val="zh-CN" w:eastAsia="zh-CN"/>
+        </w:rPr>
+        <w:t xml:space="preserve">；缺失、错误或重复头部统一返回</w:t>
+      </w:r>
+      <w:r>
+        <w:rPr>
+          <w:rFonts w:ascii="Arial" w:hAnsi="Arial" w:eastAsia="PingFang SC" w:cs="Arial"/>
+          <w:lang w:val="zh-CN" w:eastAsia="zh-CN"/>
+        </w:rPr>
+        <w:t xml:space="preserve"> </w:t>
+      </w:r>
+      <w:r>
+        <w:rPr>
+          <w:rStyle w:val="VerbatimChar"/>
+        </w:rPr>
+        <w:t xml:space="preserve">401 AUTHENTICATION_REQUIRED</w:t>
+      </w:r>
+      <w:r>
+        <w:rPr>
+          <w:rFonts w:ascii="Arial" w:hAnsi="Arial" w:eastAsia="PingFang SC" w:cs="Arial"/>
+          <w:lang w:val="zh-CN" w:eastAsia="zh-CN"/>
+        </w:rPr>
+        <w:t xml:space="preserve">，不暴露匹配细节。合法 CORS 预检由外层 CORS middleware 直接响应；没有</w:t>
+      </w:r>
+      <w:r>
+        <w:rPr>
+          <w:rFonts w:ascii="Arial" w:hAnsi="Arial" w:eastAsia="PingFang SC" w:cs="Arial"/>
+          <w:lang w:val="zh-CN" w:eastAsia="zh-CN"/>
+        </w:rPr>
+        <w:t xml:space="preserve"> </w:t>
+      </w:r>
+      <w:r>
+        <w:rPr>
+          <w:rStyle w:val="VerbatimChar"/>
+        </w:rPr>
+        <w:t xml:space="preserve">Origin</w:t>
+      </w:r>
+      <w:r>
+        <w:rPr>
+          <w:rFonts w:ascii="Arial" w:hAnsi="Arial" w:eastAsia="PingFang SC" w:cs="Arial"/>
+          <w:lang w:val="zh-CN" w:eastAsia="zh-CN"/>
+        </w:rPr>
+        <w:t xml:space="preserve">/</w:t>
+      </w:r>
+      <w:r>
+        <w:rPr>
+          <w:rStyle w:val="VerbatimChar"/>
+        </w:rPr>
+        <w:t xml:space="preserve">Access-Control-Request-Method</w:t>
+      </w:r>
+      <w:r>
+        <w:rPr>
+          <w:rFonts w:ascii="Arial" w:hAnsi="Arial" w:eastAsia="PingFang SC" w:cs="Arial"/>
+          <w:lang w:val="zh-CN" w:eastAsia="zh-CN"/>
+        </w:rPr>
+        <w:t xml:space="preserve"> </w:t>
+      </w:r>
+      <w:r>
+        <w:rPr>
+          <w:rFonts w:ascii="Arial" w:hAnsi="Arial" w:eastAsia="PingFang SC" w:cs="Arial"/>
+          <w:lang w:val="zh-CN" w:eastAsia="zh-CN"/>
+        </w:rPr>
+        <w:t xml:space="preserve">的普通</w:t>
+      </w:r>
+      <w:r>
+        <w:rPr>
+          <w:rFonts w:ascii="Arial" w:hAnsi="Arial" w:eastAsia="PingFang SC" w:cs="Arial"/>
+          <w:lang w:val="zh-CN" w:eastAsia="zh-CN"/>
+        </w:rPr>
+        <w:t xml:space="preserve"> </w:t>
+      </w:r>
+      <w:r>
+        <w:rPr>
+          <w:rStyle w:val="VerbatimChar"/>
+        </w:rPr>
+        <w:t xml:space="preserve">OPTIONS</w:t>
+      </w:r>
+      <w:r>
+        <w:rPr>
+          <w:rFonts w:ascii="Arial" w:hAnsi="Arial" w:eastAsia="PingFang SC" w:cs="Arial"/>
+          <w:lang w:val="zh-CN" w:eastAsia="zh-CN"/>
+        </w:rPr>
+        <w:t xml:space="preserve"> </w:t>
+      </w:r>
+      <w:r>
+        <w:rPr>
+          <w:rFonts w:ascii="Arial" w:hAnsi="Arial" w:eastAsia="PingFang SC" w:cs="Arial"/>
+          <w:lang w:val="zh-CN" w:eastAsia="zh-CN"/>
+        </w:rPr>
+        <w:t xml:space="preserve">不获得认证或限流豁免。</w:t>
+      </w:r>
+    </w:p>
+    <w:p>
+      <w:pPr>
+        <w:widowControl/>
+        <w:numPr>
+          <w:ilvl w:val="0"/>
+          <w:numId w:val="1008"/>
+        </w:numPr>
+        <w:pStyle w:val="Compact"/>
+      </w:pPr>
+      <w:r>
+        <w:rPr>
+          <w:rFonts w:ascii="Arial" w:hAnsi="Arial" w:eastAsia="PingFang SC" w:cs="Arial"/>
+          <w:lang w:val="zh-CN" w:eastAsia="zh-CN"/>
+        </w:rPr>
+        <w:t xml:space="preserve">精确公开路径是根</w:t>
+      </w:r>
+      <w:r>
+        <w:rPr>
+          <w:rFonts w:ascii="Arial" w:hAnsi="Arial" w:eastAsia="PingFang SC" w:cs="Arial"/>
+          <w:lang w:val="zh-CN" w:eastAsia="zh-CN"/>
+        </w:rPr>
+        <w:t xml:space="preserve"> </w:t>
+      </w:r>
+      <w:r>
+        <w:rPr>
+          <w:rStyle w:val="VerbatimChar"/>
+        </w:rPr>
+        <w:t xml:space="preserve">GET /health</w:t>
+      </w:r>
+      <w:r>
+        <w:rPr>
+          <w:rFonts w:ascii="Arial" w:hAnsi="Arial" w:eastAsia="PingFang SC" w:cs="Arial"/>
+          <w:lang w:val="zh-CN" w:eastAsia="zh-CN"/>
+        </w:rPr>
+        <w:t xml:space="preserve">、OpenAPI/Swagger/ReDoc 文档路径；</w:t>
+      </w:r>
+      <w:r>
+        <w:rPr>
+          <w:rStyle w:val="VerbatimChar"/>
+        </w:rPr>
+        <w:t xml:space="preserve">GET /api/v1/health</w:t>
+      </w:r>
+      <w:r>
+        <w:rPr>
+          <w:rFonts w:ascii="Arial" w:hAnsi="Arial" w:eastAsia="PingFang SC" w:cs="Arial"/>
+          <w:lang w:val="zh-CN" w:eastAsia="zh-CN"/>
+        </w:rPr>
+        <w:t xml:space="preserve"> </w:t>
+      </w:r>
+      <w:r>
+        <w:rPr>
+          <w:rFonts w:ascii="Arial" w:hAnsi="Arial" w:eastAsia="PingFang SC" w:cs="Arial"/>
+          <w:lang w:val="zh-CN" w:eastAsia="zh-CN"/>
+        </w:rPr>
+        <w:t xml:space="preserve">和</w:t>
+      </w:r>
+      <w:r>
+        <w:rPr>
+          <w:rFonts w:ascii="Arial" w:hAnsi="Arial" w:eastAsia="PingFang SC" w:cs="Arial"/>
+          <w:lang w:val="zh-CN" w:eastAsia="zh-CN"/>
+        </w:rPr>
+        <w:t xml:space="preserve"> </w:t>
+      </w:r>
+      <w:r>
+        <w:rPr>
+          <w:rStyle w:val="VerbatimChar"/>
+        </w:rPr>
+        <w:t xml:space="preserve">/api/v1/files/{token}</w:t>
+      </w:r>
+      <w:r>
+        <w:rPr>
+          <w:rFonts w:ascii="Arial" w:hAnsi="Arial" w:eastAsia="PingFang SC" w:cs="Arial"/>
+          <w:lang w:val="zh-CN" w:eastAsia="zh-CN"/>
+        </w:rPr>
+        <w:t xml:space="preserve"> </w:t>
+      </w:r>
+      <w:r>
+        <w:rPr>
+          <w:rFonts w:ascii="Arial" w:hAnsi="Arial" w:eastAsia="PingFang SC" w:cs="Arial"/>
+          <w:lang w:val="zh-CN" w:eastAsia="zh-CN"/>
+        </w:rPr>
+        <w:t xml:space="preserve">与其他版本化 API 一样受保护，相似前缀不会获得豁免。</w:t>
+      </w:r>
+    </w:p>
+    <w:p>
+      <w:pPr>
+        <w:widowControl/>
+        <w:numPr>
+          <w:ilvl w:val="0"/>
+          <w:numId w:val="1008"/>
+        </w:numPr>
+        <w:pStyle w:val="Compact"/>
+      </w:pPr>
+      <w:r>
+        <w:rPr>
+          <w:rStyle w:val="VerbatimChar"/>
+        </w:rPr>
+        <w:t xml:space="preserve">API_RATE_LIMIT_REQUESTS &gt; 0</w:t>
+      </w:r>
+      <w:r>
+        <w:rPr>
+          <w:rFonts w:ascii="Arial" w:hAnsi="Arial" w:eastAsia="PingFang SC" w:cs="Arial"/>
+          <w:lang w:val="zh-CN" w:eastAsia="zh-CN"/>
+        </w:rPr>
+        <w:t xml:space="preserve"> </w:t>
+      </w:r>
+      <w:r>
+        <w:rPr>
+          <w:rFonts w:ascii="Arial" w:hAnsi="Arial" w:eastAsia="PingFang SC" w:cs="Arial"/>
+          <w:lang w:val="zh-CN" w:eastAsia="zh-CN"/>
+        </w:rPr>
+        <w:t xml:space="preserve">时启用单进程 token bucket，桶命名空间固定为</w:t>
+      </w:r>
+      <w:r>
+        <w:rPr>
+          <w:rFonts w:ascii="Arial" w:hAnsi="Arial" w:eastAsia="PingFang SC" w:cs="Arial"/>
+          <w:lang w:val="zh-CN" w:eastAsia="zh-CN"/>
+        </w:rPr>
+        <w:t xml:space="preserve"> </w:t>
+      </w:r>
+      <w:r>
+        <w:rPr>
+          <w:rStyle w:val="VerbatimChar"/>
+        </w:rPr>
+        <w:t xml:space="preserve">service</w:t>
+      </w:r>
+      <w:r>
+        <w:rPr>
+          <w:rFonts w:ascii="Arial" w:hAnsi="Arial" w:eastAsia="PingFang SC" w:cs="Arial"/>
+          <w:lang w:val="zh-CN" w:eastAsia="zh-CN"/>
+        </w:rPr>
+        <w:t xml:space="preserve">、</w:t>
+      </w:r>
+      <w:r>
+        <w:rPr>
+          <w:rStyle w:val="VerbatimChar"/>
+        </w:rPr>
+        <w:t xml:space="preserve">authenticated</w:t>
+      </w:r>
+      <w:r>
+        <w:rPr>
+          <w:rFonts w:ascii="Arial" w:hAnsi="Arial" w:eastAsia="PingFang SC" w:cs="Arial"/>
+          <w:lang w:val="zh-CN" w:eastAsia="zh-CN"/>
+        </w:rPr>
+        <w:t xml:space="preserve">、</w:t>
+      </w:r>
+      <w:r>
+        <w:rPr>
+          <w:rStyle w:val="VerbatimChar"/>
+        </w:rPr>
+        <w:t xml:space="preserve">anonymous</w:t>
+      </w:r>
+      <w:r>
+        <w:rPr>
+          <w:rFonts w:ascii="Arial" w:hAnsi="Arial" w:eastAsia="PingFang SC" w:cs="Arial"/>
+          <w:lang w:val="zh-CN" w:eastAsia="zh-CN"/>
+        </w:rPr>
+        <w:t xml:space="preserve">，最多持有三个桶。成功响应带</w:t>
+      </w:r>
+      <w:r>
+        <w:rPr>
+          <w:rFonts w:ascii="Arial" w:hAnsi="Arial" w:eastAsia="PingFang SC" w:cs="Arial"/>
+          <w:lang w:val="zh-CN" w:eastAsia="zh-CN"/>
+        </w:rPr>
+        <w:t xml:space="preserve"> </w:t>
+      </w:r>
+      <w:r>
+        <w:rPr>
+          <w:rStyle w:val="VerbatimChar"/>
+        </w:rPr>
+        <w:t xml:space="preserve">X-RateLimit-Limit/Remaining</w:t>
+      </w:r>
+      <w:r>
+        <w:rPr>
+          <w:rFonts w:ascii="Arial" w:hAnsi="Arial" w:eastAsia="PingFang SC" w:cs="Arial"/>
+          <w:lang w:val="zh-CN" w:eastAsia="zh-CN"/>
+        </w:rPr>
+        <w:t xml:space="preserve">，超限返回可重试的</w:t>
+      </w:r>
+      <w:r>
+        <w:rPr>
+          <w:rFonts w:ascii="Arial" w:hAnsi="Arial" w:eastAsia="PingFang SC" w:cs="Arial"/>
+          <w:lang w:val="zh-CN" w:eastAsia="zh-CN"/>
+        </w:rPr>
+        <w:t xml:space="preserve"> </w:t>
+      </w:r>
+      <w:r>
+        <w:rPr>
+          <w:rStyle w:val="VerbatimChar"/>
+        </w:rPr>
+        <w:t xml:space="preserve">429 RATE_LIMITED</w:t>
+      </w:r>
+      <w:r>
+        <w:rPr>
+          <w:rFonts w:ascii="Arial" w:hAnsi="Arial" w:eastAsia="PingFang SC" w:cs="Arial"/>
+          <w:lang w:val="zh-CN" w:eastAsia="zh-CN"/>
+        </w:rPr>
+        <w:t xml:space="preserve"> </w:t>
+      </w:r>
+      <w:r>
+        <w:rPr>
+          <w:rFonts w:ascii="Arial" w:hAnsi="Arial" w:eastAsia="PingFang SC" w:cs="Arial"/>
+          <w:lang w:val="zh-CN" w:eastAsia="zh-CN"/>
+        </w:rPr>
+        <w:t xml:space="preserve">与</w:t>
+      </w:r>
+      <w:r>
+        <w:rPr>
+          <w:rFonts w:ascii="Arial" w:hAnsi="Arial" w:eastAsia="PingFang SC" w:cs="Arial"/>
+          <w:lang w:val="zh-CN" w:eastAsia="zh-CN"/>
+        </w:rPr>
+        <w:t xml:space="preserve"> </w:t>
+      </w:r>
+      <w:r>
+        <w:rPr>
+          <w:rStyle w:val="VerbatimChar"/>
+        </w:rPr>
+        <w:t xml:space="preserve">Retry-After</w:t>
+      </w:r>
+      <w:r>
+        <w:rPr>
+          <w:rFonts w:ascii="Arial" w:hAnsi="Arial" w:eastAsia="PingFang SC" w:cs="Arial"/>
+          <w:lang w:val="zh-CN" w:eastAsia="zh-CN"/>
+        </w:rPr>
+        <w:t xml:space="preserve">。</w:t>
+      </w:r>
+    </w:p>
+    <w:p>
+      <w:pPr>
+        <w:widowControl/>
+        <w:numPr>
+          <w:ilvl w:val="0"/>
+          <w:numId w:val="1008"/>
+        </w:numPr>
+        <w:pStyle w:val="Compact"/>
+      </w:pPr>
+      <w:r>
+        <w:rPr>
+          <w:rFonts w:ascii="Arial" w:hAnsi="Arial" w:eastAsia="PingFang SC" w:cs="Arial"/>
+          <w:lang w:val="zh-CN" w:eastAsia="zh-CN"/>
+        </w:rPr>
+        <w:t xml:space="preserve">有效请求的中间件顺序由外到内为：Request Context → Trusted Host → Browser Mutation Guard → CORS → 限流（启用时）→ API Key → 请求体上限 → route。Host/Origin 拒绝先于 Key，Key 拒绝先于 body 解析。</w:t>
+      </w:r>
+    </w:p>
+    <w:p>
+      <w:pPr>
+        <w:widowControl/>
+        <w:numPr>
+          <w:ilvl w:val="0"/>
+          <w:numId w:val="1008"/>
+        </w:numPr>
+        <w:pStyle w:val="Compact"/>
+      </w:pPr>
+      <w:r>
+        <w:rPr>
+          <w:rFonts w:ascii="Arial" w:hAnsi="Arial" w:eastAsia="PingFang SC" w:cs="Arial"/>
+          <w:lang w:val="zh-CN" w:eastAsia="zh-CN"/>
+        </w:rPr>
+        <w:t xml:space="preserve">共享 Key 同时配置到 Streamlit 时，前端必须把规范化后的请求地址锁定到</w:t>
+      </w:r>
+      <w:r>
+        <w:rPr>
+          <w:rFonts w:ascii="Arial" w:hAnsi="Arial" w:eastAsia="PingFang SC" w:cs="Arial"/>
+          <w:lang w:val="zh-CN" w:eastAsia="zh-CN"/>
+        </w:rPr>
+        <w:t xml:space="preserve"> </w:t>
+      </w:r>
+      <w:r>
+        <w:rPr>
+          <w:rStyle w:val="VerbatimChar"/>
+        </w:rPr>
+        <w:t xml:space="preserve">NANOLOOP_API_BASE_URL</w:t>
+      </w:r>
+      <w:r>
+        <w:rPr>
+          <w:rFonts w:ascii="Arial" w:hAnsi="Arial" w:eastAsia="PingFang SC" w:cs="Arial"/>
+          <w:lang w:val="zh-CN" w:eastAsia="zh-CN"/>
+        </w:rPr>
+        <w:t xml:space="preserve">，不允许会话状态把 Key 改投到其他 origin/path。没有共享 Key 时才保留可编辑地址的本地开发行为。</w:t>
+      </w:r>
+    </w:p>
+    <w:p>
+      <w:pPr>
+        <w:widowControl/>
+        <w:numPr>
+          <w:ilvl w:val="0"/>
+          <w:numId w:val="1008"/>
+        </w:numPr>
+        <w:pStyle w:val="Compact"/>
+      </w:pPr>
+      <w:r>
+        <w:rPr>
+          <w:rFonts w:ascii="Arial" w:hAnsi="Arial" w:eastAsia="PingFang SC" w:cs="Arial"/>
+          <w:lang w:val="zh-CN" w:eastAsia="zh-CN"/>
+        </w:rPr>
+        <w:t xml:space="preserve">共享 Key 只是单一部署密钥，不是用户/租户身份、角色或资源授权；三桶限流也不跨进程共享。开放公网前仍必须由受信任反向代理提供 TLS、真实身份/授权、分布式限速和访问日志。</w:t>
       </w:r>
     </w:p>
     <w:bookmarkEnd w:id="42"/>
@@ -7143,7 +7704,7 @@
                 <w:sz w:val="17"/>
                 <w:lang w:val="zh-CN" w:eastAsia="zh-CN"/>
               </w:rPr>
-              <w:t xml:space="preserve">routes、API client、OpenAPI、HTTP fixtures、集成测试、部署限制说明</w:t>
+              <w:t xml:space="preserve">routes、API client、OpenAPI（含 security/responses）、HTTP fixtures、集成测试、部署限制说明</w:t>
             </w:r>
           </w:p>
         </w:tc>
@@ -14140,7 +14701,229 @@
           <w:rFonts w:ascii="Arial" w:hAnsi="Arial" w:eastAsia="PingFang SC" w:cs="Arial"/>
           <w:lang w:val="zh-CN" w:eastAsia="zh-CN"/>
         </w:rPr>
-        <w:t xml:space="preserve">统一响应/错误/request ID、可信 Host、浏览器写请求保护、CORS、请求体与 route-specific multipart 限额已接通。</w:t>
+        <w:t xml:space="preserve">统一响应/错误/request ID、可信 Host、浏览器写请求保护、CORS、可选共享</w:t>
+      </w:r>
+      <w:r>
+        <w:rPr>
+          <w:rFonts w:ascii="Arial" w:hAnsi="Arial" w:eastAsia="PingFang SC" w:cs="Arial"/>
+          <w:lang w:val="zh-CN" w:eastAsia="zh-CN"/>
+        </w:rPr>
+        <w:t xml:space="preserve"> </w:t>
+      </w:r>
+      <w:r>
+        <w:rPr>
+          <w:rStyle w:val="VerbatimChar"/>
+        </w:rPr>
+        <w:t xml:space="preserve">X-API-Key</w:t>
+      </w:r>
+      <w:r>
+        <w:rPr>
+          <w:rFonts w:ascii="Arial" w:hAnsi="Arial" w:eastAsia="PingFang SC" w:cs="Arial"/>
+          <w:lang w:val="zh-CN" w:eastAsia="zh-CN"/>
+        </w:rPr>
+        <w:t xml:space="preserve">、请求体与 route-specific multipart 限额已接通。</w:t>
+      </w:r>
+    </w:p>
+    <w:p>
+      <w:pPr>
+        <w:widowControl/>
+        <w:numPr>
+          <w:ilvl w:val="0"/>
+          <w:numId w:val="1014"/>
+        </w:numPr>
+        <w:pStyle w:val="Compact"/>
+      </w:pPr>
+      <w:r>
+        <w:rPr>
+          <w:rStyle w:val="VerbatimChar"/>
+        </w:rPr>
+        <w:t xml:space="preserve">ApiKeyVerifier</w:t>
+      </w:r>
+      <w:r>
+        <w:rPr>
+          <w:rFonts w:ascii="Arial" w:hAnsi="Arial" w:eastAsia="PingFang SC" w:cs="Arial"/>
+          <w:lang w:val="zh-CN" w:eastAsia="zh-CN"/>
+        </w:rPr>
+        <w:t xml:space="preserve"> </w:t>
+      </w:r>
+      <w:r>
+        <w:rPr>
+          <w:rFonts w:ascii="Arial" w:hAnsi="Arial" w:eastAsia="PingFang SC" w:cs="Arial"/>
+          <w:lang w:val="zh-CN" w:eastAsia="zh-CN"/>
+        </w:rPr>
+        <w:t xml:space="preserve">仅保留 Key 的 SHA-256 摘要并做恒定时间比较；缺失、错误或重复头部有不可区分的 401 响应，所有版本化操作在 OpenAPI 声明</w:t>
+      </w:r>
+      <w:r>
+        <w:rPr>
+          <w:rFonts w:ascii="Arial" w:hAnsi="Arial" w:eastAsia="PingFang SC" w:cs="Arial"/>
+          <w:lang w:val="zh-CN" w:eastAsia="zh-CN"/>
+        </w:rPr>
+        <w:t xml:space="preserve"> </w:t>
+      </w:r>
+      <w:r>
+        <w:rPr>
+          <w:rStyle w:val="VerbatimChar"/>
+        </w:rPr>
+        <w:t xml:space="preserve">ApiKeyAuth</w:t>
+      </w:r>
+      <w:r>
+        <w:rPr>
+          <w:rFonts w:ascii="Arial" w:hAnsi="Arial" w:eastAsia="PingFang SC" w:cs="Arial"/>
+          <w:lang w:val="zh-CN" w:eastAsia="zh-CN"/>
+        </w:rPr>
+        <w:t xml:space="preserve">。</w:t>
+      </w:r>
+    </w:p>
+    <w:p>
+      <w:pPr>
+        <w:widowControl/>
+        <w:numPr>
+          <w:ilvl w:val="0"/>
+          <w:numId w:val="1014"/>
+        </w:numPr>
+        <w:pStyle w:val="Compact"/>
+      </w:pPr>
+      <w:r>
+        <w:rPr>
+          <w:rFonts w:ascii="Arial" w:hAnsi="Arial" w:eastAsia="PingFang SC" w:cs="Arial"/>
+          <w:lang w:val="zh-CN" w:eastAsia="zh-CN"/>
+        </w:rPr>
+        <w:t xml:space="preserve">可选</w:t>
+      </w:r>
+      <w:r>
+        <w:rPr>
+          <w:rFonts w:ascii="Arial" w:hAnsi="Arial" w:eastAsia="PingFang SC" w:cs="Arial"/>
+          <w:lang w:val="zh-CN" w:eastAsia="zh-CN"/>
+        </w:rPr>
+        <w:t xml:space="preserve"> </w:t>
+      </w:r>
+      <w:r>
+        <w:rPr>
+          <w:rStyle w:val="VerbatimChar"/>
+        </w:rPr>
+        <w:t xml:space="preserve">TokenBucketLimiter</w:t>
+      </w:r>
+      <w:r>
+        <w:rPr>
+          <w:rFonts w:ascii="Arial" w:hAnsi="Arial" w:eastAsia="PingFang SC" w:cs="Arial"/>
+          <w:lang w:val="zh-CN" w:eastAsia="zh-CN"/>
+        </w:rPr>
+        <w:t xml:space="preserve"> </w:t>
+      </w:r>
+      <w:r>
+        <w:rPr>
+          <w:rFonts w:ascii="Arial" w:hAnsi="Arial" w:eastAsia="PingFang SC" w:cs="Arial"/>
+          <w:lang w:val="zh-CN" w:eastAsia="zh-CN"/>
+        </w:rPr>
+        <w:t xml:space="preserve">按</w:t>
+      </w:r>
+      <w:r>
+        <w:rPr>
+          <w:rFonts w:ascii="Arial" w:hAnsi="Arial" w:eastAsia="PingFang SC" w:cs="Arial"/>
+          <w:lang w:val="zh-CN" w:eastAsia="zh-CN"/>
+        </w:rPr>
+        <w:t xml:space="preserve"> </w:t>
+      </w:r>
+      <w:r>
+        <w:rPr>
+          <w:rStyle w:val="VerbatimChar"/>
+        </w:rPr>
+        <w:t xml:space="preserve">service/authenticated/anonymous</w:t>
+      </w:r>
+      <w:r>
+        <w:rPr>
+          <w:rFonts w:ascii="Arial" w:hAnsi="Arial" w:eastAsia="PingFang SC" w:cs="Arial"/>
+          <w:lang w:val="zh-CN" w:eastAsia="zh-CN"/>
+        </w:rPr>
+        <w:t xml:space="preserve"> </w:t>
+      </w:r>
+      <w:r>
+        <w:rPr>
+          <w:rFonts w:ascii="Arial" w:hAnsi="Arial" w:eastAsia="PingFang SC" w:cs="Arial"/>
+          <w:lang w:val="zh-CN" w:eastAsia="zh-CN"/>
+        </w:rPr>
+        <w:t xml:space="preserve">三个固定调用类别限流，内存随请求来源数量保持常数；它只对当前进程生效。</w:t>
+      </w:r>
+    </w:p>
+    <w:p>
+      <w:pPr>
+        <w:widowControl/>
+        <w:numPr>
+          <w:ilvl w:val="0"/>
+          <w:numId w:val="1014"/>
+        </w:numPr>
+        <w:pStyle w:val="Compact"/>
+      </w:pPr>
+      <w:r>
+        <w:rPr>
+          <w:rFonts w:ascii="Arial" w:hAnsi="Arial" w:eastAsia="PingFang SC" w:cs="Arial"/>
+          <w:lang w:val="zh-CN" w:eastAsia="zh-CN"/>
+        </w:rPr>
+        <w:t xml:space="preserve">安全中间件保持 Host/Origin 先于限流和 Key，Key 先于 body/multipart 解析；CORS 还对浏览器暴露 401/429 所需响应头。</w:t>
+      </w:r>
+    </w:p>
+    <w:p>
+      <w:pPr>
+        <w:widowControl/>
+        <w:numPr>
+          <w:ilvl w:val="0"/>
+          <w:numId w:val="1014"/>
+        </w:numPr>
+        <w:pStyle w:val="Compact"/>
+      </w:pPr>
+      <w:r>
+        <w:rPr>
+          <w:rFonts w:ascii="Arial" w:hAnsi="Arial" w:eastAsia="PingFang SC" w:cs="Arial"/>
+          <w:lang w:val="zh-CN" w:eastAsia="zh-CN"/>
+        </w:rPr>
+        <w:t xml:space="preserve">Compose 的显式</w:t>
+      </w:r>
+      <w:r>
+        <w:rPr>
+          <w:rFonts w:ascii="Arial" w:hAnsi="Arial" w:eastAsia="PingFang SC" w:cs="Arial"/>
+          <w:lang w:val="zh-CN" w:eastAsia="zh-CN"/>
+        </w:rPr>
+        <w:t xml:space="preserve"> </w:t>
+      </w:r>
+      <w:r>
+        <w:rPr>
+          <w:rStyle w:val="VerbatimChar"/>
+        </w:rPr>
+        <w:t xml:space="preserve">TRUSTED_HOSTS</w:t>
+      </w:r>
+      <w:r>
+        <w:rPr>
+          <w:rFonts w:ascii="Arial" w:hAnsi="Arial" w:eastAsia="PingFang SC" w:cs="Arial"/>
+          <w:lang w:val="zh-CN" w:eastAsia="zh-CN"/>
+        </w:rPr>
+        <w:t xml:space="preserve"> </w:t>
+      </w:r>
+      <w:r>
+        <w:rPr>
+          <w:rFonts w:ascii="Arial" w:hAnsi="Arial" w:eastAsia="PingFang SC" w:cs="Arial"/>
+          <w:lang w:val="zh-CN" w:eastAsia="zh-CN"/>
+        </w:rPr>
+        <w:t xml:space="preserve">默认项包含内部服务名</w:t>
+      </w:r>
+      <w:r>
+        <w:rPr>
+          <w:rFonts w:ascii="Arial" w:hAnsi="Arial" w:eastAsia="PingFang SC" w:cs="Arial"/>
+          <w:lang w:val="zh-CN" w:eastAsia="zh-CN"/>
+        </w:rPr>
+        <w:t xml:space="preserve"> </w:t>
+      </w:r>
+      <w:r>
+        <w:rPr>
+          <w:rStyle w:val="VerbatimChar"/>
+        </w:rPr>
+        <w:t xml:space="preserve">api</w:t>
+      </w:r>
+      <w:r>
+        <w:rPr>
+          <w:rFonts w:ascii="Arial" w:hAnsi="Arial" w:eastAsia="PingFang SC" w:cs="Arial"/>
+          <w:lang w:val="zh-CN" w:eastAsia="zh-CN"/>
+        </w:rPr>
+        <w:t xml:space="preserve">，使前端可经 Compose DNS 访问后端；这是精确 Host 允许项，不是 wildcard。</w:t>
       </w:r>
     </w:p>
     <w:p>
@@ -14442,7 +15225,7 @@
                 <w:sz w:val="17"/>
                 <w:lang w:val="zh-CN" w:eastAsia="zh-CN"/>
               </w:rPr>
-              <w:t xml:space="preserve">、服务装配、lifespan</w:t>
+              <w:t xml:space="preserve">、服务装配、lifespan、中间件顺序</w:t>
             </w:r>
           </w:p>
         </w:tc>
@@ -14594,7 +15377,7 @@
                 <w:sz w:val="17"/>
                 <w:lang w:val="zh-CN" w:eastAsia="zh-CN"/>
               </w:rPr>
-              <w:t xml:space="preserve">app/api/routing.py</w:t>
+              <w:t xml:space="preserve">app/api/deps.py</w:t>
             </w:r>
           </w:p>
         </w:tc>
@@ -14623,7 +15406,24 @@
                 <w:sz w:val="17"/>
                 <w:lang w:val="zh-CN" w:eastAsia="zh-CN"/>
               </w:rPr>
-              <w:t xml:space="preserve">BoundedMultipartRoute</w:t>
+              <w:t xml:space="preserve">ApiKeyAuth</w:t>
+            </w:r>
+            <w:r>
+              <w:rPr>
+                <w:rFonts w:ascii="Arial" w:hAnsi="Arial" w:eastAsia="PingFang SC" w:cs="Arial"/>
+                <w:sz w:val="17"/>
+                <w:lang w:val="zh-CN" w:eastAsia="zh-CN"/>
+              </w:rPr>
+              <w:t xml:space="preserve">、</w:t>
+            </w:r>
+            <w:r>
+              <w:rPr>
+                <w:rStyle w:val="VerbatimChar"/>
+                <w:rFonts w:ascii="Arial" w:hAnsi="Arial" w:eastAsia="PingFang SC" w:cs="Arial"/>
+                <w:sz w:val="17"/>
+                <w:lang w:val="zh-CN" w:eastAsia="zh-CN"/>
+              </w:rPr>
+              <w:t xml:space="preserve">require_api_key_contract</w:t>
             </w:r>
           </w:p>
         </w:tc>
@@ -14651,7 +15451,7 @@
                 <w:sz w:val="17"/>
                 <w:lang w:val="zh-CN" w:eastAsia="zh-CN"/>
               </w:rPr>
-              <w:t xml:space="preserve">文件/字段数、part size 与类型政策</w:t>
+              <w:t xml:space="preserve">OpenAPI 安全声明与路由 fail-closed 复核</w:t>
             </w:r>
           </w:p>
         </w:tc>
@@ -14685,7 +15485,7 @@
                 <w:sz w:val="17"/>
                 <w:lang w:val="zh-CN" w:eastAsia="zh-CN"/>
               </w:rPr>
-              <w:t xml:space="preserve">app/api/middleware.py</w:t>
+              <w:t xml:space="preserve">app/api/routing.py</w:t>
             </w:r>
           </w:p>
         </w:tc>
@@ -14709,11 +15509,12 @@
             </w:pPr>
             <w:r>
               <w:rPr>
-                <w:rFonts w:ascii="Arial" w:hAnsi="Arial" w:eastAsia="PingFang SC" w:cs="Arial"/>
-                <w:sz w:val="17"/>
-                <w:lang w:val="zh-CN" w:eastAsia="zh-CN"/>
-              </w:rPr>
-              <w:t xml:space="preserve">Host/Origin/body/context middleware</w:t>
+                <w:rStyle w:val="VerbatimChar"/>
+                <w:rFonts w:ascii="Arial" w:hAnsi="Arial" w:eastAsia="PingFang SC" w:cs="Arial"/>
+                <w:sz w:val="17"/>
+                <w:lang w:val="zh-CN" w:eastAsia="zh-CN"/>
+              </w:rPr>
+              <w:t xml:space="preserve">BoundedMultipartRoute</w:t>
             </w:r>
           </w:p>
         </w:tc>
@@ -14741,7 +15542,7 @@
                 <w:sz w:val="17"/>
                 <w:lang w:val="zh-CN" w:eastAsia="zh-CN"/>
               </w:rPr>
-              <w:t xml:space="preserve">请求安全、限额和日志上下文</w:t>
+              <w:t xml:space="preserve">文件/字段数、part size 与类型政策</w:t>
             </w:r>
           </w:p>
         </w:tc>
@@ -14775,7 +15576,7 @@
                 <w:sz w:val="17"/>
                 <w:lang w:val="zh-CN" w:eastAsia="zh-CN"/>
               </w:rPr>
-              <w:t xml:space="preserve">app/api/errors.py</w:t>
+              <w:t xml:space="preserve">app/api/middleware.py</w:t>
             </w:r>
           </w:p>
         </w:tc>
@@ -14803,7 +15604,7 @@
                 <w:sz w:val="17"/>
                 <w:lang w:val="zh-CN" w:eastAsia="zh-CN"/>
               </w:rPr>
-              <w:t xml:space="preserve">异常处理器</w:t>
+              <w:t xml:space="preserve">Host/Origin/API Key/限流/body/context middleware</w:t>
             </w:r>
           </w:p>
         </w:tc>
@@ -14831,7 +15632,7 @@
                 <w:sz w:val="17"/>
                 <w:lang w:val="zh-CN" w:eastAsia="zh-CN"/>
               </w:rPr>
-              <w:t xml:space="preserve">稳定错误码与公开信息</w:t>
+              <w:t xml:space="preserve">请求安全、限额、拒绝顺序和日志上下文</w:t>
             </w:r>
           </w:p>
         </w:tc>
@@ -14865,7 +15666,7 @@
                 <w:sz w:val="17"/>
                 <w:lang w:val="zh-CN" w:eastAsia="zh-CN"/>
               </w:rPr>
-              <w:t xml:space="preserve">app/db/models.py</w:t>
+              <w:t xml:space="preserve">app/api/errors.py</w:t>
             </w:r>
           </w:p>
         </w:tc>
@@ -14893,7 +15694,7 @@
                 <w:sz w:val="17"/>
                 <w:lang w:val="zh-CN" w:eastAsia="zh-CN"/>
               </w:rPr>
-              <w:t xml:space="preserve">12 个业务表模型</w:t>
+              <w:t xml:space="preserve">异常处理器</w:t>
             </w:r>
           </w:p>
         </w:tc>
@@ -14921,7 +15722,7 @@
                 <w:sz w:val="17"/>
                 <w:lang w:val="zh-CN" w:eastAsia="zh-CN"/>
               </w:rPr>
-              <w:t xml:space="preserve">schema 事实模型</w:t>
+              <w:t xml:space="preserve">稳定错误码与公开信息</w:t>
             </w:r>
           </w:p>
         </w:tc>
@@ -14955,7 +15756,7 @@
                 <w:sz w:val="17"/>
                 <w:lang w:val="zh-CN" w:eastAsia="zh-CN"/>
               </w:rPr>
-              <w:t xml:space="preserve">app/db/repositories.py</w:t>
+              <w:t xml:space="preserve">app/db/models.py</w:t>
             </w:r>
           </w:p>
         </w:tc>
@@ -14983,16 +15784,7 @@
                 <w:sz w:val="17"/>
                 <w:lang w:val="zh-CN" w:eastAsia="zh-CN"/>
               </w:rPr>
-              <w:t xml:space="preserve">repositories、</w:t>
-            </w:r>
-            <w:r>
-              <w:rPr>
-                <w:rStyle w:val="VerbatimChar"/>
-                <w:rFonts w:ascii="Arial" w:hAnsi="Arial" w:eastAsia="PingFang SC" w:cs="Arial"/>
-                <w:sz w:val="17"/>
-                <w:lang w:val="zh-CN" w:eastAsia="zh-CN"/>
-              </w:rPr>
-              <w:t xml:space="preserve">SqlAlchemyUnitOfWork</w:t>
+              <w:t xml:space="preserve">12 个业务表模型</w:t>
             </w:r>
           </w:p>
         </w:tc>
@@ -15020,7 +15812,7 @@
                 <w:sz w:val="17"/>
                 <w:lang w:val="zh-CN" w:eastAsia="zh-CN"/>
               </w:rPr>
-              <w:t xml:space="preserve">查询、事务、CAS 与状态转换</w:t>
+              <w:t xml:space="preserve">schema 事实模型</w:t>
             </w:r>
           </w:p>
         </w:tc>
@@ -15054,7 +15846,7 @@
                 <w:sz w:val="17"/>
                 <w:lang w:val="zh-CN" w:eastAsia="zh-CN"/>
               </w:rPr>
-              <w:t xml:space="preserve">app/db/migrations/versions/</w:t>
+              <w:t xml:space="preserve">app/db/repositories.py</w:t>
             </w:r>
           </w:p>
         </w:tc>
@@ -15082,7 +15874,16 @@
                 <w:sz w:val="17"/>
                 <w:lang w:val="zh-CN" w:eastAsia="zh-CN"/>
               </w:rPr>
-              <w:t xml:space="preserve">Alembic revisions</w:t>
+              <w:t xml:space="preserve">repositories、</w:t>
+            </w:r>
+            <w:r>
+              <w:rPr>
+                <w:rStyle w:val="VerbatimChar"/>
+                <w:rFonts w:ascii="Arial" w:hAnsi="Arial" w:eastAsia="PingFang SC" w:cs="Arial"/>
+                <w:sz w:val="17"/>
+                <w:lang w:val="zh-CN" w:eastAsia="zh-CN"/>
+              </w:rPr>
+              <w:t xml:space="preserve">SqlAlchemyUnitOfWork</w:t>
             </w:r>
           </w:p>
         </w:tc>
@@ -15110,7 +15911,7 @@
                 <w:sz w:val="17"/>
                 <w:lang w:val="zh-CN" w:eastAsia="zh-CN"/>
               </w:rPr>
-              <w:t xml:space="preserve">只追加迁移，不改已发布历史</w:t>
+              <w:t xml:space="preserve">查询、事务、CAS 与状态转换</w:t>
             </w:r>
           </w:p>
         </w:tc>
@@ -15144,7 +15945,7 @@
                 <w:sz w:val="17"/>
                 <w:lang w:val="zh-CN" w:eastAsia="zh-CN"/>
               </w:rPr>
-              <w:t xml:space="preserve">app/storage/file_store.py</w:t>
+              <w:t xml:space="preserve">app/db/migrations/versions/</w:t>
             </w:r>
           </w:p>
         </w:tc>
@@ -15168,12 +15969,11 @@
             </w:pPr>
             <w:r>
               <w:rPr>
-                <w:rStyle w:val="VerbatimChar"/>
-                <w:rFonts w:ascii="Arial" w:hAnsi="Arial" w:eastAsia="PingFang SC" w:cs="Arial"/>
-                <w:sz w:val="17"/>
-                <w:lang w:val="zh-CN" w:eastAsia="zh-CN"/>
-              </w:rPr>
-              <w:t xml:space="preserve">LocalFileStore</w:t>
+                <w:rFonts w:ascii="Arial" w:hAnsi="Arial" w:eastAsia="PingFang SC" w:cs="Arial"/>
+                <w:sz w:val="17"/>
+                <w:lang w:val="zh-CN" w:eastAsia="zh-CN"/>
+              </w:rPr>
+              <w:t xml:space="preserve">Alembic revisions</w:t>
             </w:r>
           </w:p>
         </w:tc>
@@ -15201,7 +16001,7 @@
                 <w:sz w:val="17"/>
                 <w:lang w:val="zh-CN" w:eastAsia="zh-CN"/>
               </w:rPr>
-              <w:t xml:space="preserve">上传、制品、令牌、内容寻址发布</w:t>
+              <w:t xml:space="preserve">只追加迁移，不改已发布历史</w:t>
             </w:r>
           </w:p>
         </w:tc>
@@ -15235,7 +16035,7 @@
                 <w:sz w:val="17"/>
                 <w:lang w:val="zh-CN" w:eastAsia="zh-CN"/>
               </w:rPr>
-              <w:t xml:space="preserve">app/storage/knowledge_store.py</w:t>
+              <w:t xml:space="preserve">app/storage/file_store.py</w:t>
             </w:r>
           </w:p>
         </w:tc>
@@ -15264,7 +16064,7 @@
                 <w:sz w:val="17"/>
                 <w:lang w:val="zh-CN" w:eastAsia="zh-CN"/>
               </w:rPr>
-              <w:t xml:space="preserve">KnowledgeSourceStore</w:t>
+              <w:t xml:space="preserve">LocalFileStore</w:t>
             </w:r>
           </w:p>
         </w:tc>
@@ -15292,7 +16092,7 @@
                 <w:sz w:val="17"/>
                 <w:lang w:val="zh-CN" w:eastAsia="zh-CN"/>
               </w:rPr>
-              <w:t xml:space="preserve">知识源 staging、共享引用与清理</w:t>
+              <w:t xml:space="preserve">上传、制品、令牌、内容寻址发布</w:t>
             </w:r>
           </w:p>
         </w:tc>
@@ -15326,7 +16126,7 @@
                 <w:sz w:val="17"/>
                 <w:lang w:val="zh-CN" w:eastAsia="zh-CN"/>
               </w:rPr>
-              <w:t xml:space="preserve">app/orchestration/</w:t>
+              <w:t xml:space="preserve">app/storage/knowledge_store.py</w:t>
             </w:r>
           </w:p>
         </w:tc>
@@ -15350,11 +16150,12 @@
             </w:pPr>
             <w:r>
               <w:rPr>
-                <w:rFonts w:ascii="Arial" w:hAnsi="Arial" w:eastAsia="PingFang SC" w:cs="Arial"/>
-                <w:sz w:val="17"/>
-                <w:lang w:val="zh-CN" w:eastAsia="zh-CN"/>
-              </w:rPr>
-              <w:t xml:space="preserve">dispatcher、scheduler、recovery</w:t>
+                <w:rStyle w:val="VerbatimChar"/>
+                <w:rFonts w:ascii="Arial" w:hAnsi="Arial" w:eastAsia="PingFang SC" w:cs="Arial"/>
+                <w:sz w:val="17"/>
+                <w:lang w:val="zh-CN" w:eastAsia="zh-CN"/>
+              </w:rPr>
+              <w:t xml:space="preserve">KnowledgeSourceStore</w:t>
             </w:r>
           </w:p>
         </w:tc>
@@ -15382,7 +16183,7 @@
                 <w:sz w:val="17"/>
                 <w:lang w:val="zh-CN" w:eastAsia="zh-CN"/>
               </w:rPr>
-              <w:t xml:space="preserve">队列、关闭、恢复与 post-commit</w:t>
+              <w:t xml:space="preserve">知识源 staging、共享引用与清理</w:t>
             </w:r>
           </w:p>
         </w:tc>
@@ -15416,6 +16217,96 @@
                 <w:sz w:val="17"/>
                 <w:lang w:val="zh-CN" w:eastAsia="zh-CN"/>
               </w:rPr>
+              <w:t xml:space="preserve">app/orchestration/</w:t>
+            </w:r>
+          </w:p>
+        </w:tc>
+        <w:tc>
+          <w:tcPr>
+            <w:tcW w:w="3150" w:type="dxa"/>
+            <w:vAlign w:val="center"/>
+            <w:tcMar>
+              <w:top w:w="80" w:type="dxa"/>
+              <w:start w:w="120" w:type="dxa"/>
+              <w:bottom w:w="80" w:type="dxa"/>
+              <w:end w:w="120" w:type="dxa"/>
+            </w:tcMar>
+          </w:tcPr>
+          <w:p>
+            <w:pPr>
+              <w:pStyle w:val="NanoLoopTable"/>
+              <w:keepNext w:val="0"/>
+              <w:keepLines w:val="0"/>
+              <w:jc w:val="left"/>
+            </w:pPr>
+            <w:r>
+              <w:rPr>
+                <w:rFonts w:ascii="Arial" w:hAnsi="Arial" w:eastAsia="PingFang SC" w:cs="Arial"/>
+                <w:sz w:val="17"/>
+                <w:lang w:val="zh-CN" w:eastAsia="zh-CN"/>
+              </w:rPr>
+              <w:t xml:space="preserve">dispatcher、scheduler、recovery</w:t>
+            </w:r>
+          </w:p>
+        </w:tc>
+        <w:tc>
+          <w:tcPr>
+            <w:tcW w:w="4310" w:type="dxa"/>
+            <w:vAlign w:val="center"/>
+            <w:tcMar>
+              <w:top w:w="80" w:type="dxa"/>
+              <w:start w:w="120" w:type="dxa"/>
+              <w:bottom w:w="80" w:type="dxa"/>
+              <w:end w:w="120" w:type="dxa"/>
+            </w:tcMar>
+          </w:tcPr>
+          <w:p>
+            <w:pPr>
+              <w:pStyle w:val="NanoLoopTable"/>
+              <w:keepNext w:val="0"/>
+              <w:keepLines w:val="0"/>
+              <w:jc w:val="left"/>
+            </w:pPr>
+            <w:r>
+              <w:rPr>
+                <w:rFonts w:ascii="Arial" w:hAnsi="Arial" w:eastAsia="PingFang SC" w:cs="Arial"/>
+                <w:sz w:val="17"/>
+                <w:lang w:val="zh-CN" w:eastAsia="zh-CN"/>
+              </w:rPr>
+              <w:t xml:space="preserve">队列、关闭、恢复与 post-commit</w:t>
+            </w:r>
+          </w:p>
+        </w:tc>
+      </w:tr>
+      <w:tr>
+        <w:trPr>
+          <w:cantSplit w:val="true"/>
+        </w:trPr>
+        <w:tc>
+          <w:tcPr>
+            <w:tcW w:w="1900" w:type="dxa"/>
+            <w:vAlign w:val="center"/>
+            <w:tcMar>
+              <w:top w:w="80" w:type="dxa"/>
+              <w:start w:w="120" w:type="dxa"/>
+              <w:bottom w:w="80" w:type="dxa"/>
+              <w:end w:w="120" w:type="dxa"/>
+            </w:tcMar>
+          </w:tcPr>
+          <w:p>
+            <w:pPr>
+              <w:pStyle w:val="NanoLoopTable"/>
+              <w:keepNext w:val="0"/>
+              <w:keepLines w:val="0"/>
+              <w:jc w:val="left"/>
+            </w:pPr>
+            <w:r>
+              <w:rPr>
+                <w:rStyle w:val="VerbatimChar"/>
+                <w:rFonts w:ascii="Arial" w:hAnsi="Arial" w:eastAsia="PingFang SC" w:cs="Arial"/>
+                <w:sz w:val="17"/>
+                <w:lang w:val="zh-CN" w:eastAsia="zh-CN"/>
+              </w:rPr>
               <w:t xml:space="preserve">app/core/config.py</w:t>
             </w:r>
             <w:r>
@@ -15450,6 +16341,23 @@
                 <w:sz w:val="17"/>
                 <w:lang w:val="zh-CN" w:eastAsia="zh-CN"/>
               </w:rPr>
+              <w:t xml:space="preserve">rate_limit.py</w:t>
+            </w:r>
+            <w:r>
+              <w:rPr>
+                <w:rFonts w:ascii="Arial" w:hAnsi="Arial" w:eastAsia="PingFang SC" w:cs="Arial"/>
+                <w:sz w:val="17"/>
+                <w:lang w:val="zh-CN" w:eastAsia="zh-CN"/>
+              </w:rPr>
+              <w:t xml:space="preserve">、</w:t>
+            </w:r>
+            <w:r>
+              <w:rPr>
+                <w:rStyle w:val="VerbatimChar"/>
+                <w:rFonts w:ascii="Arial" w:hAnsi="Arial" w:eastAsia="PingFang SC" w:cs="Arial"/>
+                <w:sz w:val="17"/>
+                <w:lang w:val="zh-CN" w:eastAsia="zh-CN"/>
+              </w:rPr>
               <w:t xml:space="preserve">logging.py</w:t>
             </w:r>
           </w:p>
@@ -15478,7 +16386,7 @@
                 <w:sz w:val="17"/>
                 <w:lang w:val="zh-CN" w:eastAsia="zh-CN"/>
               </w:rPr>
-              <w:t xml:space="preserve">Settings、安全与结构化日志</w:t>
+              <w:t xml:space="preserve">Settings、Key 验证、固定三桶限流与结构化日志</w:t>
             </w:r>
           </w:p>
         </w:tc>
@@ -15507,6 +16415,96 @@
                 <w:lang w:val="zh-CN" w:eastAsia="zh-CN"/>
               </w:rPr>
               <w:t xml:space="preserve">环境合同与生产边界</w:t>
+            </w:r>
+          </w:p>
+        </w:tc>
+      </w:tr>
+      <w:tr>
+        <w:trPr>
+          <w:cantSplit w:val="true"/>
+        </w:trPr>
+        <w:tc>
+          <w:tcPr>
+            <w:tcW w:w="1900" w:type="dxa"/>
+            <w:vAlign w:val="center"/>
+            <w:tcMar>
+              <w:top w:w="80" w:type="dxa"/>
+              <w:start w:w="120" w:type="dxa"/>
+              <w:bottom w:w="80" w:type="dxa"/>
+              <w:end w:w="120" w:type="dxa"/>
+            </w:tcMar>
+          </w:tcPr>
+          <w:p>
+            <w:pPr>
+              <w:pStyle w:val="NanoLoopTable"/>
+              <w:keepNext w:val="0"/>
+              <w:keepLines w:val="0"/>
+              <w:jc w:val="left"/>
+            </w:pPr>
+            <w:r>
+              <w:rPr>
+                <w:rStyle w:val="VerbatimChar"/>
+                <w:rFonts w:ascii="Arial" w:hAnsi="Arial" w:eastAsia="PingFang SC" w:cs="Arial"/>
+                <w:sz w:val="17"/>
+                <w:lang w:val="zh-CN" w:eastAsia="zh-CN"/>
+              </w:rPr>
+              <w:t xml:space="preserve">docs/adr/0004-shared-api-key-and-single-process-rate-limit.md</w:t>
+            </w:r>
+          </w:p>
+        </w:tc>
+        <w:tc>
+          <w:tcPr>
+            <w:tcW w:w="3150" w:type="dxa"/>
+            <w:vAlign w:val="center"/>
+            <w:tcMar>
+              <w:top w:w="80" w:type="dxa"/>
+              <w:start w:w="120" w:type="dxa"/>
+              <w:bottom w:w="80" w:type="dxa"/>
+              <w:end w:w="120" w:type="dxa"/>
+            </w:tcMar>
+          </w:tcPr>
+          <w:p>
+            <w:pPr>
+              <w:pStyle w:val="NanoLoopTable"/>
+              <w:keepNext w:val="0"/>
+              <w:keepLines w:val="0"/>
+              <w:jc w:val="left"/>
+            </w:pPr>
+            <w:r>
+              <w:rPr>
+                <w:rFonts w:ascii="Arial" w:hAnsi="Arial" w:eastAsia="PingFang SC" w:cs="Arial"/>
+                <w:sz w:val="17"/>
+                <w:lang w:val="zh-CN" w:eastAsia="zh-CN"/>
+              </w:rPr>
+              <w:t xml:space="preserve">当前安全决策、顺序与局限</w:t>
+            </w:r>
+          </w:p>
+        </w:tc>
+        <w:tc>
+          <w:tcPr>
+            <w:tcW w:w="4310" w:type="dxa"/>
+            <w:vAlign w:val="center"/>
+            <w:tcMar>
+              <w:top w:w="80" w:type="dxa"/>
+              <w:start w:w="120" w:type="dxa"/>
+              <w:bottom w:w="80" w:type="dxa"/>
+              <w:end w:w="120" w:type="dxa"/>
+            </w:tcMar>
+          </w:tcPr>
+          <w:p>
+            <w:pPr>
+              <w:pStyle w:val="NanoLoopTable"/>
+              <w:keepNext w:val="0"/>
+              <w:keepLines w:val="0"/>
+              <w:jc w:val="left"/>
+            </w:pPr>
+            <w:r>
+              <w:rPr>
+                <w:rFonts w:ascii="Arial" w:hAnsi="Arial" w:eastAsia="PingFang SC" w:cs="Arial"/>
+                <w:sz w:val="17"/>
+                <w:lang w:val="zh-CN" w:eastAsia="zh-CN"/>
+              </w:rPr>
+              <w:t xml:space="preserve">认证/限流更换前先写新 ADR</w:t>
             </w:r>
           </w:p>
         </w:tc>
@@ -16912,6 +17910,158 @@
     </w:p>
     <w:p>
       <w:pPr>
+        <w:widowControl/>
+        <w:numPr>
+          <w:ilvl w:val="0"/>
+          <w:numId w:val="1015"/>
+        </w:numPr>
+        <w:pStyle w:val="Compact"/>
+      </w:pPr>
+      <w:r>
+        <w:rPr>
+          <w:rFonts w:ascii="Arial" w:hAnsi="Arial" w:eastAsia="PingFang SC" w:cs="Arial"/>
+          <w:lang w:val="zh-CN" w:eastAsia="zh-CN"/>
+        </w:rPr>
+        <w:t xml:space="preserve">共享 Key 启用时，版本化 API、签名文件下载和版本化 health 不得绕过验证；公开豁免必须是精确路径，只有外层 CORS middleware 识别的合法预检可直接响应。</w:t>
+      </w:r>
+    </w:p>
+    <w:p>
+      <w:pPr>
+        <w:widowControl/>
+        <w:numPr>
+          <w:ilvl w:val="0"/>
+          <w:numId w:val="1015"/>
+        </w:numPr>
+        <w:pStyle w:val="Compact"/>
+      </w:pPr>
+      <w:r>
+        <w:rPr>
+          <w:rFonts w:ascii="Arial" w:hAnsi="Arial" w:eastAsia="PingFang SC" w:cs="Arial"/>
+          <w:lang w:val="zh-CN" w:eastAsia="zh-CN"/>
+        </w:rPr>
+        <w:t xml:space="preserve">不得记录、回显或把原始 Key 放入错误 details；后端 verifier 只保留摘要，重复 Key 头部必须 fail closed。</w:t>
+      </w:r>
+    </w:p>
+    <w:p>
+      <w:pPr>
+        <w:widowControl/>
+        <w:numPr>
+          <w:ilvl w:val="0"/>
+          <w:numId w:val="1015"/>
+        </w:numPr>
+        <w:pStyle w:val="Compact"/>
+      </w:pPr>
+      <w:r>
+        <w:rPr>
+          <w:rFonts w:ascii="Arial" w:hAnsi="Arial" w:eastAsia="PingFang SC" w:cs="Arial"/>
+          <w:lang w:val="zh-CN" w:eastAsia="zh-CN"/>
+        </w:rPr>
+        <w:t xml:space="preserve">中间件顺序、CORS 响应头和 OpenAPI</w:t>
+      </w:r>
+      <w:r>
+        <w:rPr>
+          <w:rFonts w:ascii="Arial" w:hAnsi="Arial" w:eastAsia="PingFang SC" w:cs="Arial"/>
+          <w:lang w:val="zh-CN" w:eastAsia="zh-CN"/>
+        </w:rPr>
+        <w:t xml:space="preserve"> </w:t>
+      </w:r>
+      <w:r>
+        <w:rPr>
+          <w:rStyle w:val="VerbatimChar"/>
+        </w:rPr>
+        <w:t xml:space="preserve">ApiKeyAuth</w:t>
+      </w:r>
+      <w:r>
+        <w:rPr>
+          <w:rFonts w:ascii="Arial" w:hAnsi="Arial" w:eastAsia="PingFang SC" w:cs="Arial"/>
+          <w:lang w:val="zh-CN" w:eastAsia="zh-CN"/>
+        </w:rPr>
+        <w:t xml:space="preserve">/401/403/429 是公开合同；修改时同步 HTTP 合同测试。</w:t>
+      </w:r>
+    </w:p>
+    <w:p>
+      <w:pPr>
+        <w:widowControl/>
+        <w:numPr>
+          <w:ilvl w:val="0"/>
+          <w:numId w:val="1015"/>
+        </w:numPr>
+        <w:pStyle w:val="Compact"/>
+      </w:pPr>
+      <w:r>
+        <w:rPr>
+          <w:rFonts w:ascii="Arial" w:hAnsi="Arial" w:eastAsia="PingFang SC" w:cs="Arial"/>
+          <w:lang w:val="zh-CN" w:eastAsia="zh-CN"/>
+        </w:rPr>
+        <w:t xml:space="preserve">进程内限流不得按 IP/Key 动态无界建桶，也不得声称为多 worker/多副本全局配额。</w:t>
+      </w:r>
+    </w:p>
+    <w:p>
+      <w:pPr>
+        <w:widowControl/>
+        <w:numPr>
+          <w:ilvl w:val="0"/>
+          <w:numId w:val="1015"/>
+        </w:numPr>
+        <w:pStyle w:val="Compact"/>
+      </w:pPr>
+      <w:r>
+        <w:rPr>
+          <w:rFonts w:ascii="Arial" w:hAnsi="Arial" w:eastAsia="PingFang SC" w:cs="Arial"/>
+          <w:lang w:val="zh-CN" w:eastAsia="zh-CN"/>
+        </w:rPr>
+        <w:t xml:space="preserve">Compose/容器 DNS 名必须显式进入</w:t>
+      </w:r>
+      <w:r>
+        <w:rPr>
+          <w:rFonts w:ascii="Arial" w:hAnsi="Arial" w:eastAsia="PingFang SC" w:cs="Arial"/>
+          <w:lang w:val="zh-CN" w:eastAsia="zh-CN"/>
+        </w:rPr>
+        <w:t xml:space="preserve"> </w:t>
+      </w:r>
+      <w:r>
+        <w:rPr>
+          <w:rStyle w:val="VerbatimChar"/>
+        </w:rPr>
+        <w:t xml:space="preserve">TRUSTED_HOSTS</w:t>
+      </w:r>
+      <w:r>
+        <w:rPr>
+          <w:rFonts w:ascii="Arial" w:hAnsi="Arial" w:eastAsia="PingFang SC" w:cs="Arial"/>
+          <w:lang w:val="zh-CN" w:eastAsia="zh-CN"/>
+        </w:rPr>
+        <w:t xml:space="preserve">；不得用</w:t>
+      </w:r>
+      <w:r>
+        <w:rPr>
+          <w:rFonts w:ascii="Arial" w:hAnsi="Arial" w:eastAsia="PingFang SC" w:cs="Arial"/>
+          <w:lang w:val="zh-CN" w:eastAsia="zh-CN"/>
+        </w:rPr>
+        <w:t xml:space="preserve"> </w:t>
+      </w:r>
+      <w:r>
+        <w:rPr>
+          <w:rStyle w:val="VerbatimChar"/>
+        </w:rPr>
+        <w:t xml:space="preserve">*</w:t>
+      </w:r>
+      <w:r>
+        <w:rPr>
+          <w:rFonts w:ascii="Arial" w:hAnsi="Arial" w:eastAsia="PingFang SC" w:cs="Arial"/>
+          <w:lang w:val="zh-CN" w:eastAsia="zh-CN"/>
+        </w:rPr>
+        <w:t xml:space="preserve"> </w:t>
+      </w:r>
+      <w:r>
+        <w:rPr>
+          <w:rFonts w:ascii="Arial" w:hAnsi="Arial" w:eastAsia="PingFang SC" w:cs="Arial"/>
+          <w:lang w:val="zh-CN" w:eastAsia="zh-CN"/>
+        </w:rPr>
+        <w:t xml:space="preserve">为了便利跨容器访问而关闭 Host 边界。</w:t>
+      </w:r>
+    </w:p>
+    <w:p>
+      <w:pPr>
         <w:pStyle w:val="FirstParagraph"/>
         <w:widowControl/>
       </w:pPr>
@@ -17165,7 +18315,7 @@
                 <w:sz w:val="17"/>
                 <w:lang w:val="zh-CN" w:eastAsia="zh-CN"/>
               </w:rPr>
-              <w:t xml:space="preserve">引入明确身份认证和授权边界</w:t>
+              <w:t xml:space="preserve">用用户/租户身份与资源授权取代共享 Key 边界</w:t>
             </w:r>
           </w:p>
         </w:tc>
@@ -17193,7 +18343,7 @@
                 <w:sz w:val="17"/>
                 <w:lang w:val="zh-CN" w:eastAsia="zh-CN"/>
               </w:rPr>
-              <w:t xml:space="preserve">API/文件下载均按主体授权；匿名行为、错误与审计有测试</w:t>
+              <w:t xml:space="preserve">API/文件下载按主体和所有权授权；登录、匿名、撤销、错误与审计有测试</w:t>
             </w:r>
           </w:p>
         </w:tc>
@@ -17315,7 +18465,7 @@
                 <w:sz w:val="17"/>
                 <w:lang w:val="zh-CN" w:eastAsia="zh-CN"/>
               </w:rPr>
-              <w:t xml:space="preserve">C-P1</w:t>
+              <w:t xml:space="preserve">C-P0</w:t>
             </w:r>
           </w:p>
         </w:tc>
@@ -17343,7 +18493,7 @@
                 <w:sz w:val="17"/>
                 <w:lang w:val="zh-CN" w:eastAsia="zh-CN"/>
               </w:rPr>
-              <w:t xml:space="preserve">设计 PostgreSQL + 共享对象存储 + 外部任务队列</w:t>
+              <w:t xml:space="preserve">增加备份/恢复与灾难演练</w:t>
             </w:r>
           </w:p>
         </w:tc>
@@ -17371,7 +18521,7 @@
                 <w:sz w:val="17"/>
                 <w:lang w:val="zh-CN" w:eastAsia="zh-CN"/>
               </w:rPr>
-              <w:t xml:space="preserve">ADR、迁移工具、幂等 worker ownership 和回滚演练</w:t>
+              <w:t xml:space="preserve">DB、制品、模型 snapshot、知识索引版本可一致恢复；定期演练 RPO/RTO</w:t>
             </w:r>
           </w:p>
         </w:tc>
@@ -17432,7 +18582,7 @@
                 <w:sz w:val="17"/>
                 <w:lang w:val="zh-CN" w:eastAsia="zh-CN"/>
               </w:rPr>
-              <w:t xml:space="preserve">增加备份/恢复与灾难演练</w:t>
+              <w:t xml:space="preserve">设计 PostgreSQL + 共享对象存储 + 外部任务队列</w:t>
             </w:r>
           </w:p>
         </w:tc>
@@ -17460,7 +18610,96 @@
                 <w:sz w:val="17"/>
                 <w:lang w:val="zh-CN" w:eastAsia="zh-CN"/>
               </w:rPr>
-              <w:t xml:space="preserve">DB、制品、模型 snapshot、知识索引版本可一致恢复</w:t>
+              <w:t xml:space="preserve">ADR、迁移工具、幂等 worker ownership 和回滚演练</w:t>
+            </w:r>
+          </w:p>
+        </w:tc>
+      </w:tr>
+      <w:tr>
+        <w:trPr>
+          <w:cantSplit w:val="true"/>
+        </w:trPr>
+        <w:tc>
+          <w:tcPr>
+            <w:tcW w:w="1900" w:type="dxa"/>
+            <w:vAlign w:val="center"/>
+            <w:tcMar>
+              <w:top w:w="80" w:type="dxa"/>
+              <w:start w:w="120" w:type="dxa"/>
+              <w:bottom w:w="80" w:type="dxa"/>
+              <w:end w:w="120" w:type="dxa"/>
+            </w:tcMar>
+          </w:tcPr>
+          <w:p>
+            <w:pPr>
+              <w:pStyle w:val="NanoLoopTable"/>
+              <w:keepNext w:val="0"/>
+              <w:keepLines w:val="0"/>
+              <w:jc w:val="left"/>
+            </w:pPr>
+            <w:r>
+              <w:rPr>
+                <w:rFonts w:ascii="Arial" w:hAnsi="Arial" w:eastAsia="PingFang SC" w:cs="Arial"/>
+                <w:sz w:val="17"/>
+                <w:lang w:val="zh-CN" w:eastAsia="zh-CN"/>
+              </w:rPr>
+              <w:t xml:space="preserve">C-P1</w:t>
+            </w:r>
+          </w:p>
+        </w:tc>
+        <w:tc>
+          <w:tcPr>
+            <w:tcW w:w="3150" w:type="dxa"/>
+            <w:vAlign w:val="center"/>
+            <w:tcMar>
+              <w:top w:w="80" w:type="dxa"/>
+              <w:start w:w="120" w:type="dxa"/>
+              <w:bottom w:w="80" w:type="dxa"/>
+              <w:end w:w="120" w:type="dxa"/>
+            </w:tcMar>
+          </w:tcPr>
+          <w:p>
+            <w:pPr>
+              <w:pStyle w:val="NanoLoopTable"/>
+              <w:keepNext w:val="0"/>
+              <w:keepLines w:val="0"/>
+              <w:jc w:val="left"/>
+            </w:pPr>
+            <w:r>
+              <w:rPr>
+                <w:rFonts w:ascii="Arial" w:hAnsi="Arial" w:eastAsia="PingFang SC" w:cs="Arial"/>
+                <w:sz w:val="17"/>
+                <w:lang w:val="zh-CN" w:eastAsia="zh-CN"/>
+              </w:rPr>
+              <w:t xml:space="preserve">将单进程三桶升级为分布式主体限流</w:t>
+            </w:r>
+          </w:p>
+        </w:tc>
+        <w:tc>
+          <w:tcPr>
+            <w:tcW w:w="4310" w:type="dxa"/>
+            <w:vAlign w:val="center"/>
+            <w:tcMar>
+              <w:top w:w="80" w:type="dxa"/>
+              <w:start w:w="120" w:type="dxa"/>
+              <w:bottom w:w="80" w:type="dxa"/>
+              <w:end w:w="120" w:type="dxa"/>
+            </w:tcMar>
+          </w:tcPr>
+          <w:p>
+            <w:pPr>
+              <w:pStyle w:val="NanoLoopTable"/>
+              <w:keepNext w:val="0"/>
+              <w:keepLines w:val="0"/>
+              <w:jc w:val="left"/>
+            </w:pPr>
+            <w:r>
+              <w:rPr>
+                <w:rFonts w:ascii="Arial" w:hAnsi="Arial" w:eastAsia="PingFang SC" w:cs="Arial"/>
+                <w:sz w:val="17"/>
+                <w:lang w:val="zh-CN" w:eastAsia="zh-CN"/>
+              </w:rPr>
+              <w:t xml:space="preserve">多副本共享计数、按主体/操作分级、时钟/故障策略和容量测试有证据</w:t>
             </w:r>
           </w:p>
         </w:tc>
@@ -17611,7 +18850,51 @@
           <w:sz w:val="16"/>
           <w:lang w:val="zh-CN" w:eastAsia="zh-CN"/>
         </w:rPr>
-        <w:t xml:space="preserve"> tests/unit/api tests/unit/db tests/unit/storage tests/unit/orchestration</w:t>
+        <w:t xml:space="preserve"> tests/unit/api tests/unit/core/test_security.py tests/unit/core/test_rate_limit.py</w:t>
+      </w:r>
+      <w:r>
+        <w:rPr>
+          <w:rFonts w:ascii="Menlo" w:hAnsi="Menlo" w:eastAsia="PingFang SC" w:cs="Menlo"/>
+          <w:sz w:val="16"/>
+          <w:lang w:val="zh-CN" w:eastAsia="zh-CN"/>
+        </w:rPr>
+        <w:br/>
+      </w:r>
+      <w:r>
+        <w:rPr>
+          <w:rStyle w:val="ExtensionTok"/>
+          <w:rFonts w:ascii="Menlo" w:hAnsi="Menlo" w:eastAsia="PingFang SC" w:cs="Menlo"/>
+          <w:sz w:val="16"/>
+          <w:lang w:val="zh-CN" w:eastAsia="zh-CN"/>
+        </w:rPr>
+        <w:t xml:space="preserve">.venv/bin/pytest</w:t>
+      </w:r>
+      <w:r>
+        <w:rPr>
+          <w:rStyle w:val="NormalTok"/>
+          <w:rFonts w:ascii="Menlo" w:hAnsi="Menlo" w:eastAsia="PingFang SC" w:cs="Menlo"/>
+          <w:sz w:val="16"/>
+          <w:lang w:val="zh-CN" w:eastAsia="zh-CN"/>
+        </w:rPr>
+        <w:t xml:space="preserve"> </w:t>
+      </w:r>
+      <w:r>
+        <w:rPr>
+          <w:rStyle w:val="AttributeTok"/>
+          <w:rFonts w:ascii="Menlo" w:hAnsi="Menlo" w:eastAsia="PingFang SC" w:cs="Menlo"/>
+          <w:sz w:val="16"/>
+          <w:lang w:val="zh-CN" w:eastAsia="zh-CN"/>
+        </w:rPr>
+        <w:t xml:space="preserve">-q</w:t>
+      </w:r>
+      <w:r>
+        <w:rPr>
+          <w:rStyle w:val="NormalTok"/>
+          <w:rFonts w:ascii="Menlo" w:hAnsi="Menlo" w:eastAsia="PingFang SC" w:cs="Menlo"/>
+          <w:sz w:val="16"/>
+          <w:lang w:val="zh-CN" w:eastAsia="zh-CN"/>
+        </w:rPr>
+        <w:t xml:space="preserve"> tests/unit/db tests/unit/storage tests/unit/orchestration</w:t>
       </w:r>
       <w:r>
         <w:rPr>
@@ -20401,7 +21684,165 @@
           <w:rFonts w:ascii="Arial" w:hAnsi="Arial" w:eastAsia="PingFang SC" w:cs="Arial"/>
           <w:lang w:val="zh-CN" w:eastAsia="zh-CN"/>
         </w:rPr>
-        <w:t xml:space="preserve">统一处理 envelope、错误、multipart、下载和查询。</w:t>
+        <w:t xml:space="preserve">统一处理 envelope、错误、multipart、下载和查询；</w:t>
+      </w:r>
+      <w:r>
+        <w:rPr>
+          <w:rStyle w:val="VerbatimChar"/>
+        </w:rPr>
+        <w:t xml:space="preserve">X-API-Key</w:t>
+      </w:r>
+      <w:r>
+        <w:rPr>
+          <w:rFonts w:ascii="Arial" w:hAnsi="Arial" w:eastAsia="PingFang SC" w:cs="Arial"/>
+          <w:lang w:val="zh-CN" w:eastAsia="zh-CN"/>
+        </w:rPr>
+        <w:t xml:space="preserve"> </w:t>
+      </w:r>
+      <w:r>
+        <w:rPr>
+          <w:rFonts w:ascii="Arial" w:hAnsi="Arial" w:eastAsia="PingFang SC" w:cs="Arial"/>
+          <w:lang w:val="zh-CN" w:eastAsia="zh-CN"/>
+        </w:rPr>
+        <w:t xml:space="preserve">只由 client 内部注入，调用方不能通过通用 headers 伪造或替换它。</w:t>
+      </w:r>
+    </w:p>
+    <w:p>
+      <w:pPr>
+        <w:widowControl/>
+        <w:numPr>
+          <w:ilvl w:val="0"/>
+          <w:numId w:val="1018"/>
+        </w:numPr>
+        <w:pStyle w:val="Compact"/>
+      </w:pPr>
+      <w:r>
+        <w:rPr>
+          <w:rStyle w:val="VerbatimChar"/>
+        </w:rPr>
+        <w:t xml:space="preserve">frontend/app.py</w:t>
+      </w:r>
+      <w:r>
+        <w:rPr>
+          <w:rFonts w:ascii="Arial" w:hAnsi="Arial" w:eastAsia="PingFang SC" w:cs="Arial"/>
+          <w:lang w:val="zh-CN" w:eastAsia="zh-CN"/>
+        </w:rPr>
+        <w:t xml:space="preserve"> </w:t>
+      </w:r>
+      <w:r>
+        <w:rPr>
+          <w:rFonts w:ascii="Arial" w:hAnsi="Arial" w:eastAsia="PingFang SC" w:cs="Arial"/>
+          <w:lang w:val="zh-CN" w:eastAsia="zh-CN"/>
+        </w:rPr>
+        <w:t xml:space="preserve">只从</w:t>
+      </w:r>
+      <w:r>
+        <w:rPr>
+          <w:rFonts w:ascii="Arial" w:hAnsi="Arial" w:eastAsia="PingFang SC" w:cs="Arial"/>
+          <w:lang w:val="zh-CN" w:eastAsia="zh-CN"/>
+        </w:rPr>
+        <w:t xml:space="preserve"> </w:t>
+      </w:r>
+      <w:r>
+        <w:rPr>
+          <w:rStyle w:val="VerbatimChar"/>
+        </w:rPr>
+        <w:t xml:space="preserve">NANOLOOP_API_KEY</w:t>
+      </w:r>
+      <w:r>
+        <w:rPr>
+          <w:rFonts w:ascii="Arial" w:hAnsi="Arial" w:eastAsia="PingFang SC" w:cs="Arial"/>
+          <w:lang w:val="zh-CN" w:eastAsia="zh-CN"/>
+        </w:rPr>
+        <w:t xml:space="preserve"> </w:t>
+      </w:r>
+      <w:r>
+        <w:rPr>
+          <w:rFonts w:ascii="Arial" w:hAnsi="Arial" w:eastAsia="PingFang SC" w:cs="Arial"/>
+          <w:lang w:val="zh-CN" w:eastAsia="zh-CN"/>
+        </w:rPr>
+        <w:t xml:space="preserve">进程环境取 Key；client cache key 只保存 SHA-256 指纹，环境 Key 轮换会重建 client。</w:t>
+      </w:r>
+    </w:p>
+    <w:p>
+      <w:pPr>
+        <w:widowControl/>
+        <w:numPr>
+          <w:ilvl w:val="0"/>
+          <w:numId w:val="1018"/>
+        </w:numPr>
+        <w:pStyle w:val="Compact"/>
+      </w:pPr>
+      <w:r>
+        <w:rPr>
+          <w:rFonts w:ascii="Arial" w:hAnsi="Arial" w:eastAsia="PingFang SC" w:cs="Arial"/>
+          <w:lang w:val="zh-CN" w:eastAsia="zh-CN"/>
+        </w:rPr>
+        <w:t xml:space="preserve">Key 启用时，侧边栏的后端地址被</w:t>
+      </w:r>
+      <w:r>
+        <w:rPr>
+          <w:rFonts w:ascii="Arial" w:hAnsi="Arial" w:eastAsia="PingFang SC" w:cs="Arial"/>
+          <w:lang w:val="zh-CN" w:eastAsia="zh-CN"/>
+        </w:rPr>
+        <w:t xml:space="preserve"> </w:t>
+      </w:r>
+      <w:r>
+        <w:rPr>
+          <w:rStyle w:val="VerbatimChar"/>
+        </w:rPr>
+        <w:t xml:space="preserve">NANOLOOP_API_BASE_URL</w:t>
+      </w:r>
+      <w:r>
+        <w:rPr>
+          <w:rFonts w:ascii="Arial" w:hAnsi="Arial" w:eastAsia="PingFang SC" w:cs="Arial"/>
+          <w:lang w:val="zh-CN" w:eastAsia="zh-CN"/>
+        </w:rPr>
+        <w:t xml:space="preserve"> </w:t>
+      </w:r>
+      <w:r>
+        <w:rPr>
+          <w:rFonts w:ascii="Arial" w:hAnsi="Arial" w:eastAsia="PingFang SC" w:cs="Arial"/>
+          <w:lang w:val="zh-CN" w:eastAsia="zh-CN"/>
+        </w:rPr>
+        <w:t xml:space="preserve">锁定且不可编辑；</w:t>
+      </w:r>
+      <w:r>
+        <w:rPr>
+          <w:rStyle w:val="VerbatimChar"/>
+        </w:rPr>
+        <w:t xml:space="preserve">_get_client()</w:t>
+      </w:r>
+      <w:r>
+        <w:rPr>
+          <w:rFonts w:ascii="Arial" w:hAnsi="Arial" w:eastAsia="PingFang SC" w:cs="Arial"/>
+          <w:lang w:val="zh-CN" w:eastAsia="zh-CN"/>
+        </w:rPr>
+        <w:t xml:space="preserve"> </w:t>
+      </w:r>
+      <w:r>
+        <w:rPr>
+          <w:rFonts w:ascii="Arial" w:hAnsi="Arial" w:eastAsia="PingFang SC" w:cs="Arial"/>
+          <w:lang w:val="zh-CN" w:eastAsia="zh-CN"/>
+        </w:rPr>
+        <w:t xml:space="preserve">再次规范化并完全比对会话/运维地址，因而被篡改的 session 无法获得带 Key 的 client。</w:t>
+      </w:r>
+    </w:p>
+    <w:p>
+      <w:pPr>
+        <w:widowControl/>
+        <w:numPr>
+          <w:ilvl w:val="0"/>
+          <w:numId w:val="1018"/>
+        </w:numPr>
+        <w:pStyle w:val="Compact"/>
+      </w:pPr>
+      <w:r>
+        <w:rPr>
+          <w:rFonts w:ascii="Arial" w:hAnsi="Arial" w:eastAsia="PingFang SC" w:cs="Arial"/>
+          <w:lang w:val="zh-CN" w:eastAsia="zh-CN"/>
+        </w:rPr>
+        <w:t xml:space="preserve">Key 未启用时保留原有开发体验：用户可编辑、规范化并保存 API 地址。</w:t>
       </w:r>
     </w:p>
     <w:p>
@@ -20667,7 +22108,7 @@
                 <w:sz w:val="17"/>
                 <w:lang w:val="zh-CN" w:eastAsia="zh-CN"/>
               </w:rPr>
-              <w:t xml:space="preserve">页面路由与业务流程</w:t>
+              <w:t xml:space="preserve">页面路由、业务流程、API 地址锁定与 client cache</w:t>
             </w:r>
           </w:p>
         </w:tc>
@@ -20695,7 +22136,7 @@
                 <w:sz w:val="17"/>
                 <w:lang w:val="zh-CN" w:eastAsia="zh-CN"/>
               </w:rPr>
-              <w:t xml:space="preserve">新页面、工作流和可见状态</w:t>
+              <w:t xml:space="preserve">新页面、工作流、Key 轮换/目标绑定和可见状态</w:t>
             </w:r>
           </w:p>
         </w:tc>
@@ -20757,7 +22198,40 @@
                 <w:sz w:val="17"/>
                 <w:lang w:val="zh-CN" w:eastAsia="zh-CN"/>
               </w:rPr>
-              <w:t xml:space="preserve">REST 唯一入口</w:t>
+              <w:t xml:space="preserve">REST 唯一入口与</w:t>
+            </w:r>
+            <w:r>
+              <w:rPr>
+                <w:rFonts w:ascii="Arial" w:hAnsi="Arial" w:eastAsia="PingFang SC" w:cs="Arial"/>
+                <w:sz w:val="17"/>
+                <w:lang w:val="zh-CN" w:eastAsia="zh-CN"/>
+              </w:rPr>
+              <w:t xml:space="preserve"> </w:t>
+            </w:r>
+            <w:r>
+              <w:rPr>
+                <w:rStyle w:val="VerbatimChar"/>
+                <w:rFonts w:ascii="Arial" w:hAnsi="Arial" w:eastAsia="PingFang SC" w:cs="Arial"/>
+                <w:sz w:val="17"/>
+                <w:lang w:val="zh-CN" w:eastAsia="zh-CN"/>
+              </w:rPr>
+              <w:t xml:space="preserve">X-API-Key</w:t>
+            </w:r>
+            <w:r>
+              <w:rPr>
+                <w:rFonts w:ascii="Arial" w:hAnsi="Arial" w:eastAsia="PingFang SC" w:cs="Arial"/>
+                <w:sz w:val="17"/>
+                <w:lang w:val="zh-CN" w:eastAsia="zh-CN"/>
+              </w:rPr>
+              <w:t xml:space="preserve"> </w:t>
+            </w:r>
+            <w:r>
+              <w:rPr>
+                <w:rFonts w:ascii="Arial" w:hAnsi="Arial" w:eastAsia="PingFang SC" w:cs="Arial"/>
+                <w:sz w:val="17"/>
+                <w:lang w:val="zh-CN" w:eastAsia="zh-CN"/>
+              </w:rPr>
+              <w:t xml:space="preserve">注入</w:t>
             </w:r>
           </w:p>
         </w:tc>
@@ -20785,7 +22259,7 @@
                 <w:sz w:val="17"/>
                 <w:lang w:val="zh-CN" w:eastAsia="zh-CN"/>
               </w:rPr>
-              <w:t xml:space="preserve">API 合同变化、上传、轮询与下载</w:t>
+              <w:t xml:space="preserve">API 合同变化、认证错误、上传、轮询与下载</w:t>
             </w:r>
           </w:p>
         </w:tc>
@@ -21650,6 +23124,185 @@
           <w:lang w:val="zh-CN" w:eastAsia="zh-CN"/>
         </w:rPr>
         <w:t xml:space="preserve">；不合格时隐藏并解释。</w:t>
+      </w:r>
+    </w:p>
+    <w:p>
+      <w:pPr>
+        <w:widowControl/>
+        <w:numPr>
+          <w:ilvl w:val="0"/>
+          <w:numId w:val="1019"/>
+        </w:numPr>
+        <w:pStyle w:val="Compact"/>
+      </w:pPr>
+      <w:r>
+        <w:rPr>
+          <w:rFonts w:ascii="Arial" w:hAnsi="Arial" w:eastAsia="PingFang SC" w:cs="Arial"/>
+          <w:lang w:val="zh-CN" w:eastAsia="zh-CN"/>
+        </w:rPr>
+        <w:t xml:space="preserve">部署 Key 不得作为明文字段进入</w:t>
+      </w:r>
+      <w:r>
+        <w:rPr>
+          <w:rFonts w:ascii="Arial" w:hAnsi="Arial" w:eastAsia="PingFang SC" w:cs="Arial"/>
+          <w:lang w:val="zh-CN" w:eastAsia="zh-CN"/>
+        </w:rPr>
+        <w:t xml:space="preserve"> </w:t>
+      </w:r>
+      <w:r>
+        <w:rPr>
+          <w:rStyle w:val="VerbatimChar"/>
+        </w:rPr>
+        <w:t xml:space="preserve">st.session_state</w:t>
+      </w:r>
+      <w:r>
+        <w:rPr>
+          <w:rFonts w:ascii="Arial" w:hAnsi="Arial" w:eastAsia="PingFang SC" w:cs="Arial"/>
+          <w:lang w:val="zh-CN" w:eastAsia="zh-CN"/>
+        </w:rPr>
+        <w:t xml:space="preserve">、URL、页面、错误文本或日志；client cache 身份只使用指纹，原值封装在 API client 内。</w:t>
+      </w:r>
+    </w:p>
+    <w:p>
+      <w:pPr>
+        <w:widowControl/>
+        <w:numPr>
+          <w:ilvl w:val="0"/>
+          <w:numId w:val="1019"/>
+        </w:numPr>
+        <w:pStyle w:val="Compact"/>
+      </w:pPr>
+      <w:r>
+        <w:rPr>
+          <w:rFonts w:ascii="Arial" w:hAnsi="Arial" w:eastAsia="PingFang SC" w:cs="Arial"/>
+          <w:lang w:val="zh-CN" w:eastAsia="zh-CN"/>
+        </w:rPr>
+        <w:t xml:space="preserve">前端必须保留</w:t>
+      </w:r>
+      <w:r>
+        <w:rPr>
+          <w:rFonts w:ascii="Arial" w:hAnsi="Arial" w:eastAsia="PingFang SC" w:cs="Arial"/>
+          <w:lang w:val="zh-CN" w:eastAsia="zh-CN"/>
+        </w:rPr>
+        <w:t xml:space="preserve"> </w:t>
+      </w:r>
+      <w:r>
+        <w:rPr>
+          <w:rStyle w:val="VerbatimChar"/>
+        </w:rPr>
+        <w:t xml:space="preserve">AUTHENTICATION_REQUIRED</w:t>
+      </w:r>
+      <w:r>
+        <w:rPr>
+          <w:rFonts w:ascii="Arial" w:hAnsi="Arial" w:eastAsia="PingFang SC" w:cs="Arial"/>
+          <w:lang w:val="zh-CN" w:eastAsia="zh-CN"/>
+        </w:rPr>
+        <w:t xml:space="preserve"> </w:t>
+      </w:r>
+      <w:r>
+        <w:rPr>
+          <w:rFonts w:ascii="Arial" w:hAnsi="Arial" w:eastAsia="PingFang SC" w:cs="Arial"/>
+          <w:lang w:val="zh-CN" w:eastAsia="zh-CN"/>
+        </w:rPr>
+        <w:t xml:space="preserve">和</w:t>
+      </w:r>
+      <w:r>
+        <w:rPr>
+          <w:rFonts w:ascii="Arial" w:hAnsi="Arial" w:eastAsia="PingFang SC" w:cs="Arial"/>
+          <w:lang w:val="zh-CN" w:eastAsia="zh-CN"/>
+        </w:rPr>
+        <w:t xml:space="preserve"> </w:t>
+      </w:r>
+      <w:r>
+        <w:rPr>
+          <w:rStyle w:val="VerbatimChar"/>
+        </w:rPr>
+        <w:t xml:space="preserve">RATE_LIMITED</w:t>
+      </w:r>
+      <w:r>
+        <w:rPr>
+          <w:rFonts w:ascii="Arial" w:hAnsi="Arial" w:eastAsia="PingFang SC" w:cs="Arial"/>
+          <w:lang w:val="zh-CN" w:eastAsia="zh-CN"/>
+        </w:rPr>
+        <w:t xml:space="preserve"> </w:t>
+      </w:r>
+      <w:r>
+        <w:rPr>
+          <w:rFonts w:ascii="Arial" w:hAnsi="Arial" w:eastAsia="PingFang SC" w:cs="Arial"/>
+          <w:lang w:val="zh-CN" w:eastAsia="zh-CN"/>
+        </w:rPr>
+        <w:t xml:space="preserve">的服务端语义；对可变更请求不因</w:t>
+      </w:r>
+      <w:r>
+        <w:rPr>
+          <w:rFonts w:ascii="Arial" w:hAnsi="Arial" w:eastAsia="PingFang SC" w:cs="Arial"/>
+          <w:lang w:val="zh-CN" w:eastAsia="zh-CN"/>
+        </w:rPr>
+        <w:t xml:space="preserve"> </w:t>
+      </w:r>
+      <w:r>
+        <w:rPr>
+          <w:rStyle w:val="VerbatimChar"/>
+        </w:rPr>
+        <w:t xml:space="preserve">retryable=true</w:t>
+      </w:r>
+      <w:r>
+        <w:rPr>
+          <w:rFonts w:ascii="Arial" w:hAnsi="Arial" w:eastAsia="PingFang SC" w:cs="Arial"/>
+          <w:lang w:val="zh-CN" w:eastAsia="zh-CN"/>
+        </w:rPr>
+        <w:t xml:space="preserve"> </w:t>
+      </w:r>
+      <w:r>
+        <w:rPr>
+          <w:rFonts w:ascii="Arial" w:hAnsi="Arial" w:eastAsia="PingFang SC" w:cs="Arial"/>
+          <w:lang w:val="zh-CN" w:eastAsia="zh-CN"/>
+        </w:rPr>
+        <w:t xml:space="preserve">而无条件自动重放。</w:t>
+      </w:r>
+    </w:p>
+    <w:p>
+      <w:pPr>
+        <w:widowControl/>
+        <w:numPr>
+          <w:ilvl w:val="0"/>
+          <w:numId w:val="1019"/>
+        </w:numPr>
+        <w:pStyle w:val="Compact"/>
+      </w:pPr>
+      <w:r>
+        <w:rPr>
+          <w:rFonts w:ascii="Arial" w:hAnsi="Arial" w:eastAsia="PingFang SC" w:cs="Arial"/>
+          <w:lang w:val="zh-CN" w:eastAsia="zh-CN"/>
+        </w:rPr>
+        <w:t xml:space="preserve">只要进程配置共享 Key，任何 session 控制的 API 地址都不得越过规范化后的</w:t>
+      </w:r>
+      <w:r>
+        <w:rPr>
+          <w:rFonts w:ascii="Arial" w:hAnsi="Arial" w:eastAsia="PingFang SC" w:cs="Arial"/>
+          <w:lang w:val="zh-CN" w:eastAsia="zh-CN"/>
+        </w:rPr>
+        <w:t xml:space="preserve"> </w:t>
+      </w:r>
+      <w:r>
+        <w:rPr>
+          <w:rStyle w:val="VerbatimChar"/>
+        </w:rPr>
+        <w:t xml:space="preserve">NANOLOOP_API_BASE_URL</w:t>
+      </w:r>
+      <w:r>
+        <w:rPr>
+          <w:rFonts w:ascii="Arial" w:hAnsi="Arial" w:eastAsia="PingFang SC" w:cs="Arial"/>
+          <w:lang w:val="zh-CN" w:eastAsia="zh-CN"/>
+        </w:rPr>
+        <w:t xml:space="preserve"> </w:t>
+      </w:r>
+      <w:r>
+        <w:rPr>
+          <w:rFonts w:ascii="Arial" w:hAnsi="Arial" w:eastAsia="PingFang SC" w:cs="Arial"/>
+          <w:lang w:val="zh-CN" w:eastAsia="zh-CN"/>
+        </w:rPr>
+        <w:t xml:space="preserve">完全匹配；失配时先丢弃旧 client，再可见拒绝创建。</w:t>
       </w:r>
     </w:p>
     <w:bookmarkEnd w:id="81"/>
@@ -22280,6 +23933,184 @@
                 <w:sz w:val="17"/>
                 <w:lang w:val="zh-CN" w:eastAsia="zh-CN"/>
               </w:rPr>
+              <w:t xml:space="preserve">E-P1</w:t>
+            </w:r>
+          </w:p>
+        </w:tc>
+        <w:tc>
+          <w:tcPr>
+            <w:tcW w:w="3150" w:type="dxa"/>
+            <w:vAlign w:val="center"/>
+            <w:tcMar>
+              <w:top w:w="80" w:type="dxa"/>
+              <w:start w:w="120" w:type="dxa"/>
+              <w:bottom w:w="80" w:type="dxa"/>
+              <w:end w:w="120" w:type="dxa"/>
+            </w:tcMar>
+          </w:tcPr>
+          <w:p>
+            <w:pPr>
+              <w:pStyle w:val="NanoLoopTable"/>
+              <w:keepNext w:val="0"/>
+              <w:keepLines w:val="0"/>
+              <w:jc w:val="left"/>
+            </w:pPr>
+            <w:r>
+              <w:rPr>
+                <w:rFonts w:ascii="Arial" w:hAnsi="Arial" w:eastAsia="PingFang SC" w:cs="Arial"/>
+                <w:sz w:val="17"/>
+                <w:lang w:val="zh-CN" w:eastAsia="zh-CN"/>
+              </w:rPr>
+              <w:t xml:space="preserve">完善 401/429 与 Key 轮换体验</w:t>
+            </w:r>
+          </w:p>
+        </w:tc>
+        <w:tc>
+          <w:tcPr>
+            <w:tcW w:w="4310" w:type="dxa"/>
+            <w:vAlign w:val="center"/>
+            <w:tcMar>
+              <w:top w:w="80" w:type="dxa"/>
+              <w:start w:w="120" w:type="dxa"/>
+              <w:bottom w:w="80" w:type="dxa"/>
+              <w:end w:w="120" w:type="dxa"/>
+            </w:tcMar>
+          </w:tcPr>
+          <w:p>
+            <w:pPr>
+              <w:pStyle w:val="NanoLoopTable"/>
+              <w:keepNext w:val="0"/>
+              <w:keepLines w:val="0"/>
+              <w:jc w:val="left"/>
+            </w:pPr>
+            <w:r>
+              <w:rPr>
+                <w:rFonts w:ascii="Arial" w:hAnsi="Arial" w:eastAsia="PingFang SC" w:cs="Arial"/>
+                <w:sz w:val="17"/>
+                <w:lang w:val="zh-CN" w:eastAsia="zh-CN"/>
+              </w:rPr>
+              <w:t xml:space="preserve">401 引导运维更新环境；429 显示等待信息，只对可安全重试的读请求按策略重试</w:t>
+            </w:r>
+          </w:p>
+        </w:tc>
+      </w:tr>
+      <w:tr>
+        <w:trPr>
+          <w:cantSplit w:val="true"/>
+        </w:trPr>
+        <w:tc>
+          <w:tcPr>
+            <w:tcW w:w="1900" w:type="dxa"/>
+            <w:vAlign w:val="center"/>
+            <w:tcMar>
+              <w:top w:w="80" w:type="dxa"/>
+              <w:start w:w="120" w:type="dxa"/>
+              <w:bottom w:w="80" w:type="dxa"/>
+              <w:end w:w="120" w:type="dxa"/>
+            </w:tcMar>
+          </w:tcPr>
+          <w:p>
+            <w:pPr>
+              <w:pStyle w:val="NanoLoopTable"/>
+              <w:keepNext w:val="0"/>
+              <w:keepLines w:val="0"/>
+              <w:jc w:val="left"/>
+            </w:pPr>
+            <w:r>
+              <w:rPr>
+                <w:rFonts w:ascii="Arial" w:hAnsi="Arial" w:eastAsia="PingFang SC" w:cs="Arial"/>
+                <w:sz w:val="17"/>
+                <w:lang w:val="zh-CN" w:eastAsia="zh-CN"/>
+              </w:rPr>
+              <w:t xml:space="preserve">E-P1</w:t>
+            </w:r>
+          </w:p>
+        </w:tc>
+        <w:tc>
+          <w:tcPr>
+            <w:tcW w:w="3150" w:type="dxa"/>
+            <w:vAlign w:val="center"/>
+            <w:tcMar>
+              <w:top w:w="80" w:type="dxa"/>
+              <w:start w:w="120" w:type="dxa"/>
+              <w:bottom w:w="80" w:type="dxa"/>
+              <w:end w:w="120" w:type="dxa"/>
+            </w:tcMar>
+          </w:tcPr>
+          <w:p>
+            <w:pPr>
+              <w:pStyle w:val="NanoLoopTable"/>
+              <w:keepNext w:val="0"/>
+              <w:keepLines w:val="0"/>
+              <w:jc w:val="left"/>
+            </w:pPr>
+            <w:r>
+              <w:rPr>
+                <w:rFonts w:ascii="Arial" w:hAnsi="Arial" w:eastAsia="PingFang SC" w:cs="Arial"/>
+                <w:sz w:val="17"/>
+                <w:lang w:val="zh-CN" w:eastAsia="zh-CN"/>
+              </w:rPr>
+              <w:t xml:space="preserve">扩展共享 Key 目标绑定回归</w:t>
+            </w:r>
+          </w:p>
+        </w:tc>
+        <w:tc>
+          <w:tcPr>
+            <w:tcW w:w="4310" w:type="dxa"/>
+            <w:vAlign w:val="center"/>
+            <w:tcMar>
+              <w:top w:w="80" w:type="dxa"/>
+              <w:start w:w="120" w:type="dxa"/>
+              <w:bottom w:w="80" w:type="dxa"/>
+              <w:end w:w="120" w:type="dxa"/>
+            </w:tcMar>
+          </w:tcPr>
+          <w:p>
+            <w:pPr>
+              <w:pStyle w:val="NanoLoopTable"/>
+              <w:keepNext w:val="0"/>
+              <w:keepLines w:val="0"/>
+              <w:jc w:val="left"/>
+            </w:pPr>
+            <w:r>
+              <w:rPr>
+                <w:rFonts w:ascii="Arial" w:hAnsi="Arial" w:eastAsia="PingFang SC" w:cs="Arial"/>
+                <w:sz w:val="17"/>
+                <w:lang w:val="zh-CN" w:eastAsia="zh-CN"/>
+              </w:rPr>
+              <w:t xml:space="preserve">覆盖等价 URL 规范化、带 path 部署、非法运维值、session 篡改与 Key 轮换；错误中不泄密</w:t>
+            </w:r>
+          </w:p>
+        </w:tc>
+      </w:tr>
+      <w:tr>
+        <w:trPr>
+          <w:cantSplit w:val="true"/>
+        </w:trPr>
+        <w:tc>
+          <w:tcPr>
+            <w:tcW w:w="1900" w:type="dxa"/>
+            <w:vAlign w:val="center"/>
+            <w:tcMar>
+              <w:top w:w="80" w:type="dxa"/>
+              <w:start w:w="120" w:type="dxa"/>
+              <w:bottom w:w="80" w:type="dxa"/>
+              <w:end w:w="120" w:type="dxa"/>
+            </w:tcMar>
+          </w:tcPr>
+          <w:p>
+            <w:pPr>
+              <w:pStyle w:val="NanoLoopTable"/>
+              <w:keepNext w:val="0"/>
+              <w:keepLines w:val="0"/>
+              <w:jc w:val="left"/>
+            </w:pPr>
+            <w:r>
+              <w:rPr>
+                <w:rFonts w:ascii="Arial" w:hAnsi="Arial" w:eastAsia="PingFang SC" w:cs="Arial"/>
+                <w:sz w:val="17"/>
+                <w:lang w:val="zh-CN" w:eastAsia="zh-CN"/>
+              </w:rPr>
               <w:t xml:space="preserve">E-P2</w:t>
             </w:r>
           </w:p>
@@ -22605,7 +24436,34 @@
           <w:rFonts w:ascii="Arial" w:hAnsi="Arial" w:eastAsia="PingFang SC" w:cs="Arial"/>
           <w:lang w:val="zh-CN" w:eastAsia="zh-CN"/>
         </w:rPr>
-        <w:t xml:space="preserve">在 Python 3.11/3.12 测试，并构建非 root、只读根文件系统的 API/前端 CPU 镜像。</w:t>
+        <w:t xml:space="preserve">在 Python 3.11/3.12 测试，并构建 API/前端 CPU 镜像；GitHub</w:t>
+      </w:r>
+      <w:r>
+        <w:rPr>
+          <w:rFonts w:ascii="Arial" w:hAnsi="Arial" w:eastAsia="PingFang SC" w:cs="Arial"/>
+          <w:lang w:val="zh-CN" w:eastAsia="zh-CN"/>
+        </w:rPr>
+        <w:t xml:space="preserve"> </w:t>
+      </w:r>
+      <w:r>
+        <w:rPr>
+          <w:rStyle w:val="VerbatimChar"/>
+        </w:rPr>
+        <w:t xml:space="preserve">main</w:t>
+      </w:r>
+      <w:r>
+        <w:rPr>
+          <w:rFonts w:ascii="Arial" w:hAnsi="Arial" w:eastAsia="PingFang SC" w:cs="Arial"/>
+          <w:lang w:val="zh-CN" w:eastAsia="zh-CN"/>
+        </w:rPr>
+        <w:t xml:space="preserve"> </w:t>
+      </w:r>
+      <w:r>
+        <w:rPr>
+          <w:rFonts w:ascii="Arial" w:hAnsi="Arial" w:eastAsia="PingFang SC" w:cs="Arial"/>
+          <w:lang w:val="zh-CN" w:eastAsia="zh-CN"/>
+        </w:rPr>
+        <w:t xml:space="preserve">基线已通过两个镜像的实际启动验活。</w:t>
       </w:r>
     </w:p>
     <w:p>
@@ -22619,9 +24477,16 @@
       </w:pPr>
       <w:r>
         <w:rPr>
+          <w:rFonts w:ascii="Arial" w:hAnsi="Arial" w:eastAsia="PingFang SC" w:cs="Arial"/>
+          <w:lang w:val="zh-CN" w:eastAsia="zh-CN"/>
+        </w:rPr>
+        <w:t xml:space="preserve">容器 job 用非 root、只读根、</w:t>
+      </w:r>
+      <w:r>
+        <w:rPr>
           <w:rStyle w:val="VerbatimChar"/>
         </w:rPr>
-        <w:t xml:space="preserve">docker-compose.yml</w:t>
+        <w:t xml:space="preserve">cap-drop ALL</w:t>
       </w:r>
       <w:r>
         <w:rPr>
@@ -22635,7 +24500,74 @@
           <w:rFonts w:ascii="Arial" w:hAnsi="Arial" w:eastAsia="PingFang SC" w:cs="Arial"/>
           <w:lang w:val="zh-CN" w:eastAsia="zh-CN"/>
         </w:rPr>
-        <w:t xml:space="preserve">明确只读模型 bundle、可写 snapshot/output/knowledge volumes、cap drop、no-new-privileges 和健康检查。</w:t>
+        <w:t xml:space="preserve">和</w:t>
+      </w:r>
+      <w:r>
+        <w:rPr>
+          <w:rFonts w:ascii="Arial" w:hAnsi="Arial" w:eastAsia="PingFang SC" w:cs="Arial"/>
+          <w:lang w:val="zh-CN" w:eastAsia="zh-CN"/>
+        </w:rPr>
+        <w:t xml:space="preserve"> </w:t>
+      </w:r>
+      <w:r>
+        <w:rPr>
+          <w:rStyle w:val="VerbatimChar"/>
+        </w:rPr>
+        <w:t xml:space="preserve">no-new-privileges</w:t>
+      </w:r>
+      <w:r>
+        <w:rPr>
+          <w:rFonts w:ascii="Arial" w:hAnsi="Arial" w:eastAsia="PingFang SC" w:cs="Arial"/>
+          <w:lang w:val="zh-CN" w:eastAsia="zh-CN"/>
+        </w:rPr>
+        <w:t xml:space="preserve"> </w:t>
+      </w:r>
+      <w:r>
+        <w:rPr>
+          <w:rFonts w:ascii="Arial" w:hAnsi="Arial" w:eastAsia="PingFang SC" w:cs="Arial"/>
+          <w:lang w:val="zh-CN" w:eastAsia="zh-CN"/>
+        </w:rPr>
+        <w:t xml:space="preserve">启动 API/前端；API 先在容器内用 CI 专用 Key 验证受保护的</w:t>
+      </w:r>
+      <w:r>
+        <w:rPr>
+          <w:rFonts w:ascii="Arial" w:hAnsi="Arial" w:eastAsia="PingFang SC" w:cs="Arial"/>
+          <w:lang w:val="zh-CN" w:eastAsia="zh-CN"/>
+        </w:rPr>
+        <w:t xml:space="preserve"> </w:t>
+      </w:r>
+      <w:r>
+        <w:rPr>
+          <w:rStyle w:val="VerbatimChar"/>
+        </w:rPr>
+        <w:t xml:space="preserve">/api/v1/health</w:t>
+      </w:r>
+      <w:r>
+        <w:rPr>
+          <w:rFonts w:ascii="Arial" w:hAnsi="Arial" w:eastAsia="PingFang SC" w:cs="Arial"/>
+          <w:lang w:val="zh-CN" w:eastAsia="zh-CN"/>
+        </w:rPr>
+        <w:t xml:space="preserve">，前端也验证自身</w:t>
+      </w:r>
+      <w:r>
+        <w:rPr>
+          <w:rFonts w:ascii="Arial" w:hAnsi="Arial" w:eastAsia="PingFang SC" w:cs="Arial"/>
+          <w:lang w:val="zh-CN" w:eastAsia="zh-CN"/>
+        </w:rPr>
+        <w:t xml:space="preserve"> </w:t>
+      </w:r>
+      <w:r>
+        <w:rPr>
+          <w:rStyle w:val="VerbatimChar"/>
+        </w:rPr>
+        <w:t xml:space="preserve">/_stcore/health</w:t>
+      </w:r>
+      <w:r>
+        <w:rPr>
+          <w:rFonts w:ascii="Arial" w:hAnsi="Arial" w:eastAsia="PingFang SC" w:cs="Arial"/>
+          <w:lang w:val="zh-CN" w:eastAsia="zh-CN"/>
+        </w:rPr>
+        <w:t xml:space="preserve">。</w:t>
       </w:r>
     </w:p>
     <w:p>
@@ -22649,8 +24581,200 @@
       </w:pPr>
       <w:r>
         <w:rPr>
+          <w:rFonts w:ascii="Arial" w:hAnsi="Arial" w:eastAsia="PingFang SC" w:cs="Arial"/>
+          <w:lang w:val="zh-CN" w:eastAsia="zh-CN"/>
+        </w:rPr>
+        <w:t xml:space="preserve">API 与前端运行在同一个临时隔离 Docker 网络，API 使用</w:t>
+      </w:r>
+      <w:r>
+        <w:rPr>
+          <w:rFonts w:ascii="Arial" w:hAnsi="Arial" w:eastAsia="PingFang SC" w:cs="Arial"/>
+          <w:lang w:val="zh-CN" w:eastAsia="zh-CN"/>
+        </w:rPr>
+        <w:t xml:space="preserve"> </w:t>
+      </w:r>
+      <w:r>
+        <w:rPr>
           <w:rStyle w:val="VerbatimChar"/>
         </w:rPr>
+        <w:t xml:space="preserve">api</w:t>
+      </w:r>
+      <w:r>
+        <w:rPr>
+          <w:rFonts w:ascii="Arial" w:hAnsi="Arial" w:eastAsia="PingFang SC" w:cs="Arial"/>
+          <w:lang w:val="zh-CN" w:eastAsia="zh-CN"/>
+        </w:rPr>
+        <w:t xml:space="preserve"> </w:t>
+      </w:r>
+      <w:r>
+        <w:rPr>
+          <w:rFonts w:ascii="Arial" w:hAnsi="Arial" w:eastAsia="PingFang SC" w:cs="Arial"/>
+          <w:lang w:val="zh-CN" w:eastAsia="zh-CN"/>
+        </w:rPr>
+        <w:t xml:space="preserve">网络别名且</w:t>
+      </w:r>
+      <w:r>
+        <w:rPr>
+          <w:rFonts w:ascii="Arial" w:hAnsi="Arial" w:eastAsia="PingFang SC" w:cs="Arial"/>
+          <w:lang w:val="zh-CN" w:eastAsia="zh-CN"/>
+        </w:rPr>
+        <w:t xml:space="preserve"> </w:t>
+      </w:r>
+      <w:r>
+        <w:rPr>
+          <w:rStyle w:val="VerbatimChar"/>
+        </w:rPr>
+        <w:t xml:space="preserve">TRUSTED_HOSTS</w:t>
+      </w:r>
+      <w:r>
+        <w:rPr>
+          <w:rFonts w:ascii="Arial" w:hAnsi="Arial" w:eastAsia="PingFang SC" w:cs="Arial"/>
+          <w:lang w:val="zh-CN" w:eastAsia="zh-CN"/>
+        </w:rPr>
+        <w:t xml:space="preserve"> </w:t>
+      </w:r>
+      <w:r>
+        <w:rPr>
+          <w:rFonts w:ascii="Arial" w:hAnsi="Arial" w:eastAsia="PingFang SC" w:cs="Arial"/>
+          <w:lang w:val="zh-CN" w:eastAsia="zh-CN"/>
+        </w:rPr>
+        <w:t xml:space="preserve">显式允许该名。前端容器携带同一合成 Key 实际请求</w:t>
+      </w:r>
+      <w:r>
+        <w:rPr>
+          <w:rFonts w:ascii="Arial" w:hAnsi="Arial" w:eastAsia="PingFang SC" w:cs="Arial"/>
+          <w:lang w:val="zh-CN" w:eastAsia="zh-CN"/>
+        </w:rPr>
+        <w:t xml:space="preserve"> </w:t>
+      </w:r>
+      <w:r>
+        <w:rPr>
+          <w:rStyle w:val="VerbatimChar"/>
+        </w:rPr>
+        <w:t xml:space="preserve">http://api:8000/api/v1/health</w:t>
+      </w:r>
+      <w:r>
+        <w:rPr>
+          <w:rFonts w:ascii="Arial" w:hAnsi="Arial" w:eastAsia="PingFang SC" w:cs="Arial"/>
+          <w:lang w:val="zh-CN" w:eastAsia="zh-CN"/>
+        </w:rPr>
+        <w:t xml:space="preserve">，一次覆盖 Docker DNS、Host allowlist 和 Key 跨容器传递。</w:t>
+      </w:r>
+    </w:p>
+    <w:p>
+      <w:pPr>
+        <w:widowControl/>
+        <w:numPr>
+          <w:ilvl w:val="0"/>
+          <w:numId w:val="1020"/>
+        </w:numPr>
+        <w:pStyle w:val="Compact"/>
+      </w:pPr>
+      <w:r>
+        <w:rPr>
+          <w:rFonts w:ascii="Arial" w:hAnsi="Arial" w:eastAsia="PingFang SC" w:cs="Arial"/>
+          <w:lang w:val="zh-CN" w:eastAsia="zh-CN"/>
+        </w:rPr>
+        <w:t xml:space="preserve">当前 workflow 中</w:t>
+      </w:r>
+      <w:r>
+        <w:rPr>
+          <w:rFonts w:ascii="Arial" w:hAnsi="Arial" w:eastAsia="PingFang SC" w:cs="Arial"/>
+          <w:lang w:val="zh-CN" w:eastAsia="zh-CN"/>
+        </w:rPr>
+        <w:t xml:space="preserve"> </w:t>
+      </w:r>
+      <w:r>
+        <w:rPr>
+          <w:rStyle w:val="VerbatimChar"/>
+        </w:rPr>
+        <w:t xml:space="preserve">actions/checkout</w:t>
+      </w:r>
+      <w:r>
+        <w:rPr>
+          <w:rFonts w:ascii="Arial" w:hAnsi="Arial" w:eastAsia="PingFang SC" w:cs="Arial"/>
+          <w:lang w:val="zh-CN" w:eastAsia="zh-CN"/>
+        </w:rPr>
+        <w:t xml:space="preserve"> </w:t>
+      </w:r>
+      <w:r>
+        <w:rPr>
+          <w:rFonts w:ascii="Arial" w:hAnsi="Arial" w:eastAsia="PingFang SC" w:cs="Arial"/>
+          <w:lang w:val="zh-CN" w:eastAsia="zh-CN"/>
+        </w:rPr>
+        <w:t xml:space="preserve">和</w:t>
+      </w:r>
+      <w:r>
+        <w:rPr>
+          <w:rFonts w:ascii="Arial" w:hAnsi="Arial" w:eastAsia="PingFang SC" w:cs="Arial"/>
+          <w:lang w:val="zh-CN" w:eastAsia="zh-CN"/>
+        </w:rPr>
+        <w:t xml:space="preserve"> </w:t>
+      </w:r>
+      <w:r>
+        <w:rPr>
+          <w:rStyle w:val="VerbatimChar"/>
+        </w:rPr>
+        <w:t xml:space="preserve">actions/setup-python</w:t>
+      </w:r>
+      <w:r>
+        <w:rPr>
+          <w:rFonts w:ascii="Arial" w:hAnsi="Arial" w:eastAsia="PingFang SC" w:cs="Arial"/>
+          <w:lang w:val="zh-CN" w:eastAsia="zh-CN"/>
+        </w:rPr>
+        <w:t xml:space="preserve"> </w:t>
+      </w:r>
+      <w:r>
+        <w:rPr>
+          <w:rFonts w:ascii="Arial" w:hAnsi="Arial" w:eastAsia="PingFang SC" w:cs="Arial"/>
+          <w:lang w:val="zh-CN" w:eastAsia="zh-CN"/>
+        </w:rPr>
+        <w:t xml:space="preserve">均固定为官方 release 的完整 commit SHA；更新时必须记录对应 tag 与审核依据。</w:t>
+      </w:r>
+    </w:p>
+    <w:p>
+      <w:pPr>
+        <w:widowControl/>
+        <w:numPr>
+          <w:ilvl w:val="0"/>
+          <w:numId w:val="1020"/>
+        </w:numPr>
+        <w:pStyle w:val="Compact"/>
+      </w:pPr>
+      <w:r>
+        <w:rPr>
+          <w:rStyle w:val="VerbatimChar"/>
+        </w:rPr>
+        <w:t xml:space="preserve">docker-compose.yml</w:t>
+      </w:r>
+      <w:r>
+        <w:rPr>
+          <w:rFonts w:ascii="Arial" w:hAnsi="Arial" w:eastAsia="PingFang SC" w:cs="Arial"/>
+          <w:lang w:val="zh-CN" w:eastAsia="zh-CN"/>
+        </w:rPr>
+        <w:t xml:space="preserve"> </w:t>
+      </w:r>
+      <w:r>
+        <w:rPr>
+          <w:rFonts w:ascii="Arial" w:hAnsi="Arial" w:eastAsia="PingFang SC" w:cs="Arial"/>
+          <w:lang w:val="zh-CN" w:eastAsia="zh-CN"/>
+        </w:rPr>
+        <w:t xml:space="preserve">明确只读模型 bundle、可写 snapshot/output/knowledge volumes、cap drop、no-new-privileges 和健康检查。</w:t>
+      </w:r>
+    </w:p>
+    <w:p>
+      <w:pPr>
+        <w:widowControl/>
+        <w:numPr>
+          <w:ilvl w:val="0"/>
+          <w:numId w:val="1020"/>
+        </w:numPr>
+        <w:pStyle w:val="Compact"/>
+      </w:pPr>
+      <w:r>
+        <w:rPr>
+          <w:rStyle w:val="VerbatimChar"/>
+        </w:rPr>
         <w:t xml:space="preserve">scripts/smoke_test.py</w:t>
       </w:r>
       <w:r>
@@ -22665,7 +24789,61 @@
           <w:rFonts w:ascii="Arial" w:hAnsi="Arial" w:eastAsia="PingFang SC" w:cs="Arial"/>
           <w:lang w:val="zh-CN" w:eastAsia="zh-CN"/>
         </w:rPr>
-        <w:t xml:space="preserve">定义黑盒闭环；无外部资产时只能用</w:t>
+        <w:t xml:space="preserve">定义黑盒闭环，通过</w:t>
+      </w:r>
+      <w:r>
+        <w:rPr>
+          <w:rFonts w:ascii="Arial" w:hAnsi="Arial" w:eastAsia="PingFang SC" w:cs="Arial"/>
+          <w:lang w:val="zh-CN" w:eastAsia="zh-CN"/>
+        </w:rPr>
+        <w:t xml:space="preserve"> </w:t>
+      </w:r>
+      <w:r>
+        <w:rPr>
+          <w:rStyle w:val="VerbatimChar"/>
+        </w:rPr>
+        <w:t xml:space="preserve">--api-key</w:t>
+      </w:r>
+      <w:r>
+        <w:rPr>
+          <w:rFonts w:ascii="Arial" w:hAnsi="Arial" w:eastAsia="PingFang SC" w:cs="Arial"/>
+          <w:lang w:val="zh-CN" w:eastAsia="zh-CN"/>
+        </w:rPr>
+        <w:t xml:space="preserve"> </w:t>
+      </w:r>
+      <w:r>
+        <w:rPr>
+          <w:rFonts w:ascii="Arial" w:hAnsi="Arial" w:eastAsia="PingFang SC" w:cs="Arial"/>
+          <w:lang w:val="zh-CN" w:eastAsia="zh-CN"/>
+        </w:rPr>
+        <w:t xml:space="preserve">或</w:t>
+      </w:r>
+      <w:r>
+        <w:rPr>
+          <w:rFonts w:ascii="Arial" w:hAnsi="Arial" w:eastAsia="PingFang SC" w:cs="Arial"/>
+          <w:lang w:val="zh-CN" w:eastAsia="zh-CN"/>
+        </w:rPr>
+        <w:t xml:space="preserve"> </w:t>
+      </w:r>
+      <w:r>
+        <w:rPr>
+          <w:rStyle w:val="VerbatimChar"/>
+        </w:rPr>
+        <w:t xml:space="preserve">NANOLOOP_API_KEY</w:t>
+      </w:r>
+      <w:r>
+        <w:rPr>
+          <w:rFonts w:ascii="Arial" w:hAnsi="Arial" w:eastAsia="PingFang SC" w:cs="Arial"/>
+          <w:lang w:val="zh-CN" w:eastAsia="zh-CN"/>
+        </w:rPr>
+        <w:t xml:space="preserve"> </w:t>
+      </w:r>
+      <w:r>
+        <w:rPr>
+          <w:rFonts w:ascii="Arial" w:hAnsi="Arial" w:eastAsia="PingFang SC" w:cs="Arial"/>
+          <w:lang w:val="zh-CN" w:eastAsia="zh-CN"/>
+        </w:rPr>
+        <w:t xml:space="preserve">调用受保护 API；无外部资产时只能用</w:t>
       </w:r>
       <w:r>
         <w:rPr>
@@ -23816,7 +25994,7 @@
           <w:rFonts w:ascii="Arial" w:hAnsi="Arial" w:eastAsia="PingFang SC" w:cs="Arial"/>
           <w:lang w:val="zh-CN" w:eastAsia="zh-CN"/>
         </w:rPr>
-        <w:t xml:space="preserve">普通测试不得依赖外网、私有权重、生产语料、API Key 或特定 GPU。</w:t>
+        <w:t xml:space="preserve">普通测试不得依赖外网、私有权重、生产语料、外部注入/生产 API Key 或特定 GPU；安全合同测试使用固定合成 Key。</w:t>
       </w:r>
     </w:p>
     <w:p>
@@ -23943,6 +26121,148 @@
           <w:lang w:val="zh-CN" w:eastAsia="zh-CN"/>
         </w:rPr>
         <w:t xml:space="preserve">、数据库和运行输出。</w:t>
+      </w:r>
+    </w:p>
+    <w:p>
+      <w:pPr>
+        <w:widowControl/>
+        <w:numPr>
+          <w:ilvl w:val="0"/>
+          <w:numId w:val="1021"/>
+        </w:numPr>
+        <w:pStyle w:val="Compact"/>
+      </w:pPr>
+      <w:r>
+        <w:rPr>
+          <w:rFonts w:ascii="Arial" w:hAnsi="Arial" w:eastAsia="PingFang SC" w:cs="Arial"/>
+          <w:lang w:val="zh-CN" w:eastAsia="zh-CN"/>
+        </w:rPr>
+        <w:t xml:space="preserve">第三方 Actions 只能引用审核过的完整 commit SHA；版本 tag 仅作注释，不得退回浮动</w:t>
+      </w:r>
+      <w:r>
+        <w:rPr>
+          <w:rFonts w:ascii="Arial" w:hAnsi="Arial" w:eastAsia="PingFang SC" w:cs="Arial"/>
+          <w:lang w:val="zh-CN" w:eastAsia="zh-CN"/>
+        </w:rPr>
+        <w:t xml:space="preserve"> </w:t>
+      </w:r>
+      <w:r>
+        <w:rPr>
+          <w:rStyle w:val="VerbatimChar"/>
+        </w:rPr>
+        <w:t xml:space="preserve">@vN</w:t>
+      </w:r>
+      <w:r>
+        <w:rPr>
+          <w:rFonts w:ascii="Arial" w:hAnsi="Arial" w:eastAsia="PingFang SC" w:cs="Arial"/>
+          <w:lang w:val="zh-CN" w:eastAsia="zh-CN"/>
+        </w:rPr>
+        <w:t xml:space="preserve">。</w:t>
+      </w:r>
+    </w:p>
+    <w:p>
+      <w:pPr>
+        <w:widowControl/>
+        <w:numPr>
+          <w:ilvl w:val="0"/>
+          <w:numId w:val="1021"/>
+        </w:numPr>
+        <w:pStyle w:val="Compact"/>
+      </w:pPr>
+      <w:r>
+        <w:rPr>
+          <w:rFonts w:ascii="Arial" w:hAnsi="Arial" w:eastAsia="PingFang SC" w:cs="Arial"/>
+          <w:lang w:val="zh-CN" w:eastAsia="zh-CN"/>
+        </w:rPr>
+        <w:t xml:space="preserve">CI 中的 API Key 必须是专用合成值，不复用部署密钥；日志、失败输出和测试 snapshot 不得包含原始秘密。</w:t>
+      </w:r>
+    </w:p>
+    <w:p>
+      <w:pPr>
+        <w:widowControl/>
+        <w:numPr>
+          <w:ilvl w:val="0"/>
+          <w:numId w:val="1021"/>
+        </w:numPr>
+        <w:pStyle w:val="Compact"/>
+      </w:pPr>
+      <w:r>
+        <w:rPr>
+          <w:rFonts w:ascii="Arial" w:hAnsi="Arial" w:eastAsia="PingFang SC" w:cs="Arial"/>
+          <w:lang w:val="zh-CN" w:eastAsia="zh-CN"/>
+        </w:rPr>
+        <w:t xml:space="preserve">OpenAPI 快照必须保留</w:t>
+      </w:r>
+      <w:r>
+        <w:rPr>
+          <w:rFonts w:ascii="Arial" w:hAnsi="Arial" w:eastAsia="PingFang SC" w:cs="Arial"/>
+          <w:lang w:val="zh-CN" w:eastAsia="zh-CN"/>
+        </w:rPr>
+        <w:t xml:space="preserve"> </w:t>
+      </w:r>
+      <w:r>
+        <w:rPr>
+          <w:rStyle w:val="VerbatimChar"/>
+        </w:rPr>
+        <w:t xml:space="preserve">ApiKeyAuth</w:t>
+      </w:r>
+      <w:r>
+        <w:rPr>
+          <w:rFonts w:ascii="Arial" w:hAnsi="Arial" w:eastAsia="PingFang SC" w:cs="Arial"/>
+          <w:lang w:val="zh-CN" w:eastAsia="zh-CN"/>
+        </w:rPr>
+        <w:t xml:space="preserve"> </w:t>
+      </w:r>
+      <w:r>
+        <w:rPr>
+          <w:rFonts w:ascii="Arial" w:hAnsi="Arial" w:eastAsia="PingFang SC" w:cs="Arial"/>
+          <w:lang w:val="zh-CN" w:eastAsia="zh-CN"/>
+        </w:rPr>
+        <w:t xml:space="preserve">header scheme、全部版本化 operation 的 security requirement 以及 401/403/429 错误响应。</w:t>
+      </w:r>
+    </w:p>
+    <w:p>
+      <w:pPr>
+        <w:widowControl/>
+        <w:numPr>
+          <w:ilvl w:val="0"/>
+          <w:numId w:val="1021"/>
+        </w:numPr>
+        <w:pStyle w:val="Compact"/>
+      </w:pPr>
+      <w:r>
+        <w:rPr>
+          <w:rFonts w:ascii="Arial" w:hAnsi="Arial" w:eastAsia="PingFang SC" w:cs="Arial"/>
+          <w:lang w:val="zh-CN" w:eastAsia="zh-CN"/>
+        </w:rPr>
+        <w:t xml:space="preserve">容器 CI 不得只用 localhost 分别验进程；至少一个请求必须从前端容器通过服务 DNS 携 Key 到达受保护 API，并保持精确</w:t>
+      </w:r>
+      <w:r>
+        <w:rPr>
+          <w:rFonts w:ascii="Arial" w:hAnsi="Arial" w:eastAsia="PingFang SC" w:cs="Arial"/>
+          <w:lang w:val="zh-CN" w:eastAsia="zh-CN"/>
+        </w:rPr>
+        <w:t xml:space="preserve"> </w:t>
+      </w:r>
+      <w:r>
+        <w:rPr>
+          <w:rStyle w:val="VerbatimChar"/>
+        </w:rPr>
+        <w:t xml:space="preserve">TRUSTED_HOSTS</w:t>
+      </w:r>
+      <w:r>
+        <w:rPr>
+          <w:rFonts w:ascii="Arial" w:hAnsi="Arial" w:eastAsia="PingFang SC" w:cs="Arial"/>
+          <w:lang w:val="zh-CN" w:eastAsia="zh-CN"/>
+        </w:rPr>
+        <w:t xml:space="preserve"> </w:t>
+      </w:r>
+      <w:r>
+        <w:rPr>
+          <w:rFonts w:ascii="Arial" w:hAnsi="Arial" w:eastAsia="PingFang SC" w:cs="Arial"/>
+          <w:lang w:val="zh-CN" w:eastAsia="zh-CN"/>
+        </w:rPr>
+        <w:t xml:space="preserve">而非 wildcard。</w:t>
       </w:r>
     </w:p>
     <w:bookmarkEnd w:id="88"/>
@@ -24139,7 +26459,7 @@
                 <w:sz w:val="17"/>
                 <w:lang w:val="zh-CN" w:eastAsia="zh-CN"/>
               </w:rPr>
-              <w:t xml:space="preserve">建立首次可追溯 GitHub 基线并按批次同步</w:t>
+              <w:t xml:space="preserve">持续维护 GitHub 发布门禁与可追溯批次</w:t>
             </w:r>
           </w:p>
         </w:tc>
@@ -24167,7 +26487,7 @@
                 <w:sz w:val="17"/>
                 <w:lang w:val="zh-CN" w:eastAsia="zh-CN"/>
               </w:rPr>
-              <w:t xml:space="preserve">分支、提交、Draft PR、CI 链接和变更摘要完整</w:t>
+              <w:t xml:space="preserve">短分支、提交、Draft PR、必需 CI、回滚信息和变更摘要完整</w:t>
             </w:r>
           </w:p>
         </w:tc>
@@ -24406,7 +26726,7 @@
                 <w:sz w:val="17"/>
                 <w:lang w:val="zh-CN" w:eastAsia="zh-CN"/>
               </w:rPr>
-              <w:t xml:space="preserve">启动并健康检查前端 CI 容器</w:t>
+              <w:t xml:space="preserve">把已有跨容器 health 扩展为业务请求/安全头 E2E</w:t>
             </w:r>
           </w:p>
         </w:tc>
@@ -24434,40 +26754,7 @@
                 <w:sz w:val="17"/>
                 <w:lang w:val="zh-CN" w:eastAsia="zh-CN"/>
               </w:rPr>
-              <w:t xml:space="preserve">当前 CI 只构建前端镜像；新增非 root、只读根和</w:t>
-            </w:r>
-            <w:r>
-              <w:rPr>
-                <w:rFonts w:ascii="Arial" w:hAnsi="Arial" w:eastAsia="PingFang SC" w:cs="Arial"/>
-                <w:sz w:val="17"/>
-                <w:lang w:val="zh-CN" w:eastAsia="zh-CN"/>
-              </w:rPr>
-              <w:t xml:space="preserve"> </w:t>
-            </w:r>
-            <w:r>
-              <w:rPr>
-                <w:rStyle w:val="VerbatimChar"/>
-                <w:rFonts w:ascii="Arial" w:hAnsi="Arial" w:eastAsia="PingFang SC" w:cs="Arial"/>
-                <w:sz w:val="17"/>
-                <w:lang w:val="zh-CN" w:eastAsia="zh-CN"/>
-              </w:rPr>
-              <w:t xml:space="preserve">/health</w:t>
-            </w:r>
-            <w:r>
-              <w:rPr>
-                <w:rFonts w:ascii="Arial" w:hAnsi="Arial" w:eastAsia="PingFang SC" w:cs="Arial"/>
-                <w:sz w:val="17"/>
-                <w:lang w:val="zh-CN" w:eastAsia="zh-CN"/>
-              </w:rPr>
-              <w:t xml:space="preserve"> </w:t>
-            </w:r>
-            <w:r>
-              <w:rPr>
-                <w:rFonts w:ascii="Arial" w:hAnsi="Arial" w:eastAsia="PingFang SC" w:cs="Arial"/>
-                <w:sz w:val="17"/>
-                <w:lang w:val="zh-CN" w:eastAsia="zh-CN"/>
-              </w:rPr>
-              <w:t xml:space="preserve">运行证据</w:t>
+              <w:t xml:space="preserve">在已验证 DNS/Host/Key 基础上，覆盖 Streamlit 实际 client、上传、读状态、签名下载和 CORS/限流响应头；可使用可授权固定 fixture</w:t>
             </w:r>
           </w:p>
         </w:tc>
@@ -24645,7 +26932,7 @@
                 <w:sz w:val="17"/>
                 <w:lang w:val="zh-CN" w:eastAsia="zh-CN"/>
               </w:rPr>
-              <w:t xml:space="preserve">constraints/lock、基础镜像 digest、Actions commit SHA 与更新流程明确</w:t>
+              <w:t xml:space="preserve">constraints/lock、基础镜像 digest、已固定 Actions 的更新流程明确</w:t>
             </w:r>
           </w:p>
         </w:tc>
@@ -25261,6 +27548,42 @@
       </w:pPr>
       <w:r>
         <w:rPr>
+          <w:rStyle w:val="VariableTok"/>
+          <w:rFonts w:ascii="Menlo" w:hAnsi="Menlo" w:eastAsia="PingFang SC" w:cs="Menlo"/>
+          <w:sz w:val="16"/>
+          <w:lang w:val="zh-CN" w:eastAsia="zh-CN"/>
+        </w:rPr>
+        <w:t xml:space="preserve">NANOLOOP_API_KEY</w:t>
+      </w:r>
+      <w:r>
+        <w:rPr>
+          <w:rStyle w:val="OperatorTok"/>
+          <w:rFonts w:ascii="Menlo" w:hAnsi="Menlo" w:eastAsia="PingFang SC" w:cs="Menlo"/>
+          <w:sz w:val="16"/>
+          <w:lang w:val="zh-CN" w:eastAsia="zh-CN"/>
+        </w:rPr>
+        <w:t xml:space="preserve">=</w:t>
+      </w:r>
+      <w:r>
+        <w:rPr>
+          <w:rStyle w:val="StringTok"/>
+          <w:rFonts w:ascii="Menlo" w:hAnsi="Menlo" w:eastAsia="PingFang SC" w:cs="Menlo"/>
+          <w:sz w:val="16"/>
+          <w:lang w:val="zh-CN" w:eastAsia="zh-CN"/>
+        </w:rPr>
+        <w:t xml:space="preserve">'&lt;deployment-key&gt;'</w:t>
+      </w:r>
+      <w:r>
+        <w:rPr>
+          <w:rStyle w:val="NormalTok"/>
+          <w:rFonts w:ascii="Menlo" w:hAnsi="Menlo" w:eastAsia="PingFang SC" w:cs="Menlo"/>
+          <w:sz w:val="16"/>
+          <w:lang w:val="zh-CN" w:eastAsia="zh-CN"/>
+        </w:rPr>
+        <w:t xml:space="preserve"> </w:t>
+      </w:r>
+      <w:r>
+        <w:rPr>
           <w:rStyle w:val="ExtensionTok"/>
           <w:rFonts w:ascii="Menlo" w:hAnsi="Menlo" w:eastAsia="PingFang SC" w:cs="Menlo"/>
           <w:sz w:val="16"/>
@@ -25369,6 +27692,32 @@
     <w:p>
       <w:pPr>
         <w:pStyle w:val="FirstParagraph"/>
+        <w:widowControl/>
+      </w:pPr>
+      <w:r>
+        <w:rPr>
+          <w:rStyle w:val="VerbatimChar"/>
+        </w:rPr>
+        <w:t xml:space="preserve">--api-key</w:t>
+      </w:r>
+      <w:r>
+        <w:rPr>
+          <w:rFonts w:ascii="Arial" w:hAnsi="Arial" w:eastAsia="PingFang SC" w:cs="Arial"/>
+          <w:lang w:val="zh-CN" w:eastAsia="zh-CN"/>
+        </w:rPr>
+        <w:t xml:space="preserve"> </w:t>
+      </w:r>
+      <w:r>
+        <w:rPr>
+          <w:rFonts w:ascii="Arial" w:hAnsi="Arial" w:eastAsia="PingFang SC" w:cs="Arial"/>
+          <w:lang w:val="zh-CN" w:eastAsia="zh-CN"/>
+        </w:rPr>
+        <w:t xml:space="preserve">可显式覆盖环境值；CI 和文档不得使用真实部署 Key 作示例。</w:t>
+      </w:r>
+    </w:p>
+    <w:p>
+      <w:pPr>
+        <w:pStyle w:val="BodyText"/>
         <w:widowControl/>
       </w:pPr>
       <w:r>
@@ -26521,7 +28870,7 @@
           <w:rFonts w:ascii="Arial" w:hAnsi="Arial" w:eastAsia="PingFang SC" w:cs="Arial"/>
           <w:lang w:val="zh-CN" w:eastAsia="zh-CN"/>
         </w:rPr>
-        <w:t xml:space="preserve">所有路径均位于</w:t>
+        <w:t xml:space="preserve">所有版本化路径均位于</w:t>
       </w:r>
       <w:r>
         <w:rPr>
@@ -26541,12 +28890,59 @@
           <w:rFonts w:ascii="Arial" w:hAnsi="Arial" w:eastAsia="PingFang SC" w:cs="Arial"/>
           <w:lang w:val="zh-CN" w:eastAsia="zh-CN"/>
         </w:rPr>
-        <w:t xml:space="preserve">；</w:t>
+        <w:t xml:space="preserve">，并在 OpenAPI 声明 header 型</w:t>
+      </w:r>
+      <w:r>
+        <w:rPr>
+          <w:rFonts w:ascii="Arial" w:hAnsi="Arial" w:eastAsia="PingFang SC" w:cs="Arial"/>
+          <w:lang w:val="zh-CN" w:eastAsia="zh-CN"/>
+        </w:rPr>
+        <w:t xml:space="preserve"> </w:t>
       </w:r>
       <w:r>
         <w:rPr>
           <w:rStyle w:val="VerbatimChar"/>
         </w:rPr>
+        <w:t xml:space="preserve">ApiKeyAuth</w:t>
+      </w:r>
+      <w:r>
+        <w:rPr>
+          <w:rFonts w:ascii="Arial" w:hAnsi="Arial" w:eastAsia="PingFang SC" w:cs="Arial"/>
+          <w:lang w:val="zh-CN" w:eastAsia="zh-CN"/>
+        </w:rPr>
+        <w:t xml:space="preserve">。只有配置</w:t>
+      </w:r>
+      <w:r>
+        <w:rPr>
+          <w:rFonts w:ascii="Arial" w:hAnsi="Arial" w:eastAsia="PingFang SC" w:cs="Arial"/>
+          <w:lang w:val="zh-CN" w:eastAsia="zh-CN"/>
+        </w:rPr>
+        <w:t xml:space="preserve"> </w:t>
+      </w:r>
+      <w:r>
+        <w:rPr>
+          <w:rStyle w:val="VerbatimChar"/>
+        </w:rPr>
+        <w:t xml:space="preserve">NANOLOOP_API_KEY</w:t>
+      </w:r>
+      <w:r>
+        <w:rPr>
+          <w:rFonts w:ascii="Arial" w:hAnsi="Arial" w:eastAsia="PingFang SC" w:cs="Arial"/>
+          <w:lang w:val="zh-CN" w:eastAsia="zh-CN"/>
+        </w:rPr>
+        <w:t xml:space="preserve"> </w:t>
+      </w:r>
+      <w:r>
+        <w:rPr>
+          <w:rFonts w:ascii="Arial" w:hAnsi="Arial" w:eastAsia="PingFang SC" w:cs="Arial"/>
+          <w:lang w:val="zh-CN" w:eastAsia="zh-CN"/>
+        </w:rPr>
+        <w:t xml:space="preserve">时才执行共享 Key；没配置时保持本地开发兼容。</w:t>
+      </w:r>
+      <w:r>
+        <w:rPr>
+          <w:rStyle w:val="VerbatimChar"/>
+        </w:rPr>
         <w:t xml:space="preserve">GET /health</w:t>
       </w:r>
       <w:r>
@@ -26561,7 +28957,82 @@
           <w:rFonts w:ascii="Arial" w:hAnsi="Arial" w:eastAsia="PingFang SC" w:cs="Arial"/>
           <w:lang w:val="zh-CN" w:eastAsia="zh-CN"/>
         </w:rPr>
-        <w:t xml:space="preserve">还提供无前缀兼容入口。</w:t>
+        <w:t xml:space="preserve">是精确公开的无前缀</w:t>
+      </w:r>
+      <w:r>
+        <w:rPr>
+          <w:rFonts w:ascii="Arial" w:hAnsi="Arial" w:eastAsia="PingFang SC" w:cs="Arial"/>
+          <w:lang w:val="zh-CN" w:eastAsia="zh-CN"/>
+        </w:rPr>
+        <w:t xml:space="preserve"> </w:t>
+      </w:r>
+      <w:r>
+        <w:rPr>
+          <w:rFonts w:ascii="Arial" w:hAnsi="Arial" w:eastAsia="PingFang SC" w:cs="Arial"/>
+          <w:lang w:val="zh-CN" w:eastAsia="zh-CN"/>
+        </w:rPr>
+        <w:t xml:space="preserve">容器健康入口，而表中</w:t>
+      </w:r>
+      <w:r>
+        <w:rPr>
+          <w:rFonts w:ascii="Arial" w:hAnsi="Arial" w:eastAsia="PingFang SC" w:cs="Arial"/>
+          <w:lang w:val="zh-CN" w:eastAsia="zh-CN"/>
+        </w:rPr>
+        <w:t xml:space="preserve"> </w:t>
+      </w:r>
+      <w:r>
+        <w:rPr>
+          <w:rStyle w:val="VerbatimChar"/>
+        </w:rPr>
+        <w:t xml:space="preserve">/api/v1/health</w:t>
+      </w:r>
+      <w:r>
+        <w:rPr>
+          <w:rFonts w:ascii="Arial" w:hAnsi="Arial" w:eastAsia="PingFang SC" w:cs="Arial"/>
+          <w:lang w:val="zh-CN" w:eastAsia="zh-CN"/>
+        </w:rPr>
+        <w:t xml:space="preserve"> </w:t>
+      </w:r>
+      <w:r>
+        <w:rPr>
+          <w:rFonts w:ascii="Arial" w:hAnsi="Arial" w:eastAsia="PingFang SC" w:cs="Arial"/>
+          <w:lang w:val="zh-CN" w:eastAsia="zh-CN"/>
+        </w:rPr>
+        <w:t xml:space="preserve">在 Key 启用时需要</w:t>
+      </w:r>
+      <w:r>
+        <w:rPr>
+          <w:rFonts w:ascii="Arial" w:hAnsi="Arial" w:eastAsia="PingFang SC" w:cs="Arial"/>
+          <w:lang w:val="zh-CN" w:eastAsia="zh-CN"/>
+        </w:rPr>
+        <w:t xml:space="preserve"> </w:t>
+      </w:r>
+      <w:r>
+        <w:rPr>
+          <w:rStyle w:val="VerbatimChar"/>
+        </w:rPr>
+        <w:t xml:space="preserve">X-API-Key</w:t>
+      </w:r>
+      <w:r>
+        <w:rPr>
+          <w:rFonts w:ascii="Arial" w:hAnsi="Arial" w:eastAsia="PingFang SC" w:cs="Arial"/>
+          <w:lang w:val="zh-CN" w:eastAsia="zh-CN"/>
+        </w:rPr>
+        <w:t xml:space="preserve">。OpenAPI/Swagger/ReDoc 路径同样</w:t>
+      </w:r>
+      <w:r>
+        <w:rPr>
+          <w:rFonts w:ascii="Arial" w:hAnsi="Arial" w:eastAsia="PingFang SC" w:cs="Arial"/>
+          <w:lang w:val="zh-CN" w:eastAsia="zh-CN"/>
+        </w:rPr>
+        <w:t xml:space="preserve"> </w:t>
+      </w:r>
+      <w:r>
+        <w:rPr>
+          <w:rFonts w:ascii="Arial" w:hAnsi="Arial" w:eastAsia="PingFang SC" w:cs="Arial"/>
+          <w:lang w:val="zh-CN" w:eastAsia="zh-CN"/>
+        </w:rPr>
+        <w:t xml:space="preserve">精确公开；签名文件 URL 仍需 Key，token 不替代部署认证。</w:t>
       </w:r>
     </w:p>
     <w:tbl>
@@ -28991,6 +31462,39 @@
         <w:rPr>
           <w:rStyle w:val="VerbatimChar"/>
         </w:rPr>
+        <w:t xml:space="preserve">AUTHENTICATION_REQUIRED</w:t>
+      </w:r>
+      <w:r>
+        <w:rPr>
+          <w:rFonts w:ascii="Arial" w:hAnsi="Arial" w:eastAsia="PingFang SC" w:cs="Arial"/>
+          <w:lang w:val="zh-CN" w:eastAsia="zh-CN"/>
+        </w:rPr>
+        <w:t xml:space="preserve">、</w:t>
+      </w:r>
+      <w:r>
+        <w:rPr>
+          <w:rStyle w:val="VerbatimChar"/>
+        </w:rPr>
+        <w:t xml:space="preserve">RATE_LIMITED</w:t>
+      </w:r>
+      <w:r>
+        <w:rPr>
+          <w:rFonts w:ascii="Arial" w:hAnsi="Arial" w:eastAsia="PingFang SC" w:cs="Arial"/>
+          <w:lang w:val="zh-CN" w:eastAsia="zh-CN"/>
+        </w:rPr>
+        <w:t xml:space="preserve">、</w:t>
+      </w:r>
+      <w:r>
+        <w:rPr>
+          <w:rFonts w:ascii="Arial" w:hAnsi="Arial" w:eastAsia="PingFang SC" w:cs="Arial"/>
+          <w:lang w:val="zh-CN" w:eastAsia="zh-CN"/>
+        </w:rPr>
+        <w:t xml:space="preserve"> </w:t>
+      </w:r>
+      <w:r>
+        <w:rPr>
+          <w:rStyle w:val="VerbatimChar"/>
+        </w:rPr>
         <w:t xml:space="preserve">INPUT_ARTIFACT_MISMATCH</w:t>
       </w:r>
       <w:r>
@@ -29209,7 +31713,148 @@
           <w:rFonts w:ascii="Arial" w:hAnsi="Arial" w:eastAsia="PingFang SC" w:cs="Arial"/>
           <w:lang w:val="zh-CN" w:eastAsia="zh-CN"/>
         </w:rPr>
-        <w:t xml:space="preserve">。证据不足通常是 HTTP 200 的业务结果，不应误当传输异常。</w:t>
+        <w:t xml:space="preserve">。</w:t>
+      </w:r>
+      <w:r>
+        <w:rPr>
+          <w:rStyle w:val="VerbatimChar"/>
+        </w:rPr>
+        <w:t xml:space="preserve">AUTHENTICATION_REQUIRED</w:t>
+      </w:r>
+      <w:r>
+        <w:rPr>
+          <w:rFonts w:ascii="Arial" w:hAnsi="Arial" w:eastAsia="PingFang SC" w:cs="Arial"/>
+          <w:lang w:val="zh-CN" w:eastAsia="zh-CN"/>
+        </w:rPr>
+        <w:t xml:space="preserve"> </w:t>
+      </w:r>
+      <w:r>
+        <w:rPr>
+          <w:rFonts w:ascii="Arial" w:hAnsi="Arial" w:eastAsia="PingFang SC" w:cs="Arial"/>
+          <w:lang w:val="zh-CN" w:eastAsia="zh-CN"/>
+        </w:rPr>
+        <w:t xml:space="preserve">使用 HTTP 401 与</w:t>
+      </w:r>
+      <w:r>
+        <w:rPr>
+          <w:rFonts w:ascii="Arial" w:hAnsi="Arial" w:eastAsia="PingFang SC" w:cs="Arial"/>
+          <w:lang w:val="zh-CN" w:eastAsia="zh-CN"/>
+        </w:rPr>
+        <w:t xml:space="preserve"> </w:t>
+      </w:r>
+      <w:r>
+        <w:rPr>
+          <w:rStyle w:val="VerbatimChar"/>
+        </w:rPr>
+        <w:t xml:space="preserve">WWW-Authenticate</w:t>
+      </w:r>
+      <w:r>
+        <w:rPr>
+          <w:rFonts w:ascii="Arial" w:hAnsi="Arial" w:eastAsia="PingFang SC" w:cs="Arial"/>
+          <w:lang w:val="zh-CN" w:eastAsia="zh-CN"/>
+        </w:rPr>
+        <w:t xml:space="preserve">；</w:t>
+      </w:r>
+      <w:r>
+        <w:rPr>
+          <w:rFonts w:ascii="Arial" w:hAnsi="Arial" w:eastAsia="PingFang SC" w:cs="Arial"/>
+          <w:lang w:val="zh-CN" w:eastAsia="zh-CN"/>
+        </w:rPr>
+        <w:t xml:space="preserve"> </w:t>
+      </w:r>
+      <w:r>
+        <w:rPr>
+          <w:rStyle w:val="VerbatimChar"/>
+        </w:rPr>
+        <w:t xml:space="preserve">RATE_LIMITED</w:t>
+      </w:r>
+      <w:r>
+        <w:rPr>
+          <w:rFonts w:ascii="Arial" w:hAnsi="Arial" w:eastAsia="PingFang SC" w:cs="Arial"/>
+          <w:lang w:val="zh-CN" w:eastAsia="zh-CN"/>
+        </w:rPr>
+        <w:t xml:space="preserve"> </w:t>
+      </w:r>
+      <w:r>
+        <w:rPr>
+          <w:rFonts w:ascii="Arial" w:hAnsi="Arial" w:eastAsia="PingFang SC" w:cs="Arial"/>
+          <w:lang w:val="zh-CN" w:eastAsia="zh-CN"/>
+        </w:rPr>
+        <w:t xml:space="preserve">使用 HTTP 429、</w:t>
+      </w:r>
+      <w:r>
+        <w:rPr>
+          <w:rStyle w:val="VerbatimChar"/>
+        </w:rPr>
+        <w:t xml:space="preserve">retryable=true</w:t>
+      </w:r>
+      <w:r>
+        <w:rPr>
+          <w:rFonts w:ascii="Arial" w:hAnsi="Arial" w:eastAsia="PingFang SC" w:cs="Arial"/>
+          <w:lang w:val="zh-CN" w:eastAsia="zh-CN"/>
+        </w:rPr>
+        <w:t xml:space="preserve">、</w:t>
+      </w:r>
+      <w:r>
+        <w:rPr>
+          <w:rStyle w:val="VerbatimChar"/>
+        </w:rPr>
+        <w:t xml:space="preserve">Retry-After</w:t>
+      </w:r>
+      <w:r>
+        <w:rPr>
+          <w:rFonts w:ascii="Arial" w:hAnsi="Arial" w:eastAsia="PingFang SC" w:cs="Arial"/>
+          <w:lang w:val="zh-CN" w:eastAsia="zh-CN"/>
+        </w:rPr>
+        <w:t xml:space="preserve"> </w:t>
+      </w:r>
+      <w:r>
+        <w:rPr>
+          <w:rFonts w:ascii="Arial" w:hAnsi="Arial" w:eastAsia="PingFang SC" w:cs="Arial"/>
+          <w:lang w:val="zh-CN" w:eastAsia="zh-CN"/>
+        </w:rPr>
+        <w:t xml:space="preserve">与</w:t>
+      </w:r>
+      <w:r>
+        <w:rPr>
+          <w:rFonts w:ascii="Arial" w:hAnsi="Arial" w:eastAsia="PingFang SC" w:cs="Arial"/>
+          <w:lang w:val="zh-CN" w:eastAsia="zh-CN"/>
+        </w:rPr>
+        <w:t xml:space="preserve"> </w:t>
+      </w:r>
+      <w:r>
+        <w:rPr>
+          <w:rStyle w:val="VerbatimChar"/>
+        </w:rPr>
+        <w:t xml:space="preserve">X-RateLimit-*</w:t>
+      </w:r>
+      <w:r>
+        <w:rPr>
+          <w:rFonts w:ascii="Arial" w:hAnsi="Arial" w:eastAsia="PingFang SC" w:cs="Arial"/>
+          <w:lang w:val="zh-CN" w:eastAsia="zh-CN"/>
+        </w:rPr>
+        <w:t xml:space="preserve"> </w:t>
+      </w:r>
+      <w:r>
+        <w:rPr>
+          <w:rFonts w:ascii="Arial" w:hAnsi="Arial" w:eastAsia="PingFang SC" w:cs="Arial"/>
+          <w:lang w:val="zh-CN" w:eastAsia="zh-CN"/>
+        </w:rPr>
+        <w:t xml:space="preserve">头。证据不足</w:t>
+      </w:r>
+      <w:r>
+        <w:rPr>
+          <w:rFonts w:ascii="Arial" w:hAnsi="Arial" w:eastAsia="PingFang SC" w:cs="Arial"/>
+          <w:lang w:val="zh-CN" w:eastAsia="zh-CN"/>
+        </w:rPr>
+        <w:t xml:space="preserve"> </w:t>
+      </w:r>
+      <w:r>
+        <w:rPr>
+          <w:rFonts w:ascii="Arial" w:hAnsi="Arial" w:eastAsia="PingFang SC" w:cs="Arial"/>
+          <w:lang w:val="zh-CN" w:eastAsia="zh-CN"/>
+        </w:rPr>
+        <w:t xml:space="preserve">通常是 HTTP 200 的业务结果，不应误当传输异常。</w:t>
       </w:r>
     </w:p>
     <w:bookmarkEnd w:id="97"/>
@@ -32052,7 +34697,24 @@
                 <w:sz w:val="17"/>
                 <w:lang w:val="zh-CN" w:eastAsia="zh-CN"/>
               </w:rPr>
-              <w:t xml:space="preserve">local/test hosts</w:t>
+              <w:t xml:space="preserve">local/test hosts；Compose 追加</w:t>
+            </w:r>
+            <w:r>
+              <w:rPr>
+                <w:rFonts w:ascii="Arial" w:hAnsi="Arial" w:eastAsia="PingFang SC" w:cs="Arial"/>
+                <w:sz w:val="17"/>
+                <w:lang w:val="zh-CN" w:eastAsia="zh-CN"/>
+              </w:rPr>
+              <w:t xml:space="preserve"> </w:t>
+            </w:r>
+            <w:r>
+              <w:rPr>
+                <w:rStyle w:val="VerbatimChar"/>
+                <w:rFonts w:ascii="Arial" w:hAnsi="Arial" w:eastAsia="PingFang SC" w:cs="Arial"/>
+                <w:sz w:val="17"/>
+                <w:lang w:val="zh-CN" w:eastAsia="zh-CN"/>
+              </w:rPr>
+              <w:t xml:space="preserve">api</w:t>
             </w:r>
           </w:p>
         </w:tc>
@@ -32108,7 +34770,7 @@
                 <w:sz w:val="17"/>
                 <w:lang w:val="zh-CN" w:eastAsia="zh-CN"/>
               </w:rPr>
-              <w:t xml:space="preserve">显式 Host allowlist</w:t>
+              <w:t xml:space="preserve">显式 Host allowlist；内部服务 DNS 名也必须精确列出</w:t>
             </w:r>
           </w:p>
         </w:tc>
@@ -32227,6 +34889,572 @@
                 <w:lang w:val="zh-CN" w:eastAsia="zh-CN"/>
               </w:rPr>
               <w:t xml:space="preserve">浏览器写请求允许 origin</w:t>
+            </w:r>
+          </w:p>
+        </w:tc>
+      </w:tr>
+      <w:tr>
+        <w:trPr>
+          <w:cantSplit w:val="true"/>
+        </w:trPr>
+        <w:tc>
+          <w:tcPr>
+            <w:tcW w:w="2450" w:type="dxa"/>
+            <w:vAlign w:val="center"/>
+            <w:tcMar>
+              <w:top w:w="80" w:type="dxa"/>
+              <w:start w:w="120" w:type="dxa"/>
+              <w:bottom w:w="80" w:type="dxa"/>
+              <w:end w:w="120" w:type="dxa"/>
+            </w:tcMar>
+          </w:tcPr>
+          <w:p>
+            <w:pPr>
+              <w:pStyle w:val="NanoLoopTable"/>
+              <w:keepNext w:val="0"/>
+              <w:keepLines w:val="0"/>
+              <w:jc w:val="left"/>
+            </w:pPr>
+            <w:r>
+              <w:rPr>
+                <w:rStyle w:val="VerbatimChar"/>
+                <w:rFonts w:ascii="Arial" w:hAnsi="Arial" w:eastAsia="PingFang SC" w:cs="Arial"/>
+                <w:sz w:val="17"/>
+                <w:lang w:val="zh-CN" w:eastAsia="zh-CN"/>
+              </w:rPr>
+              <w:t xml:space="preserve">NANOLOOP_API_KEY</w:t>
+            </w:r>
+          </w:p>
+        </w:tc>
+        <w:tc>
+          <w:tcPr>
+            <w:tcW w:w="1550" w:type="dxa"/>
+            <w:vAlign w:val="center"/>
+            <w:tcMar>
+              <w:top w:w="80" w:type="dxa"/>
+              <w:start w:w="120" w:type="dxa"/>
+              <w:bottom w:w="80" w:type="dxa"/>
+              <w:end w:w="120" w:type="dxa"/>
+            </w:tcMar>
+          </w:tcPr>
+          <w:p>
+            <w:pPr>
+              <w:pStyle w:val="NanoLoopTable"/>
+              <w:keepNext w:val="0"/>
+              <w:keepLines w:val="0"/>
+              <w:jc w:val="left"/>
+            </w:pPr>
+            <w:r>
+              <w:rPr>
+                <w:rFonts w:ascii="Arial" w:hAnsi="Arial" w:eastAsia="PingFang SC" w:cs="Arial"/>
+                <w:sz w:val="17"/>
+                <w:lang w:val="zh-CN" w:eastAsia="zh-CN"/>
+              </w:rPr>
+              <w:t xml:space="preserve">空（关闭）</w:t>
+            </w:r>
+          </w:p>
+        </w:tc>
+        <w:tc>
+          <w:tcPr>
+            <w:tcW w:w="900" w:type="dxa"/>
+            <w:vAlign w:val="center"/>
+            <w:tcMar>
+              <w:top w:w="80" w:type="dxa"/>
+              <w:start w:w="120" w:type="dxa"/>
+              <w:bottom w:w="80" w:type="dxa"/>
+              <w:end w:w="120" w:type="dxa"/>
+            </w:tcMar>
+          </w:tcPr>
+          <w:p>
+            <w:pPr>
+              <w:pStyle w:val="NanoLoopTable"/>
+              <w:keepNext w:val="0"/>
+              <w:keepLines w:val="0"/>
+              <w:jc w:val="left"/>
+            </w:pPr>
+            <w:r>
+              <w:rPr>
+                <w:rFonts w:ascii="Arial" w:hAnsi="Arial" w:eastAsia="PingFang SC" w:cs="Arial"/>
+                <w:sz w:val="17"/>
+                <w:lang w:val="zh-CN" w:eastAsia="zh-CN"/>
+              </w:rPr>
+              <w:t xml:space="preserve">C/E/F</w:t>
+            </w:r>
+          </w:p>
+        </w:tc>
+        <w:tc>
+          <w:tcPr>
+            <w:tcW w:w="4460" w:type="dxa"/>
+            <w:vAlign w:val="center"/>
+            <w:tcMar>
+              <w:top w:w="80" w:type="dxa"/>
+              <w:start w:w="120" w:type="dxa"/>
+              <w:bottom w:w="80" w:type="dxa"/>
+              <w:end w:w="120" w:type="dxa"/>
+            </w:tcMar>
+          </w:tcPr>
+          <w:p>
+            <w:pPr>
+              <w:pStyle w:val="NanoLoopTable"/>
+              <w:keepNext w:val="0"/>
+              <w:keepLines w:val="0"/>
+              <w:jc w:val="left"/>
+            </w:pPr>
+            <w:r>
+              <w:rPr>
+                <w:rFonts w:ascii="Arial" w:hAnsi="Arial" w:eastAsia="PingFang SC" w:cs="Arial"/>
+                <w:sz w:val="17"/>
+                <w:lang w:val="zh-CN" w:eastAsia="zh-CN"/>
+              </w:rPr>
+              <w:t xml:space="preserve">可选共享部署 Key；32～128 位 URL-safe 字符，只在 TLS 后使用</w:t>
+            </w:r>
+          </w:p>
+        </w:tc>
+      </w:tr>
+      <w:tr>
+        <w:trPr>
+          <w:cantSplit w:val="true"/>
+        </w:trPr>
+        <w:tc>
+          <w:tcPr>
+            <w:tcW w:w="2450" w:type="dxa"/>
+            <w:vAlign w:val="center"/>
+            <w:tcMar>
+              <w:top w:w="80" w:type="dxa"/>
+              <w:start w:w="120" w:type="dxa"/>
+              <w:bottom w:w="80" w:type="dxa"/>
+              <w:end w:w="120" w:type="dxa"/>
+            </w:tcMar>
+          </w:tcPr>
+          <w:p>
+            <w:pPr>
+              <w:pStyle w:val="NanoLoopTable"/>
+              <w:keepNext w:val="0"/>
+              <w:keepLines w:val="0"/>
+              <w:jc w:val="left"/>
+            </w:pPr>
+            <w:r>
+              <w:rPr>
+                <w:rStyle w:val="VerbatimChar"/>
+                <w:rFonts w:ascii="Arial" w:hAnsi="Arial" w:eastAsia="PingFang SC" w:cs="Arial"/>
+                <w:sz w:val="17"/>
+                <w:lang w:val="zh-CN" w:eastAsia="zh-CN"/>
+              </w:rPr>
+              <w:t xml:space="preserve">NANOLOOP_API_BASE_URL</w:t>
+            </w:r>
+          </w:p>
+        </w:tc>
+        <w:tc>
+          <w:tcPr>
+            <w:tcW w:w="1550" w:type="dxa"/>
+            <w:vAlign w:val="center"/>
+            <w:tcMar>
+              <w:top w:w="80" w:type="dxa"/>
+              <w:start w:w="120" w:type="dxa"/>
+              <w:bottom w:w="80" w:type="dxa"/>
+              <w:end w:w="120" w:type="dxa"/>
+            </w:tcMar>
+          </w:tcPr>
+          <w:p>
+            <w:pPr>
+              <w:pStyle w:val="NanoLoopTable"/>
+              <w:keepNext w:val="0"/>
+              <w:keepLines w:val="0"/>
+              <w:jc w:val="left"/>
+            </w:pPr>
+            <w:r>
+              <w:rPr>
+                <w:rStyle w:val="VerbatimChar"/>
+                <w:rFonts w:ascii="Arial" w:hAnsi="Arial" w:eastAsia="PingFang SC" w:cs="Arial"/>
+                <w:sz w:val="17"/>
+                <w:lang w:val="zh-CN" w:eastAsia="zh-CN"/>
+              </w:rPr>
+              <w:t xml:space="preserve">http://127.0.0.1:8000</w:t>
+            </w:r>
+            <w:r>
+              <w:rPr>
+                <w:rFonts w:ascii="Arial" w:hAnsi="Arial" w:eastAsia="PingFang SC" w:cs="Arial"/>
+                <w:sz w:val="17"/>
+                <w:lang w:val="zh-CN" w:eastAsia="zh-CN"/>
+              </w:rPr>
+              <w:t xml:space="preserve">；Compose</w:t>
+            </w:r>
+            <w:r>
+              <w:rPr>
+                <w:rFonts w:ascii="Arial" w:hAnsi="Arial" w:eastAsia="PingFang SC" w:cs="Arial"/>
+                <w:sz w:val="17"/>
+                <w:lang w:val="zh-CN" w:eastAsia="zh-CN"/>
+              </w:rPr>
+              <w:t xml:space="preserve"> </w:t>
+            </w:r>
+            <w:r>
+              <w:rPr>
+                <w:rStyle w:val="VerbatimChar"/>
+                <w:rFonts w:ascii="Arial" w:hAnsi="Arial" w:eastAsia="PingFang SC" w:cs="Arial"/>
+                <w:sz w:val="17"/>
+                <w:lang w:val="zh-CN" w:eastAsia="zh-CN"/>
+              </w:rPr>
+              <w:t xml:space="preserve">http://api:8000</w:t>
+            </w:r>
+          </w:p>
+        </w:tc>
+        <w:tc>
+          <w:tcPr>
+            <w:tcW w:w="900" w:type="dxa"/>
+            <w:vAlign w:val="center"/>
+            <w:tcMar>
+              <w:top w:w="80" w:type="dxa"/>
+              <w:start w:w="120" w:type="dxa"/>
+              <w:bottom w:w="80" w:type="dxa"/>
+              <w:end w:w="120" w:type="dxa"/>
+            </w:tcMar>
+          </w:tcPr>
+          <w:p>
+            <w:pPr>
+              <w:pStyle w:val="NanoLoopTable"/>
+              <w:keepNext w:val="0"/>
+              <w:keepLines w:val="0"/>
+              <w:jc w:val="left"/>
+            </w:pPr>
+            <w:r>
+              <w:rPr>
+                <w:rFonts w:ascii="Arial" w:hAnsi="Arial" w:eastAsia="PingFang SC" w:cs="Arial"/>
+                <w:sz w:val="17"/>
+                <w:lang w:val="zh-CN" w:eastAsia="zh-CN"/>
+              </w:rPr>
+              <w:t xml:space="preserve">E/F</w:t>
+            </w:r>
+          </w:p>
+        </w:tc>
+        <w:tc>
+          <w:tcPr>
+            <w:tcW w:w="4460" w:type="dxa"/>
+            <w:vAlign w:val="center"/>
+            <w:tcMar>
+              <w:top w:w="80" w:type="dxa"/>
+              <w:start w:w="120" w:type="dxa"/>
+              <w:bottom w:w="80" w:type="dxa"/>
+              <w:end w:w="120" w:type="dxa"/>
+            </w:tcMar>
+          </w:tcPr>
+          <w:p>
+            <w:pPr>
+              <w:pStyle w:val="NanoLoopTable"/>
+              <w:keepNext w:val="0"/>
+              <w:keepLines w:val="0"/>
+              <w:jc w:val="left"/>
+            </w:pPr>
+            <w:r>
+              <w:rPr>
+                <w:rFonts w:ascii="Arial" w:hAnsi="Arial" w:eastAsia="PingFang SC" w:cs="Arial"/>
+                <w:sz w:val="17"/>
+                <w:lang w:val="zh-CN" w:eastAsia="zh-CN"/>
+              </w:rPr>
+              <w:t xml:space="preserve">Streamlit 后端目标；配置共享 Key 时是不可被 session 改写的运维锁定值</w:t>
+            </w:r>
+          </w:p>
+        </w:tc>
+      </w:tr>
+      <w:tr>
+        <w:trPr>
+          <w:cantSplit w:val="true"/>
+        </w:trPr>
+        <w:tc>
+          <w:tcPr>
+            <w:tcW w:w="2450" w:type="dxa"/>
+            <w:vAlign w:val="center"/>
+            <w:tcMar>
+              <w:top w:w="80" w:type="dxa"/>
+              <w:start w:w="120" w:type="dxa"/>
+              <w:bottom w:w="80" w:type="dxa"/>
+              <w:end w:w="120" w:type="dxa"/>
+            </w:tcMar>
+          </w:tcPr>
+          <w:p>
+            <w:pPr>
+              <w:pStyle w:val="NanoLoopTable"/>
+              <w:keepNext w:val="0"/>
+              <w:keepLines w:val="0"/>
+              <w:jc w:val="left"/>
+            </w:pPr>
+            <w:r>
+              <w:rPr>
+                <w:rStyle w:val="VerbatimChar"/>
+                <w:rFonts w:ascii="Arial" w:hAnsi="Arial" w:eastAsia="PingFang SC" w:cs="Arial"/>
+                <w:sz w:val="17"/>
+                <w:lang w:val="zh-CN" w:eastAsia="zh-CN"/>
+              </w:rPr>
+              <w:t xml:space="preserve">API_RATE_LIMIT_REQUESTS</w:t>
+            </w:r>
+          </w:p>
+        </w:tc>
+        <w:tc>
+          <w:tcPr>
+            <w:tcW w:w="1550" w:type="dxa"/>
+            <w:vAlign w:val="center"/>
+            <w:tcMar>
+              <w:top w:w="80" w:type="dxa"/>
+              <w:start w:w="120" w:type="dxa"/>
+              <w:bottom w:w="80" w:type="dxa"/>
+              <w:end w:w="120" w:type="dxa"/>
+            </w:tcMar>
+          </w:tcPr>
+          <w:p>
+            <w:pPr>
+              <w:pStyle w:val="NanoLoopTable"/>
+              <w:keepNext w:val="0"/>
+              <w:keepLines w:val="0"/>
+              <w:jc w:val="left"/>
+            </w:pPr>
+            <w:r>
+              <w:rPr>
+                <w:rFonts w:ascii="Arial" w:hAnsi="Arial" w:eastAsia="PingFang SC" w:cs="Arial"/>
+                <w:sz w:val="17"/>
+                <w:lang w:val="zh-CN" w:eastAsia="zh-CN"/>
+              </w:rPr>
+              <w:t xml:space="preserve">Settings</w:t>
+            </w:r>
+            <w:r>
+              <w:rPr>
+                <w:rFonts w:ascii="Arial" w:hAnsi="Arial" w:eastAsia="PingFang SC" w:cs="Arial"/>
+                <w:sz w:val="17"/>
+                <w:lang w:val="zh-CN" w:eastAsia="zh-CN"/>
+              </w:rPr>
+              <w:t xml:space="preserve"> </w:t>
+            </w:r>
+            <w:r>
+              <w:rPr>
+                <w:rStyle w:val="VerbatimChar"/>
+                <w:rFonts w:ascii="Arial" w:hAnsi="Arial" w:eastAsia="PingFang SC" w:cs="Arial"/>
+                <w:sz w:val="17"/>
+                <w:lang w:val="zh-CN" w:eastAsia="zh-CN"/>
+              </w:rPr>
+              <w:t xml:space="preserve">0</w:t>
+            </w:r>
+            <w:r>
+              <w:rPr>
+                <w:rFonts w:ascii="Arial" w:hAnsi="Arial" w:eastAsia="PingFang SC" w:cs="Arial"/>
+                <w:sz w:val="17"/>
+                <w:lang w:val="zh-CN" w:eastAsia="zh-CN"/>
+              </w:rPr>
+              <w:t xml:space="preserve">；Compose</w:t>
+            </w:r>
+            <w:r>
+              <w:rPr>
+                <w:rFonts w:ascii="Arial" w:hAnsi="Arial" w:eastAsia="PingFang SC" w:cs="Arial"/>
+                <w:sz w:val="17"/>
+                <w:lang w:val="zh-CN" w:eastAsia="zh-CN"/>
+              </w:rPr>
+              <w:t xml:space="preserve"> </w:t>
+            </w:r>
+            <w:r>
+              <w:rPr>
+                <w:rStyle w:val="VerbatimChar"/>
+                <w:rFonts w:ascii="Arial" w:hAnsi="Arial" w:eastAsia="PingFang SC" w:cs="Arial"/>
+                <w:sz w:val="17"/>
+                <w:lang w:val="zh-CN" w:eastAsia="zh-CN"/>
+              </w:rPr>
+              <w:t xml:space="preserve">120</w:t>
+            </w:r>
+          </w:p>
+        </w:tc>
+        <w:tc>
+          <w:tcPr>
+            <w:tcW w:w="900" w:type="dxa"/>
+            <w:vAlign w:val="center"/>
+            <w:tcMar>
+              <w:top w:w="80" w:type="dxa"/>
+              <w:start w:w="120" w:type="dxa"/>
+              <w:bottom w:w="80" w:type="dxa"/>
+              <w:end w:w="120" w:type="dxa"/>
+            </w:tcMar>
+          </w:tcPr>
+          <w:p>
+            <w:pPr>
+              <w:pStyle w:val="NanoLoopTable"/>
+              <w:keepNext w:val="0"/>
+              <w:keepLines w:val="0"/>
+              <w:jc w:val="left"/>
+            </w:pPr>
+            <w:r>
+              <w:rPr>
+                <w:rFonts w:ascii="Arial" w:hAnsi="Arial" w:eastAsia="PingFang SC" w:cs="Arial"/>
+                <w:sz w:val="17"/>
+                <w:lang w:val="zh-CN" w:eastAsia="zh-CN"/>
+              </w:rPr>
+              <w:t xml:space="preserve">C/F</w:t>
+            </w:r>
+          </w:p>
+        </w:tc>
+        <w:tc>
+          <w:tcPr>
+            <w:tcW w:w="4460" w:type="dxa"/>
+            <w:vAlign w:val="center"/>
+            <w:tcMar>
+              <w:top w:w="80" w:type="dxa"/>
+              <w:start w:w="120" w:type="dxa"/>
+              <w:bottom w:w="80" w:type="dxa"/>
+              <w:end w:w="120" w:type="dxa"/>
+            </w:tcMar>
+          </w:tcPr>
+          <w:p>
+            <w:pPr>
+              <w:pStyle w:val="NanoLoopTable"/>
+              <w:keepNext w:val="0"/>
+              <w:keepLines w:val="0"/>
+              <w:jc w:val="left"/>
+            </w:pPr>
+            <w:r>
+              <w:rPr>
+                <w:rFonts w:ascii="Arial" w:hAnsi="Arial" w:eastAsia="PingFang SC" w:cs="Arial"/>
+                <w:sz w:val="17"/>
+                <w:lang w:val="zh-CN" w:eastAsia="zh-CN"/>
+              </w:rPr>
+              <w:t xml:space="preserve">每个固定类别桶的容量；与下一项共同决定连续补充速率，</w:t>
+            </w:r>
+            <w:r>
+              <w:rPr>
+                <w:rStyle w:val="VerbatimChar"/>
+                <w:rFonts w:ascii="Arial" w:hAnsi="Arial" w:eastAsia="PingFang SC" w:cs="Arial"/>
+                <w:sz w:val="17"/>
+                <w:lang w:val="zh-CN" w:eastAsia="zh-CN"/>
+              </w:rPr>
+              <w:t xml:space="preserve">0</w:t>
+            </w:r>
+            <w:r>
+              <w:rPr>
+                <w:rFonts w:ascii="Arial" w:hAnsi="Arial" w:eastAsia="PingFang SC" w:cs="Arial"/>
+                <w:sz w:val="17"/>
+                <w:lang w:val="zh-CN" w:eastAsia="zh-CN"/>
+              </w:rPr>
+              <w:t xml:space="preserve"> </w:t>
+            </w:r>
+            <w:r>
+              <w:rPr>
+                <w:rFonts w:ascii="Arial" w:hAnsi="Arial" w:eastAsia="PingFang SC" w:cs="Arial"/>
+                <w:sz w:val="17"/>
+                <w:lang w:val="zh-CN" w:eastAsia="zh-CN"/>
+              </w:rPr>
+              <w:t xml:space="preserve">关闭</w:t>
+            </w:r>
+          </w:p>
+        </w:tc>
+      </w:tr>
+      <w:tr>
+        <w:trPr>
+          <w:cantSplit w:val="true"/>
+        </w:trPr>
+        <w:tc>
+          <w:tcPr>
+            <w:tcW w:w="2450" w:type="dxa"/>
+            <w:vAlign w:val="center"/>
+            <w:tcMar>
+              <w:top w:w="80" w:type="dxa"/>
+              <w:start w:w="120" w:type="dxa"/>
+              <w:bottom w:w="80" w:type="dxa"/>
+              <w:end w:w="120" w:type="dxa"/>
+            </w:tcMar>
+          </w:tcPr>
+          <w:p>
+            <w:pPr>
+              <w:pStyle w:val="NanoLoopTable"/>
+              <w:keepNext w:val="0"/>
+              <w:keepLines w:val="0"/>
+              <w:jc w:val="left"/>
+            </w:pPr>
+            <w:r>
+              <w:rPr>
+                <w:rStyle w:val="VerbatimChar"/>
+                <w:rFonts w:ascii="Arial" w:hAnsi="Arial" w:eastAsia="PingFang SC" w:cs="Arial"/>
+                <w:sz w:val="17"/>
+                <w:lang w:val="zh-CN" w:eastAsia="zh-CN"/>
+              </w:rPr>
+              <w:t xml:space="preserve">API_RATE_LIMIT_WINDOW_SECONDS</w:t>
+            </w:r>
+          </w:p>
+        </w:tc>
+        <w:tc>
+          <w:tcPr>
+            <w:tcW w:w="1550" w:type="dxa"/>
+            <w:vAlign w:val="center"/>
+            <w:tcMar>
+              <w:top w:w="80" w:type="dxa"/>
+              <w:start w:w="120" w:type="dxa"/>
+              <w:bottom w:w="80" w:type="dxa"/>
+              <w:end w:w="120" w:type="dxa"/>
+            </w:tcMar>
+          </w:tcPr>
+          <w:p>
+            <w:pPr>
+              <w:pStyle w:val="NanoLoopTable"/>
+              <w:keepNext w:val="0"/>
+              <w:keepLines w:val="0"/>
+              <w:jc w:val="left"/>
+            </w:pPr>
+            <w:r>
+              <w:rPr>
+                <w:rStyle w:val="VerbatimChar"/>
+                <w:rFonts w:ascii="Arial" w:hAnsi="Arial" w:eastAsia="PingFang SC" w:cs="Arial"/>
+                <w:sz w:val="17"/>
+                <w:lang w:val="zh-CN" w:eastAsia="zh-CN"/>
+              </w:rPr>
+              <w:t xml:space="preserve">60</w:t>
+            </w:r>
+          </w:p>
+        </w:tc>
+        <w:tc>
+          <w:tcPr>
+            <w:tcW w:w="900" w:type="dxa"/>
+            <w:vAlign w:val="center"/>
+            <w:tcMar>
+              <w:top w:w="80" w:type="dxa"/>
+              <w:start w:w="120" w:type="dxa"/>
+              <w:bottom w:w="80" w:type="dxa"/>
+              <w:end w:w="120" w:type="dxa"/>
+            </w:tcMar>
+          </w:tcPr>
+          <w:p>
+            <w:pPr>
+              <w:pStyle w:val="NanoLoopTable"/>
+              <w:keepNext w:val="0"/>
+              <w:keepLines w:val="0"/>
+              <w:jc w:val="left"/>
+            </w:pPr>
+            <w:r>
+              <w:rPr>
+                <w:rFonts w:ascii="Arial" w:hAnsi="Arial" w:eastAsia="PingFang SC" w:cs="Arial"/>
+                <w:sz w:val="17"/>
+                <w:lang w:val="zh-CN" w:eastAsia="zh-CN"/>
+              </w:rPr>
+              <w:t xml:space="preserve">C/F</w:t>
+            </w:r>
+          </w:p>
+        </w:tc>
+        <w:tc>
+          <w:tcPr>
+            <w:tcW w:w="4460" w:type="dxa"/>
+            <w:vAlign w:val="center"/>
+            <w:tcMar>
+              <w:top w:w="80" w:type="dxa"/>
+              <w:start w:w="120" w:type="dxa"/>
+              <w:bottom w:w="80" w:type="dxa"/>
+              <w:end w:w="120" w:type="dxa"/>
+            </w:tcMar>
+          </w:tcPr>
+          <w:p>
+            <w:pPr>
+              <w:pStyle w:val="NanoLoopTable"/>
+              <w:keepNext w:val="0"/>
+              <w:keepLines w:val="0"/>
+              <w:jc w:val="left"/>
+            </w:pPr>
+            <w:r>
+              <w:rPr>
+                <w:rFonts w:ascii="Arial" w:hAnsi="Arial" w:eastAsia="PingFang SC" w:cs="Arial"/>
+                <w:sz w:val="17"/>
+                <w:lang w:val="zh-CN" w:eastAsia="zh-CN"/>
+              </w:rPr>
+              <w:t xml:space="preserve">token bucket 从空到满的补充时长；进程内生效，不在副本间共享</w:t>
             </w:r>
           </w:p>
         </w:tc>
@@ -32998,7 +36226,7 @@
                 <w:sz w:val="17"/>
                 <w:lang w:val="zh-CN" w:eastAsia="zh-CN"/>
               </w:rPr>
-              <w:t xml:space="preserve">迁移</w:t>
+              <w:t xml:space="preserve">API 安全</w:t>
             </w:r>
           </w:p>
         </w:tc>
@@ -33027,7 +36255,7 @@
                 <w:sz w:val="17"/>
                 <w:lang w:val="zh-CN" w:eastAsia="zh-CN"/>
               </w:rPr>
-              <w:t xml:space="preserve">PYTHON_BIN=.venv/bin/python ./scripts/check_migrations.sh</w:t>
+              <w:t xml:space="preserve">.venv/bin/pytest -q tests/unit/core/test_security.py tests/unit/core/test_rate_limit.py tests/unit/api/test_middleware.py tests/unit/frontend/test_api_client.py tests/integration/api_contract</w:t>
             </w:r>
           </w:p>
         </w:tc>
@@ -33055,7 +36283,7 @@
                 <w:sz w:val="17"/>
                 <w:lang w:val="zh-CN" w:eastAsia="zh-CN"/>
               </w:rPr>
-              <w:t xml:space="preserve">upgrade/downgrade/upgrade 与 drift 为零</w:t>
+              <w:t xml:space="preserve">Key 成败/目标绑定、CORS 预检、三桶隔离、429 头和 OpenAPI security 均符合合同</w:t>
             </w:r>
           </w:p>
         </w:tc>
@@ -33088,6 +36316,96 @@
                 <w:sz w:val="17"/>
                 <w:lang w:val="zh-CN" w:eastAsia="zh-CN"/>
               </w:rPr>
+              <w:t xml:space="preserve">迁移</w:t>
+            </w:r>
+          </w:p>
+        </w:tc>
+        <w:tc>
+          <w:tcPr>
+            <w:tcW w:w="2850" w:type="dxa"/>
+            <w:vAlign w:val="center"/>
+            <w:tcMar>
+              <w:top w:w="80" w:type="dxa"/>
+              <w:start w:w="120" w:type="dxa"/>
+              <w:bottom w:w="80" w:type="dxa"/>
+              <w:end w:w="120" w:type="dxa"/>
+            </w:tcMar>
+          </w:tcPr>
+          <w:p>
+            <w:pPr>
+              <w:pStyle w:val="NanoLoopTable"/>
+              <w:keepNext w:val="0"/>
+              <w:keepLines w:val="0"/>
+              <w:jc w:val="left"/>
+            </w:pPr>
+            <w:r>
+              <w:rPr>
+                <w:rStyle w:val="VerbatimChar"/>
+                <w:rFonts w:ascii="Arial" w:hAnsi="Arial" w:eastAsia="PingFang SC" w:cs="Arial"/>
+                <w:sz w:val="17"/>
+                <w:lang w:val="zh-CN" w:eastAsia="zh-CN"/>
+              </w:rPr>
+              <w:t xml:space="preserve">PYTHON_BIN=.venv/bin/python ./scripts/check_migrations.sh</w:t>
+            </w:r>
+          </w:p>
+        </w:tc>
+        <w:tc>
+          <w:tcPr>
+            <w:tcW w:w="5060" w:type="dxa"/>
+            <w:vAlign w:val="center"/>
+            <w:tcMar>
+              <w:top w:w="80" w:type="dxa"/>
+              <w:start w:w="120" w:type="dxa"/>
+              <w:bottom w:w="80" w:type="dxa"/>
+              <w:end w:w="120" w:type="dxa"/>
+            </w:tcMar>
+          </w:tcPr>
+          <w:p>
+            <w:pPr>
+              <w:pStyle w:val="NanoLoopTable"/>
+              <w:keepNext w:val="0"/>
+              <w:keepLines w:val="0"/>
+              <w:jc w:val="left"/>
+            </w:pPr>
+            <w:r>
+              <w:rPr>
+                <w:rFonts w:ascii="Arial" w:hAnsi="Arial" w:eastAsia="PingFang SC" w:cs="Arial"/>
+                <w:sz w:val="17"/>
+                <w:lang w:val="zh-CN" w:eastAsia="zh-CN"/>
+              </w:rPr>
+              <w:t xml:space="preserve">upgrade/downgrade/upgrade 与 drift 为零</w:t>
+            </w:r>
+          </w:p>
+        </w:tc>
+      </w:tr>
+      <w:tr>
+        <w:trPr>
+          <w:cantSplit w:val="true"/>
+        </w:trPr>
+        <w:tc>
+          <w:tcPr>
+            <w:tcW w:w="1450" w:type="dxa"/>
+            <w:vAlign w:val="center"/>
+            <w:tcMar>
+              <w:top w:w="80" w:type="dxa"/>
+              <w:start w:w="120" w:type="dxa"/>
+              <w:bottom w:w="80" w:type="dxa"/>
+              <w:end w:w="120" w:type="dxa"/>
+            </w:tcMar>
+          </w:tcPr>
+          <w:p>
+            <w:pPr>
+              <w:pStyle w:val="NanoLoopTable"/>
+              <w:keepNext w:val="0"/>
+              <w:keepLines w:val="0"/>
+              <w:jc w:val="left"/>
+            </w:pPr>
+            <w:r>
+              <w:rPr>
+                <w:rFonts w:ascii="Arial" w:hAnsi="Arial" w:eastAsia="PingFang SC" w:cs="Arial"/>
+                <w:sz w:val="17"/>
+                <w:lang w:val="zh-CN" w:eastAsia="zh-CN"/>
+              </w:rPr>
               <w:t xml:space="preserve">Compose</w:t>
             </w:r>
           </w:p>
@@ -33146,6 +36464,145 @@
                 <w:lang w:val="zh-CN" w:eastAsia="zh-CN"/>
               </w:rPr>
               <w:t xml:space="preserve">配置可解析且变量合同一致</w:t>
+            </w:r>
+          </w:p>
+        </w:tc>
+      </w:tr>
+      <w:tr>
+        <w:trPr>
+          <w:cantSplit w:val="true"/>
+        </w:trPr>
+        <w:tc>
+          <w:tcPr>
+            <w:tcW w:w="1450" w:type="dxa"/>
+            <w:vAlign w:val="center"/>
+            <w:tcMar>
+              <w:top w:w="80" w:type="dxa"/>
+              <w:start w:w="120" w:type="dxa"/>
+              <w:bottom w:w="80" w:type="dxa"/>
+              <w:end w:w="120" w:type="dxa"/>
+            </w:tcMar>
+          </w:tcPr>
+          <w:p>
+            <w:pPr>
+              <w:pStyle w:val="NanoLoopTable"/>
+              <w:keepNext w:val="0"/>
+              <w:keepLines w:val="0"/>
+              <w:jc w:val="left"/>
+            </w:pPr>
+            <w:r>
+              <w:rPr>
+                <w:rFonts w:ascii="Arial" w:hAnsi="Arial" w:eastAsia="PingFang SC" w:cs="Arial"/>
+                <w:sz w:val="17"/>
+                <w:lang w:val="zh-CN" w:eastAsia="zh-CN"/>
+              </w:rPr>
+              <w:t xml:space="preserve">容器 CI</w:t>
+            </w:r>
+          </w:p>
+        </w:tc>
+        <w:tc>
+          <w:tcPr>
+            <w:tcW w:w="2850" w:type="dxa"/>
+            <w:vAlign w:val="center"/>
+            <w:tcMar>
+              <w:top w:w="80" w:type="dxa"/>
+              <w:start w:w="120" w:type="dxa"/>
+              <w:bottom w:w="80" w:type="dxa"/>
+              <w:end w:w="120" w:type="dxa"/>
+            </w:tcMar>
+          </w:tcPr>
+          <w:p>
+            <w:pPr>
+              <w:pStyle w:val="NanoLoopTable"/>
+              <w:keepNext w:val="0"/>
+              <w:keepLines w:val="0"/>
+              <w:jc w:val="left"/>
+            </w:pPr>
+            <w:r>
+              <w:rPr>
+                <w:rFonts w:ascii="Arial" w:hAnsi="Arial" w:eastAsia="PingFang SC" w:cs="Arial"/>
+                <w:sz w:val="17"/>
+                <w:lang w:val="zh-CN" w:eastAsia="zh-CN"/>
+              </w:rPr>
+              <w:t xml:space="preserve">GitHub</w:t>
+            </w:r>
+            <w:r>
+              <w:rPr>
+                <w:rFonts w:ascii="Arial" w:hAnsi="Arial" w:eastAsia="PingFang SC" w:cs="Arial"/>
+                <w:sz w:val="17"/>
+                <w:lang w:val="zh-CN" w:eastAsia="zh-CN"/>
+              </w:rPr>
+              <w:t xml:space="preserve"> </w:t>
+            </w:r>
+            <w:r>
+              <w:rPr>
+                <w:rStyle w:val="VerbatimChar"/>
+                <w:rFonts w:ascii="Arial" w:hAnsi="Arial" w:eastAsia="PingFang SC" w:cs="Arial"/>
+                <w:sz w:val="17"/>
+                <w:lang w:val="zh-CN" w:eastAsia="zh-CN"/>
+              </w:rPr>
+              <w:t xml:space="preserve">CPU container smoke test</w:t>
+            </w:r>
+          </w:p>
+        </w:tc>
+        <w:tc>
+          <w:tcPr>
+            <w:tcW w:w="5060" w:type="dxa"/>
+            <w:vAlign w:val="center"/>
+            <w:tcMar>
+              <w:top w:w="80" w:type="dxa"/>
+              <w:start w:w="120" w:type="dxa"/>
+              <w:bottom w:w="80" w:type="dxa"/>
+              <w:end w:w="120" w:type="dxa"/>
+            </w:tcMar>
+          </w:tcPr>
+          <w:p>
+            <w:pPr>
+              <w:pStyle w:val="NanoLoopTable"/>
+              <w:keepNext w:val="0"/>
+              <w:keepLines w:val="0"/>
+              <w:jc w:val="left"/>
+            </w:pPr>
+            <w:r>
+              <w:rPr>
+                <w:rFonts w:ascii="Arial" w:hAnsi="Arial" w:eastAsia="PingFang SC" w:cs="Arial"/>
+                <w:sz w:val="17"/>
+                <w:lang w:val="zh-CN" w:eastAsia="zh-CN"/>
+              </w:rPr>
+              <w:t xml:space="preserve">API/前端以非 root、只读根启动；前端容器在隔离网络经</w:t>
+            </w:r>
+            <w:r>
+              <w:rPr>
+                <w:rFonts w:ascii="Arial" w:hAnsi="Arial" w:eastAsia="PingFang SC" w:cs="Arial"/>
+                <w:sz w:val="17"/>
+                <w:lang w:val="zh-CN" w:eastAsia="zh-CN"/>
+              </w:rPr>
+              <w:t xml:space="preserve"> </w:t>
+            </w:r>
+            <w:r>
+              <w:rPr>
+                <w:rStyle w:val="VerbatimChar"/>
+                <w:rFonts w:ascii="Arial" w:hAnsi="Arial" w:eastAsia="PingFang SC" w:cs="Arial"/>
+                <w:sz w:val="17"/>
+                <w:lang w:val="zh-CN" w:eastAsia="zh-CN"/>
+              </w:rPr>
+              <w:t xml:space="preserve">api</w:t>
+            </w:r>
+            <w:r>
+              <w:rPr>
+                <w:rFonts w:ascii="Arial" w:hAnsi="Arial" w:eastAsia="PingFang SC" w:cs="Arial"/>
+                <w:sz w:val="17"/>
+                <w:lang w:val="zh-CN" w:eastAsia="zh-CN"/>
+              </w:rPr>
+              <w:t xml:space="preserve"> </w:t>
+            </w:r>
+            <w:r>
+              <w:rPr>
+                <w:rFonts w:ascii="Arial" w:hAnsi="Arial" w:eastAsia="PingFang SC" w:cs="Arial"/>
+                <w:sz w:val="17"/>
+                <w:lang w:val="zh-CN" w:eastAsia="zh-CN"/>
+              </w:rPr>
+              <w:t xml:space="preserve">DNS/Host 携测试 Key 访问版本化 health</w:t>
             </w:r>
           </w:p>
         </w:tc>
@@ -33174,7 +36631,7 @@
           <w:rFonts w:ascii="Arial" w:hAnsi="Arial" w:eastAsia="PingFang SC" w:cs="Arial"/>
           <w:lang w:val="zh-CN" w:eastAsia="zh-CN"/>
         </w:rPr>
-        <w:t xml:space="preserve">已聚合前六项中的本地代码门禁。</w:t>
+        <w:t xml:space="preserve">已聚合代码质量、类型、OpenAPI、全量 Pytest、前端与迁移门禁；API 安全用例包含在全量 Pytest 中。Compose 和容器运行证据需另行执行。</w:t>
       </w:r>
     </w:p>
     <w:bookmarkEnd w:id="105"/>
@@ -34990,10 +38447,6 @@
     </w:sectPr>
   </w:body>
 </w:document>
-</file>
-
-<file path=word/comments.xml><?xml version="1.0" encoding="utf-8"?>
-<w:comments xmlns:w="http://schemas.openxmlformats.org/wordprocessingml/2006/main" xmlns:m="http://schemas.openxmlformats.org/officeDocument/2006/math" xmlns:r="http://schemas.openxmlformats.org/officeDocument/2006/relationships" xmlns:o="urn:schemas-microsoft-com:office:office" xmlns:v="urn:schemas-microsoft-com:vml" xmlns:w10="urn:schemas-microsoft-com:office:word" xmlns:a="http://schemas.openxmlformats.org/drawingml/2006/main" xmlns:pic="http://schemas.openxmlformats.org/drawingml/2006/picture" xmlns:wp="http://schemas.openxmlformats.org/drawingml/2006/wordprocessingDrawing"/>
 </file>
 
 <file path=word/footer1.xml><?xml version="1.0" encoding="utf-8"?>

</xml_diff>